<commit_message>
Comptoir : suivi atelier, encaissement et journal de caisse
- Fiche « Gérer » : étapes de traitement à cocher, photos d'intervention
  (prises au téléphone), facture et encaissement
- Restitution au comptoir : reste à payer affiché, encaissement, restitution
  possible avec impayé (tracée dans l'historique)
- Le technicien encaisse (paiement signé de son nom) ; remboursement,
  annulation et remise restent au manager
- Facture créée automatiquement à la validation de la prestation
- Journal de caisse quotidien : par moyen, par personne, espèces à rapprocher
- Côté client : étapes cochées et photos d'atelier visibles
- Corrige l'agrégat du journal de caisse, la détection de succès des actions
  sans résultat, et clarifie le message en cas de rejet CSRF
- Guide de fonctionnement mis à jour. 50 tests backend.

Co-Authored-By: Claude Opus 5.5 <noreply@anthropic.com>
</commit_message>
<xml_diff>
--- a/docs/guide-fonctionnement.docx
+++ b/docs/guide-fonctionnement.docx
@@ -109,7 +109,7 @@
     <w:sdt>
       <w:sdtPr>
         <w:alias w:val="Sommaire"/>
-        <w:id w:val="-304855047"/>
+        <w:id w:val="-1404745692"/>
       </w:sdtPr>
       <w:sdtEndPr/>
       <w:sdtContent>
@@ -138,7 +138,7 @@
           <w:r>
             <w:fldChar w:fldCharType="separate"/>
           </w:r>
-          <w:hyperlink w:anchor="_Toc241860560" w:history="1">
+          <w:hyperlink w:anchor="_Toc241882488" w:history="1">
             <w:r>
               <w:rPr>
                 <w:rStyle w:val="Lienhypertexte"/>
@@ -162,7 +162,7 @@
               <w:rPr>
                 <w:noProof/>
               </w:rPr>
-              <w:instrText xml:space="preserve"> PAGEREF _Toc241860560 \h </w:instrText>
+              <w:instrText xml:space="preserve"> PAGEREF _Toc241882488 \h </w:instrText>
             </w:r>
             <w:r>
               <w:rPr>
@@ -179,7 +179,7 @@
               <w:rPr>
                 <w:noProof/>
               </w:rPr>
-              <w:t>3</w:t>
+              <w:t>4</w:t>
             </w:r>
             <w:r>
               <w:rPr>
@@ -205,7 +205,7 @@
               <w14:ligatures w14:val="standardContextual"/>
             </w:rPr>
           </w:pPr>
-          <w:hyperlink w:anchor="_Toc241860561" w:history="1">
+          <w:hyperlink w:anchor="_Toc241882489" w:history="1">
             <w:r>
               <w:rPr>
                 <w:rStyle w:val="Lienhypertexte"/>
@@ -229,7 +229,7 @@
               <w:rPr>
                 <w:noProof/>
               </w:rPr>
-              <w:instrText xml:space="preserve"> PAGEREF _Toc241860561 \h </w:instrText>
+              <w:instrText xml:space="preserve"> PAGEREF _Toc241882489 \h </w:instrText>
             </w:r>
             <w:r>
               <w:rPr>
@@ -246,7 +246,7 @@
               <w:rPr>
                 <w:noProof/>
               </w:rPr>
-              <w:t>3</w:t>
+              <w:t>4</w:t>
             </w:r>
             <w:r>
               <w:rPr>
@@ -272,7 +272,7 @@
               <w14:ligatures w14:val="standardContextual"/>
             </w:rPr>
           </w:pPr>
-          <w:hyperlink w:anchor="_Toc241860562" w:history="1">
+          <w:hyperlink w:anchor="_Toc241882490" w:history="1">
             <w:r>
               <w:rPr>
                 <w:rStyle w:val="Lienhypertexte"/>
@@ -296,7 +296,7 @@
               <w:rPr>
                 <w:noProof/>
               </w:rPr>
-              <w:instrText xml:space="preserve"> PAGEREF _Toc241860562 \h </w:instrText>
+              <w:instrText xml:space="preserve"> PAGEREF _Toc241882490 \h </w:instrText>
             </w:r>
             <w:r>
               <w:rPr>
@@ -313,7 +313,7 @@
               <w:rPr>
                 <w:noProof/>
               </w:rPr>
-              <w:t>3</w:t>
+              <w:t>4</w:t>
             </w:r>
             <w:r>
               <w:rPr>
@@ -339,7 +339,7 @@
               <w14:ligatures w14:val="standardContextual"/>
             </w:rPr>
           </w:pPr>
-          <w:hyperlink w:anchor="_Toc241860563" w:history="1">
+          <w:hyperlink w:anchor="_Toc241882491" w:history="1">
             <w:r>
               <w:rPr>
                 <w:rStyle w:val="Lienhypertexte"/>
@@ -363,7 +363,7 @@
               <w:rPr>
                 <w:noProof/>
               </w:rPr>
-              <w:instrText xml:space="preserve"> PAGEREF _Toc241860563 \h </w:instrText>
+              <w:instrText xml:space="preserve"> PAGEREF _Toc241882491 \h </w:instrText>
             </w:r>
             <w:r>
               <w:rPr>
@@ -380,7 +380,7 @@
               <w:rPr>
                 <w:noProof/>
               </w:rPr>
-              <w:t>4</w:t>
+              <w:t>5</w:t>
             </w:r>
             <w:r>
               <w:rPr>
@@ -406,7 +406,7 @@
               <w14:ligatures w14:val="standardContextual"/>
             </w:rPr>
           </w:pPr>
-          <w:hyperlink w:anchor="_Toc241860564" w:history="1">
+          <w:hyperlink w:anchor="_Toc241882492" w:history="1">
             <w:r>
               <w:rPr>
                 <w:rStyle w:val="Lienhypertexte"/>
@@ -430,7 +430,7 @@
               <w:rPr>
                 <w:noProof/>
               </w:rPr>
-              <w:instrText xml:space="preserve"> PAGEREF _Toc241860564 \h </w:instrText>
+              <w:instrText xml:space="preserve"> PAGEREF _Toc241882492 \h </w:instrText>
             </w:r>
             <w:r>
               <w:rPr>
@@ -447,7 +447,7 @@
               <w:rPr>
                 <w:noProof/>
               </w:rPr>
-              <w:t>4</w:t>
+              <w:t>5</w:t>
             </w:r>
             <w:r>
               <w:rPr>
@@ -473,7 +473,7 @@
               <w14:ligatures w14:val="standardContextual"/>
             </w:rPr>
           </w:pPr>
-          <w:hyperlink w:anchor="_Toc241860565" w:history="1">
+          <w:hyperlink w:anchor="_Toc241882493" w:history="1">
             <w:r>
               <w:rPr>
                 <w:rStyle w:val="Lienhypertexte"/>
@@ -497,7 +497,7 @@
               <w:rPr>
                 <w:noProof/>
               </w:rPr>
-              <w:instrText xml:space="preserve"> PAGEREF _Toc241860565 \h </w:instrText>
+              <w:instrText xml:space="preserve"> PAGEREF _Toc241882493 \h </w:instrText>
             </w:r>
             <w:r>
               <w:rPr>
@@ -514,7 +514,7 @@
               <w:rPr>
                 <w:noProof/>
               </w:rPr>
-              <w:t>4</w:t>
+              <w:t>5</w:t>
             </w:r>
             <w:r>
               <w:rPr>
@@ -540,7 +540,7 @@
               <w14:ligatures w14:val="standardContextual"/>
             </w:rPr>
           </w:pPr>
-          <w:hyperlink w:anchor="_Toc241860566" w:history="1">
+          <w:hyperlink w:anchor="_Toc241882494" w:history="1">
             <w:r>
               <w:rPr>
                 <w:rStyle w:val="Lienhypertexte"/>
@@ -564,7 +564,7 @@
               <w:rPr>
                 <w:noProof/>
               </w:rPr>
-              <w:instrText xml:space="preserve"> PAGEREF _Toc241860566 \h </w:instrText>
+              <w:instrText xml:space="preserve"> PAGEREF _Toc241882494 \h </w:instrText>
             </w:r>
             <w:r>
               <w:rPr>
@@ -581,7 +581,7 @@
               <w:rPr>
                 <w:noProof/>
               </w:rPr>
-              <w:t>5</w:t>
+              <w:t>6</w:t>
             </w:r>
             <w:r>
               <w:rPr>
@@ -607,7 +607,7 @@
               <w14:ligatures w14:val="standardContextual"/>
             </w:rPr>
           </w:pPr>
-          <w:hyperlink w:anchor="_Toc241860567" w:history="1">
+          <w:hyperlink w:anchor="_Toc241882495" w:history="1">
             <w:r>
               <w:rPr>
                 <w:rStyle w:val="Lienhypertexte"/>
@@ -631,7 +631,7 @@
               <w:rPr>
                 <w:noProof/>
               </w:rPr>
-              <w:instrText xml:space="preserve"> PAGEREF _Toc241860567 \h </w:instrText>
+              <w:instrText xml:space="preserve"> PAGEREF _Toc241882495 \h </w:instrText>
             </w:r>
             <w:r>
               <w:rPr>
@@ -648,7 +648,7 @@
               <w:rPr>
                 <w:noProof/>
               </w:rPr>
-              <w:t>5</w:t>
+              <w:t>6</w:t>
             </w:r>
             <w:r>
               <w:rPr>
@@ -674,7 +674,7 @@
               <w14:ligatures w14:val="standardContextual"/>
             </w:rPr>
           </w:pPr>
-          <w:hyperlink w:anchor="_Toc241860568" w:history="1">
+          <w:hyperlink w:anchor="_Toc241882496" w:history="1">
             <w:r>
               <w:rPr>
                 <w:rStyle w:val="Lienhypertexte"/>
@@ -698,7 +698,7 @@
               <w:rPr>
                 <w:noProof/>
               </w:rPr>
-              <w:instrText xml:space="preserve"> PAGEREF _Toc241860568 \h </w:instrText>
+              <w:instrText xml:space="preserve"> PAGEREF _Toc241882496 \h </w:instrText>
             </w:r>
             <w:r>
               <w:rPr>
@@ -715,7 +715,7 @@
               <w:rPr>
                 <w:noProof/>
               </w:rPr>
-              <w:t>5</w:t>
+              <w:t>6</w:t>
             </w:r>
             <w:r>
               <w:rPr>
@@ -741,7 +741,7 @@
               <w14:ligatures w14:val="standardContextual"/>
             </w:rPr>
           </w:pPr>
-          <w:hyperlink w:anchor="_Toc241860569" w:history="1">
+          <w:hyperlink w:anchor="_Toc241882497" w:history="1">
             <w:r>
               <w:rPr>
                 <w:rStyle w:val="Lienhypertexte"/>
@@ -765,7 +765,7 @@
               <w:rPr>
                 <w:noProof/>
               </w:rPr>
-              <w:instrText xml:space="preserve"> PAGEREF _Toc241860569 \h </w:instrText>
+              <w:instrText xml:space="preserve"> PAGEREF _Toc241882497 \h </w:instrText>
             </w:r>
             <w:r>
               <w:rPr>
@@ -782,7 +782,7 @@
               <w:rPr>
                 <w:noProof/>
               </w:rPr>
-              <w:t>6</w:t>
+              <w:t>7</w:t>
             </w:r>
             <w:r>
               <w:rPr>
@@ -808,7 +808,7 @@
               <w14:ligatures w14:val="standardContextual"/>
             </w:rPr>
           </w:pPr>
-          <w:hyperlink w:anchor="_Toc241860570" w:history="1">
+          <w:hyperlink w:anchor="_Toc241882498" w:history="1">
             <w:r>
               <w:rPr>
                 <w:rStyle w:val="Lienhypertexte"/>
@@ -832,7 +832,7 @@
               <w:rPr>
                 <w:noProof/>
               </w:rPr>
-              <w:instrText xml:space="preserve"> PAGEREF _Toc241860570 \h </w:instrText>
+              <w:instrText xml:space="preserve"> PAGEREF _Toc241882498 \h </w:instrText>
             </w:r>
             <w:r>
               <w:rPr>
@@ -849,7 +849,7 @@
               <w:rPr>
                 <w:noProof/>
               </w:rPr>
-              <w:t>6</w:t>
+              <w:t>7</w:t>
             </w:r>
             <w:r>
               <w:rPr>
@@ -875,13 +875,13 @@
               <w14:ligatures w14:val="standardContextual"/>
             </w:rPr>
           </w:pPr>
-          <w:hyperlink w:anchor="_Toc241860571" w:history="1">
+          <w:hyperlink w:anchor="_Toc241882499" w:history="1">
             <w:r>
               <w:rPr>
                 <w:rStyle w:val="Lienhypertexte"/>
                 <w:noProof/>
               </w:rPr>
-              <w:t>3.2 L’avancement affiché au client</w:t>
+              <w:t>3.2 Restitution et paiement au comptoir</w:t>
             </w:r>
             <w:r>
               <w:rPr>
@@ -899,7 +899,7 @@
               <w:rPr>
                 <w:noProof/>
               </w:rPr>
-              <w:instrText xml:space="preserve"> PAGEREF _Toc241860571 \h </w:instrText>
+              <w:instrText xml:space="preserve"> PAGEREF _Toc241882499 \h </w:instrText>
             </w:r>
             <w:r>
               <w:rPr>
@@ -916,7 +916,74 @@
               <w:rPr>
                 <w:noProof/>
               </w:rPr>
-              <w:t>6</w:t>
+              <w:t>7</w:t>
+            </w:r>
+            <w:r>
+              <w:rPr>
+                <w:noProof/>
+              </w:rPr>
+              <w:fldChar w:fldCharType="end"/>
+            </w:r>
+          </w:hyperlink>
+        </w:p>
+        <w:p>
+          <w:pPr>
+            <w:pStyle w:val="TM2"/>
+            <w:tabs>
+              <w:tab w:val="right" w:leader="dot" w:pos="9016"/>
+            </w:tabs>
+            <w:rPr>
+              <w:rFonts w:asciiTheme="minorHAnsi" w:eastAsiaTheme="minorEastAsia" w:hAnsiTheme="minorHAnsi" w:cstheme="minorBidi"/>
+              <w:noProof/>
+              <w:color w:val="auto"/>
+              <w:kern w:val="2"/>
+              <w:sz w:val="24"/>
+              <w:szCs w:val="24"/>
+              <w14:ligatures w14:val="standardContextual"/>
+            </w:rPr>
+          </w:pPr>
+          <w:hyperlink w:anchor="_Toc241882500" w:history="1">
+            <w:r>
+              <w:rPr>
+                <w:rStyle w:val="Lienhypertexte"/>
+                <w:noProof/>
+              </w:rPr>
+              <w:t>3.3 L’avancement affiché au client</w:t>
+            </w:r>
+            <w:r>
+              <w:rPr>
+                <w:noProof/>
+              </w:rPr>
+              <w:tab/>
+            </w:r>
+            <w:r>
+              <w:rPr>
+                <w:noProof/>
+              </w:rPr>
+              <w:fldChar w:fldCharType="begin"/>
+            </w:r>
+            <w:r>
+              <w:rPr>
+                <w:noProof/>
+              </w:rPr>
+              <w:instrText xml:space="preserve"> PAGEREF _Toc241882500 \h </w:instrText>
+            </w:r>
+            <w:r>
+              <w:rPr>
+                <w:noProof/>
+              </w:rPr>
+            </w:r>
+            <w:r>
+              <w:rPr>
+                <w:noProof/>
+              </w:rPr>
+              <w:fldChar w:fldCharType="separate"/>
+            </w:r>
+            <w:r>
+              <w:rPr>
+                <w:noProof/>
+              </w:rPr>
+              <w:t>8</w:t>
             </w:r>
             <w:r>
               <w:rPr>
@@ -942,7 +1009,7 @@
               <w14:ligatures w14:val="standardContextual"/>
             </w:rPr>
           </w:pPr>
-          <w:hyperlink w:anchor="_Toc241860572" w:history="1">
+          <w:hyperlink w:anchor="_Toc241882501" w:history="1">
             <w:r>
               <w:rPr>
                 <w:rStyle w:val="Lienhypertexte"/>
@@ -966,7 +1033,7 @@
               <w:rPr>
                 <w:noProof/>
               </w:rPr>
-              <w:instrText xml:space="preserve"> PAGEREF _Toc241860572 \h </w:instrText>
+              <w:instrText xml:space="preserve"> PAGEREF _Toc241882501 \h </w:instrText>
             </w:r>
             <w:r>
               <w:rPr>
@@ -983,7 +1050,7 @@
               <w:rPr>
                 <w:noProof/>
               </w:rPr>
-              <w:t>7</w:t>
+              <w:t>9</w:t>
             </w:r>
             <w:r>
               <w:rPr>
@@ -1009,7 +1076,7 @@
               <w14:ligatures w14:val="standardContextual"/>
             </w:rPr>
           </w:pPr>
-          <w:hyperlink w:anchor="_Toc241860573" w:history="1">
+          <w:hyperlink w:anchor="_Toc241882502" w:history="1">
             <w:r>
               <w:rPr>
                 <w:rStyle w:val="Lienhypertexte"/>
@@ -1033,7 +1100,7 @@
               <w:rPr>
                 <w:noProof/>
               </w:rPr>
-              <w:instrText xml:space="preserve"> PAGEREF _Toc241860573 \h </w:instrText>
+              <w:instrText xml:space="preserve"> PAGEREF _Toc241882502 \h </w:instrText>
             </w:r>
             <w:r>
               <w:rPr>
@@ -1050,7 +1117,7 @@
               <w:rPr>
                 <w:noProof/>
               </w:rPr>
-              <w:t>7</w:t>
+              <w:t>9</w:t>
             </w:r>
             <w:r>
               <w:rPr>
@@ -1076,7 +1143,7 @@
               <w14:ligatures w14:val="standardContextual"/>
             </w:rPr>
           </w:pPr>
-          <w:hyperlink w:anchor="_Toc241860574" w:history="1">
+          <w:hyperlink w:anchor="_Toc241882503" w:history="1">
             <w:r>
               <w:rPr>
                 <w:rStyle w:val="Lienhypertexte"/>
@@ -1100,7 +1167,7 @@
               <w:rPr>
                 <w:noProof/>
               </w:rPr>
-              <w:instrText xml:space="preserve"> PAGEREF _Toc241860574 \h </w:instrText>
+              <w:instrText xml:space="preserve"> PAGEREF _Toc241882503 \h </w:instrText>
             </w:r>
             <w:r>
               <w:rPr>
@@ -1117,7 +1184,7 @@
               <w:rPr>
                 <w:noProof/>
               </w:rPr>
-              <w:t>7</w:t>
+              <w:t>9</w:t>
             </w:r>
             <w:r>
               <w:rPr>
@@ -1143,7 +1210,7 @@
               <w14:ligatures w14:val="standardContextual"/>
             </w:rPr>
           </w:pPr>
-          <w:hyperlink w:anchor="_Toc241860575" w:history="1">
+          <w:hyperlink w:anchor="_Toc241882504" w:history="1">
             <w:r>
               <w:rPr>
                 <w:rStyle w:val="Lienhypertexte"/>
@@ -1167,7 +1234,7 @@
               <w:rPr>
                 <w:noProof/>
               </w:rPr>
-              <w:instrText xml:space="preserve"> PAGEREF _Toc241860575 \h </w:instrText>
+              <w:instrText xml:space="preserve"> PAGEREF _Toc241882504 \h </w:instrText>
             </w:r>
             <w:r>
               <w:rPr>
@@ -1184,7 +1251,7 @@
               <w:rPr>
                 <w:noProof/>
               </w:rPr>
-              <w:t>8</w:t>
+              <w:t>10</w:t>
             </w:r>
             <w:r>
               <w:rPr>
@@ -1210,7 +1277,7 @@
               <w14:ligatures w14:val="standardContextual"/>
             </w:rPr>
           </w:pPr>
-          <w:hyperlink w:anchor="_Toc241860576" w:history="1">
+          <w:hyperlink w:anchor="_Toc241882505" w:history="1">
             <w:r>
               <w:rPr>
                 <w:rStyle w:val="Lienhypertexte"/>
@@ -1234,7 +1301,7 @@
               <w:rPr>
                 <w:noProof/>
               </w:rPr>
-              <w:instrText xml:space="preserve"> PAGEREF _Toc241860576 \h </w:instrText>
+              <w:instrText xml:space="preserve"> PAGEREF _Toc241882505 \h </w:instrText>
             </w:r>
             <w:r>
               <w:rPr>
@@ -1251,7 +1318,7 @@
               <w:rPr>
                 <w:noProof/>
               </w:rPr>
-              <w:t>8</w:t>
+              <w:t>10</w:t>
             </w:r>
             <w:r>
               <w:rPr>
@@ -1277,7 +1344,7 @@
               <w14:ligatures w14:val="standardContextual"/>
             </w:rPr>
           </w:pPr>
-          <w:hyperlink w:anchor="_Toc241860577" w:history="1">
+          <w:hyperlink w:anchor="_Toc241882506" w:history="1">
             <w:r>
               <w:rPr>
                 <w:rStyle w:val="Lienhypertexte"/>
@@ -1301,7 +1368,7 @@
               <w:rPr>
                 <w:noProof/>
               </w:rPr>
-              <w:instrText xml:space="preserve"> PAGEREF _Toc241860577 \h </w:instrText>
+              <w:instrText xml:space="preserve"> PAGEREF _Toc241882506 \h </w:instrText>
             </w:r>
             <w:r>
               <w:rPr>
@@ -1318,7 +1385,7 @@
               <w:rPr>
                 <w:noProof/>
               </w:rPr>
-              <w:t>9</w:t>
+              <w:t>11</w:t>
             </w:r>
             <w:r>
               <w:rPr>
@@ -1344,7 +1411,7 @@
               <w14:ligatures w14:val="standardContextual"/>
             </w:rPr>
           </w:pPr>
-          <w:hyperlink w:anchor="_Toc241860578" w:history="1">
+          <w:hyperlink w:anchor="_Toc241882507" w:history="1">
             <w:r>
               <w:rPr>
                 <w:rStyle w:val="Lienhypertexte"/>
@@ -1368,7 +1435,7 @@
               <w:rPr>
                 <w:noProof/>
               </w:rPr>
-              <w:instrText xml:space="preserve"> PAGEREF _Toc241860578 \h </w:instrText>
+              <w:instrText xml:space="preserve"> PAGEREF _Toc241882507 \h </w:instrText>
             </w:r>
             <w:r>
               <w:rPr>
@@ -1385,7 +1452,7 @@
               <w:rPr>
                 <w:noProof/>
               </w:rPr>
-              <w:t>10</w:t>
+              <w:t>12</w:t>
             </w:r>
             <w:r>
               <w:rPr>
@@ -1411,7 +1478,7 @@
               <w14:ligatures w14:val="standardContextual"/>
             </w:rPr>
           </w:pPr>
-          <w:hyperlink w:anchor="_Toc241860579" w:history="1">
+          <w:hyperlink w:anchor="_Toc241882508" w:history="1">
             <w:r>
               <w:rPr>
                 <w:rStyle w:val="Lienhypertexte"/>
@@ -1435,7 +1502,7 @@
               <w:rPr>
                 <w:noProof/>
               </w:rPr>
-              <w:instrText xml:space="preserve"> PAGEREF _Toc241860579 \h </w:instrText>
+              <w:instrText xml:space="preserve"> PAGEREF _Toc241882508 \h </w:instrText>
             </w:r>
             <w:r>
               <w:rPr>
@@ -1452,7 +1519,7 @@
               <w:rPr>
                 <w:noProof/>
               </w:rPr>
-              <w:t>10</w:t>
+              <w:t>12</w:t>
             </w:r>
             <w:r>
               <w:rPr>
@@ -1478,7 +1545,7 @@
               <w14:ligatures w14:val="standardContextual"/>
             </w:rPr>
           </w:pPr>
-          <w:hyperlink w:anchor="_Toc241860580" w:history="1">
+          <w:hyperlink w:anchor="_Toc241882509" w:history="1">
             <w:r>
               <w:rPr>
                 <w:rStyle w:val="Lienhypertexte"/>
@@ -1502,7 +1569,7 @@
               <w:rPr>
                 <w:noProof/>
               </w:rPr>
-              <w:instrText xml:space="preserve"> PAGEREF _Toc241860580 \h </w:instrText>
+              <w:instrText xml:space="preserve"> PAGEREF _Toc241882509 \h </w:instrText>
             </w:r>
             <w:r>
               <w:rPr>
@@ -1519,7 +1586,7 @@
               <w:rPr>
                 <w:noProof/>
               </w:rPr>
-              <w:t>10</w:t>
+              <w:t>12</w:t>
             </w:r>
             <w:r>
               <w:rPr>
@@ -1545,7 +1612,7 @@
               <w14:ligatures w14:val="standardContextual"/>
             </w:rPr>
           </w:pPr>
-          <w:hyperlink w:anchor="_Toc241860581" w:history="1">
+          <w:hyperlink w:anchor="_Toc241882510" w:history="1">
             <w:r>
               <w:rPr>
                 <w:rStyle w:val="Lienhypertexte"/>
@@ -1569,7 +1636,7 @@
               <w:rPr>
                 <w:noProof/>
               </w:rPr>
-              <w:instrText xml:space="preserve"> PAGEREF _Toc241860581 \h </w:instrText>
+              <w:instrText xml:space="preserve"> PAGEREF _Toc241882510 \h </w:instrText>
             </w:r>
             <w:r>
               <w:rPr>
@@ -1586,7 +1653,7 @@
               <w:rPr>
                 <w:noProof/>
               </w:rPr>
-              <w:t>11</w:t>
+              <w:t>13</w:t>
             </w:r>
             <w:r>
               <w:rPr>
@@ -1612,7 +1679,7 @@
               <w14:ligatures w14:val="standardContextual"/>
             </w:rPr>
           </w:pPr>
-          <w:hyperlink w:anchor="_Toc241860582" w:history="1">
+          <w:hyperlink w:anchor="_Toc241882511" w:history="1">
             <w:r>
               <w:rPr>
                 <w:rStyle w:val="Lienhypertexte"/>
@@ -1636,7 +1703,7 @@
               <w:rPr>
                 <w:noProof/>
               </w:rPr>
-              <w:instrText xml:space="preserve"> PAGEREF _Toc241860582 \h </w:instrText>
+              <w:instrText xml:space="preserve"> PAGEREF _Toc241882511 \h </w:instrText>
             </w:r>
             <w:r>
               <w:rPr>
@@ -1653,7 +1720,7 @@
               <w:rPr>
                 <w:noProof/>
               </w:rPr>
-              <w:t>11</w:t>
+              <w:t>13</w:t>
             </w:r>
             <w:r>
               <w:rPr>
@@ -1679,7 +1746,7 @@
               <w14:ligatures w14:val="standardContextual"/>
             </w:rPr>
           </w:pPr>
-          <w:hyperlink w:anchor="_Toc241860583" w:history="1">
+          <w:hyperlink w:anchor="_Toc241882512" w:history="1">
             <w:r>
               <w:rPr>
                 <w:rStyle w:val="Lienhypertexte"/>
@@ -1703,7 +1770,7 @@
               <w:rPr>
                 <w:noProof/>
               </w:rPr>
-              <w:instrText xml:space="preserve"> PAGEREF _Toc241860583 \h </w:instrText>
+              <w:instrText xml:space="preserve"> PAGEREF _Toc241882512 \h </w:instrText>
             </w:r>
             <w:r>
               <w:rPr>
@@ -1720,7 +1787,7 @@
               <w:rPr>
                 <w:noProof/>
               </w:rPr>
-              <w:t>11</w:t>
+              <w:t>13</w:t>
             </w:r>
             <w:r>
               <w:rPr>
@@ -1746,13 +1813,13 @@
               <w14:ligatures w14:val="standardContextual"/>
             </w:rPr>
           </w:pPr>
-          <w:hyperlink w:anchor="_Toc241860584" w:history="1">
+          <w:hyperlink w:anchor="_Toc241882513" w:history="1">
             <w:r>
               <w:rPr>
                 <w:rStyle w:val="Lienhypertexte"/>
                 <w:noProof/>
               </w:rPr>
-              <w:t>8.3 Statut d’une facture</w:t>
+              <w:t>8.3 Le journal de caisse</w:t>
             </w:r>
             <w:r>
               <w:rPr>
@@ -1770,7 +1837,7 @@
               <w:rPr>
                 <w:noProof/>
               </w:rPr>
-              <w:instrText xml:space="preserve"> PAGEREF _Toc241860584 \h </w:instrText>
+              <w:instrText xml:space="preserve"> PAGEREF _Toc241882513 \h </w:instrText>
             </w:r>
             <w:r>
               <w:rPr>
@@ -1787,7 +1854,74 @@
               <w:rPr>
                 <w:noProof/>
               </w:rPr>
-              <w:t>11</w:t>
+              <w:t>13</w:t>
+            </w:r>
+            <w:r>
+              <w:rPr>
+                <w:noProof/>
+              </w:rPr>
+              <w:fldChar w:fldCharType="end"/>
+            </w:r>
+          </w:hyperlink>
+        </w:p>
+        <w:p>
+          <w:pPr>
+            <w:pStyle w:val="TM2"/>
+            <w:tabs>
+              <w:tab w:val="right" w:leader="dot" w:pos="9016"/>
+            </w:tabs>
+            <w:rPr>
+              <w:rFonts w:asciiTheme="minorHAnsi" w:eastAsiaTheme="minorEastAsia" w:hAnsiTheme="minorHAnsi" w:cstheme="minorBidi"/>
+              <w:noProof/>
+              <w:color w:val="auto"/>
+              <w:kern w:val="2"/>
+              <w:sz w:val="24"/>
+              <w:szCs w:val="24"/>
+              <w14:ligatures w14:val="standardContextual"/>
+            </w:rPr>
+          </w:pPr>
+          <w:hyperlink w:anchor="_Toc241882514" w:history="1">
+            <w:r>
+              <w:rPr>
+                <w:rStyle w:val="Lienhypertexte"/>
+                <w:noProof/>
+              </w:rPr>
+              <w:t>8.4 Statut d’une facture</w:t>
+            </w:r>
+            <w:r>
+              <w:rPr>
+                <w:noProof/>
+              </w:rPr>
+              <w:tab/>
+            </w:r>
+            <w:r>
+              <w:rPr>
+                <w:noProof/>
+              </w:rPr>
+              <w:fldChar w:fldCharType="begin"/>
+            </w:r>
+            <w:r>
+              <w:rPr>
+                <w:noProof/>
+              </w:rPr>
+              <w:instrText xml:space="preserve"> PAGEREF _Toc241882514 \h </w:instrText>
+            </w:r>
+            <w:r>
+              <w:rPr>
+                <w:noProof/>
+              </w:rPr>
+            </w:r>
+            <w:r>
+              <w:rPr>
+                <w:noProof/>
+              </w:rPr>
+              <w:fldChar w:fldCharType="separate"/>
+            </w:r>
+            <w:r>
+              <w:rPr>
+                <w:noProof/>
+              </w:rPr>
+              <w:t>13</w:t>
             </w:r>
             <w:r>
               <w:rPr>
@@ -1813,7 +1947,7 @@
               <w14:ligatures w14:val="standardContextual"/>
             </w:rPr>
           </w:pPr>
-          <w:hyperlink w:anchor="_Toc241860585" w:history="1">
+          <w:hyperlink w:anchor="_Toc241882515" w:history="1">
             <w:r>
               <w:rPr>
                 <w:rStyle w:val="Lienhypertexte"/>
@@ -1837,7 +1971,7 @@
               <w:rPr>
                 <w:noProof/>
               </w:rPr>
-              <w:instrText xml:space="preserve"> PAGEREF _Toc241860585 \h </w:instrText>
+              <w:instrText xml:space="preserve"> PAGEREF _Toc241882515 \h </w:instrText>
             </w:r>
             <w:r>
               <w:rPr>
@@ -1854,7 +1988,7 @@
               <w:rPr>
                 <w:noProof/>
               </w:rPr>
-              <w:t>12</w:t>
+              <w:t>14</w:t>
             </w:r>
             <w:r>
               <w:rPr>
@@ -1880,7 +2014,7 @@
               <w14:ligatures w14:val="standardContextual"/>
             </w:rPr>
           </w:pPr>
-          <w:hyperlink w:anchor="_Toc241860586" w:history="1">
+          <w:hyperlink w:anchor="_Toc241882516" w:history="1">
             <w:r>
               <w:rPr>
                 <w:rStyle w:val="Lienhypertexte"/>
@@ -1904,7 +2038,7 @@
               <w:rPr>
                 <w:noProof/>
               </w:rPr>
-              <w:instrText xml:space="preserve"> PAGEREF _Toc241860586 \h </w:instrText>
+              <w:instrText xml:space="preserve"> PAGEREF _Toc241882516 \h </w:instrText>
             </w:r>
             <w:r>
               <w:rPr>
@@ -1921,7 +2055,7 @@
               <w:rPr>
                 <w:noProof/>
               </w:rPr>
-              <w:t>12</w:t>
+              <w:t>14</w:t>
             </w:r>
             <w:r>
               <w:rPr>
@@ -1947,7 +2081,7 @@
               <w14:ligatures w14:val="standardContextual"/>
             </w:rPr>
           </w:pPr>
-          <w:hyperlink w:anchor="_Toc241860587" w:history="1">
+          <w:hyperlink w:anchor="_Toc241882517" w:history="1">
             <w:r>
               <w:rPr>
                 <w:rStyle w:val="Lienhypertexte"/>
@@ -1971,7 +2105,7 @@
               <w:rPr>
                 <w:noProof/>
               </w:rPr>
-              <w:instrText xml:space="preserve"> PAGEREF _Toc241860587 \h </w:instrText>
+              <w:instrText xml:space="preserve"> PAGEREF _Toc241882517 \h </w:instrText>
             </w:r>
             <w:r>
               <w:rPr>
@@ -1988,7 +2122,7 @@
               <w:rPr>
                 <w:noProof/>
               </w:rPr>
-              <w:t>12</w:t>
+              <w:t>14</w:t>
             </w:r>
             <w:r>
               <w:rPr>
@@ -2014,7 +2148,7 @@
               <w14:ligatures w14:val="standardContextual"/>
             </w:rPr>
           </w:pPr>
-          <w:hyperlink w:anchor="_Toc241860588" w:history="1">
+          <w:hyperlink w:anchor="_Toc241882518" w:history="1">
             <w:r>
               <w:rPr>
                 <w:rStyle w:val="Lienhypertexte"/>
@@ -2038,7 +2172,7 @@
               <w:rPr>
                 <w:noProof/>
               </w:rPr>
-              <w:instrText xml:space="preserve"> PAGEREF _Toc241860588 \h </w:instrText>
+              <w:instrText xml:space="preserve"> PAGEREF _Toc241882518 \h </w:instrText>
             </w:r>
             <w:r>
               <w:rPr>
@@ -2055,7 +2189,7 @@
               <w:rPr>
                 <w:noProof/>
               </w:rPr>
-              <w:t>13</w:t>
+              <w:t>15</w:t>
             </w:r>
             <w:r>
               <w:rPr>
@@ -2081,7 +2215,7 @@
               <w14:ligatures w14:val="standardContextual"/>
             </w:rPr>
           </w:pPr>
-          <w:hyperlink w:anchor="_Toc241860589" w:history="1">
+          <w:hyperlink w:anchor="_Toc241882519" w:history="1">
             <w:r>
               <w:rPr>
                 <w:rStyle w:val="Lienhypertexte"/>
@@ -2105,7 +2239,7 @@
               <w:rPr>
                 <w:noProof/>
               </w:rPr>
-              <w:instrText xml:space="preserve"> PAGEREF _Toc241860589 \h </w:instrText>
+              <w:instrText xml:space="preserve"> PAGEREF _Toc241882519 \h </w:instrText>
             </w:r>
             <w:r>
               <w:rPr>
@@ -2122,7 +2256,7 @@
               <w:rPr>
                 <w:noProof/>
               </w:rPr>
-              <w:t>14</w:t>
+              <w:t>16</w:t>
             </w:r>
             <w:r>
               <w:rPr>
@@ -2148,7 +2282,7 @@
               <w14:ligatures w14:val="standardContextual"/>
             </w:rPr>
           </w:pPr>
-          <w:hyperlink w:anchor="_Toc241860590" w:history="1">
+          <w:hyperlink w:anchor="_Toc241882520" w:history="1">
             <w:r>
               <w:rPr>
                 <w:rStyle w:val="Lienhypertexte"/>
@@ -2172,7 +2306,7 @@
               <w:rPr>
                 <w:noProof/>
               </w:rPr>
-              <w:instrText xml:space="preserve"> PAGEREF _Toc241860590 \h </w:instrText>
+              <w:instrText xml:space="preserve"> PAGEREF _Toc241882520 \h </w:instrText>
             </w:r>
             <w:r>
               <w:rPr>
@@ -2189,7 +2323,7 @@
               <w:rPr>
                 <w:noProof/>
               </w:rPr>
-              <w:t>15</w:t>
+              <w:t>17</w:t>
             </w:r>
             <w:r>
               <w:rPr>
@@ -2215,7 +2349,7 @@
               <w14:ligatures w14:val="standardContextual"/>
             </w:rPr>
           </w:pPr>
-          <w:hyperlink w:anchor="_Toc241860591" w:history="1">
+          <w:hyperlink w:anchor="_Toc241882521" w:history="1">
             <w:r>
               <w:rPr>
                 <w:rStyle w:val="Lienhypertexte"/>
@@ -2239,7 +2373,7 @@
               <w:rPr>
                 <w:noProof/>
               </w:rPr>
-              <w:instrText xml:space="preserve"> PAGEREF _Toc241860591 \h </w:instrText>
+              <w:instrText xml:space="preserve"> PAGEREF _Toc241882521 \h </w:instrText>
             </w:r>
             <w:r>
               <w:rPr>
@@ -2256,7 +2390,7 @@
               <w:rPr>
                 <w:noProof/>
               </w:rPr>
-              <w:t>16</w:t>
+              <w:t>18</w:t>
             </w:r>
             <w:r>
               <w:rPr>
@@ -2282,7 +2416,7 @@
               <w14:ligatures w14:val="standardContextual"/>
             </w:rPr>
           </w:pPr>
-          <w:hyperlink w:anchor="_Toc241860592" w:history="1">
+          <w:hyperlink w:anchor="_Toc241882522" w:history="1">
             <w:r>
               <w:rPr>
                 <w:rStyle w:val="Lienhypertexte"/>
@@ -2306,7 +2440,7 @@
               <w:rPr>
                 <w:noProof/>
               </w:rPr>
-              <w:instrText xml:space="preserve"> PAGEREF _Toc241860592 \h </w:instrText>
+              <w:instrText xml:space="preserve"> PAGEREF _Toc241882522 \h </w:instrText>
             </w:r>
             <w:r>
               <w:rPr>
@@ -2323,7 +2457,7 @@
               <w:rPr>
                 <w:noProof/>
               </w:rPr>
-              <w:t>16</w:t>
+              <w:t>18</w:t>
             </w:r>
             <w:r>
               <w:rPr>
@@ -2349,7 +2483,7 @@
               <w14:ligatures w14:val="standardContextual"/>
             </w:rPr>
           </w:pPr>
-          <w:hyperlink w:anchor="_Toc241860593" w:history="1">
+          <w:hyperlink w:anchor="_Toc241882523" w:history="1">
             <w:r>
               <w:rPr>
                 <w:rStyle w:val="Lienhypertexte"/>
@@ -2373,7 +2507,7 @@
               <w:rPr>
                 <w:noProof/>
               </w:rPr>
-              <w:instrText xml:space="preserve"> PAGEREF _Toc241860593 \h </w:instrText>
+              <w:instrText xml:space="preserve"> PAGEREF _Toc241882523 \h </w:instrText>
             </w:r>
             <w:r>
               <w:rPr>
@@ -2390,7 +2524,7 @@
               <w:rPr>
                 <w:noProof/>
               </w:rPr>
-              <w:t>17</w:t>
+              <w:t>19</w:t>
             </w:r>
             <w:r>
               <w:rPr>
@@ -2416,7 +2550,7 @@
               <w14:ligatures w14:val="standardContextual"/>
             </w:rPr>
           </w:pPr>
-          <w:hyperlink w:anchor="_Toc241860594" w:history="1">
+          <w:hyperlink w:anchor="_Toc241882524" w:history="1">
             <w:r>
               <w:rPr>
                 <w:rStyle w:val="Lienhypertexte"/>
@@ -2440,7 +2574,7 @@
               <w:rPr>
                 <w:noProof/>
               </w:rPr>
-              <w:instrText xml:space="preserve"> PAGEREF _Toc241860594 \h </w:instrText>
+              <w:instrText xml:space="preserve"> PAGEREF _Toc241882524 \h </w:instrText>
             </w:r>
             <w:r>
               <w:rPr>
@@ -2457,7 +2591,7 @@
               <w:rPr>
                 <w:noProof/>
               </w:rPr>
-              <w:t>18</w:t>
+              <w:t>20</w:t>
             </w:r>
             <w:r>
               <w:rPr>
@@ -2483,7 +2617,7 @@
               <w14:ligatures w14:val="standardContextual"/>
             </w:rPr>
           </w:pPr>
-          <w:hyperlink w:anchor="_Toc241860595" w:history="1">
+          <w:hyperlink w:anchor="_Toc241882525" w:history="1">
             <w:r>
               <w:rPr>
                 <w:rStyle w:val="Lienhypertexte"/>
@@ -2507,7 +2641,7 @@
               <w:rPr>
                 <w:noProof/>
               </w:rPr>
-              <w:instrText xml:space="preserve"> PAGEREF _Toc241860595 \h </w:instrText>
+              <w:instrText xml:space="preserve"> PAGEREF _Toc241882525 \h </w:instrText>
             </w:r>
             <w:r>
               <w:rPr>
@@ -2524,7 +2658,7 @@
               <w:rPr>
                 <w:noProof/>
               </w:rPr>
-              <w:t>18</w:t>
+              <w:t>20</w:t>
             </w:r>
             <w:r>
               <w:rPr>
@@ -2536,6 +2670,7 @@
         </w:p>
         <w:p>
           <w:r>
+            <w:lastRenderedPageBreak/>
             <w:fldChar w:fldCharType="end"/>
           </w:r>
         </w:p>
@@ -2546,7 +2681,7 @@
         <w:pStyle w:val="Titre1"/>
         <w:pageBreakBefore/>
       </w:pPr>
-      <w:bookmarkStart w:id="0" w:name="_Toc241860560"/>
+      <w:bookmarkStart w:id="0" w:name="_Toc241882488"/>
       <w:r>
         <w:lastRenderedPageBreak/>
         <w:t>1. Présentation de la plateforme</w:t>
@@ -2997,7 +3132,7 @@
       <w:pPr>
         <w:pStyle w:val="Titre2"/>
       </w:pPr>
-      <w:bookmarkStart w:id="1" w:name="_Toc241860561"/>
+      <w:bookmarkStart w:id="1" w:name="_Toc241882489"/>
       <w:r>
         <w:t>1.1 Une seule connexion</w:t>
       </w:r>
@@ -3025,7 +3160,7 @@
       <w:pPr>
         <w:pStyle w:val="Titre2"/>
       </w:pPr>
-      <w:bookmarkStart w:id="2" w:name="_Toc241860562"/>
+      <w:bookmarkStart w:id="2" w:name="_Toc241882490"/>
       <w:r>
         <w:t>1.2 Principes de fonctionnement</w:t>
       </w:r>
@@ -3116,7 +3251,7 @@
         <w:pStyle w:val="Titre1"/>
         <w:pageBreakBefore/>
       </w:pPr>
-      <w:bookmarkStart w:id="3" w:name="_Toc241860563"/>
+      <w:bookmarkStart w:id="3" w:name="_Toc241882491"/>
       <w:r>
         <w:lastRenderedPageBreak/>
         <w:t>2. Les rôles et leurs droits</w:t>
@@ -3940,7 +4075,7 @@
       <w:pPr>
         <w:pStyle w:val="Titre2"/>
       </w:pPr>
-      <w:bookmarkStart w:id="4" w:name="_Toc241860564"/>
+      <w:bookmarkStart w:id="4" w:name="_Toc241882492"/>
       <w:r>
         <w:t>2.1 Visiteur</w:t>
       </w:r>
@@ -4050,7 +4185,7 @@
       <w:pPr>
         <w:pStyle w:val="Titre2"/>
       </w:pPr>
-      <w:bookmarkStart w:id="5" w:name="_Toc241860565"/>
+      <w:bookmarkStart w:id="5" w:name="_Toc241882493"/>
       <w:r>
         <w:t>2.2 Client</w:t>
       </w:r>
@@ -4264,7 +4399,7 @@
       <w:pPr>
         <w:pStyle w:val="Titre2"/>
       </w:pPr>
-      <w:bookmarkStart w:id="6" w:name="_Toc241860566"/>
+      <w:bookmarkStart w:id="6" w:name="_Toc241882494"/>
       <w:r>
         <w:lastRenderedPageBreak/>
         <w:t>2.3 Technicien</w:t>
@@ -4626,7 +4761,7 @@
                 <w:sz w:val="19"/>
                 <w:szCs w:val="19"/>
               </w:rPr>
-              <w:t>Enregistrer la restitution au client (« Restituer au client »).</w:t>
+              <w:t>Encaisser le client (espèces, Wave, Orange Money, carte, virement) puis enregistrer la restitution (« Restituer au client »).</w:t>
             </w:r>
           </w:p>
         </w:tc>
@@ -4715,17 +4850,17 @@
         <w:spacing w:after="60" w:line="264" w:lineRule="auto"/>
       </w:pPr>
       <w:r>
-        <w:t xml:space="preserve">Il </w:t>
+        <w:t xml:space="preserve">Chaque paiement qu’il encaisse est </w:t>
       </w:r>
       <w:r>
         <w:rPr>
           <w:b/>
           <w:bCs/>
         </w:rPr>
-        <w:t>ne peut pas</w:t>
-      </w:r>
-      <w:r>
-        <w:t xml:space="preserve"> confirmer ou refuser une demande, valider le contrôle qualité, reporter un rendez-vous, affecter un collègue, modifier les tarifs, ni accéder aux finances et aux statistiques.</w:t>
+        <w:t>signé de son nom</w:t>
+      </w:r>
+      <w:r>
+        <w:t xml:space="preserve"> et apparaît dans le journal de caisse du manager.</w:t>
       </w:r>
     </w:p>
     <w:p>
@@ -4738,38 +4873,18 @@
         <w:spacing w:after="60" w:line="264" w:lineRule="auto"/>
       </w:pPr>
       <w:r>
-        <w:t xml:space="preserve">Il reçoit une notification quand une prestation </w:t>
+        <w:t xml:space="preserve">Il </w:t>
       </w:r>
       <w:r>
         <w:rPr>
           <w:b/>
           <w:bCs/>
         </w:rPr>
-        <w:t>lui est affectée</w:t>
-      </w:r>
-      <w:r>
-        <w:t xml:space="preserve"> et quand le </w:t>
-      </w:r>
-      <w:r>
-        <w:rPr>
-          <w:b/>
-          <w:bCs/>
-        </w:rPr>
-        <w:t>véhicule est déposé</w:t>
-      </w:r>
-      <w:r>
-        <w:t>.</w:t>
-      </w:r>
-    </w:p>
-    <w:p>
-      <w:pPr>
-        <w:pStyle w:val="Titre2"/>
-      </w:pPr>
-      <w:bookmarkStart w:id="7" w:name="_Toc241860567"/>
-      <w:r>
-        <w:t>2.4 Manager</w:t>
-      </w:r>
-      <w:bookmarkEnd w:id="7"/>
+        <w:t>ne peut pas</w:t>
+      </w:r>
+      <w:r>
+        <w:t xml:space="preserve"> confirmer ou refuser une demande, valider le contrôle qualité, reporter un rendez-vous, affecter un collègue, modifier les tarifs, rembourser, annuler une facture, accorder une remise, ni consulter le journal de caisse et les statistiques.</w:t>
+      </w:r>
     </w:p>
     <w:p>
       <w:pPr>
@@ -4781,25 +4896,38 @@
         <w:spacing w:after="60" w:line="264" w:lineRule="auto"/>
       </w:pPr>
       <w:r>
+        <w:t xml:space="preserve">Il reçoit une notification quand une prestation </w:t>
+      </w:r>
+      <w:r>
         <w:rPr>
           <w:b/>
           <w:bCs/>
         </w:rPr>
-        <w:t>Voit tout le planning</w:t>
-      </w:r>
-      <w:r>
-        <w:t xml:space="preserve"> et peut réaliser </w:t>
+        <w:t>lui est affectée</w:t>
+      </w:r>
+      <w:r>
+        <w:t xml:space="preserve"> et quand le </w:t>
       </w:r>
       <w:r>
         <w:rPr>
           <w:b/>
           <w:bCs/>
         </w:rPr>
-        <w:t>toutes les actions</w:t>
-      </w:r>
-      <w:r>
-        <w:t xml:space="preserve"> du parcours d’un rendez-vous, sans la limite de 24 h imposée au client.</w:t>
-      </w:r>
+        <w:t>véhicule est déposé</w:t>
+      </w:r>
+      <w:r>
+        <w:t>.</w:t>
+      </w:r>
+    </w:p>
+    <w:p>
+      <w:pPr>
+        <w:pStyle w:val="Titre2"/>
+      </w:pPr>
+      <w:bookmarkStart w:id="7" w:name="_Toc241882495"/>
+      <w:r>
+        <w:t>2.4 Manager</w:t>
+      </w:r>
+      <w:bookmarkEnd w:id="7"/>
     </w:p>
     <w:p>
       <w:pPr>
@@ -4815,30 +4943,20 @@
           <w:b/>
           <w:bCs/>
         </w:rPr>
-        <w:t>Confirme ou refuse</w:t>
-      </w:r>
-      <w:r>
-        <w:t xml:space="preserve"> les demandes, </w:t>
+        <w:t>Voit tout le planning</w:t>
+      </w:r>
+      <w:r>
+        <w:t xml:space="preserve"> et peut réaliser </w:t>
       </w:r>
       <w:r>
         <w:rPr>
           <w:b/>
           <w:bCs/>
         </w:rPr>
-        <w:t>reporte</w:t>
-      </w:r>
-      <w:r>
-        <w:t xml:space="preserve"> un rendez-vous sur un autre créneau libre, </w:t>
-      </w:r>
-      <w:r>
-        <w:rPr>
-          <w:b/>
-          <w:bCs/>
-        </w:rPr>
-        <w:t>affecte</w:t>
-      </w:r>
-      <w:r>
-        <w:t xml:space="preserve"> un technicien.</w:t>
+        <w:t>toutes les actions</w:t>
+      </w:r>
+      <w:r>
+        <w:t xml:space="preserve"> du parcours d’un rendez-vous, sans la limite de 24 h imposée au client.</w:t>
       </w:r>
     </w:p>
     <w:p>
@@ -4855,10 +4973,30 @@
           <w:b/>
           <w:bCs/>
         </w:rPr>
-        <w:t>Valide le contrôle qualité</w:t>
-      </w:r>
-      <w:r>
-        <w:t xml:space="preserve"> (ou renvoie la prestation en traitement) : c’est lui qui décide qu’un véhicule est prêt.</w:t>
+        <w:t>Confirme ou refuse</w:t>
+      </w:r>
+      <w:r>
+        <w:t xml:space="preserve"> les demandes, </w:t>
+      </w:r>
+      <w:r>
+        <w:rPr>
+          <w:b/>
+          <w:bCs/>
+        </w:rPr>
+        <w:t>reporte</w:t>
+      </w:r>
+      <w:r>
+        <w:t xml:space="preserve"> un rendez-vous sur un autre créneau libre, </w:t>
+      </w:r>
+      <w:r>
+        <w:rPr>
+          <w:b/>
+          <w:bCs/>
+        </w:rPr>
+        <w:t>affecte</w:t>
+      </w:r>
+      <w:r>
+        <w:t xml:space="preserve"> un technicien.</w:t>
       </w:r>
     </w:p>
     <w:p>
@@ -4875,30 +5013,10 @@
           <w:b/>
           <w:bCs/>
         </w:rPr>
-        <w:t>Gère les clients</w:t>
-      </w:r>
-      <w:r>
-        <w:t xml:space="preserve"> (création, segment Nouveau / Actif / VIP, notes internes), </w:t>
-      </w:r>
-      <w:r>
-        <w:rPr>
-          <w:b/>
-          <w:bCs/>
-        </w:rPr>
-        <w:t>les prestations</w:t>
-      </w:r>
-      <w:r>
-        <w:t xml:space="preserve"> (tarifs, durées, suspension) et le </w:t>
-      </w:r>
-      <w:r>
-        <w:rPr>
-          <w:b/>
-          <w:bCs/>
-        </w:rPr>
-        <w:t>statut de l’équipe</w:t>
-      </w:r>
-      <w:r>
-        <w:t>.</w:t>
+        <w:t>Valide le contrôle qualité</w:t>
+      </w:r>
+      <w:r>
+        <w:t xml:space="preserve"> (ou renvoie la prestation en traitement) : c’est lui qui décide qu’un véhicule est prêt.</w:t>
       </w:r>
     </w:p>
     <w:p>
@@ -4915,10 +5033,30 @@
           <w:b/>
           <w:bCs/>
         </w:rPr>
-        <w:t>Facture et encaisse</w:t>
-      </w:r>
-      <w:r>
-        <w:t xml:space="preserve"> : établit les factures, enregistre les paiements, rembourse, annule.</w:t>
+        <w:t>Gère les clients</w:t>
+      </w:r>
+      <w:r>
+        <w:t xml:space="preserve"> (création, segment Nouveau / Actif / VIP, notes internes), </w:t>
+      </w:r>
+      <w:r>
+        <w:rPr>
+          <w:b/>
+          <w:bCs/>
+        </w:rPr>
+        <w:t>les prestations</w:t>
+      </w:r>
+      <w:r>
+        <w:t xml:space="preserve"> (tarifs, durées, suspension) et le </w:t>
+      </w:r>
+      <w:r>
+        <w:rPr>
+          <w:b/>
+          <w:bCs/>
+        </w:rPr>
+        <w:t>statut de l’équipe</w:t>
+      </w:r>
+      <w:r>
+        <w:t>.</w:t>
       </w:r>
     </w:p>
     <w:p>
@@ -4935,10 +5073,20 @@
           <w:b/>
           <w:bCs/>
         </w:rPr>
-        <w:t>Publie les contenus</w:t>
-      </w:r>
-      <w:r>
-        <w:t xml:space="preserve"> du site : réalisations, avis clients, chiffres clés.</w:t>
+        <w:t>Facture et contrôle la caisse</w:t>
+      </w:r>
+      <w:r>
+        <w:t xml:space="preserve"> : établit les factures sur devis, encaisse, rembourse, annule, et vérifie chaque soir le </w:t>
+      </w:r>
+      <w:r>
+        <w:rPr>
+          <w:b/>
+          <w:bCs/>
+        </w:rPr>
+        <w:t>journal de caisse</w:t>
+      </w:r>
+      <w:r>
+        <w:t>.</w:t>
       </w:r>
     </w:p>
     <w:p>
@@ -4955,10 +5103,10 @@
           <w:b/>
           <w:bCs/>
         </w:rPr>
-        <w:t>Consulte les statistiques</w:t>
-      </w:r>
-      <w:r>
-        <w:t xml:space="preserve"> et exporte les données en CSV.</w:t>
+        <w:t>Publie les contenus</w:t>
+      </w:r>
+      <w:r>
+        <w:t xml:space="preserve"> du site : réalisations, avis clients, chiffres clés.</w:t>
       </w:r>
     </w:p>
     <w:p>
@@ -4971,48 +5119,15 @@
         <w:spacing w:after="60" w:line="264" w:lineRule="auto"/>
       </w:pPr>
       <w:r>
-        <w:t xml:space="preserve">Reçoit les notifications de </w:t>
-      </w:r>
-      <w:r>
         <w:rPr>
           <w:b/>
           <w:bCs/>
         </w:rPr>
-        <w:t>nouvelle demande</w:t>
-      </w:r>
-      <w:r>
-        <w:t>, d’</w:t>
-      </w:r>
-      <w:r>
-        <w:rPr>
-          <w:b/>
-          <w:bCs/>
-        </w:rPr>
-        <w:t>annulation par un client</w:t>
-      </w:r>
-      <w:r>
-        <w:t xml:space="preserve"> et de </w:t>
-      </w:r>
-      <w:r>
-        <w:rPr>
-          <w:b/>
-          <w:bCs/>
-        </w:rPr>
-        <w:t>contrôle final à valider</w:t>
-      </w:r>
-      <w:r>
-        <w:t>.</w:t>
-      </w:r>
-    </w:p>
-    <w:p>
-      <w:pPr>
-        <w:pStyle w:val="Titre2"/>
-      </w:pPr>
-      <w:bookmarkStart w:id="8" w:name="_Toc241860568"/>
-      <w:r>
-        <w:t>2.5 Administrateur</w:t>
-      </w:r>
-      <w:bookmarkEnd w:id="8"/>
+        <w:t>Consulte les statistiques</w:t>
+      </w:r>
+      <w:r>
+        <w:t xml:space="preserve"> et exporte les données en CSV.</w:t>
+      </w:r>
     </w:p>
     <w:p>
       <w:pPr>
@@ -5024,18 +5139,48 @@
         <w:spacing w:after="60" w:line="264" w:lineRule="auto"/>
       </w:pPr>
       <w:r>
-        <w:t xml:space="preserve">Dispose de </w:t>
+        <w:t xml:space="preserve">Reçoit les notifications de </w:t>
       </w:r>
       <w:r>
         <w:rPr>
           <w:b/>
           <w:bCs/>
         </w:rPr>
-        <w:t>tous les droits du manager</w:t>
+        <w:t>nouvelle demande</w:t>
+      </w:r>
+      <w:r>
+        <w:t>, d’</w:t>
+      </w:r>
+      <w:r>
+        <w:rPr>
+          <w:b/>
+          <w:bCs/>
+        </w:rPr>
+        <w:t>annulation par un client</w:t>
+      </w:r>
+      <w:r>
+        <w:t xml:space="preserve"> et de </w:t>
+      </w:r>
+      <w:r>
+        <w:rPr>
+          <w:b/>
+          <w:bCs/>
+        </w:rPr>
+        <w:t>contrôle final à valider</w:t>
       </w:r>
       <w:r>
         <w:t>.</w:t>
       </w:r>
+    </w:p>
+    <w:p>
+      <w:pPr>
+        <w:pStyle w:val="Titre2"/>
+      </w:pPr>
+      <w:bookmarkStart w:id="8" w:name="_Toc241882496"/>
+      <w:r>
+        <w:t>2.5 Administrateur</w:t>
+      </w:r>
+      <w:bookmarkEnd w:id="8"/>
     </w:p>
     <w:p>
       <w:pPr>
@@ -5047,54 +5192,14 @@
         <w:spacing w:after="60" w:line="264" w:lineRule="auto"/>
       </w:pPr>
       <w:r>
-        <w:t xml:space="preserve">Accède au </w:t>
+        <w:t xml:space="preserve">Dispose de </w:t>
       </w:r>
       <w:r>
         <w:rPr>
           <w:b/>
           <w:bCs/>
         </w:rPr>
-        <w:t>back-office d’administration</w:t>
-      </w:r>
-      <w:r>
-        <w:t xml:space="preserve"> (/admin/) pour créer les comptes de l’équipe et leur attribuer un rôle, régler les </w:t>
-      </w:r>
-      <w:r>
-        <w:rPr>
-          <w:b/>
-          <w:bCs/>
-        </w:rPr>
-        <w:t>horaires d’ouverture</w:t>
-      </w:r>
-      <w:r>
-        <w:t xml:space="preserve"> et les </w:t>
-      </w:r>
-      <w:r>
-        <w:rPr>
-          <w:b/>
-          <w:bCs/>
-        </w:rPr>
-        <w:t>fermetures exceptionnelles</w:t>
-      </w:r>
-      <w:r>
-        <w:t xml:space="preserve">, lire les </w:t>
-      </w:r>
-      <w:r>
-        <w:rPr>
-          <w:b/>
-          <w:bCs/>
-        </w:rPr>
-        <w:t>messages du formulaire de contact</w:t>
-      </w:r>
-      <w:r>
-        <w:t xml:space="preserve"> et consulter le </w:t>
-      </w:r>
-      <w:r>
-        <w:rPr>
-          <w:b/>
-          <w:bCs/>
-        </w:rPr>
-        <w:t>journal d’audit</w:t>
+        <w:t>tous les droits du manager</w:t>
       </w:r>
       <w:r>
         <w:t>.</w:t>
@@ -5110,15 +5215,78 @@
         <w:spacing w:after="60" w:line="264" w:lineRule="auto"/>
       </w:pPr>
       <w:r>
-        <w:t>Même dans le back-office, le statut d’un rendez-vous reste en lecture seule : il passe obligatoirement par les actions du parcours, pour que tout reste tracé.</w:t>
+        <w:t xml:space="preserve">Accède au </w:t>
+      </w:r>
+      <w:r>
+        <w:rPr>
+          <w:b/>
+          <w:bCs/>
+        </w:rPr>
+        <w:t>back-office d’administration</w:t>
+      </w:r>
+      <w:r>
+        <w:t xml:space="preserve"> (/admin/) pour créer les comptes de l’équipe et leur attribuer un rôle, régler les </w:t>
+      </w:r>
+      <w:r>
+        <w:rPr>
+          <w:b/>
+          <w:bCs/>
+        </w:rPr>
+        <w:t>horaires d’ouverture</w:t>
+      </w:r>
+      <w:r>
+        <w:t xml:space="preserve"> et les </w:t>
+      </w:r>
+      <w:r>
+        <w:rPr>
+          <w:b/>
+          <w:bCs/>
+        </w:rPr>
+        <w:t>fermetures exceptionnelles</w:t>
+      </w:r>
+      <w:r>
+        <w:t xml:space="preserve">, lire les </w:t>
+      </w:r>
+      <w:r>
+        <w:rPr>
+          <w:b/>
+          <w:bCs/>
+        </w:rPr>
+        <w:t>messages du formulaire de contact</w:t>
+      </w:r>
+      <w:r>
+        <w:t xml:space="preserve"> et consulter le </w:t>
+      </w:r>
+      <w:r>
+        <w:rPr>
+          <w:b/>
+          <w:bCs/>
+        </w:rPr>
+        <w:t>journal d’audit</w:t>
+      </w:r>
+      <w:r>
+        <w:t>.</w:t>
       </w:r>
     </w:p>
     <w:p>
       <w:pPr>
+        <w:pStyle w:val="Paragraphedeliste"/>
+        <w:numPr>
+          <w:ilvl w:val="0"/>
+          <w:numId w:val="2"/>
+        </w:numPr>
+        <w:spacing w:after="60" w:line="264" w:lineRule="auto"/>
+      </w:pPr>
+      <w:r>
+        <w:t>Même dans le back-office, le statut d’un rendez-vous reste en lecture seule : il passe obligatoirement par les actions du parcours, pour que tout reste tracé.</w:t>
+      </w:r>
+    </w:p>
+    <w:p>
+      <w:pPr>
         <w:pStyle w:val="Titre1"/>
         <w:pageBreakBefore/>
       </w:pPr>
-      <w:bookmarkStart w:id="9" w:name="_Toc241860569"/>
+      <w:bookmarkStart w:id="9" w:name="_Toc241882497"/>
       <w:r>
         <w:lastRenderedPageBreak/>
         <w:t>3. Le parcours d’un rendez-vous</w:t>
@@ -6010,7 +6178,7 @@
                 <w:sz w:val="19"/>
                 <w:szCs w:val="19"/>
               </w:rPr>
-              <w:t>Contrôle validé : le véhicule est prêt à être récupéré.</w:t>
+              <w:t>Contrôle validé : le véhicule est prêt. La facture est créée automatiquement.</w:t>
             </w:r>
           </w:p>
         </w:tc>
@@ -6070,7 +6238,7 @@
                 <w:sz w:val="19"/>
                 <w:szCs w:val="19"/>
               </w:rPr>
-              <w:t>Oui (« Votre véhicule est prêt »)</w:t>
+              <w:t>Oui (« Votre véhicule est prêt », « Facture disponible »)</w:t>
             </w:r>
           </w:p>
         </w:tc>
@@ -6136,7 +6304,7 @@
                 <w:sz w:val="19"/>
                 <w:szCs w:val="19"/>
               </w:rPr>
-              <w:t>Le client est venu chercher son véhicule.</w:t>
+              <w:t>Le client paie au comptoir et récupère son véhicule.</w:t>
             </w:r>
           </w:p>
         </w:tc>
@@ -6209,7 +6377,7 @@
       <w:pPr>
         <w:pStyle w:val="Titre2"/>
       </w:pPr>
-      <w:bookmarkStart w:id="10" w:name="_Toc241860570"/>
+      <w:bookmarkStart w:id="10" w:name="_Toc241882498"/>
       <w:r>
         <w:t>3.1 Situations particulières</w:t>
       </w:r>
@@ -6859,51 +7027,11 @@
       <w:pPr>
         <w:pStyle w:val="Titre2"/>
       </w:pPr>
-      <w:bookmarkStart w:id="11" w:name="_Toc241860571"/>
-      <w:r>
-        <w:t>3.2 L’avancement affiché au client</w:t>
+      <w:bookmarkStart w:id="11" w:name="_Toc241882499"/>
+      <w:r>
+        <w:t>3.2 Restitution et paiement au comptoir</w:t>
       </w:r>
       <w:bookmarkEnd w:id="11"/>
-    </w:p>
-    <w:p>
-      <w:pPr>
-        <w:spacing w:after="120" w:line="276" w:lineRule="auto"/>
-      </w:pPr>
-      <w:r>
-        <w:t xml:space="preserve">La barre d’avancement ne repose pas sur le temps écoulé mais sur les </w:t>
-      </w:r>
-      <w:r>
-        <w:rPr>
-          <w:b/>
-          <w:bCs/>
-        </w:rPr>
-        <w:t>étapes réellement validées</w:t>
-      </w:r>
-      <w:r>
-        <w:t xml:space="preserve"> : chaque statut correspond à un palier, et pendant le traitement la barre progresse à chaque étape cochée par le technicien.</w:t>
-      </w:r>
-    </w:p>
-    <w:p>
-      <w:pPr>
-        <w:pStyle w:val="Titre1"/>
-        <w:pageBreakBefore/>
-      </w:pPr>
-      <w:bookmarkStart w:id="12" w:name="_Toc241860572"/>
-      <w:r>
-        <w:lastRenderedPageBreak/>
-        <w:t>4. Réservation en ligne et disponibilités</w:t>
-      </w:r>
-      <w:bookmarkEnd w:id="12"/>
-    </w:p>
-    <w:p>
-      <w:pPr>
-        <w:pStyle w:val="Titre2"/>
-      </w:pPr>
-      <w:bookmarkStart w:id="13" w:name="_Toc241860573"/>
-      <w:r>
-        <w:t>4.1 Le tunnel de réservation</w:t>
-      </w:r>
-      <w:bookmarkEnd w:id="13"/>
     </w:p>
     <w:p>
       <w:pPr>
@@ -6915,14 +7043,17 @@
         <w:spacing w:after="60"/>
       </w:pPr>
       <w:r>
+        <w:t xml:space="preserve">Le technicien clique « Restituer au client ». La plateforme affiche la facture et le </w:t>
+      </w:r>
+      <w:r>
         <w:rPr>
           <w:b/>
           <w:bCs/>
         </w:rPr>
-        <w:t>Service</w:t>
-      </w:r>
-      <w:r>
-        <w:t xml:space="preserve"> : choix d’une prestation réservable, avec son tarif et sa durée.</w:t>
+        <w:t>reste à payer</w:t>
+      </w:r>
+      <w:r>
+        <w:t>.</w:t>
       </w:r>
     </w:p>
     <w:p>
@@ -6935,14 +7066,17 @@
         <w:spacing w:after="60"/>
       </w:pPr>
       <w:r>
+        <w:t xml:space="preserve">Il </w:t>
+      </w:r>
+      <w:r>
         <w:rPr>
           <w:b/>
           <w:bCs/>
         </w:rPr>
-        <w:t>Véhicule</w:t>
-      </w:r>
-      <w:r>
-        <w:t xml:space="preserve"> : un véhicule déjà enregistré, ou un nouveau (marque, modèle, immatriculation).</w:t>
+        <w:t>encaisse</w:t>
+      </w:r>
+      <w:r>
+        <w:t xml:space="preserve"> (espèces le plus souvent, ou Wave, Orange Money, carte, virement). Un paiement partiel est possible.</w:t>
       </w:r>
     </w:p>
     <w:p>
@@ -6955,14 +7089,17 @@
         <w:spacing w:after="60"/>
       </w:pPr>
       <w:r>
+        <w:t xml:space="preserve">Une fois tout payé, il </w:t>
+      </w:r>
+      <w:r>
         <w:rPr>
           <w:b/>
           <w:bCs/>
         </w:rPr>
-        <w:t>Date</w:t>
-      </w:r>
-      <w:r>
-        <w:t xml:space="preserve"> : seuls les jours ayant au moins un créneau libre sont proposés.</w:t>
+        <w:t>restitue le véhicule</w:t>
+      </w:r>
+      <w:r>
+        <w:t>.</w:t>
       </w:r>
     </w:p>
     <w:p>
@@ -6975,6 +7112,130 @@
         <w:spacing w:after="60"/>
       </w:pPr>
       <w:r>
+        <w:lastRenderedPageBreak/>
+        <w:t>Si le client ne règle pas tout (client de confiance, paiement plus tard), la restitution reste possible après confirmation : l’historique note alors « Restitué avec un reste à payer de … FCFA ».</w:t>
+      </w:r>
+    </w:p>
+    <w:p>
+      <w:pPr>
+        <w:pStyle w:val="Titre2"/>
+      </w:pPr>
+      <w:bookmarkStart w:id="12" w:name="_Toc241882500"/>
+      <w:r>
+        <w:t>3.3 L’avancement affiché au client</w:t>
+      </w:r>
+      <w:bookmarkEnd w:id="12"/>
+    </w:p>
+    <w:p>
+      <w:pPr>
+        <w:spacing w:after="120" w:line="276" w:lineRule="auto"/>
+      </w:pPr>
+      <w:r>
+        <w:t xml:space="preserve">La barre d’avancement ne repose pas sur le temps écoulé mais sur les </w:t>
+      </w:r>
+      <w:r>
+        <w:rPr>
+          <w:b/>
+          <w:bCs/>
+        </w:rPr>
+        <w:t>étapes réellement validées</w:t>
+      </w:r>
+      <w:r>
+        <w:t xml:space="preserve"> : chaque statut correspond à un palier, et pendant le traitement la barre progresse à chaque étape cochée par le technicien.</w:t>
+      </w:r>
+    </w:p>
+    <w:p>
+      <w:pPr>
+        <w:pStyle w:val="Titre1"/>
+        <w:pageBreakBefore/>
+      </w:pPr>
+      <w:bookmarkStart w:id="13" w:name="_Toc241882501"/>
+      <w:r>
+        <w:lastRenderedPageBreak/>
+        <w:t>4. Réservation en ligne et disponibilités</w:t>
+      </w:r>
+      <w:bookmarkEnd w:id="13"/>
+    </w:p>
+    <w:p>
+      <w:pPr>
+        <w:pStyle w:val="Titre2"/>
+      </w:pPr>
+      <w:bookmarkStart w:id="14" w:name="_Toc241882502"/>
+      <w:r>
+        <w:t>4.1 Le tunnel de réservation</w:t>
+      </w:r>
+      <w:bookmarkEnd w:id="14"/>
+    </w:p>
+    <w:p>
+      <w:pPr>
+        <w:pStyle w:val="Paragraphedeliste"/>
+        <w:numPr>
+          <w:ilvl w:val="0"/>
+          <w:numId w:val="4"/>
+        </w:numPr>
+        <w:spacing w:after="60"/>
+      </w:pPr>
+      <w:r>
+        <w:rPr>
+          <w:b/>
+          <w:bCs/>
+        </w:rPr>
+        <w:t>Service</w:t>
+      </w:r>
+      <w:r>
+        <w:t xml:space="preserve"> : choix d’une prestation réservable, avec son tarif et sa durée.</w:t>
+      </w:r>
+    </w:p>
+    <w:p>
+      <w:pPr>
+        <w:pStyle w:val="Paragraphedeliste"/>
+        <w:numPr>
+          <w:ilvl w:val="0"/>
+          <w:numId w:val="4"/>
+        </w:numPr>
+        <w:spacing w:after="60"/>
+      </w:pPr>
+      <w:r>
+        <w:rPr>
+          <w:b/>
+          <w:bCs/>
+        </w:rPr>
+        <w:t>Véhicule</w:t>
+      </w:r>
+      <w:r>
+        <w:t xml:space="preserve"> : un véhicule déjà enregistré, ou un nouveau (marque, modèle, immatriculation).</w:t>
+      </w:r>
+    </w:p>
+    <w:p>
+      <w:pPr>
+        <w:pStyle w:val="Paragraphedeliste"/>
+        <w:numPr>
+          <w:ilvl w:val="0"/>
+          <w:numId w:val="4"/>
+        </w:numPr>
+        <w:spacing w:after="60"/>
+      </w:pPr>
+      <w:r>
+        <w:rPr>
+          <w:b/>
+          <w:bCs/>
+        </w:rPr>
+        <w:t>Date</w:t>
+      </w:r>
+      <w:r>
+        <w:t xml:space="preserve"> : seuls les jours ayant au moins un créneau libre sont proposés.</w:t>
+      </w:r>
+    </w:p>
+    <w:p>
+      <w:pPr>
+        <w:pStyle w:val="Paragraphedeliste"/>
+        <w:numPr>
+          <w:ilvl w:val="0"/>
+          <w:numId w:val="4"/>
+        </w:numPr>
+        <w:spacing w:after="60"/>
+      </w:pPr>
+      <w:r>
         <w:rPr>
           <w:b/>
           <w:bCs/>
@@ -6990,7 +7251,7 @@
         <w:pStyle w:val="Paragraphedeliste"/>
         <w:numPr>
           <w:ilvl w:val="0"/>
-          <w:numId w:val="3"/>
+          <w:numId w:val="4"/>
         </w:numPr>
         <w:spacing w:after="60"/>
       </w:pPr>
@@ -7010,7 +7271,7 @@
         <w:pStyle w:val="Paragraphedeliste"/>
         <w:numPr>
           <w:ilvl w:val="0"/>
-          <w:numId w:val="3"/>
+          <w:numId w:val="4"/>
         </w:numPr>
         <w:spacing w:after="60"/>
       </w:pPr>
@@ -7030,7 +7291,7 @@
         <w:pStyle w:val="Paragraphedeliste"/>
         <w:numPr>
           <w:ilvl w:val="0"/>
-          <w:numId w:val="3"/>
+          <w:numId w:val="4"/>
         </w:numPr>
         <w:spacing w:after="60"/>
       </w:pPr>
@@ -7059,11 +7320,11 @@
       <w:pPr>
         <w:pStyle w:val="Titre2"/>
       </w:pPr>
-      <w:bookmarkStart w:id="14" w:name="_Toc241860574"/>
+      <w:bookmarkStart w:id="15" w:name="_Toc241882503"/>
       <w:r>
         <w:t>4.2 Comment les créneaux sont calculés</w:t>
       </w:r>
-      <w:bookmarkEnd w:id="14"/>
+      <w:bookmarkEnd w:id="15"/>
     </w:p>
     <w:p>
       <w:pPr>
@@ -8019,12 +8280,12 @@
         <w:pStyle w:val="Titre1"/>
         <w:pageBreakBefore/>
       </w:pPr>
-      <w:bookmarkStart w:id="15" w:name="_Toc241860575"/>
+      <w:bookmarkStart w:id="16" w:name="_Toc241882504"/>
       <w:r>
         <w:lastRenderedPageBreak/>
         <w:t>5. L’espace client</w:t>
       </w:r>
-      <w:bookmarkEnd w:id="15"/>
+      <w:bookmarkEnd w:id="16"/>
     </w:p>
     <w:tbl>
       <w:tblPr>
@@ -8602,11 +8863,11 @@
       <w:pPr>
         <w:pStyle w:val="Titre2"/>
       </w:pPr>
-      <w:bookmarkStart w:id="16" w:name="_Toc241860576"/>
+      <w:bookmarkStart w:id="17" w:name="_Toc241882505"/>
       <w:r>
         <w:t>5.1 Photo du véhicule</w:t>
       </w:r>
-      <w:bookmarkEnd w:id="16"/>
+      <w:bookmarkEnd w:id="17"/>
     </w:p>
     <w:p>
       <w:pPr>
@@ -8682,12 +8943,12 @@
         <w:pStyle w:val="Titre1"/>
         <w:pageBreakBefore/>
       </w:pPr>
-      <w:bookmarkStart w:id="17" w:name="_Toc241860577"/>
+      <w:bookmarkStart w:id="18" w:name="_Toc241882506"/>
       <w:r>
         <w:lastRenderedPageBreak/>
         <w:t>6. L’espace professionnel</w:t>
       </w:r>
-      <w:bookmarkEnd w:id="17"/>
+      <w:bookmarkEnd w:id="18"/>
     </w:p>
     <w:p>
       <w:pPr>
@@ -8957,7 +9218,7 @@
                 <w:sz w:val="19"/>
                 <w:szCs w:val="19"/>
               </w:rPr>
-              <w:t>Notifications</w:t>
+              <w:t>Fiche « Gérer » d’un rendez-vous</w:t>
             </w:r>
           </w:p>
         </w:tc>
@@ -9017,7 +9278,7 @@
                 <w:sz w:val="19"/>
                 <w:szCs w:val="19"/>
               </w:rPr>
-              <w:t>Ce qui demande une action (nouvelle demande, contrôle à valider, prestation affectée…).</w:t>
+              <w:t>Étapes de traitement à cocher, photos (inspection, avant, après — prises directement avec le téléphone), facture et encaissement, affectation, notes internes, report, historique.</w:t>
             </w:r>
           </w:p>
         </w:tc>
@@ -9054,7 +9315,7 @@
                 <w:sz w:val="19"/>
                 <w:szCs w:val="19"/>
               </w:rPr>
-              <w:t>Rendez-vous</w:t>
+              <w:t>Journal de caisse</w:t>
             </w:r>
           </w:p>
         </w:tc>
@@ -9083,7 +9344,7 @@
                 <w:sz w:val="19"/>
                 <w:szCs w:val="19"/>
               </w:rPr>
-              <w:t>Toute l’équipe</w:t>
+              <w:t>Manager, admin</w:t>
             </w:r>
           </w:p>
         </w:tc>
@@ -9112,7 +9373,7 @@
                 <w:sz w:val="19"/>
                 <w:szCs w:val="19"/>
               </w:rPr>
-              <w:t>Liste filtrable (statut, date). Seules les actions autorisées pour le rôle et l’étape sont proposées. Fiche « Gérer » : affectation, notes internes, report, historique complet.</w:t>
+              <w:t>Encaissements du jour par moyen et par personne, espèces à retrouver en caisse, remboursements.</w:t>
             </w:r>
           </w:p>
         </w:tc>
@@ -9150,7 +9411,7 @@
                 <w:sz w:val="19"/>
                 <w:szCs w:val="19"/>
               </w:rPr>
-              <w:t>Clients</w:t>
+              <w:t>Notifications</w:t>
             </w:r>
           </w:p>
         </w:tc>
@@ -9180,7 +9441,7 @@
                 <w:sz w:val="19"/>
                 <w:szCs w:val="19"/>
               </w:rPr>
-              <w:t>Toute l’équipe (modification : manager)</w:t>
+              <w:t>Toute l’équipe</w:t>
             </w:r>
           </w:p>
         </w:tc>
@@ -9210,7 +9471,7 @@
                 <w:sz w:val="19"/>
                 <w:szCs w:val="19"/>
               </w:rPr>
-              <w:t>Recherche par nom, téléphone, email ou immatriculation ; fiche avec véhicules, rendez-vous, montant des prestations, segment et notes internes.</w:t>
+              <w:t>Ce qui demande une action (nouvelle demande, contrôle à valider, prestation affectée…).</w:t>
             </w:r>
           </w:p>
         </w:tc>
@@ -9247,7 +9508,7 @@
                 <w:sz w:val="19"/>
                 <w:szCs w:val="19"/>
               </w:rPr>
-              <w:t>Véhicules</w:t>
+              <w:t>Rendez-vous</w:t>
             </w:r>
           </w:p>
         </w:tc>
@@ -9305,7 +9566,7 @@
                 <w:sz w:val="19"/>
                 <w:szCs w:val="19"/>
               </w:rPr>
-              <w:t>Tous les véhicules enregistrés et leur propriétaire.</w:t>
+              <w:t>Liste filtrable (statut, date). Seules les actions autorisées pour le rôle et l’étape sont proposées. Fiche « Gérer » : affectation, notes internes, report, historique complet.</w:t>
             </w:r>
           </w:p>
         </w:tc>
@@ -9343,7 +9604,7 @@
                 <w:sz w:val="19"/>
                 <w:szCs w:val="19"/>
               </w:rPr>
-              <w:t>Prestations</w:t>
+              <w:t>Clients</w:t>
             </w:r>
           </w:p>
         </w:tc>
@@ -9373,7 +9634,7 @@
                 <w:sz w:val="19"/>
                 <w:szCs w:val="19"/>
               </w:rPr>
-              <w:t>Manager, admin</w:t>
+              <w:t>Toute l’équipe (modification : manager)</w:t>
             </w:r>
           </w:p>
         </w:tc>
@@ -9403,7 +9664,7 @@
                 <w:sz w:val="19"/>
                 <w:szCs w:val="19"/>
               </w:rPr>
-              <w:t>Création et modification (tarif fixe, « à partir de » ou sur devis ; durée bloquée au planning), suspension.</w:t>
+              <w:t>Recherche par nom, téléphone, email ou immatriculation ; fiche avec véhicules, rendez-vous, montant des prestations, segment et notes internes.</w:t>
             </w:r>
           </w:p>
         </w:tc>
@@ -9440,6 +9701,199 @@
                 <w:sz w:val="19"/>
                 <w:szCs w:val="19"/>
               </w:rPr>
+              <w:t>Véhicules</w:t>
+            </w:r>
+          </w:p>
+        </w:tc>
+        <w:tc>
+          <w:tcPr>
+            <w:tcW w:w="1985" w:type="dxa"/>
+            <w:tcBorders>
+              <w:top w:val="single" w:sz="4" w:space="0" w:color="D9D9D9"/>
+              <w:left w:val="single" w:sz="4" w:space="0" w:color="D9D9D9"/>
+              <w:bottom w:val="single" w:sz="4" w:space="0" w:color="D9D9D9"/>
+              <w:right w:val="single" w:sz="4" w:space="0" w:color="D9D9D9"/>
+            </w:tcBorders>
+            <w:tcMar>
+              <w:top w:w="70" w:type="dxa"/>
+              <w:left w:w="110" w:type="dxa"/>
+              <w:bottom w:w="70" w:type="dxa"/>
+              <w:right w:w="110" w:type="dxa"/>
+            </w:tcMar>
+          </w:tcPr>
+          <w:p>
+            <w:pPr>
+              <w:spacing w:line="252" w:lineRule="auto"/>
+            </w:pPr>
+            <w:r>
+              <w:rPr>
+                <w:sz w:val="19"/>
+                <w:szCs w:val="19"/>
+              </w:rPr>
+              <w:t>Toute l’équipe</w:t>
+            </w:r>
+          </w:p>
+        </w:tc>
+        <w:tc>
+          <w:tcPr>
+            <w:tcW w:w="5417" w:type="dxa"/>
+            <w:tcBorders>
+              <w:top w:val="single" w:sz="4" w:space="0" w:color="D9D9D9"/>
+              <w:left w:val="single" w:sz="4" w:space="0" w:color="D9D9D9"/>
+              <w:bottom w:val="single" w:sz="4" w:space="0" w:color="D9D9D9"/>
+              <w:right w:val="single" w:sz="4" w:space="0" w:color="D9D9D9"/>
+            </w:tcBorders>
+            <w:tcMar>
+              <w:top w:w="70" w:type="dxa"/>
+              <w:left w:w="110" w:type="dxa"/>
+              <w:bottom w:w="70" w:type="dxa"/>
+              <w:right w:w="110" w:type="dxa"/>
+            </w:tcMar>
+          </w:tcPr>
+          <w:p>
+            <w:pPr>
+              <w:spacing w:line="252" w:lineRule="auto"/>
+            </w:pPr>
+            <w:r>
+              <w:rPr>
+                <w:sz w:val="19"/>
+                <w:szCs w:val="19"/>
+              </w:rPr>
+              <w:t>Tous les véhicules enregistrés et leur propriétaire.</w:t>
+            </w:r>
+          </w:p>
+        </w:tc>
+      </w:tr>
+      <w:tr>
+        <w:tblPrEx>
+          <w:tblCellMar>
+            <w:top w:w="0" w:type="dxa"/>
+            <w:bottom w:w="0" w:type="dxa"/>
+          </w:tblCellMar>
+        </w:tblPrEx>
+        <w:tc>
+          <w:tcPr>
+            <w:tcW w:w="1624" w:type="dxa"/>
+            <w:tcBorders>
+              <w:top w:val="single" w:sz="4" w:space="0" w:color="D9D9D9"/>
+              <w:left w:val="single" w:sz="4" w:space="0" w:color="D9D9D9"/>
+              <w:bottom w:val="single" w:sz="4" w:space="0" w:color="D9D9D9"/>
+              <w:right w:val="single" w:sz="4" w:space="0" w:color="D9D9D9"/>
+            </w:tcBorders>
+            <w:shd w:val="clear" w:color="auto" w:fill="FAF7F2"/>
+            <w:tcMar>
+              <w:top w:w="70" w:type="dxa"/>
+              <w:left w:w="110" w:type="dxa"/>
+              <w:bottom w:w="70" w:type="dxa"/>
+              <w:right w:w="110" w:type="dxa"/>
+            </w:tcMar>
+          </w:tcPr>
+          <w:p>
+            <w:pPr>
+              <w:spacing w:line="252" w:lineRule="auto"/>
+            </w:pPr>
+            <w:r>
+              <w:rPr>
+                <w:sz w:val="19"/>
+                <w:szCs w:val="19"/>
+              </w:rPr>
+              <w:t>Prestations</w:t>
+            </w:r>
+          </w:p>
+        </w:tc>
+        <w:tc>
+          <w:tcPr>
+            <w:tcW w:w="1985" w:type="dxa"/>
+            <w:tcBorders>
+              <w:top w:val="single" w:sz="4" w:space="0" w:color="D9D9D9"/>
+              <w:left w:val="single" w:sz="4" w:space="0" w:color="D9D9D9"/>
+              <w:bottom w:val="single" w:sz="4" w:space="0" w:color="D9D9D9"/>
+              <w:right w:val="single" w:sz="4" w:space="0" w:color="D9D9D9"/>
+            </w:tcBorders>
+            <w:shd w:val="clear" w:color="auto" w:fill="FAF7F2"/>
+            <w:tcMar>
+              <w:top w:w="70" w:type="dxa"/>
+              <w:left w:w="110" w:type="dxa"/>
+              <w:bottom w:w="70" w:type="dxa"/>
+              <w:right w:w="110" w:type="dxa"/>
+            </w:tcMar>
+          </w:tcPr>
+          <w:p>
+            <w:pPr>
+              <w:spacing w:line="252" w:lineRule="auto"/>
+            </w:pPr>
+            <w:r>
+              <w:rPr>
+                <w:sz w:val="19"/>
+                <w:szCs w:val="19"/>
+              </w:rPr>
+              <w:t>Manager, admin</w:t>
+            </w:r>
+          </w:p>
+        </w:tc>
+        <w:tc>
+          <w:tcPr>
+            <w:tcW w:w="5417" w:type="dxa"/>
+            <w:tcBorders>
+              <w:top w:val="single" w:sz="4" w:space="0" w:color="D9D9D9"/>
+              <w:left w:val="single" w:sz="4" w:space="0" w:color="D9D9D9"/>
+              <w:bottom w:val="single" w:sz="4" w:space="0" w:color="D9D9D9"/>
+              <w:right w:val="single" w:sz="4" w:space="0" w:color="D9D9D9"/>
+            </w:tcBorders>
+            <w:shd w:val="clear" w:color="auto" w:fill="FAF7F2"/>
+            <w:tcMar>
+              <w:top w:w="70" w:type="dxa"/>
+              <w:left w:w="110" w:type="dxa"/>
+              <w:bottom w:w="70" w:type="dxa"/>
+              <w:right w:w="110" w:type="dxa"/>
+            </w:tcMar>
+          </w:tcPr>
+          <w:p>
+            <w:pPr>
+              <w:spacing w:line="252" w:lineRule="auto"/>
+            </w:pPr>
+            <w:r>
+              <w:rPr>
+                <w:sz w:val="19"/>
+                <w:szCs w:val="19"/>
+              </w:rPr>
+              <w:t>Création et modification (tarif fixe, « à partir de » ou sur devis ; durée bloquée au planning), suspension.</w:t>
+            </w:r>
+          </w:p>
+        </w:tc>
+      </w:tr>
+      <w:tr>
+        <w:tblPrEx>
+          <w:tblCellMar>
+            <w:top w:w="0" w:type="dxa"/>
+            <w:bottom w:w="0" w:type="dxa"/>
+          </w:tblCellMar>
+        </w:tblPrEx>
+        <w:tc>
+          <w:tcPr>
+            <w:tcW w:w="1624" w:type="dxa"/>
+            <w:tcBorders>
+              <w:top w:val="single" w:sz="4" w:space="0" w:color="D9D9D9"/>
+              <w:left w:val="single" w:sz="4" w:space="0" w:color="D9D9D9"/>
+              <w:bottom w:val="single" w:sz="4" w:space="0" w:color="D9D9D9"/>
+              <w:right w:val="single" w:sz="4" w:space="0" w:color="D9D9D9"/>
+            </w:tcBorders>
+            <w:tcMar>
+              <w:top w:w="70" w:type="dxa"/>
+              <w:left w:w="110" w:type="dxa"/>
+              <w:bottom w:w="70" w:type="dxa"/>
+              <w:right w:w="110" w:type="dxa"/>
+            </w:tcMar>
+          </w:tcPr>
+          <w:p>
+            <w:pPr>
+              <w:spacing w:line="252" w:lineRule="auto"/>
+            </w:pPr>
+            <w:r>
+              <w:rPr>
+                <w:sz w:val="19"/>
+                <w:szCs w:val="19"/>
+              </w:rPr>
               <w:t>Équipe</w:t>
             </w:r>
           </w:p>
@@ -9527,7 +9981,7 @@
         <w:t xml:space="preserve">Écrans en cours de réalisation : </w:t>
       </w:r>
       <w:r>
-        <w:t>les modules Atelier (étapes, photos), Facturation, Galerie et Statistiques sont opérationnels côté serveur et testés ; leurs écrans dans l’espace professionnel restent à construire. En attendant, ces rubriques affichent « prévu prochainement » et l’administrateur dispose du back-office pour les factures et les contenus.</w:t>
+        <w:t>la liste complète des factures (devis, annulations), la gestion de la galerie et les statistiques sont opérationnelles côté serveur et testées ; leurs écrans restent à construire. En attendant, ces rubriques affichent « prévu prochainement » et l’administrateur dispose du back-office.</w:t>
       </w:r>
     </w:p>
     <w:p>
@@ -9535,22 +9989,22 @@
         <w:pStyle w:val="Titre1"/>
         <w:pageBreakBefore/>
       </w:pPr>
-      <w:bookmarkStart w:id="18" w:name="_Toc241860578"/>
+      <w:bookmarkStart w:id="19" w:name="_Toc241882507"/>
       <w:r>
         <w:lastRenderedPageBreak/>
         <w:t>7. Le suivi atelier</w:t>
       </w:r>
-      <w:bookmarkEnd w:id="18"/>
+      <w:bookmarkEnd w:id="19"/>
     </w:p>
     <w:p>
       <w:pPr>
         <w:pStyle w:val="Titre2"/>
       </w:pPr>
-      <w:bookmarkStart w:id="19" w:name="_Toc241860579"/>
+      <w:bookmarkStart w:id="20" w:name="_Toc241882508"/>
       <w:r>
         <w:t>7.1 Étapes de traitement</w:t>
       </w:r>
-      <w:bookmarkEnd w:id="19"/>
+      <w:bookmarkEnd w:id="20"/>
     </w:p>
     <w:p>
       <w:pPr>
@@ -9635,11 +10089,11 @@
       <w:pPr>
         <w:pStyle w:val="Titre2"/>
       </w:pPr>
-      <w:bookmarkStart w:id="20" w:name="_Toc241860580"/>
+      <w:bookmarkStart w:id="21" w:name="_Toc241882509"/>
       <w:r>
         <w:t>7.2 Photos d’intervention</w:t>
       </w:r>
-      <w:bookmarkEnd w:id="20"/>
+      <w:bookmarkEnd w:id="21"/>
     </w:p>
     <w:tbl>
       <w:tblPr>
@@ -9986,22 +10440,22 @@
         <w:pStyle w:val="Titre1"/>
         <w:pageBreakBefore/>
       </w:pPr>
-      <w:bookmarkStart w:id="21" w:name="_Toc241860581"/>
+      <w:bookmarkStart w:id="22" w:name="_Toc241882510"/>
       <w:r>
         <w:lastRenderedPageBreak/>
         <w:t>8. Facturation et paiements</w:t>
       </w:r>
-      <w:bookmarkEnd w:id="21"/>
+      <w:bookmarkEnd w:id="22"/>
     </w:p>
     <w:p>
       <w:pPr>
         <w:pStyle w:val="Titre2"/>
       </w:pPr>
-      <w:bookmarkStart w:id="22" w:name="_Toc241860582"/>
+      <w:bookmarkStart w:id="23" w:name="_Toc241882511"/>
       <w:r>
         <w:t>8.1 Les factures</w:t>
       </w:r>
-      <w:bookmarkEnd w:id="22"/>
+      <w:bookmarkEnd w:id="23"/>
     </w:p>
     <w:p>
       <w:pPr>
@@ -10013,17 +10467,17 @@
         <w:spacing w:after="60" w:line="264" w:lineRule="auto"/>
       </w:pPr>
       <w:r>
-        <w:t xml:space="preserve">Une facture s’établit pour une prestation </w:t>
+        <w:t xml:space="preserve">La facture est </w:t>
       </w:r>
       <w:r>
         <w:rPr>
           <w:b/>
           <w:bCs/>
         </w:rPr>
-        <w:t>terminée ou restituée</w:t>
-      </w:r>
-      <w:r>
-        <w:t xml:space="preserve">, avec une numérotation continue </w:t>
+        <w:t>créée automatiquement</w:t>
+      </w:r>
+      <w:r>
+        <w:t xml:space="preserve"> quand le manager valide la prestation (statut Terminé), au prix annoncé lors de la réservation, avec une numérotation continue </w:t>
       </w:r>
       <w:r>
         <w:rPr>
@@ -10033,7 +10487,7 @@
         <w:t>INV-AAAA-XXXX</w:t>
       </w:r>
       <w:r>
-        <w:t>.</w:t>
+        <w:t>. Elle est donc prête quand le client arrive au comptoir.</w:t>
       </w:r>
     </w:p>
     <w:p>
@@ -10046,7 +10500,17 @@
         <w:spacing w:after="60" w:line="264" w:lineRule="auto"/>
       </w:pPr>
       <w:r>
-        <w:t xml:space="preserve">Par défaut, elle reprend la prestation au prix annoncé lors de la réservation ; le manager peut détailler d’autres lignes et accorder une </w:t>
+        <w:t xml:space="preserve">Pour une prestation </w:t>
+      </w:r>
+      <w:r>
+        <w:rPr>
+          <w:b/>
+          <w:bCs/>
+        </w:rPr>
+        <w:t>sur devis</w:t>
+      </w:r>
+      <w:r>
+        <w:t xml:space="preserve">, ou pour ajouter des lignes et une </w:t>
       </w:r>
       <w:r>
         <w:rPr>
@@ -10056,7 +10520,7 @@
         <w:t>remise</w:t>
       </w:r>
       <w:r>
-        <w:t>. Une prestation « sur devis » exige des lignes détaillées.</w:t>
+        <w:t>, le manager établit lui-même la facture (il peut annuler la facture automatique et la refaire).</w:t>
       </w:r>
     </w:p>
     <w:p>
@@ -10103,11 +10567,11 @@
       <w:pPr>
         <w:pStyle w:val="Titre2"/>
       </w:pPr>
-      <w:bookmarkStart w:id="23" w:name="_Toc241860583"/>
+      <w:bookmarkStart w:id="24" w:name="_Toc241882512"/>
       <w:r>
         <w:t>8.2 Les paiements</w:t>
       </w:r>
-      <w:bookmarkEnd w:id="23"/>
+      <w:bookmarkEnd w:id="24"/>
     </w:p>
     <w:p>
       <w:pPr>
@@ -10139,7 +10603,17 @@
         <w:t>enregistré manuellement</w:t>
       </w:r>
       <w:r>
-        <w:t xml:space="preserve"> par le manager, avec la référence de transaction si elle existe.</w:t>
+        <w:t xml:space="preserve"> — par le </w:t>
+      </w:r>
+      <w:r>
+        <w:rPr>
+          <w:b/>
+          <w:bCs/>
+        </w:rPr>
+        <w:t>technicien au comptoir</w:t>
+      </w:r>
+      <w:r>
+        <w:t xml:space="preserve"> ou par le manager — avec la référence de transaction si elle existe.</w:t>
       </w:r>
     </w:p>
     <w:p>
@@ -10221,18 +10695,76 @@
         <w:t>annulée</w:t>
       </w:r>
       <w:r>
-        <w:t xml:space="preserve"> qu’après remboursement de tous ses paiements.</w:t>
+        <w:t xml:space="preserve"> qu’après remboursement de tous ses paiements. Remboursements et annulations sont </w:t>
+      </w:r>
+      <w:r>
+        <w:rPr>
+          <w:b/>
+          <w:bCs/>
+        </w:rPr>
+        <w:t>réservés au manager</w:t>
+      </w:r>
+      <w:r>
+        <w:t>.</w:t>
       </w:r>
     </w:p>
     <w:p>
       <w:pPr>
         <w:pStyle w:val="Titre2"/>
       </w:pPr>
-      <w:bookmarkStart w:id="24" w:name="_Toc241860584"/>
-      <w:r>
-        <w:t>8.3 Statut d’une facture</w:t>
-      </w:r>
-      <w:bookmarkEnd w:id="24"/>
+      <w:bookmarkStart w:id="25" w:name="_Toc241882513"/>
+      <w:r>
+        <w:t>8.3 Le journal de caisse</w:t>
+      </w:r>
+      <w:bookmarkEnd w:id="25"/>
+    </w:p>
+    <w:p>
+      <w:pPr>
+        <w:spacing w:after="120" w:line="276" w:lineRule="auto"/>
+      </w:pPr>
+      <w:r>
+        <w:t xml:space="preserve">Chaque jour, le manager consulte le </w:t>
+      </w:r>
+      <w:r>
+        <w:rPr>
+          <w:b/>
+          <w:bCs/>
+        </w:rPr>
+        <w:t>journal de caisse</w:t>
+      </w:r>
+      <w:r>
+        <w:t xml:space="preserve"> : total encaissé, </w:t>
+      </w:r>
+      <w:r>
+        <w:rPr>
+          <w:b/>
+          <w:bCs/>
+        </w:rPr>
+        <w:t>montant en espèces à retrouver dans la caisse</w:t>
+      </w:r>
+      <w:r>
+        <w:t xml:space="preserve">, répartition par moyen de paiement et </w:t>
+      </w:r>
+      <w:r>
+        <w:rPr>
+          <w:b/>
+          <w:bCs/>
+        </w:rPr>
+        <w:t>par personne</w:t>
+      </w:r>
+      <w:r>
+        <w:t>, et liste détaillée de chaque paiement (heure, client, facture, auteur). C’est le contrôle qui permet de confier l’encaissement à l’équipe du comptoir.</w:t>
+      </w:r>
+    </w:p>
+    <w:p>
+      <w:pPr>
+        <w:pStyle w:val="Titre2"/>
+      </w:pPr>
+      <w:bookmarkStart w:id="26" w:name="_Toc241882514"/>
+      <w:r>
+        <w:t>8.4 Statut d’une facture</w:t>
+      </w:r>
+      <w:bookmarkEnd w:id="26"/>
     </w:p>
     <w:p>
       <w:pPr>
@@ -10690,22 +11222,22 @@
         <w:pStyle w:val="Titre1"/>
         <w:pageBreakBefore/>
       </w:pPr>
-      <w:bookmarkStart w:id="25" w:name="_Toc241860585"/>
+      <w:bookmarkStart w:id="27" w:name="_Toc241882515"/>
       <w:r>
         <w:lastRenderedPageBreak/>
         <w:t>9. Les notifications</w:t>
       </w:r>
-      <w:bookmarkEnd w:id="25"/>
+      <w:bookmarkEnd w:id="27"/>
     </w:p>
     <w:p>
       <w:pPr>
         <w:pStyle w:val="Titre2"/>
       </w:pPr>
-      <w:bookmarkStart w:id="26" w:name="_Toc241860586"/>
+      <w:bookmarkStart w:id="28" w:name="_Toc241882516"/>
       <w:r>
         <w:t>9.1 Pour le client</w:t>
       </w:r>
-      <w:bookmarkEnd w:id="26"/>
+      <w:bookmarkEnd w:id="28"/>
     </w:p>
     <w:p>
       <w:pPr>
@@ -11369,11 +11901,11 @@
       <w:pPr>
         <w:pStyle w:val="Titre2"/>
       </w:pPr>
-      <w:bookmarkStart w:id="27" w:name="_Toc241860587"/>
+      <w:bookmarkStart w:id="29" w:name="_Toc241882517"/>
       <w:r>
         <w:t>9.2 Pour l’équipe</w:t>
       </w:r>
-      <w:bookmarkEnd w:id="27"/>
+      <w:bookmarkEnd w:id="29"/>
     </w:p>
     <w:p>
       <w:pPr>
@@ -11847,12 +12379,12 @@
         <w:pStyle w:val="Titre1"/>
         <w:pageBreakBefore/>
       </w:pPr>
-      <w:bookmarkStart w:id="28" w:name="_Toc241860588"/>
+      <w:bookmarkStart w:id="30" w:name="_Toc241882518"/>
       <w:r>
         <w:lastRenderedPageBreak/>
         <w:t>10. Contenus publics du site</w:t>
       </w:r>
-      <w:bookmarkEnd w:id="28"/>
+      <w:bookmarkEnd w:id="30"/>
     </w:p>
     <w:p>
       <w:pPr>
@@ -12283,12 +12815,12 @@
         <w:pStyle w:val="Titre1"/>
         <w:pageBreakBefore/>
       </w:pPr>
-      <w:bookmarkStart w:id="29" w:name="_Toc241860589"/>
+      <w:bookmarkStart w:id="31" w:name="_Toc241882519"/>
       <w:r>
         <w:lastRenderedPageBreak/>
         <w:t>11. Statistiques et exports</w:t>
       </w:r>
-      <w:bookmarkEnd w:id="29"/>
+      <w:bookmarkEnd w:id="31"/>
     </w:p>
     <w:p>
       <w:pPr>
@@ -12916,12 +13448,12 @@
         <w:pStyle w:val="Titre1"/>
         <w:pageBreakBefore/>
       </w:pPr>
-      <w:bookmarkStart w:id="30" w:name="_Toc241860590"/>
+      <w:bookmarkStart w:id="32" w:name="_Toc241882520"/>
       <w:r>
         <w:lastRenderedPageBreak/>
         <w:t>12. Sécurité et confidentialité</w:t>
       </w:r>
-      <w:bookmarkEnd w:id="30"/>
+      <w:bookmarkEnd w:id="32"/>
     </w:p>
     <w:p>
       <w:pPr>
@@ -13030,7 +13562,7 @@
         <w:t>Cloisonnement</w:t>
       </w:r>
       <w:r>
-        <w:t xml:space="preserve"> : chaque client ne voit que ses véhicules, rendez-vous, photos, factures et notifications ; les techniciens n’ont pas accès aux finances.</w:t>
+        <w:t xml:space="preserve"> : chaque client ne voit que ses véhicules, rendez-vous, photos, factures et notifications ; un technicien ne voit que les factures des véhicules qu’il rend au comptoir, et ne peut ni rembourser ni annuler.</w:t>
       </w:r>
     </w:p>
     <w:p>
@@ -13078,12 +13610,12 @@
         <w:pStyle w:val="Titre1"/>
         <w:pageBreakBefore/>
       </w:pPr>
-      <w:bookmarkStart w:id="31" w:name="_Toc241860591"/>
+      <w:bookmarkStart w:id="33" w:name="_Toc241882521"/>
       <w:r>
         <w:lastRenderedPageBreak/>
         <w:t>13. Administration</w:t>
       </w:r>
-      <w:bookmarkEnd w:id="31"/>
+      <w:bookmarkEnd w:id="33"/>
     </w:p>
     <w:p>
       <w:pPr>
@@ -13215,18 +13747,18 @@
       <w:pPr>
         <w:pStyle w:val="Titre2"/>
       </w:pPr>
-      <w:bookmarkStart w:id="32" w:name="_Toc241860592"/>
+      <w:bookmarkStart w:id="34" w:name="_Toc241882522"/>
       <w:r>
         <w:t>13.1 Mise en service : liste de contrôle</w:t>
       </w:r>
-      <w:bookmarkEnd w:id="32"/>
+      <w:bookmarkEnd w:id="34"/>
     </w:p>
     <w:p>
       <w:pPr>
         <w:pStyle w:val="Paragraphedeliste"/>
         <w:numPr>
           <w:ilvl w:val="0"/>
-          <w:numId w:val="4"/>
+          <w:numId w:val="5"/>
         </w:numPr>
         <w:spacing w:after="60"/>
       </w:pPr>
@@ -13239,7 +13771,7 @@
         <w:pStyle w:val="Paragraphedeliste"/>
         <w:numPr>
           <w:ilvl w:val="0"/>
-          <w:numId w:val="4"/>
+          <w:numId w:val="5"/>
         </w:numPr>
         <w:spacing w:after="60"/>
       </w:pPr>
@@ -13262,7 +13794,7 @@
         <w:pStyle w:val="Paragraphedeliste"/>
         <w:numPr>
           <w:ilvl w:val="0"/>
-          <w:numId w:val="4"/>
+          <w:numId w:val="5"/>
         </w:numPr>
         <w:spacing w:after="60"/>
       </w:pPr>
@@ -13285,7 +13817,7 @@
         <w:pStyle w:val="Paragraphedeliste"/>
         <w:numPr>
           <w:ilvl w:val="0"/>
-          <w:numId w:val="4"/>
+          <w:numId w:val="5"/>
         </w:numPr>
         <w:spacing w:after="60"/>
       </w:pPr>
@@ -13308,7 +13840,7 @@
         <w:pStyle w:val="Paragraphedeliste"/>
         <w:numPr>
           <w:ilvl w:val="0"/>
-          <w:numId w:val="4"/>
+          <w:numId w:val="5"/>
         </w:numPr>
         <w:spacing w:after="60"/>
       </w:pPr>
@@ -13331,7 +13863,7 @@
         <w:pStyle w:val="Paragraphedeliste"/>
         <w:numPr>
           <w:ilvl w:val="0"/>
-          <w:numId w:val="4"/>
+          <w:numId w:val="5"/>
         </w:numPr>
         <w:spacing w:after="60"/>
       </w:pPr>
@@ -13354,7 +13886,7 @@
         <w:pStyle w:val="Paragraphedeliste"/>
         <w:numPr>
           <w:ilvl w:val="0"/>
-          <w:numId w:val="4"/>
+          <w:numId w:val="5"/>
         </w:numPr>
         <w:spacing w:after="60"/>
       </w:pPr>
@@ -13367,12 +13899,12 @@
         <w:pStyle w:val="Titre1"/>
         <w:pageBreakBefore/>
       </w:pPr>
-      <w:bookmarkStart w:id="33" w:name="_Toc241860593"/>
+      <w:bookmarkStart w:id="35" w:name="_Toc241882523"/>
       <w:r>
         <w:lastRenderedPageBreak/>
         <w:t>14. État d’avancement</w:t>
       </w:r>
-      <w:bookmarkEnd w:id="33"/>
+      <w:bookmarkEnd w:id="35"/>
     </w:p>
     <w:tbl>
       <w:tblPr>
@@ -13982,7 +14514,7 @@
                 <w:sz w:val="19"/>
                 <w:szCs w:val="19"/>
               </w:rPr>
-              <w:t>Écrans pro à construire (avancement visible côté client)</w:t>
+              <w:t>Opérationnel (équipe et client)</w:t>
             </w:r>
           </w:p>
         </w:tc>
@@ -14020,7 +14552,7 @@
                 <w:sz w:val="19"/>
                 <w:szCs w:val="19"/>
               </w:rPr>
-              <w:t>Facturation et paiements</w:t>
+              <w:t>Restitution et encaissement au comptoir, journal de caisse</w:t>
             </w:r>
           </w:p>
         </w:tc>
@@ -14080,7 +14612,7 @@
                 <w:sz w:val="19"/>
                 <w:szCs w:val="19"/>
               </w:rPr>
-              <w:t>Client : opérationnel. Pro : écrans à construire</w:t>
+              <w:t>Opérationnel</w:t>
             </w:r>
           </w:p>
         </w:tc>
@@ -14117,7 +14649,7 @@
                 <w:sz w:val="19"/>
                 <w:szCs w:val="19"/>
               </w:rPr>
-              <w:t>Galerie, avis, chiffres clés</w:t>
+              <w:t>Facturation : liste, devis, annulations</w:t>
             </w:r>
           </w:p>
         </w:tc>
@@ -14175,7 +14707,7 @@
                 <w:sz w:val="19"/>
                 <w:szCs w:val="19"/>
               </w:rPr>
-              <w:t>Affichage public opérationnel. Gestion : écrans pro à construire</w:t>
+              <w:t>Client : opérationnel. Pro : écran à construire</w:t>
             </w:r>
           </w:p>
         </w:tc>
@@ -14213,7 +14745,7 @@
                 <w:sz w:val="19"/>
                 <w:szCs w:val="19"/>
               </w:rPr>
-              <w:t>Statistiques et exports</w:t>
+              <w:t>Galerie, avis, chiffres clés</w:t>
             </w:r>
           </w:p>
         </w:tc>
@@ -14273,7 +14805,7 @@
                 <w:sz w:val="19"/>
                 <w:szCs w:val="19"/>
               </w:rPr>
-              <w:t>Écrans pro à construire</w:t>
+              <w:t>Affichage public opérationnel. Gestion : écrans pro à construire</w:t>
             </w:r>
           </w:p>
         </w:tc>
@@ -14310,6 +14842,102 @@
                 <w:sz w:val="19"/>
                 <w:szCs w:val="19"/>
               </w:rPr>
+              <w:t>Statistiques et exports</w:t>
+            </w:r>
+          </w:p>
+        </w:tc>
+        <w:tc>
+          <w:tcPr>
+            <w:tcW w:w="1805" w:type="dxa"/>
+            <w:tcBorders>
+              <w:top w:val="single" w:sz="4" w:space="0" w:color="D9D9D9"/>
+              <w:left w:val="single" w:sz="4" w:space="0" w:color="D9D9D9"/>
+              <w:bottom w:val="single" w:sz="4" w:space="0" w:color="D9D9D9"/>
+              <w:right w:val="single" w:sz="4" w:space="0" w:color="D9D9D9"/>
+            </w:tcBorders>
+            <w:tcMar>
+              <w:top w:w="70" w:type="dxa"/>
+              <w:left w:w="110" w:type="dxa"/>
+              <w:bottom w:w="70" w:type="dxa"/>
+              <w:right w:w="110" w:type="dxa"/>
+            </w:tcMar>
+          </w:tcPr>
+          <w:p>
+            <w:pPr>
+              <w:spacing w:line="252" w:lineRule="auto"/>
+            </w:pPr>
+            <w:r>
+              <w:rPr>
+                <w:sz w:val="19"/>
+                <w:szCs w:val="19"/>
+              </w:rPr>
+              <w:t>Opérationnel</w:t>
+            </w:r>
+          </w:p>
+        </w:tc>
+        <w:tc>
+          <w:tcPr>
+            <w:tcW w:w="3070" w:type="dxa"/>
+            <w:tcBorders>
+              <w:top w:val="single" w:sz="4" w:space="0" w:color="D9D9D9"/>
+              <w:left w:val="single" w:sz="4" w:space="0" w:color="D9D9D9"/>
+              <w:bottom w:val="single" w:sz="4" w:space="0" w:color="D9D9D9"/>
+              <w:right w:val="single" w:sz="4" w:space="0" w:color="D9D9D9"/>
+            </w:tcBorders>
+            <w:tcMar>
+              <w:top w:w="70" w:type="dxa"/>
+              <w:left w:w="110" w:type="dxa"/>
+              <w:bottom w:w="70" w:type="dxa"/>
+              <w:right w:w="110" w:type="dxa"/>
+            </w:tcMar>
+          </w:tcPr>
+          <w:p>
+            <w:pPr>
+              <w:spacing w:line="252" w:lineRule="auto"/>
+            </w:pPr>
+            <w:r>
+              <w:rPr>
+                <w:sz w:val="19"/>
+                <w:szCs w:val="19"/>
+              </w:rPr>
+              <w:t>Écrans pro à construire</w:t>
+            </w:r>
+          </w:p>
+        </w:tc>
+      </w:tr>
+      <w:tr>
+        <w:tblPrEx>
+          <w:tblCellMar>
+            <w:top w:w="0" w:type="dxa"/>
+            <w:bottom w:w="0" w:type="dxa"/>
+          </w:tblCellMar>
+        </w:tblPrEx>
+        <w:tc>
+          <w:tcPr>
+            <w:tcW w:w="4151" w:type="dxa"/>
+            <w:tcBorders>
+              <w:top w:val="single" w:sz="4" w:space="0" w:color="D9D9D9"/>
+              <w:left w:val="single" w:sz="4" w:space="0" w:color="D9D9D9"/>
+              <w:bottom w:val="single" w:sz="4" w:space="0" w:color="D9D9D9"/>
+              <w:right w:val="single" w:sz="4" w:space="0" w:color="D9D9D9"/>
+            </w:tcBorders>
+            <w:shd w:val="clear" w:color="auto" w:fill="FAF7F2"/>
+            <w:tcMar>
+              <w:top w:w="70" w:type="dxa"/>
+              <w:left w:w="110" w:type="dxa"/>
+              <w:bottom w:w="70" w:type="dxa"/>
+              <w:right w:w="110" w:type="dxa"/>
+            </w:tcMar>
+          </w:tcPr>
+          <w:p>
+            <w:pPr>
+              <w:spacing w:line="252" w:lineRule="auto"/>
+            </w:pPr>
+            <w:r>
+              <w:rPr>
+                <w:sz w:val="19"/>
+                <w:szCs w:val="19"/>
+              </w:rPr>
               <w:t>Paiement en ligne (API Wave / Orange Money), WhatsApp / SMS, application mobile</w:t>
             </w:r>
           </w:p>
@@ -14323,6 +14951,7 @@
               <w:bottom w:val="single" w:sz="4" w:space="0" w:color="D9D9D9"/>
               <w:right w:val="single" w:sz="4" w:space="0" w:color="D9D9D9"/>
             </w:tcBorders>
+            <w:shd w:val="clear" w:color="auto" w:fill="FAF7F2"/>
             <w:tcMar>
               <w:top w:w="70" w:type="dxa"/>
               <w:left w:w="110" w:type="dxa"/>
@@ -14352,6 +14981,7 @@
               <w:bottom w:val="single" w:sz="4" w:space="0" w:color="D9D9D9"/>
               <w:right w:val="single" w:sz="4" w:space="0" w:color="D9D9D9"/>
             </w:tcBorders>
+            <w:shd w:val="clear" w:color="auto" w:fill="FAF7F2"/>
             <w:tcMar>
               <w:top w:w="70" w:type="dxa"/>
               <w:left w:w="110" w:type="dxa"/>
@@ -14391,7 +15021,7 @@
           <w:b/>
           <w:bCs/>
         </w:rPr>
-        <w:t>46 tests automatiques</w:t>
+        <w:t>50 tests automatiques</w:t>
       </w:r>
       <w:r>
         <w:t xml:space="preserve"> côté serveur (réservation, disponibilités, parcours, droits par rôle, cloisonnement des données, photos, factures, paiements, statistiques, notifications, mot de passe oublié).</w:t>
@@ -14402,12 +15032,12 @@
         <w:pStyle w:val="Titre1"/>
         <w:pageBreakBefore/>
       </w:pPr>
-      <w:bookmarkStart w:id="34" w:name="_Toc241860594"/>
+      <w:bookmarkStart w:id="36" w:name="_Toc241882524"/>
       <w:r>
         <w:lastRenderedPageBreak/>
         <w:t>Annexe — Repères techniques</w:t>
       </w:r>
-      <w:bookmarkEnd w:id="34"/>
+      <w:bookmarkEnd w:id="36"/>
     </w:p>
     <w:tbl>
       <w:tblPr>
@@ -14985,11 +15615,11 @@
       <w:pPr>
         <w:pStyle w:val="Titre2"/>
       </w:pPr>
-      <w:bookmarkStart w:id="35" w:name="_Toc241860595"/>
+      <w:bookmarkStart w:id="37" w:name="_Toc241882525"/>
       <w:r>
         <w:t>Mode démonstration</w:t>
       </w:r>
-      <w:bookmarkEnd w:id="35"/>
+      <w:bookmarkEnd w:id="37"/>
     </w:p>
     <w:p>
       <w:pPr>
@@ -15179,68 +15809,64 @@
 <file path=word/numbering.xml><?xml version="1.0" encoding="utf-8"?>
 <w:numbering xmlns:wpc="http://schemas.microsoft.com/office/word/2010/wordprocessingCanvas" xmlns:cx="http://schemas.microsoft.com/office/drawing/2014/chartex" xmlns:cx1="http://schemas.microsoft.com/office/drawing/2015/9/8/chartex" xmlns:cx2="http://schemas.microsoft.com/office/drawing/2015/10/21/chartex" xmlns:cx3="http://schemas.microsoft.com/office/drawing/2016/5/9/chartex" xmlns:cx4="http://schemas.microsoft.com/office/drawing/2016/5/10/chartex" xmlns:cx5="http://schemas.microsoft.com/office/drawing/2016/5/11/chartex" xmlns:cx6="http://schemas.microsoft.com/office/drawing/2016/5/12/chartex" xmlns:cx7="http://schemas.microsoft.com/office/drawing/2016/5/13/chartex" xmlns:cx8="http://schemas.microsoft.com/office/drawing/2016/5/14/chartex" xmlns:mc="http://schemas.openxmlformats.org/markup-compatibility/2006" xmlns:aink="http://schemas.microsoft.com/office/drawing/2016/ink" xmlns:am3d="http://schemas.microsoft.com/office/drawing/2017/model3d" xmlns:o="urn:schemas-microsoft-com:office:office" xmlns:oel="http://schemas.microsoft.com/office/2019/extlst" xmlns:r="http://schemas.openxmlformats.org/officeDocument/2006/relationships" xmlns:m="http://schemas.openxmlformats.org/officeDocument/2006/math" xmlns:v="urn:schemas-microsoft-com:vml" xmlns:wp14="http://schemas.microsoft.com/office/word/2010/wordprocessingDrawing" xmlns:wp="http://schemas.openxmlformats.org/drawingml/2006/wordprocessingDrawing" xmlns:w10="urn:schemas-microsoft-com:office:word" xmlns:w="http://schemas.openxmlformats.org/wordprocessingml/2006/main" xmlns:w14="http://schemas.microsoft.com/office/word/2010/wordml" xmlns:w15="http://schemas.microsoft.com/office/word/2012/wordml" xmlns:w16cex="http://schemas.microsoft.com/office/word/2018/wordml/cex" xmlns:w16cid="http://schemas.microsoft.com/office/word/2016/wordml/cid" xmlns:w16="http://schemas.microsoft.com/office/word/2018/wordml" xmlns:w16du="http://schemas.microsoft.com/office/word/2023/wordml/word16du" xmlns:w16sdtdh="http://schemas.microsoft.com/office/word/2020/wordml/sdtdatahash" xmlns:w16sdtfl="http://schemas.microsoft.com/office/word/2024/wordml/sdtformatlock" xmlns:w16se="http://schemas.microsoft.com/office/word/2015/wordml/symex" xmlns:wpg="http://schemas.microsoft.com/office/word/2010/wordprocessingGroup" xmlns:wpi="http://schemas.microsoft.com/office/word/2010/wordprocessingInk" xmlns:wne="http://schemas.microsoft.com/office/word/2006/wordml" xmlns:wps="http://schemas.microsoft.com/office/word/2010/wordprocessingShape" mc:Ignorable="w14 w15 w16se w16cid w16 w16cex w16sdtdh w16sdtfl w16du wp14">
   <w:abstractNum w:abstractNumId="0" w15:restartNumberingAfterBreak="0">
-    <w:nsid w:val="0A9A5DF8"/>
+    <w:nsid w:val="34CB7D9B"/>
     <w:multiLevelType w:val="hybridMultilevel"/>
-    <w:tmpl w:val="975E65AC"/>
-    <w:lvl w:ilvl="0" w:tplc="D43241B6">
+    <w:tmpl w:val="CDF0F27C"/>
+    <w:lvl w:ilvl="0" w:tplc="24845CDE">
       <w:start w:val="1"/>
-      <w:numFmt w:val="bullet"/>
-      <w:lvlText w:val="•"/>
+      <w:numFmt w:val="decimal"/>
+      <w:lvlText w:val="%1."/>
       <w:lvlJc w:val="left"/>
       <w:pPr>
-        <w:ind w:left="360" w:hanging="240"/>
+        <w:ind w:left="360" w:hanging="300"/>
       </w:pPr>
     </w:lvl>
-    <w:lvl w:ilvl="1" w:tplc="6802903C" w:tentative="1">
-      <w:start w:val="1"/>
-      <w:numFmt w:val="bullet"/>
-      <w:lvlText w:val="–"/>
-      <w:lvlJc w:val="left"/>
-      <w:pPr>
-        <w:ind w:left="720" w:hanging="240"/>
-      </w:pPr>
-    </w:lvl>
-    <w:lvl w:ilvl="2" w:tplc="F8045B44">
+    <w:lvl w:ilvl="1" w:tplc="32DEDFC4">
       <w:numFmt w:val="decimal"/>
       <w:lvlText w:val=""/>
       <w:lvlJc w:val="left"/>
     </w:lvl>
-    <w:lvl w:ilvl="3" w:tplc="95C07736">
+    <w:lvl w:ilvl="2" w:tplc="0E483FB4">
       <w:numFmt w:val="decimal"/>
       <w:lvlText w:val=""/>
       <w:lvlJc w:val="left"/>
     </w:lvl>
-    <w:lvl w:ilvl="4" w:tplc="ADF2A2B0">
+    <w:lvl w:ilvl="3" w:tplc="4FE2E042">
       <w:numFmt w:val="decimal"/>
       <w:lvlText w:val=""/>
       <w:lvlJc w:val="left"/>
     </w:lvl>
-    <w:lvl w:ilvl="5" w:tplc="A5F4308C">
+    <w:lvl w:ilvl="4" w:tplc="DE08765E">
       <w:numFmt w:val="decimal"/>
       <w:lvlText w:val=""/>
       <w:lvlJc w:val="left"/>
     </w:lvl>
-    <w:lvl w:ilvl="6" w:tplc="DE727AC4">
+    <w:lvl w:ilvl="5" w:tplc="65FAC598">
       <w:numFmt w:val="decimal"/>
       <w:lvlText w:val=""/>
       <w:lvlJc w:val="left"/>
     </w:lvl>
-    <w:lvl w:ilvl="7" w:tplc="1C681ED2">
+    <w:lvl w:ilvl="6" w:tplc="04F68FFE">
       <w:numFmt w:val="decimal"/>
       <w:lvlText w:val=""/>
       <w:lvlJc w:val="left"/>
     </w:lvl>
-    <w:lvl w:ilvl="8" w:tplc="C60084DA">
+    <w:lvl w:ilvl="7" w:tplc="6F8CE0A6">
+      <w:numFmt w:val="decimal"/>
+      <w:lvlText w:val=""/>
+      <w:lvlJc w:val="left"/>
+    </w:lvl>
+    <w:lvl w:ilvl="8" w:tplc="EE8CEFF8">
       <w:numFmt w:val="decimal"/>
       <w:lvlText w:val=""/>
       <w:lvlJc w:val="left"/>
     </w:lvl>
   </w:abstractNum>
   <w:abstractNum w:abstractNumId="1" w15:restartNumberingAfterBreak="0">
-    <w:nsid w:val="26B77DA4"/>
+    <w:nsid w:val="4E9B59A4"/>
     <w:multiLevelType w:val="hybridMultilevel"/>
-    <w:tmpl w:val="7E166FC0"/>
-    <w:lvl w:ilvl="0" w:tplc="B4A6C106" w:tentative="1">
+    <w:tmpl w:val="038EB794"/>
+    <w:lvl w:ilvl="0" w:tplc="3CF85860" w:tentative="1">
       <w:start w:val="1"/>
       <w:numFmt w:val="bullet"/>
       <w:lvlText w:val="●"/>
@@ -15249,7 +15875,7 @@
         <w:ind w:left="720" w:hanging="360"/>
       </w:pPr>
     </w:lvl>
-    <w:lvl w:ilvl="1" w:tplc="BA2EF508" w:tentative="1">
+    <w:lvl w:ilvl="1" w:tplc="BEA40F84" w:tentative="1">
       <w:start w:val="1"/>
       <w:numFmt w:val="bullet"/>
       <w:lvlText w:val="○"/>
@@ -15258,7 +15884,7 @@
         <w:ind w:left="1440" w:hanging="360"/>
       </w:pPr>
     </w:lvl>
-    <w:lvl w:ilvl="2" w:tplc="FD0674E4" w:tentative="1">
+    <w:lvl w:ilvl="2" w:tplc="796EE5B6" w:tentative="1">
       <w:start w:val="1"/>
       <w:numFmt w:val="bullet"/>
       <w:lvlText w:val="■"/>
@@ -15267,7 +15893,7 @@
         <w:ind w:left="2160" w:hanging="360"/>
       </w:pPr>
     </w:lvl>
-    <w:lvl w:ilvl="3" w:tplc="E0C68D0E" w:tentative="1">
+    <w:lvl w:ilvl="3" w:tplc="FEA6BE2E" w:tentative="1">
       <w:start w:val="1"/>
       <w:numFmt w:val="bullet"/>
       <w:lvlText w:val="●"/>
@@ -15276,7 +15902,7 @@
         <w:ind w:left="2880" w:hanging="360"/>
       </w:pPr>
     </w:lvl>
-    <w:lvl w:ilvl="4" w:tplc="B81207DA" w:tentative="1">
+    <w:lvl w:ilvl="4" w:tplc="7FE01BD2" w:tentative="1">
       <w:start w:val="1"/>
       <w:numFmt w:val="bullet"/>
       <w:lvlText w:val="○"/>
@@ -15285,7 +15911,7 @@
         <w:ind w:left="3600" w:hanging="360"/>
       </w:pPr>
     </w:lvl>
-    <w:lvl w:ilvl="5" w:tplc="89E0E2C8" w:tentative="1">
+    <w:lvl w:ilvl="5" w:tplc="D124F8BE" w:tentative="1">
       <w:start w:val="1"/>
       <w:numFmt w:val="bullet"/>
       <w:lvlText w:val="■"/>
@@ -15294,7 +15920,7 @@
         <w:ind w:left="4320" w:hanging="360"/>
       </w:pPr>
     </w:lvl>
-    <w:lvl w:ilvl="6" w:tplc="D3121A32" w:tentative="1">
+    <w:lvl w:ilvl="6" w:tplc="468A7724" w:tentative="1">
       <w:start w:val="1"/>
       <w:numFmt w:val="bullet"/>
       <w:lvlText w:val="●"/>
@@ -15303,7 +15929,7 @@
         <w:ind w:left="5040" w:hanging="360"/>
       </w:pPr>
     </w:lvl>
-    <w:lvl w:ilvl="7" w:tplc="71126148" w:tentative="1">
+    <w:lvl w:ilvl="7" w:tplc="FE78F2CA" w:tentative="1">
       <w:start w:val="1"/>
       <w:numFmt w:val="bullet"/>
       <w:lvlText w:val="●"/>
@@ -15312,7 +15938,7 @@
         <w:ind w:left="5760" w:hanging="360"/>
       </w:pPr>
     </w:lvl>
-    <w:lvl w:ilvl="8" w:tplc="5CCEC530" w:tentative="1">
+    <w:lvl w:ilvl="8" w:tplc="B308D686" w:tentative="1">
       <w:start w:val="1"/>
       <w:numFmt w:val="bullet"/>
       <w:lvlText w:val="●"/>
@@ -15323,10 +15949,10 @@
     </w:lvl>
   </w:abstractNum>
   <w:abstractNum w:abstractNumId="2" w15:restartNumberingAfterBreak="0">
-    <w:nsid w:val="589C3404"/>
+    <w:nsid w:val="51FF62BA"/>
     <w:multiLevelType w:val="hybridMultilevel"/>
-    <w:tmpl w:val="7CAC426A"/>
-    <w:lvl w:ilvl="0" w:tplc="4630F316">
+    <w:tmpl w:val="7B281C32"/>
+    <w:lvl w:ilvl="0" w:tplc="25A801D6">
       <w:start w:val="1"/>
       <w:numFmt w:val="decimal"/>
       <w:lvlText w:val="%1."/>
@@ -15335,52 +15961,52 @@
         <w:ind w:left="360" w:hanging="300"/>
       </w:pPr>
     </w:lvl>
-    <w:lvl w:ilvl="1" w:tplc="2CFA0144">
+    <w:lvl w:ilvl="1" w:tplc="D8302372">
       <w:numFmt w:val="decimal"/>
       <w:lvlText w:val=""/>
       <w:lvlJc w:val="left"/>
     </w:lvl>
-    <w:lvl w:ilvl="2" w:tplc="08ECA26A">
+    <w:lvl w:ilvl="2" w:tplc="4CDAC128">
       <w:numFmt w:val="decimal"/>
       <w:lvlText w:val=""/>
       <w:lvlJc w:val="left"/>
     </w:lvl>
-    <w:lvl w:ilvl="3" w:tplc="64DE11B0">
+    <w:lvl w:ilvl="3" w:tplc="D72C6E72">
       <w:numFmt w:val="decimal"/>
       <w:lvlText w:val=""/>
       <w:lvlJc w:val="left"/>
     </w:lvl>
-    <w:lvl w:ilvl="4" w:tplc="0AA6D8EE">
+    <w:lvl w:ilvl="4" w:tplc="AED24744">
       <w:numFmt w:val="decimal"/>
       <w:lvlText w:val=""/>
       <w:lvlJc w:val="left"/>
     </w:lvl>
-    <w:lvl w:ilvl="5" w:tplc="E158A6D0">
+    <w:lvl w:ilvl="5" w:tplc="7D9A198A">
       <w:numFmt w:val="decimal"/>
       <w:lvlText w:val=""/>
       <w:lvlJc w:val="left"/>
     </w:lvl>
-    <w:lvl w:ilvl="6" w:tplc="00201C20">
+    <w:lvl w:ilvl="6" w:tplc="1BCE2742">
       <w:numFmt w:val="decimal"/>
       <w:lvlText w:val=""/>
       <w:lvlJc w:val="left"/>
     </w:lvl>
-    <w:lvl w:ilvl="7" w:tplc="53902AD6">
+    <w:lvl w:ilvl="7" w:tplc="9718F5DA">
       <w:numFmt w:val="decimal"/>
       <w:lvlText w:val=""/>
       <w:lvlJc w:val="left"/>
     </w:lvl>
-    <w:lvl w:ilvl="8" w:tplc="BA1A11B0">
+    <w:lvl w:ilvl="8" w:tplc="612684A0">
       <w:numFmt w:val="decimal"/>
       <w:lvlText w:val=""/>
       <w:lvlJc w:val="left"/>
     </w:lvl>
   </w:abstractNum>
   <w:abstractNum w:abstractNumId="3" w15:restartNumberingAfterBreak="0">
-    <w:nsid w:val="66E951DB"/>
+    <w:nsid w:val="5D2D6488"/>
     <w:multiLevelType w:val="hybridMultilevel"/>
-    <w:tmpl w:val="3010223C"/>
-    <w:lvl w:ilvl="0" w:tplc="BA6EB2B6">
+    <w:tmpl w:val="E104DEA4"/>
+    <w:lvl w:ilvl="0" w:tplc="EA64ACDC">
       <w:start w:val="1"/>
       <w:numFmt w:val="decimal"/>
       <w:lvlText w:val="%1."/>
@@ -15389,66 +16015,130 @@
         <w:ind w:left="360" w:hanging="300"/>
       </w:pPr>
     </w:lvl>
-    <w:lvl w:ilvl="1" w:tplc="9F1214F0">
+    <w:lvl w:ilvl="1" w:tplc="F28EDBCE">
       <w:numFmt w:val="decimal"/>
       <w:lvlText w:val=""/>
       <w:lvlJc w:val="left"/>
     </w:lvl>
-    <w:lvl w:ilvl="2" w:tplc="8072096C">
+    <w:lvl w:ilvl="2" w:tplc="F91AE534">
       <w:numFmt w:val="decimal"/>
       <w:lvlText w:val=""/>
       <w:lvlJc w:val="left"/>
     </w:lvl>
-    <w:lvl w:ilvl="3" w:tplc="F078D4A0">
+    <w:lvl w:ilvl="3" w:tplc="AF527EF2">
       <w:numFmt w:val="decimal"/>
       <w:lvlText w:val=""/>
       <w:lvlJc w:val="left"/>
     </w:lvl>
-    <w:lvl w:ilvl="4" w:tplc="B238C3EC">
+    <w:lvl w:ilvl="4" w:tplc="7ABE2B5C">
       <w:numFmt w:val="decimal"/>
       <w:lvlText w:val=""/>
       <w:lvlJc w:val="left"/>
     </w:lvl>
-    <w:lvl w:ilvl="5" w:tplc="C0A65C08">
+    <w:lvl w:ilvl="5" w:tplc="C36A5382">
       <w:numFmt w:val="decimal"/>
       <w:lvlText w:val=""/>
       <w:lvlJc w:val="left"/>
     </w:lvl>
-    <w:lvl w:ilvl="6" w:tplc="FD3A291A">
+    <w:lvl w:ilvl="6" w:tplc="2C0052F8">
       <w:numFmt w:val="decimal"/>
       <w:lvlText w:val=""/>
       <w:lvlJc w:val="left"/>
     </w:lvl>
-    <w:lvl w:ilvl="7" w:tplc="0F00EECC">
+    <w:lvl w:ilvl="7" w:tplc="7DB4F63A">
       <w:numFmt w:val="decimal"/>
       <w:lvlText w:val=""/>
       <w:lvlJc w:val="left"/>
     </w:lvl>
-    <w:lvl w:ilvl="8" w:tplc="ADB81E9E">
+    <w:lvl w:ilvl="8" w:tplc="C8C02348">
       <w:numFmt w:val="decimal"/>
       <w:lvlText w:val=""/>
       <w:lvlJc w:val="left"/>
     </w:lvl>
   </w:abstractNum>
-  <w:num w:numId="1" w16cid:durableId="2057654328">
+  <w:abstractNum w:abstractNumId="4" w15:restartNumberingAfterBreak="0">
+    <w:nsid w:val="606B431C"/>
+    <w:multiLevelType w:val="hybridMultilevel"/>
+    <w:tmpl w:val="B31836C0"/>
+    <w:lvl w:ilvl="0" w:tplc="ACAA8CF4">
+      <w:start w:val="1"/>
+      <w:numFmt w:val="bullet"/>
+      <w:lvlText w:val="•"/>
+      <w:lvlJc w:val="left"/>
+      <w:pPr>
+        <w:ind w:left="360" w:hanging="240"/>
+      </w:pPr>
+    </w:lvl>
+    <w:lvl w:ilvl="1" w:tplc="0AD62B28" w:tentative="1">
+      <w:start w:val="1"/>
+      <w:numFmt w:val="bullet"/>
+      <w:lvlText w:val="–"/>
+      <w:lvlJc w:val="left"/>
+      <w:pPr>
+        <w:ind w:left="720" w:hanging="240"/>
+      </w:pPr>
+    </w:lvl>
+    <w:lvl w:ilvl="2" w:tplc="1560785A">
+      <w:numFmt w:val="decimal"/>
+      <w:lvlText w:val=""/>
+      <w:lvlJc w:val="left"/>
+    </w:lvl>
+    <w:lvl w:ilvl="3" w:tplc="779AD264">
+      <w:numFmt w:val="decimal"/>
+      <w:lvlText w:val=""/>
+      <w:lvlJc w:val="left"/>
+    </w:lvl>
+    <w:lvl w:ilvl="4" w:tplc="FC226B2A">
+      <w:numFmt w:val="decimal"/>
+      <w:lvlText w:val=""/>
+      <w:lvlJc w:val="left"/>
+    </w:lvl>
+    <w:lvl w:ilvl="5" w:tplc="C8EC80DA">
+      <w:numFmt w:val="decimal"/>
+      <w:lvlText w:val=""/>
+      <w:lvlJc w:val="left"/>
+    </w:lvl>
+    <w:lvl w:ilvl="6" w:tplc="B4D4DEEE">
+      <w:numFmt w:val="decimal"/>
+      <w:lvlText w:val=""/>
+      <w:lvlJc w:val="left"/>
+    </w:lvl>
+    <w:lvl w:ilvl="7" w:tplc="CB46B83E">
+      <w:numFmt w:val="decimal"/>
+      <w:lvlText w:val=""/>
+      <w:lvlJc w:val="left"/>
+    </w:lvl>
+    <w:lvl w:ilvl="8" w:tplc="B21442A8">
+      <w:numFmt w:val="decimal"/>
+      <w:lvlText w:val=""/>
+      <w:lvlJc w:val="left"/>
+    </w:lvl>
+  </w:abstractNum>
+  <w:num w:numId="1" w16cid:durableId="237525010">
     <w:abstractNumId w:val="1"/>
     <w:lvlOverride w:ilvl="0">
       <w:startOverride w:val="1"/>
     </w:lvlOverride>
   </w:num>
-  <w:num w:numId="2" w16cid:durableId="1825387315">
+  <w:num w:numId="2" w16cid:durableId="164057759">
+    <w:abstractNumId w:val="4"/>
+    <w:lvlOverride w:ilvl="0">
+      <w:startOverride w:val="1"/>
+    </w:lvlOverride>
+  </w:num>
+  <w:num w:numId="3" w16cid:durableId="1562786339">
     <w:abstractNumId w:val="0"/>
     <w:lvlOverride w:ilvl="0">
       <w:startOverride w:val="1"/>
     </w:lvlOverride>
   </w:num>
-  <w:num w:numId="3" w16cid:durableId="1627156871">
+  <w:num w:numId="4" w16cid:durableId="493954630">
     <w:abstractNumId w:val="2"/>
     <w:lvlOverride w:ilvl="0">
       <w:startOverride w:val="1"/>
     </w:lvlOverride>
   </w:num>
-  <w:num w:numId="4" w16cid:durableId="1067991923">
+  <w:num w:numId="5" w16cid:durableId="1816604148">
     <w:abstractNumId w:val="3"/>
     <w:lvlOverride w:ilvl="0">
       <w:startOverride w:val="1"/>
@@ -16095,7 +16785,7 @@
     <w:autoRedefine/>
     <w:uiPriority w:val="39"/>
     <w:unhideWhenUsed/>
-    <w:rsid w:val="00BB5387"/>
+    <w:rsid w:val="009215DD"/>
     <w:pPr>
       <w:spacing w:after="100"/>
     </w:pPr>
@@ -16107,7 +16797,7 @@
     <w:autoRedefine/>
     <w:uiPriority w:val="39"/>
     <w:unhideWhenUsed/>
-    <w:rsid w:val="00BB5387"/>
+    <w:rsid w:val="009215DD"/>
     <w:pPr>
       <w:spacing w:after="100"/>
       <w:ind w:left="210"/>

</xml_diff>

<commit_message>
Écran Factures du manager
- Liste des factures : recherche, filtres par statut, reste à encaisser,
  prestations terminées encore à facturer
- Détail : lignes, totaux, paiements (auteur, référence), encaissement,
  remboursement, annulation (après remboursement), PDF
- Établir une facture sur devis : lignes libres, remise, mentions ;
  raccourci depuis la fiche « Gérer » d'une prestation sans facture
- Statuts de facture au féminin ; suppression de l'ancien calcul
  d'avancement ; README et guide de fonctionnement à jour

Co-Authored-By: Claude Opus 5.5 <noreply@anthropic.com>
</commit_message>
<xml_diff>
--- a/docs/guide-fonctionnement.docx
+++ b/docs/guide-fonctionnement.docx
@@ -109,7 +109,7 @@
     <w:sdt>
       <w:sdtPr>
         <w:alias w:val="Sommaire"/>
-        <w:id w:val="-1404745692"/>
+        <w:id w:val="-164858589"/>
       </w:sdtPr>
       <w:sdtEndPr/>
       <w:sdtContent>
@@ -138,7 +138,7 @@
           <w:r>
             <w:fldChar w:fldCharType="separate"/>
           </w:r>
-          <w:hyperlink w:anchor="_Toc241882488" w:history="1">
+          <w:hyperlink w:anchor="_Toc242017355" w:history="1">
             <w:r>
               <w:rPr>
                 <w:rStyle w:val="Lienhypertexte"/>
@@ -162,7 +162,7 @@
               <w:rPr>
                 <w:noProof/>
               </w:rPr>
-              <w:instrText xml:space="preserve"> PAGEREF _Toc241882488 \h </w:instrText>
+              <w:instrText xml:space="preserve"> PAGEREF _Toc242017355 \h </w:instrText>
             </w:r>
             <w:r>
               <w:rPr>
@@ -205,7 +205,7 @@
               <w14:ligatures w14:val="standardContextual"/>
             </w:rPr>
           </w:pPr>
-          <w:hyperlink w:anchor="_Toc241882489" w:history="1">
+          <w:hyperlink w:anchor="_Toc242017356" w:history="1">
             <w:r>
               <w:rPr>
                 <w:rStyle w:val="Lienhypertexte"/>
@@ -229,7 +229,7 @@
               <w:rPr>
                 <w:noProof/>
               </w:rPr>
-              <w:instrText xml:space="preserve"> PAGEREF _Toc241882489 \h </w:instrText>
+              <w:instrText xml:space="preserve"> PAGEREF _Toc242017356 \h </w:instrText>
             </w:r>
             <w:r>
               <w:rPr>
@@ -272,7 +272,7 @@
               <w14:ligatures w14:val="standardContextual"/>
             </w:rPr>
           </w:pPr>
-          <w:hyperlink w:anchor="_Toc241882490" w:history="1">
+          <w:hyperlink w:anchor="_Toc242017357" w:history="1">
             <w:r>
               <w:rPr>
                 <w:rStyle w:val="Lienhypertexte"/>
@@ -296,7 +296,7 @@
               <w:rPr>
                 <w:noProof/>
               </w:rPr>
-              <w:instrText xml:space="preserve"> PAGEREF _Toc241882490 \h </w:instrText>
+              <w:instrText xml:space="preserve"> PAGEREF _Toc242017357 \h </w:instrText>
             </w:r>
             <w:r>
               <w:rPr>
@@ -339,7 +339,7 @@
               <w14:ligatures w14:val="standardContextual"/>
             </w:rPr>
           </w:pPr>
-          <w:hyperlink w:anchor="_Toc241882491" w:history="1">
+          <w:hyperlink w:anchor="_Toc242017358" w:history="1">
             <w:r>
               <w:rPr>
                 <w:rStyle w:val="Lienhypertexte"/>
@@ -363,7 +363,7 @@
               <w:rPr>
                 <w:noProof/>
               </w:rPr>
-              <w:instrText xml:space="preserve"> PAGEREF _Toc241882491 \h </w:instrText>
+              <w:instrText xml:space="preserve"> PAGEREF _Toc242017358 \h </w:instrText>
             </w:r>
             <w:r>
               <w:rPr>
@@ -406,7 +406,7 @@
               <w14:ligatures w14:val="standardContextual"/>
             </w:rPr>
           </w:pPr>
-          <w:hyperlink w:anchor="_Toc241882492" w:history="1">
+          <w:hyperlink w:anchor="_Toc242017359" w:history="1">
             <w:r>
               <w:rPr>
                 <w:rStyle w:val="Lienhypertexte"/>
@@ -430,7 +430,7 @@
               <w:rPr>
                 <w:noProof/>
               </w:rPr>
-              <w:instrText xml:space="preserve"> PAGEREF _Toc241882492 \h </w:instrText>
+              <w:instrText xml:space="preserve"> PAGEREF _Toc242017359 \h </w:instrText>
             </w:r>
             <w:r>
               <w:rPr>
@@ -473,7 +473,7 @@
               <w14:ligatures w14:val="standardContextual"/>
             </w:rPr>
           </w:pPr>
-          <w:hyperlink w:anchor="_Toc241882493" w:history="1">
+          <w:hyperlink w:anchor="_Toc242017360" w:history="1">
             <w:r>
               <w:rPr>
                 <w:rStyle w:val="Lienhypertexte"/>
@@ -497,7 +497,7 @@
               <w:rPr>
                 <w:noProof/>
               </w:rPr>
-              <w:instrText xml:space="preserve"> PAGEREF _Toc241882493 \h </w:instrText>
+              <w:instrText xml:space="preserve"> PAGEREF _Toc242017360 \h </w:instrText>
             </w:r>
             <w:r>
               <w:rPr>
@@ -540,7 +540,7 @@
               <w14:ligatures w14:val="standardContextual"/>
             </w:rPr>
           </w:pPr>
-          <w:hyperlink w:anchor="_Toc241882494" w:history="1">
+          <w:hyperlink w:anchor="_Toc242017361" w:history="1">
             <w:r>
               <w:rPr>
                 <w:rStyle w:val="Lienhypertexte"/>
@@ -564,7 +564,7 @@
               <w:rPr>
                 <w:noProof/>
               </w:rPr>
-              <w:instrText xml:space="preserve"> PAGEREF _Toc241882494 \h </w:instrText>
+              <w:instrText xml:space="preserve"> PAGEREF _Toc242017361 \h </w:instrText>
             </w:r>
             <w:r>
               <w:rPr>
@@ -607,7 +607,7 @@
               <w14:ligatures w14:val="standardContextual"/>
             </w:rPr>
           </w:pPr>
-          <w:hyperlink w:anchor="_Toc241882495" w:history="1">
+          <w:hyperlink w:anchor="_Toc242017362" w:history="1">
             <w:r>
               <w:rPr>
                 <w:rStyle w:val="Lienhypertexte"/>
@@ -631,7 +631,7 @@
               <w:rPr>
                 <w:noProof/>
               </w:rPr>
-              <w:instrText xml:space="preserve"> PAGEREF _Toc241882495 \h </w:instrText>
+              <w:instrText xml:space="preserve"> PAGEREF _Toc242017362 \h </w:instrText>
             </w:r>
             <w:r>
               <w:rPr>
@@ -674,7 +674,7 @@
               <w14:ligatures w14:val="standardContextual"/>
             </w:rPr>
           </w:pPr>
-          <w:hyperlink w:anchor="_Toc241882496" w:history="1">
+          <w:hyperlink w:anchor="_Toc242017363" w:history="1">
             <w:r>
               <w:rPr>
                 <w:rStyle w:val="Lienhypertexte"/>
@@ -698,7 +698,7 @@
               <w:rPr>
                 <w:noProof/>
               </w:rPr>
-              <w:instrText xml:space="preserve"> PAGEREF _Toc241882496 \h </w:instrText>
+              <w:instrText xml:space="preserve"> PAGEREF _Toc242017363 \h </w:instrText>
             </w:r>
             <w:r>
               <w:rPr>
@@ -741,7 +741,7 @@
               <w14:ligatures w14:val="standardContextual"/>
             </w:rPr>
           </w:pPr>
-          <w:hyperlink w:anchor="_Toc241882497" w:history="1">
+          <w:hyperlink w:anchor="_Toc242017364" w:history="1">
             <w:r>
               <w:rPr>
                 <w:rStyle w:val="Lienhypertexte"/>
@@ -765,7 +765,7 @@
               <w:rPr>
                 <w:noProof/>
               </w:rPr>
-              <w:instrText xml:space="preserve"> PAGEREF _Toc241882497 \h </w:instrText>
+              <w:instrText xml:space="preserve"> PAGEREF _Toc242017364 \h </w:instrText>
             </w:r>
             <w:r>
               <w:rPr>
@@ -808,7 +808,7 @@
               <w14:ligatures w14:val="standardContextual"/>
             </w:rPr>
           </w:pPr>
-          <w:hyperlink w:anchor="_Toc241882498" w:history="1">
+          <w:hyperlink w:anchor="_Toc242017365" w:history="1">
             <w:r>
               <w:rPr>
                 <w:rStyle w:val="Lienhypertexte"/>
@@ -832,7 +832,7 @@
               <w:rPr>
                 <w:noProof/>
               </w:rPr>
-              <w:instrText xml:space="preserve"> PAGEREF _Toc241882498 \h </w:instrText>
+              <w:instrText xml:space="preserve"> PAGEREF _Toc242017365 \h </w:instrText>
             </w:r>
             <w:r>
               <w:rPr>
@@ -875,7 +875,7 @@
               <w14:ligatures w14:val="standardContextual"/>
             </w:rPr>
           </w:pPr>
-          <w:hyperlink w:anchor="_Toc241882499" w:history="1">
+          <w:hyperlink w:anchor="_Toc242017366" w:history="1">
             <w:r>
               <w:rPr>
                 <w:rStyle w:val="Lienhypertexte"/>
@@ -899,7 +899,7 @@
               <w:rPr>
                 <w:noProof/>
               </w:rPr>
-              <w:instrText xml:space="preserve"> PAGEREF _Toc241882499 \h </w:instrText>
+              <w:instrText xml:space="preserve"> PAGEREF _Toc242017366 \h </w:instrText>
             </w:r>
             <w:r>
               <w:rPr>
@@ -942,7 +942,7 @@
               <w14:ligatures w14:val="standardContextual"/>
             </w:rPr>
           </w:pPr>
-          <w:hyperlink w:anchor="_Toc241882500" w:history="1">
+          <w:hyperlink w:anchor="_Toc242017367" w:history="1">
             <w:r>
               <w:rPr>
                 <w:rStyle w:val="Lienhypertexte"/>
@@ -966,7 +966,7 @@
               <w:rPr>
                 <w:noProof/>
               </w:rPr>
-              <w:instrText xml:space="preserve"> PAGEREF _Toc241882500 \h </w:instrText>
+              <w:instrText xml:space="preserve"> PAGEREF _Toc242017367 \h </w:instrText>
             </w:r>
             <w:r>
               <w:rPr>
@@ -1009,7 +1009,7 @@
               <w14:ligatures w14:val="standardContextual"/>
             </w:rPr>
           </w:pPr>
-          <w:hyperlink w:anchor="_Toc241882501" w:history="1">
+          <w:hyperlink w:anchor="_Toc242017368" w:history="1">
             <w:r>
               <w:rPr>
                 <w:rStyle w:val="Lienhypertexte"/>
@@ -1033,7 +1033,7 @@
               <w:rPr>
                 <w:noProof/>
               </w:rPr>
-              <w:instrText xml:space="preserve"> PAGEREF _Toc241882501 \h </w:instrText>
+              <w:instrText xml:space="preserve"> PAGEREF _Toc242017368 \h </w:instrText>
             </w:r>
             <w:r>
               <w:rPr>
@@ -1076,7 +1076,7 @@
               <w14:ligatures w14:val="standardContextual"/>
             </w:rPr>
           </w:pPr>
-          <w:hyperlink w:anchor="_Toc241882502" w:history="1">
+          <w:hyperlink w:anchor="_Toc242017369" w:history="1">
             <w:r>
               <w:rPr>
                 <w:rStyle w:val="Lienhypertexte"/>
@@ -1100,7 +1100,7 @@
               <w:rPr>
                 <w:noProof/>
               </w:rPr>
-              <w:instrText xml:space="preserve"> PAGEREF _Toc241882502 \h </w:instrText>
+              <w:instrText xml:space="preserve"> PAGEREF _Toc242017369 \h </w:instrText>
             </w:r>
             <w:r>
               <w:rPr>
@@ -1143,7 +1143,7 @@
               <w14:ligatures w14:val="standardContextual"/>
             </w:rPr>
           </w:pPr>
-          <w:hyperlink w:anchor="_Toc241882503" w:history="1">
+          <w:hyperlink w:anchor="_Toc242017370" w:history="1">
             <w:r>
               <w:rPr>
                 <w:rStyle w:val="Lienhypertexte"/>
@@ -1167,7 +1167,7 @@
               <w:rPr>
                 <w:noProof/>
               </w:rPr>
-              <w:instrText xml:space="preserve"> PAGEREF _Toc241882503 \h </w:instrText>
+              <w:instrText xml:space="preserve"> PAGEREF _Toc242017370 \h </w:instrText>
             </w:r>
             <w:r>
               <w:rPr>
@@ -1210,7 +1210,7 @@
               <w14:ligatures w14:val="standardContextual"/>
             </w:rPr>
           </w:pPr>
-          <w:hyperlink w:anchor="_Toc241882504" w:history="1">
+          <w:hyperlink w:anchor="_Toc242017371" w:history="1">
             <w:r>
               <w:rPr>
                 <w:rStyle w:val="Lienhypertexte"/>
@@ -1234,7 +1234,7 @@
               <w:rPr>
                 <w:noProof/>
               </w:rPr>
-              <w:instrText xml:space="preserve"> PAGEREF _Toc241882504 \h </w:instrText>
+              <w:instrText xml:space="preserve"> PAGEREF _Toc242017371 \h </w:instrText>
             </w:r>
             <w:r>
               <w:rPr>
@@ -1277,7 +1277,7 @@
               <w14:ligatures w14:val="standardContextual"/>
             </w:rPr>
           </w:pPr>
-          <w:hyperlink w:anchor="_Toc241882505" w:history="1">
+          <w:hyperlink w:anchor="_Toc242017372" w:history="1">
             <w:r>
               <w:rPr>
                 <w:rStyle w:val="Lienhypertexte"/>
@@ -1301,7 +1301,7 @@
               <w:rPr>
                 <w:noProof/>
               </w:rPr>
-              <w:instrText xml:space="preserve"> PAGEREF _Toc241882505 \h </w:instrText>
+              <w:instrText xml:space="preserve"> PAGEREF _Toc242017372 \h </w:instrText>
             </w:r>
             <w:r>
               <w:rPr>
@@ -1344,7 +1344,7 @@
               <w14:ligatures w14:val="standardContextual"/>
             </w:rPr>
           </w:pPr>
-          <w:hyperlink w:anchor="_Toc241882506" w:history="1">
+          <w:hyperlink w:anchor="_Toc242017373" w:history="1">
             <w:r>
               <w:rPr>
                 <w:rStyle w:val="Lienhypertexte"/>
@@ -1368,7 +1368,7 @@
               <w:rPr>
                 <w:noProof/>
               </w:rPr>
-              <w:instrText xml:space="preserve"> PAGEREF _Toc241882506 \h </w:instrText>
+              <w:instrText xml:space="preserve"> PAGEREF _Toc242017373 \h </w:instrText>
             </w:r>
             <w:r>
               <w:rPr>
@@ -1411,7 +1411,7 @@
               <w14:ligatures w14:val="standardContextual"/>
             </w:rPr>
           </w:pPr>
-          <w:hyperlink w:anchor="_Toc241882507" w:history="1">
+          <w:hyperlink w:anchor="_Toc242017374" w:history="1">
             <w:r>
               <w:rPr>
                 <w:rStyle w:val="Lienhypertexte"/>
@@ -1435,7 +1435,7 @@
               <w:rPr>
                 <w:noProof/>
               </w:rPr>
-              <w:instrText xml:space="preserve"> PAGEREF _Toc241882507 \h </w:instrText>
+              <w:instrText xml:space="preserve"> PAGEREF _Toc242017374 \h </w:instrText>
             </w:r>
             <w:r>
               <w:rPr>
@@ -1478,7 +1478,7 @@
               <w14:ligatures w14:val="standardContextual"/>
             </w:rPr>
           </w:pPr>
-          <w:hyperlink w:anchor="_Toc241882508" w:history="1">
+          <w:hyperlink w:anchor="_Toc242017375" w:history="1">
             <w:r>
               <w:rPr>
                 <w:rStyle w:val="Lienhypertexte"/>
@@ -1502,7 +1502,7 @@
               <w:rPr>
                 <w:noProof/>
               </w:rPr>
-              <w:instrText xml:space="preserve"> PAGEREF _Toc241882508 \h </w:instrText>
+              <w:instrText xml:space="preserve"> PAGEREF _Toc242017375 \h </w:instrText>
             </w:r>
             <w:r>
               <w:rPr>
@@ -1545,7 +1545,7 @@
               <w14:ligatures w14:val="standardContextual"/>
             </w:rPr>
           </w:pPr>
-          <w:hyperlink w:anchor="_Toc241882509" w:history="1">
+          <w:hyperlink w:anchor="_Toc242017376" w:history="1">
             <w:r>
               <w:rPr>
                 <w:rStyle w:val="Lienhypertexte"/>
@@ -1569,7 +1569,7 @@
               <w:rPr>
                 <w:noProof/>
               </w:rPr>
-              <w:instrText xml:space="preserve"> PAGEREF _Toc241882509 \h </w:instrText>
+              <w:instrText xml:space="preserve"> PAGEREF _Toc242017376 \h </w:instrText>
             </w:r>
             <w:r>
               <w:rPr>
@@ -1612,7 +1612,7 @@
               <w14:ligatures w14:val="standardContextual"/>
             </w:rPr>
           </w:pPr>
-          <w:hyperlink w:anchor="_Toc241882510" w:history="1">
+          <w:hyperlink w:anchor="_Toc242017377" w:history="1">
             <w:r>
               <w:rPr>
                 <w:rStyle w:val="Lienhypertexte"/>
@@ -1636,7 +1636,7 @@
               <w:rPr>
                 <w:noProof/>
               </w:rPr>
-              <w:instrText xml:space="preserve"> PAGEREF _Toc241882510 \h </w:instrText>
+              <w:instrText xml:space="preserve"> PAGEREF _Toc242017377 \h </w:instrText>
             </w:r>
             <w:r>
               <w:rPr>
@@ -1679,7 +1679,7 @@
               <w14:ligatures w14:val="standardContextual"/>
             </w:rPr>
           </w:pPr>
-          <w:hyperlink w:anchor="_Toc241882511" w:history="1">
+          <w:hyperlink w:anchor="_Toc242017378" w:history="1">
             <w:r>
               <w:rPr>
                 <w:rStyle w:val="Lienhypertexte"/>
@@ -1703,7 +1703,7 @@
               <w:rPr>
                 <w:noProof/>
               </w:rPr>
-              <w:instrText xml:space="preserve"> PAGEREF _Toc241882511 \h </w:instrText>
+              <w:instrText xml:space="preserve"> PAGEREF _Toc242017378 \h </w:instrText>
             </w:r>
             <w:r>
               <w:rPr>
@@ -1746,7 +1746,7 @@
               <w14:ligatures w14:val="standardContextual"/>
             </w:rPr>
           </w:pPr>
-          <w:hyperlink w:anchor="_Toc241882512" w:history="1">
+          <w:hyperlink w:anchor="_Toc242017379" w:history="1">
             <w:r>
               <w:rPr>
                 <w:rStyle w:val="Lienhypertexte"/>
@@ -1770,7 +1770,7 @@
               <w:rPr>
                 <w:noProof/>
               </w:rPr>
-              <w:instrText xml:space="preserve"> PAGEREF _Toc241882512 \h </w:instrText>
+              <w:instrText xml:space="preserve"> PAGEREF _Toc242017379 \h </w:instrText>
             </w:r>
             <w:r>
               <w:rPr>
@@ -1813,7 +1813,7 @@
               <w14:ligatures w14:val="standardContextual"/>
             </w:rPr>
           </w:pPr>
-          <w:hyperlink w:anchor="_Toc241882513" w:history="1">
+          <w:hyperlink w:anchor="_Toc242017380" w:history="1">
             <w:r>
               <w:rPr>
                 <w:rStyle w:val="Lienhypertexte"/>
@@ -1837,7 +1837,7 @@
               <w:rPr>
                 <w:noProof/>
               </w:rPr>
-              <w:instrText xml:space="preserve"> PAGEREF _Toc241882513 \h </w:instrText>
+              <w:instrText xml:space="preserve"> PAGEREF _Toc242017380 \h </w:instrText>
             </w:r>
             <w:r>
               <w:rPr>
@@ -1880,7 +1880,7 @@
               <w14:ligatures w14:val="standardContextual"/>
             </w:rPr>
           </w:pPr>
-          <w:hyperlink w:anchor="_Toc241882514" w:history="1">
+          <w:hyperlink w:anchor="_Toc242017381" w:history="1">
             <w:r>
               <w:rPr>
                 <w:rStyle w:val="Lienhypertexte"/>
@@ -1904,7 +1904,7 @@
               <w:rPr>
                 <w:noProof/>
               </w:rPr>
-              <w:instrText xml:space="preserve"> PAGEREF _Toc241882514 \h </w:instrText>
+              <w:instrText xml:space="preserve"> PAGEREF _Toc242017381 \h </w:instrText>
             </w:r>
             <w:r>
               <w:rPr>
@@ -1947,7 +1947,7 @@
               <w14:ligatures w14:val="standardContextual"/>
             </w:rPr>
           </w:pPr>
-          <w:hyperlink w:anchor="_Toc241882515" w:history="1">
+          <w:hyperlink w:anchor="_Toc242017382" w:history="1">
             <w:r>
               <w:rPr>
                 <w:rStyle w:val="Lienhypertexte"/>
@@ -1971,7 +1971,7 @@
               <w:rPr>
                 <w:noProof/>
               </w:rPr>
-              <w:instrText xml:space="preserve"> PAGEREF _Toc241882515 \h </w:instrText>
+              <w:instrText xml:space="preserve"> PAGEREF _Toc242017382 \h </w:instrText>
             </w:r>
             <w:r>
               <w:rPr>
@@ -2014,7 +2014,7 @@
               <w14:ligatures w14:val="standardContextual"/>
             </w:rPr>
           </w:pPr>
-          <w:hyperlink w:anchor="_Toc241882516" w:history="1">
+          <w:hyperlink w:anchor="_Toc242017383" w:history="1">
             <w:r>
               <w:rPr>
                 <w:rStyle w:val="Lienhypertexte"/>
@@ -2038,7 +2038,7 @@
               <w:rPr>
                 <w:noProof/>
               </w:rPr>
-              <w:instrText xml:space="preserve"> PAGEREF _Toc241882516 \h </w:instrText>
+              <w:instrText xml:space="preserve"> PAGEREF _Toc242017383 \h </w:instrText>
             </w:r>
             <w:r>
               <w:rPr>
@@ -2081,7 +2081,7 @@
               <w14:ligatures w14:val="standardContextual"/>
             </w:rPr>
           </w:pPr>
-          <w:hyperlink w:anchor="_Toc241882517" w:history="1">
+          <w:hyperlink w:anchor="_Toc242017384" w:history="1">
             <w:r>
               <w:rPr>
                 <w:rStyle w:val="Lienhypertexte"/>
@@ -2105,7 +2105,7 @@
               <w:rPr>
                 <w:noProof/>
               </w:rPr>
-              <w:instrText xml:space="preserve"> PAGEREF _Toc241882517 \h </w:instrText>
+              <w:instrText xml:space="preserve"> PAGEREF _Toc242017384 \h </w:instrText>
             </w:r>
             <w:r>
               <w:rPr>
@@ -2148,7 +2148,7 @@
               <w14:ligatures w14:val="standardContextual"/>
             </w:rPr>
           </w:pPr>
-          <w:hyperlink w:anchor="_Toc241882518" w:history="1">
+          <w:hyperlink w:anchor="_Toc242017385" w:history="1">
             <w:r>
               <w:rPr>
                 <w:rStyle w:val="Lienhypertexte"/>
@@ -2172,7 +2172,7 @@
               <w:rPr>
                 <w:noProof/>
               </w:rPr>
-              <w:instrText xml:space="preserve"> PAGEREF _Toc241882518 \h </w:instrText>
+              <w:instrText xml:space="preserve"> PAGEREF _Toc242017385 \h </w:instrText>
             </w:r>
             <w:r>
               <w:rPr>
@@ -2215,7 +2215,7 @@
               <w14:ligatures w14:val="standardContextual"/>
             </w:rPr>
           </w:pPr>
-          <w:hyperlink w:anchor="_Toc241882519" w:history="1">
+          <w:hyperlink w:anchor="_Toc242017386" w:history="1">
             <w:r>
               <w:rPr>
                 <w:rStyle w:val="Lienhypertexte"/>
@@ -2239,7 +2239,7 @@
               <w:rPr>
                 <w:noProof/>
               </w:rPr>
-              <w:instrText xml:space="preserve"> PAGEREF _Toc241882519 \h </w:instrText>
+              <w:instrText xml:space="preserve"> PAGEREF _Toc242017386 \h </w:instrText>
             </w:r>
             <w:r>
               <w:rPr>
@@ -2282,7 +2282,7 @@
               <w14:ligatures w14:val="standardContextual"/>
             </w:rPr>
           </w:pPr>
-          <w:hyperlink w:anchor="_Toc241882520" w:history="1">
+          <w:hyperlink w:anchor="_Toc242017387" w:history="1">
             <w:r>
               <w:rPr>
                 <w:rStyle w:val="Lienhypertexte"/>
@@ -2306,7 +2306,7 @@
               <w:rPr>
                 <w:noProof/>
               </w:rPr>
-              <w:instrText xml:space="preserve"> PAGEREF _Toc241882520 \h </w:instrText>
+              <w:instrText xml:space="preserve"> PAGEREF _Toc242017387 \h </w:instrText>
             </w:r>
             <w:r>
               <w:rPr>
@@ -2349,7 +2349,7 @@
               <w14:ligatures w14:val="standardContextual"/>
             </w:rPr>
           </w:pPr>
-          <w:hyperlink w:anchor="_Toc241882521" w:history="1">
+          <w:hyperlink w:anchor="_Toc242017388" w:history="1">
             <w:r>
               <w:rPr>
                 <w:rStyle w:val="Lienhypertexte"/>
@@ -2373,7 +2373,7 @@
               <w:rPr>
                 <w:noProof/>
               </w:rPr>
-              <w:instrText xml:space="preserve"> PAGEREF _Toc241882521 \h </w:instrText>
+              <w:instrText xml:space="preserve"> PAGEREF _Toc242017388 \h </w:instrText>
             </w:r>
             <w:r>
               <w:rPr>
@@ -2416,7 +2416,7 @@
               <w14:ligatures w14:val="standardContextual"/>
             </w:rPr>
           </w:pPr>
-          <w:hyperlink w:anchor="_Toc241882522" w:history="1">
+          <w:hyperlink w:anchor="_Toc242017389" w:history="1">
             <w:r>
               <w:rPr>
                 <w:rStyle w:val="Lienhypertexte"/>
@@ -2440,7 +2440,7 @@
               <w:rPr>
                 <w:noProof/>
               </w:rPr>
-              <w:instrText xml:space="preserve"> PAGEREF _Toc241882522 \h </w:instrText>
+              <w:instrText xml:space="preserve"> PAGEREF _Toc242017389 \h </w:instrText>
             </w:r>
             <w:r>
               <w:rPr>
@@ -2483,7 +2483,7 @@
               <w14:ligatures w14:val="standardContextual"/>
             </w:rPr>
           </w:pPr>
-          <w:hyperlink w:anchor="_Toc241882523" w:history="1">
+          <w:hyperlink w:anchor="_Toc242017390" w:history="1">
             <w:r>
               <w:rPr>
                 <w:rStyle w:val="Lienhypertexte"/>
@@ -2507,7 +2507,7 @@
               <w:rPr>
                 <w:noProof/>
               </w:rPr>
-              <w:instrText xml:space="preserve"> PAGEREF _Toc241882523 \h </w:instrText>
+              <w:instrText xml:space="preserve"> PAGEREF _Toc242017390 \h </w:instrText>
             </w:r>
             <w:r>
               <w:rPr>
@@ -2550,7 +2550,7 @@
               <w14:ligatures w14:val="standardContextual"/>
             </w:rPr>
           </w:pPr>
-          <w:hyperlink w:anchor="_Toc241882524" w:history="1">
+          <w:hyperlink w:anchor="_Toc242017391" w:history="1">
             <w:r>
               <w:rPr>
                 <w:rStyle w:val="Lienhypertexte"/>
@@ -2574,7 +2574,7 @@
               <w:rPr>
                 <w:noProof/>
               </w:rPr>
-              <w:instrText xml:space="preserve"> PAGEREF _Toc241882524 \h </w:instrText>
+              <w:instrText xml:space="preserve"> PAGEREF _Toc242017391 \h </w:instrText>
             </w:r>
             <w:r>
               <w:rPr>
@@ -2617,7 +2617,7 @@
               <w14:ligatures w14:val="standardContextual"/>
             </w:rPr>
           </w:pPr>
-          <w:hyperlink w:anchor="_Toc241882525" w:history="1">
+          <w:hyperlink w:anchor="_Toc242017392" w:history="1">
             <w:r>
               <w:rPr>
                 <w:rStyle w:val="Lienhypertexte"/>
@@ -2641,7 +2641,7 @@
               <w:rPr>
                 <w:noProof/>
               </w:rPr>
-              <w:instrText xml:space="preserve"> PAGEREF _Toc241882525 \h </w:instrText>
+              <w:instrText xml:space="preserve"> PAGEREF _Toc242017392 \h </w:instrText>
             </w:r>
             <w:r>
               <w:rPr>
@@ -2681,7 +2681,7 @@
         <w:pStyle w:val="Titre1"/>
         <w:pageBreakBefore/>
       </w:pPr>
-      <w:bookmarkStart w:id="0" w:name="_Toc241882488"/>
+      <w:bookmarkStart w:id="0" w:name="_Toc242017355"/>
       <w:r>
         <w:lastRenderedPageBreak/>
         <w:t>1. Présentation de la plateforme</w:t>
@@ -2711,7 +2711,7 @@
           <w:left w:w="10" w:type="dxa"/>
           <w:right w:w="10" w:type="dxa"/>
         </w:tblCellMar>
-        <w:tblLook w:val="04A0" w:firstRow="1" w:lastRow="0" w:firstColumn="1" w:lastColumn="0" w:noHBand="0" w:noVBand="1"/>
+        <w:tblLook w:val="0000" w:firstRow="0" w:lastRow="0" w:firstColumn="0" w:lastColumn="0" w:noHBand="0" w:noVBand="0"/>
       </w:tblPr>
       <w:tblGrid>
         <w:gridCol w:w="1985"/>
@@ -3132,7 +3132,7 @@
       <w:pPr>
         <w:pStyle w:val="Titre2"/>
       </w:pPr>
-      <w:bookmarkStart w:id="1" w:name="_Toc241882489"/>
+      <w:bookmarkStart w:id="1" w:name="_Toc242017356"/>
       <w:r>
         <w:t>1.1 Une seule connexion</w:t>
       </w:r>
@@ -3160,7 +3160,7 @@
       <w:pPr>
         <w:pStyle w:val="Titre2"/>
       </w:pPr>
-      <w:bookmarkStart w:id="2" w:name="_Toc241882490"/>
+      <w:bookmarkStart w:id="2" w:name="_Toc242017357"/>
       <w:r>
         <w:t>1.2 Principes de fonctionnement</w:t>
       </w:r>
@@ -3251,7 +3251,7 @@
         <w:pStyle w:val="Titre1"/>
         <w:pageBreakBefore/>
       </w:pPr>
-      <w:bookmarkStart w:id="3" w:name="_Toc241882491"/>
+      <w:bookmarkStart w:id="3" w:name="_Toc242017358"/>
       <w:r>
         <w:lastRenderedPageBreak/>
         <w:t>2. Les rôles et leurs droits</w:t>
@@ -3281,7 +3281,7 @@
           <w:left w:w="10" w:type="dxa"/>
           <w:right w:w="10" w:type="dxa"/>
         </w:tblCellMar>
-        <w:tblLook w:val="04A0" w:firstRow="1" w:lastRow="0" w:firstColumn="1" w:lastColumn="0" w:noHBand="0" w:noVBand="1"/>
+        <w:tblLook w:val="0000" w:firstRow="0" w:lastRow="0" w:firstColumn="0" w:lastColumn="0" w:noHBand="0" w:noVBand="0"/>
       </w:tblPr>
       <w:tblGrid>
         <w:gridCol w:w="1444"/>
@@ -4075,7 +4075,7 @@
       <w:pPr>
         <w:pStyle w:val="Titre2"/>
       </w:pPr>
-      <w:bookmarkStart w:id="4" w:name="_Toc241882492"/>
+      <w:bookmarkStart w:id="4" w:name="_Toc242017359"/>
       <w:r>
         <w:t>2.1 Visiteur</w:t>
       </w:r>
@@ -4185,7 +4185,7 @@
       <w:pPr>
         <w:pStyle w:val="Titre2"/>
       </w:pPr>
-      <w:bookmarkStart w:id="5" w:name="_Toc241882493"/>
+      <w:bookmarkStart w:id="5" w:name="_Toc242017360"/>
       <w:r>
         <w:t>2.2 Client</w:t>
       </w:r>
@@ -4399,7 +4399,7 @@
       <w:pPr>
         <w:pStyle w:val="Titre2"/>
       </w:pPr>
-      <w:bookmarkStart w:id="6" w:name="_Toc241882494"/>
+      <w:bookmarkStart w:id="6" w:name="_Toc242017361"/>
       <w:r>
         <w:lastRenderedPageBreak/>
         <w:t>2.3 Technicien</w:t>
@@ -4449,7 +4449,7 @@
           <w:left w:w="10" w:type="dxa"/>
           <w:right w:w="10" w:type="dxa"/>
         </w:tblCellMar>
-        <w:tblLook w:val="04A0" w:firstRow="1" w:lastRow="0" w:firstColumn="1" w:lastColumn="0" w:noHBand="0" w:noVBand="1"/>
+        <w:tblLook w:val="0000" w:firstRow="0" w:lastRow="0" w:firstColumn="0" w:lastColumn="0" w:noHBand="0" w:noVBand="0"/>
       </w:tblPr>
       <w:tblGrid>
         <w:gridCol w:w="3610"/>
@@ -4923,7 +4923,7 @@
       <w:pPr>
         <w:pStyle w:val="Titre2"/>
       </w:pPr>
-      <w:bookmarkStart w:id="7" w:name="_Toc241882495"/>
+      <w:bookmarkStart w:id="7" w:name="_Toc242017362"/>
       <w:r>
         <w:t>2.4 Manager</w:t>
       </w:r>
@@ -5176,7 +5176,7 @@
       <w:pPr>
         <w:pStyle w:val="Titre2"/>
       </w:pPr>
-      <w:bookmarkStart w:id="8" w:name="_Toc241882496"/>
+      <w:bookmarkStart w:id="8" w:name="_Toc242017363"/>
       <w:r>
         <w:t>2.5 Administrateur</w:t>
       </w:r>
@@ -5286,7 +5286,7 @@
         <w:pStyle w:val="Titre1"/>
         <w:pageBreakBefore/>
       </w:pPr>
-      <w:bookmarkStart w:id="9" w:name="_Toc241882497"/>
+      <w:bookmarkStart w:id="9" w:name="_Toc242017364"/>
       <w:r>
         <w:lastRenderedPageBreak/>
         <w:t>3. Le parcours d’un rendez-vous</w:t>
@@ -5336,7 +5336,7 @@
           <w:left w:w="10" w:type="dxa"/>
           <w:right w:w="10" w:type="dxa"/>
         </w:tblCellMar>
-        <w:tblLook w:val="04A0" w:firstRow="1" w:lastRow="0" w:firstColumn="1" w:lastColumn="0" w:noHBand="0" w:noVBand="1"/>
+        <w:tblLook w:val="0000" w:firstRow="0" w:lastRow="0" w:firstColumn="0" w:lastColumn="0" w:noHBand="0" w:noVBand="0"/>
       </w:tblPr>
       <w:tblGrid>
         <w:gridCol w:w="1624"/>
@@ -6377,7 +6377,7 @@
       <w:pPr>
         <w:pStyle w:val="Titre2"/>
       </w:pPr>
-      <w:bookmarkStart w:id="10" w:name="_Toc241882498"/>
+      <w:bookmarkStart w:id="10" w:name="_Toc242017365"/>
       <w:r>
         <w:t>3.1 Situations particulières</w:t>
       </w:r>
@@ -6398,7 +6398,7 @@
           <w:left w:w="10" w:type="dxa"/>
           <w:right w:w="10" w:type="dxa"/>
         </w:tblCellMar>
-        <w:tblLook w:val="04A0" w:firstRow="1" w:lastRow="0" w:firstColumn="1" w:lastColumn="0" w:noHBand="0" w:noVBand="1"/>
+        <w:tblLook w:val="0000" w:firstRow="0" w:lastRow="0" w:firstColumn="0" w:lastColumn="0" w:noHBand="0" w:noVBand="0"/>
       </w:tblPr>
       <w:tblGrid>
         <w:gridCol w:w="1985"/>
@@ -7027,7 +7027,7 @@
       <w:pPr>
         <w:pStyle w:val="Titre2"/>
       </w:pPr>
-      <w:bookmarkStart w:id="11" w:name="_Toc241882499"/>
+      <w:bookmarkStart w:id="11" w:name="_Toc242017366"/>
       <w:r>
         <w:t>3.2 Restitution et paiement au comptoir</w:t>
       </w:r>
@@ -7120,7 +7120,7 @@
       <w:pPr>
         <w:pStyle w:val="Titre2"/>
       </w:pPr>
-      <w:bookmarkStart w:id="12" w:name="_Toc241882500"/>
+      <w:bookmarkStart w:id="12" w:name="_Toc242017367"/>
       <w:r>
         <w:t>3.3 L’avancement affiché au client</w:t>
       </w:r>
@@ -7149,7 +7149,7 @@
         <w:pStyle w:val="Titre1"/>
         <w:pageBreakBefore/>
       </w:pPr>
-      <w:bookmarkStart w:id="13" w:name="_Toc241882501"/>
+      <w:bookmarkStart w:id="13" w:name="_Toc242017368"/>
       <w:r>
         <w:lastRenderedPageBreak/>
         <w:t>4. Réservation en ligne et disponibilités</w:t>
@@ -7160,7 +7160,7 @@
       <w:pPr>
         <w:pStyle w:val="Titre2"/>
       </w:pPr>
-      <w:bookmarkStart w:id="14" w:name="_Toc241882502"/>
+      <w:bookmarkStart w:id="14" w:name="_Toc242017369"/>
       <w:r>
         <w:t>4.1 Le tunnel de réservation</w:t>
       </w:r>
@@ -7320,7 +7320,7 @@
       <w:pPr>
         <w:pStyle w:val="Titre2"/>
       </w:pPr>
-      <w:bookmarkStart w:id="15" w:name="_Toc241882503"/>
+      <w:bookmarkStart w:id="15" w:name="_Toc242017370"/>
       <w:r>
         <w:t>4.2 Comment les créneaux sont calculés</w:t>
       </w:r>
@@ -7359,7 +7359,7 @@
           <w:left w:w="10" w:type="dxa"/>
           <w:right w:w="10" w:type="dxa"/>
         </w:tblCellMar>
-        <w:tblLook w:val="04A0" w:firstRow="1" w:lastRow="0" w:firstColumn="1" w:lastColumn="0" w:noHBand="0" w:noVBand="1"/>
+        <w:tblLook w:val="0000" w:firstRow="0" w:lastRow="0" w:firstColumn="0" w:lastColumn="0" w:noHBand="0" w:noVBand="0"/>
       </w:tblPr>
       <w:tblGrid>
         <w:gridCol w:w="2707"/>
@@ -8280,7 +8280,7 @@
         <w:pStyle w:val="Titre1"/>
         <w:pageBreakBefore/>
       </w:pPr>
-      <w:bookmarkStart w:id="16" w:name="_Toc241882504"/>
+      <w:bookmarkStart w:id="16" w:name="_Toc242017371"/>
       <w:r>
         <w:lastRenderedPageBreak/>
         <w:t>5. L’espace client</w:t>
@@ -8302,7 +8302,7 @@
           <w:left w:w="10" w:type="dxa"/>
           <w:right w:w="10" w:type="dxa"/>
         </w:tblCellMar>
-        <w:tblLook w:val="04A0" w:firstRow="1" w:lastRow="0" w:firstColumn="1" w:lastColumn="0" w:noHBand="0" w:noVBand="1"/>
+        <w:tblLook w:val="0000" w:firstRow="0" w:lastRow="0" w:firstColumn="0" w:lastColumn="0" w:noHBand="0" w:noVBand="0"/>
       </w:tblPr>
       <w:tblGrid>
         <w:gridCol w:w="2166"/>
@@ -8863,7 +8863,7 @@
       <w:pPr>
         <w:pStyle w:val="Titre2"/>
       </w:pPr>
-      <w:bookmarkStart w:id="17" w:name="_Toc241882505"/>
+      <w:bookmarkStart w:id="17" w:name="_Toc242017372"/>
       <w:r>
         <w:t>5.1 Photo du véhicule</w:t>
       </w:r>
@@ -8943,7 +8943,7 @@
         <w:pStyle w:val="Titre1"/>
         <w:pageBreakBefore/>
       </w:pPr>
-      <w:bookmarkStart w:id="18" w:name="_Toc241882506"/>
+      <w:bookmarkStart w:id="18" w:name="_Toc242017373"/>
       <w:r>
         <w:lastRenderedPageBreak/>
         <w:t>6. L’espace professionnel</w:t>
@@ -8973,7 +8973,7 @@
           <w:left w:w="10" w:type="dxa"/>
           <w:right w:w="10" w:type="dxa"/>
         </w:tblCellMar>
-        <w:tblLook w:val="04A0" w:firstRow="1" w:lastRow="0" w:firstColumn="1" w:lastColumn="0" w:noHBand="0" w:noVBand="1"/>
+        <w:tblLook w:val="0000" w:firstRow="0" w:lastRow="0" w:firstColumn="0" w:lastColumn="0" w:noHBand="0" w:noVBand="0"/>
       </w:tblPr>
       <w:tblGrid>
         <w:gridCol w:w="1624"/>
@@ -9411,7 +9411,7 @@
                 <w:sz w:val="19"/>
                 <w:szCs w:val="19"/>
               </w:rPr>
-              <w:t>Notifications</w:t>
+              <w:t>Factures</w:t>
             </w:r>
           </w:p>
         </w:tc>
@@ -9441,7 +9441,7 @@
                 <w:sz w:val="19"/>
                 <w:szCs w:val="19"/>
               </w:rPr>
-              <w:t>Toute l’équipe</w:t>
+              <w:t>Manager, admin</w:t>
             </w:r>
           </w:p>
         </w:tc>
@@ -9471,7 +9471,7 @@
                 <w:sz w:val="19"/>
                 <w:szCs w:val="19"/>
               </w:rPr>
-              <w:t>Ce qui demande une action (nouvelle demande, contrôle à valider, prestation affectée…).</w:t>
+              <w:t>Toutes les factures (recherche, filtres par statut, reste à encaisser), établissement des factures sur devis avec lignes libres et remise, encaissement, remboursement, annulation, PDF.</w:t>
             </w:r>
           </w:p>
         </w:tc>
@@ -9508,7 +9508,7 @@
                 <w:sz w:val="19"/>
                 <w:szCs w:val="19"/>
               </w:rPr>
-              <w:t>Rendez-vous</w:t>
+              <w:t>Notifications</w:t>
             </w:r>
           </w:p>
         </w:tc>
@@ -9566,7 +9566,7 @@
                 <w:sz w:val="19"/>
                 <w:szCs w:val="19"/>
               </w:rPr>
-              <w:t>Liste filtrable (statut, date). Seules les actions autorisées pour le rôle et l’étape sont proposées. Fiche « Gérer » : affectation, notes internes, report, historique complet.</w:t>
+              <w:t>Ce qui demande une action (nouvelle demande, contrôle à valider, prestation affectée…).</w:t>
             </w:r>
           </w:p>
         </w:tc>
@@ -9604,7 +9604,7 @@
                 <w:sz w:val="19"/>
                 <w:szCs w:val="19"/>
               </w:rPr>
-              <w:t>Clients</w:t>
+              <w:t>Rendez-vous</w:t>
             </w:r>
           </w:p>
         </w:tc>
@@ -9634,7 +9634,7 @@
                 <w:sz w:val="19"/>
                 <w:szCs w:val="19"/>
               </w:rPr>
-              <w:t>Toute l’équipe (modification : manager)</w:t>
+              <w:t>Toute l’équipe</w:t>
             </w:r>
           </w:p>
         </w:tc>
@@ -9664,7 +9664,7 @@
                 <w:sz w:val="19"/>
                 <w:szCs w:val="19"/>
               </w:rPr>
-              <w:t>Recherche par nom, téléphone, email ou immatriculation ; fiche avec véhicules, rendez-vous, montant des prestations, segment et notes internes.</w:t>
+              <w:t>Liste filtrable (statut, date). Seules les actions autorisées pour le rôle et l’étape sont proposées. Fiche « Gérer » : affectation, notes internes, report, historique complet.</w:t>
             </w:r>
           </w:p>
         </w:tc>
@@ -9701,7 +9701,7 @@
                 <w:sz w:val="19"/>
                 <w:szCs w:val="19"/>
               </w:rPr>
-              <w:t>Véhicules</w:t>
+              <w:t>Clients</w:t>
             </w:r>
           </w:p>
         </w:tc>
@@ -9730,7 +9730,7 @@
                 <w:sz w:val="19"/>
                 <w:szCs w:val="19"/>
               </w:rPr>
-              <w:t>Toute l’équipe</w:t>
+              <w:t>Toute l’équipe (modification : manager)</w:t>
             </w:r>
           </w:p>
         </w:tc>
@@ -9759,7 +9759,7 @@
                 <w:sz w:val="19"/>
                 <w:szCs w:val="19"/>
               </w:rPr>
-              <w:t>Tous les véhicules enregistrés et leur propriétaire.</w:t>
+              <w:t>Recherche par nom, téléphone, email ou immatriculation ; fiche avec véhicules, rendez-vous, montant des prestations, segment et notes internes.</w:t>
             </w:r>
           </w:p>
         </w:tc>
@@ -9797,7 +9797,7 @@
                 <w:sz w:val="19"/>
                 <w:szCs w:val="19"/>
               </w:rPr>
-              <w:t>Prestations</w:t>
+              <w:t>Véhicules</w:t>
             </w:r>
           </w:p>
         </w:tc>
@@ -9827,7 +9827,7 @@
                 <w:sz w:val="19"/>
                 <w:szCs w:val="19"/>
               </w:rPr>
-              <w:t>Manager, admin</w:t>
+              <w:t>Toute l’équipe</w:t>
             </w:r>
           </w:p>
         </w:tc>
@@ -9857,7 +9857,7 @@
                 <w:sz w:val="19"/>
                 <w:szCs w:val="19"/>
               </w:rPr>
-              <w:t>Création et modification (tarif fixe, « à partir de » ou sur devis ; durée bloquée au planning), suspension.</w:t>
+              <w:t>Tous les véhicules enregistrés et leur propriétaire.</w:t>
             </w:r>
           </w:p>
         </w:tc>
@@ -9894,6 +9894,102 @@
                 <w:sz w:val="19"/>
                 <w:szCs w:val="19"/>
               </w:rPr>
+              <w:t>Prestations</w:t>
+            </w:r>
+          </w:p>
+        </w:tc>
+        <w:tc>
+          <w:tcPr>
+            <w:tcW w:w="1985" w:type="dxa"/>
+            <w:tcBorders>
+              <w:top w:val="single" w:sz="4" w:space="0" w:color="D9D9D9"/>
+              <w:left w:val="single" w:sz="4" w:space="0" w:color="D9D9D9"/>
+              <w:bottom w:val="single" w:sz="4" w:space="0" w:color="D9D9D9"/>
+              <w:right w:val="single" w:sz="4" w:space="0" w:color="D9D9D9"/>
+            </w:tcBorders>
+            <w:tcMar>
+              <w:top w:w="70" w:type="dxa"/>
+              <w:left w:w="110" w:type="dxa"/>
+              <w:bottom w:w="70" w:type="dxa"/>
+              <w:right w:w="110" w:type="dxa"/>
+            </w:tcMar>
+          </w:tcPr>
+          <w:p>
+            <w:pPr>
+              <w:spacing w:line="252" w:lineRule="auto"/>
+            </w:pPr>
+            <w:r>
+              <w:rPr>
+                <w:sz w:val="19"/>
+                <w:szCs w:val="19"/>
+              </w:rPr>
+              <w:t>Manager, admin</w:t>
+            </w:r>
+          </w:p>
+        </w:tc>
+        <w:tc>
+          <w:tcPr>
+            <w:tcW w:w="5417" w:type="dxa"/>
+            <w:tcBorders>
+              <w:top w:val="single" w:sz="4" w:space="0" w:color="D9D9D9"/>
+              <w:left w:val="single" w:sz="4" w:space="0" w:color="D9D9D9"/>
+              <w:bottom w:val="single" w:sz="4" w:space="0" w:color="D9D9D9"/>
+              <w:right w:val="single" w:sz="4" w:space="0" w:color="D9D9D9"/>
+            </w:tcBorders>
+            <w:tcMar>
+              <w:top w:w="70" w:type="dxa"/>
+              <w:left w:w="110" w:type="dxa"/>
+              <w:bottom w:w="70" w:type="dxa"/>
+              <w:right w:w="110" w:type="dxa"/>
+            </w:tcMar>
+          </w:tcPr>
+          <w:p>
+            <w:pPr>
+              <w:spacing w:line="252" w:lineRule="auto"/>
+            </w:pPr>
+            <w:r>
+              <w:rPr>
+                <w:sz w:val="19"/>
+                <w:szCs w:val="19"/>
+              </w:rPr>
+              <w:t>Création et modification (tarif fixe, « à partir de » ou sur devis ; durée bloquée au planning), suspension.</w:t>
+            </w:r>
+          </w:p>
+        </w:tc>
+      </w:tr>
+      <w:tr>
+        <w:tblPrEx>
+          <w:tblCellMar>
+            <w:top w:w="0" w:type="dxa"/>
+            <w:bottom w:w="0" w:type="dxa"/>
+          </w:tblCellMar>
+        </w:tblPrEx>
+        <w:tc>
+          <w:tcPr>
+            <w:tcW w:w="1624" w:type="dxa"/>
+            <w:tcBorders>
+              <w:top w:val="single" w:sz="4" w:space="0" w:color="D9D9D9"/>
+              <w:left w:val="single" w:sz="4" w:space="0" w:color="D9D9D9"/>
+              <w:bottom w:val="single" w:sz="4" w:space="0" w:color="D9D9D9"/>
+              <w:right w:val="single" w:sz="4" w:space="0" w:color="D9D9D9"/>
+            </w:tcBorders>
+            <w:shd w:val="clear" w:color="auto" w:fill="FAF7F2"/>
+            <w:tcMar>
+              <w:top w:w="70" w:type="dxa"/>
+              <w:left w:w="110" w:type="dxa"/>
+              <w:bottom w:w="70" w:type="dxa"/>
+              <w:right w:w="110" w:type="dxa"/>
+            </w:tcMar>
+          </w:tcPr>
+          <w:p>
+            <w:pPr>
+              <w:spacing w:line="252" w:lineRule="auto"/>
+            </w:pPr>
+            <w:r>
+              <w:rPr>
+                <w:sz w:val="19"/>
+                <w:szCs w:val="19"/>
+              </w:rPr>
               <w:t>Équipe</w:t>
             </w:r>
           </w:p>
@@ -9907,6 +10003,7 @@
               <w:bottom w:val="single" w:sz="4" w:space="0" w:color="D9D9D9"/>
               <w:right w:val="single" w:sz="4" w:space="0" w:color="D9D9D9"/>
             </w:tcBorders>
+            <w:shd w:val="clear" w:color="auto" w:fill="FAF7F2"/>
             <w:tcMar>
               <w:top w:w="70" w:type="dxa"/>
               <w:left w:w="110" w:type="dxa"/>
@@ -9936,6 +10033,7 @@
               <w:bottom w:val="single" w:sz="4" w:space="0" w:color="D9D9D9"/>
               <w:right w:val="single" w:sz="4" w:space="0" w:color="D9D9D9"/>
             </w:tcBorders>
+            <w:shd w:val="clear" w:color="auto" w:fill="FAF7F2"/>
             <w:tcMar>
               <w:top w:w="70" w:type="dxa"/>
               <w:left w:w="110" w:type="dxa"/>
@@ -9981,7 +10079,7 @@
         <w:t xml:space="preserve">Écrans en cours de réalisation : </w:t>
       </w:r>
       <w:r>
-        <w:t>la liste complète des factures (devis, annulations), la gestion de la galerie et les statistiques sont opérationnelles côté serveur et testées ; leurs écrans restent à construire. En attendant, ces rubriques affichent « prévu prochainement » et l’administrateur dispose du back-office.</w:t>
+        <w:t>la gestion de la galerie et les statistiques sont opérationnelles côté serveur et testées ; leurs écrans restent à construire. En attendant, ces rubriques affichent « prévu prochainement » et l’administrateur dispose du back-office.</w:t>
       </w:r>
     </w:p>
     <w:p>
@@ -9989,7 +10087,7 @@
         <w:pStyle w:val="Titre1"/>
         <w:pageBreakBefore/>
       </w:pPr>
-      <w:bookmarkStart w:id="19" w:name="_Toc241882507"/>
+      <w:bookmarkStart w:id="19" w:name="_Toc242017374"/>
       <w:r>
         <w:lastRenderedPageBreak/>
         <w:t>7. Le suivi atelier</w:t>
@@ -10000,7 +10098,7 @@
       <w:pPr>
         <w:pStyle w:val="Titre2"/>
       </w:pPr>
-      <w:bookmarkStart w:id="20" w:name="_Toc241882508"/>
+      <w:bookmarkStart w:id="20" w:name="_Toc242017375"/>
       <w:r>
         <w:t>7.1 Étapes de traitement</w:t>
       </w:r>
@@ -10089,7 +10187,7 @@
       <w:pPr>
         <w:pStyle w:val="Titre2"/>
       </w:pPr>
-      <w:bookmarkStart w:id="21" w:name="_Toc241882509"/>
+      <w:bookmarkStart w:id="21" w:name="_Toc242017376"/>
       <w:r>
         <w:t>7.2 Photos d’intervention</w:t>
       </w:r>
@@ -10110,7 +10208,7 @@
           <w:left w:w="10" w:type="dxa"/>
           <w:right w:w="10" w:type="dxa"/>
         </w:tblCellMar>
-        <w:tblLook w:val="04A0" w:firstRow="1" w:lastRow="0" w:firstColumn="1" w:lastColumn="0" w:noHBand="0" w:noVBand="1"/>
+        <w:tblLook w:val="0000" w:firstRow="0" w:lastRow="0" w:firstColumn="0" w:lastColumn="0" w:noHBand="0" w:noVBand="0"/>
       </w:tblPr>
       <w:tblGrid>
         <w:gridCol w:w="2707"/>
@@ -10440,7 +10538,7 @@
         <w:pStyle w:val="Titre1"/>
         <w:pageBreakBefore/>
       </w:pPr>
-      <w:bookmarkStart w:id="22" w:name="_Toc241882510"/>
+      <w:bookmarkStart w:id="22" w:name="_Toc242017377"/>
       <w:r>
         <w:lastRenderedPageBreak/>
         <w:t>8. Facturation et paiements</w:t>
@@ -10451,7 +10549,7 @@
       <w:pPr>
         <w:pStyle w:val="Titre2"/>
       </w:pPr>
-      <w:bookmarkStart w:id="23" w:name="_Toc241882511"/>
+      <w:bookmarkStart w:id="23" w:name="_Toc242017378"/>
       <w:r>
         <w:t>8.1 Les factures</w:t>
       </w:r>
@@ -10567,7 +10665,7 @@
       <w:pPr>
         <w:pStyle w:val="Titre2"/>
       </w:pPr>
-      <w:bookmarkStart w:id="24" w:name="_Toc241882512"/>
+      <w:bookmarkStart w:id="24" w:name="_Toc242017379"/>
       <w:r>
         <w:t>8.2 Les paiements</w:t>
       </w:r>
@@ -10712,7 +10810,7 @@
       <w:pPr>
         <w:pStyle w:val="Titre2"/>
       </w:pPr>
-      <w:bookmarkStart w:id="25" w:name="_Toc241882513"/>
+      <w:bookmarkStart w:id="25" w:name="_Toc242017380"/>
       <w:r>
         <w:t>8.3 Le journal de caisse</w:t>
       </w:r>
@@ -10760,7 +10858,7 @@
       <w:pPr>
         <w:pStyle w:val="Titre2"/>
       </w:pPr>
-      <w:bookmarkStart w:id="26" w:name="_Toc241882514"/>
+      <w:bookmarkStart w:id="26" w:name="_Toc242017381"/>
       <w:r>
         <w:t>8.4 Statut d’une facture</w:t>
       </w:r>
@@ -10799,7 +10897,7 @@
           <w:left w:w="10" w:type="dxa"/>
           <w:right w:w="10" w:type="dxa"/>
         </w:tblCellMar>
-        <w:tblLook w:val="04A0" w:firstRow="1" w:lastRow="0" w:firstColumn="1" w:lastColumn="0" w:noHBand="0" w:noVBand="1"/>
+        <w:tblLook w:val="0000" w:firstRow="0" w:lastRow="0" w:firstColumn="0" w:lastColumn="0" w:noHBand="0" w:noVBand="0"/>
       </w:tblPr>
       <w:tblGrid>
         <w:gridCol w:w="2707"/>
@@ -11222,7 +11320,7 @@
         <w:pStyle w:val="Titre1"/>
         <w:pageBreakBefore/>
       </w:pPr>
-      <w:bookmarkStart w:id="27" w:name="_Toc241882515"/>
+      <w:bookmarkStart w:id="27" w:name="_Toc242017382"/>
       <w:r>
         <w:lastRenderedPageBreak/>
         <w:t>9. Les notifications</w:t>
@@ -11233,7 +11331,7 @@
       <w:pPr>
         <w:pStyle w:val="Titre2"/>
       </w:pPr>
-      <w:bookmarkStart w:id="28" w:name="_Toc241882516"/>
+      <w:bookmarkStart w:id="28" w:name="_Toc242017383"/>
       <w:r>
         <w:t>9.1 Pour le client</w:t>
       </w:r>
@@ -11272,7 +11370,7 @@
           <w:left w:w="10" w:type="dxa"/>
           <w:right w:w="10" w:type="dxa"/>
         </w:tblCellMar>
-        <w:tblLook w:val="04A0" w:firstRow="1" w:lastRow="0" w:firstColumn="1" w:lastColumn="0" w:noHBand="0" w:noVBand="1"/>
+        <w:tblLook w:val="0000" w:firstRow="0" w:lastRow="0" w:firstColumn="0" w:lastColumn="0" w:noHBand="0" w:noVBand="0"/>
       </w:tblPr>
       <w:tblGrid>
         <w:gridCol w:w="3429"/>
@@ -11901,7 +11999,7 @@
       <w:pPr>
         <w:pStyle w:val="Titre2"/>
       </w:pPr>
-      <w:bookmarkStart w:id="29" w:name="_Toc241882517"/>
+      <w:bookmarkStart w:id="29" w:name="_Toc242017384"/>
       <w:r>
         <w:t>9.2 Pour l’équipe</w:t>
       </w:r>
@@ -11930,7 +12028,7 @@
           <w:left w:w="10" w:type="dxa"/>
           <w:right w:w="10" w:type="dxa"/>
         </w:tblCellMar>
-        <w:tblLook w:val="04A0" w:firstRow="1" w:lastRow="0" w:firstColumn="1" w:lastColumn="0" w:noHBand="0" w:noVBand="1"/>
+        <w:tblLook w:val="0000" w:firstRow="0" w:lastRow="0" w:firstColumn="0" w:lastColumn="0" w:noHBand="0" w:noVBand="0"/>
       </w:tblPr>
       <w:tblGrid>
         <w:gridCol w:w="4513"/>
@@ -12379,7 +12477,7 @@
         <w:pStyle w:val="Titre1"/>
         <w:pageBreakBefore/>
       </w:pPr>
-      <w:bookmarkStart w:id="30" w:name="_Toc241882518"/>
+      <w:bookmarkStart w:id="30" w:name="_Toc242017385"/>
       <w:r>
         <w:lastRenderedPageBreak/>
         <w:t>10. Contenus publics du site</w:t>
@@ -12429,7 +12527,7 @@
           <w:left w:w="10" w:type="dxa"/>
           <w:right w:w="10" w:type="dxa"/>
         </w:tblCellMar>
-        <w:tblLook w:val="04A0" w:firstRow="1" w:lastRow="0" w:firstColumn="1" w:lastColumn="0" w:noHBand="0" w:noVBand="1"/>
+        <w:tblLook w:val="0000" w:firstRow="0" w:lastRow="0" w:firstColumn="0" w:lastColumn="0" w:noHBand="0" w:noVBand="0"/>
       </w:tblPr>
       <w:tblGrid>
         <w:gridCol w:w="2888"/>
@@ -12815,7 +12913,7 @@
         <w:pStyle w:val="Titre1"/>
         <w:pageBreakBefore/>
       </w:pPr>
-      <w:bookmarkStart w:id="31" w:name="_Toc241882519"/>
+      <w:bookmarkStart w:id="31" w:name="_Toc242017386"/>
       <w:r>
         <w:lastRenderedPageBreak/>
         <w:t>11. Statistiques et exports</w:t>
@@ -12855,7 +12953,7 @@
           <w:left w:w="10" w:type="dxa"/>
           <w:right w:w="10" w:type="dxa"/>
         </w:tblCellMar>
-        <w:tblLook w:val="04A0" w:firstRow="1" w:lastRow="0" w:firstColumn="1" w:lastColumn="0" w:noHBand="0" w:noVBand="1"/>
+        <w:tblLook w:val="0000" w:firstRow="0" w:lastRow="0" w:firstColumn="0" w:lastColumn="0" w:noHBand="0" w:noVBand="0"/>
       </w:tblPr>
       <w:tblGrid>
         <w:gridCol w:w="2707"/>
@@ -13448,7 +13546,7 @@
         <w:pStyle w:val="Titre1"/>
         <w:pageBreakBefore/>
       </w:pPr>
-      <w:bookmarkStart w:id="32" w:name="_Toc241882520"/>
+      <w:bookmarkStart w:id="32" w:name="_Toc242017387"/>
       <w:r>
         <w:lastRenderedPageBreak/>
         <w:t>12. Sécurité et confidentialité</w:t>
@@ -13610,7 +13708,7 @@
         <w:pStyle w:val="Titre1"/>
         <w:pageBreakBefore/>
       </w:pPr>
-      <w:bookmarkStart w:id="33" w:name="_Toc241882521"/>
+      <w:bookmarkStart w:id="33" w:name="_Toc242017388"/>
       <w:r>
         <w:lastRenderedPageBreak/>
         <w:t>13. Administration</w:t>
@@ -13747,7 +13845,7 @@
       <w:pPr>
         <w:pStyle w:val="Titre2"/>
       </w:pPr>
-      <w:bookmarkStart w:id="34" w:name="_Toc241882522"/>
+      <w:bookmarkStart w:id="34" w:name="_Toc242017389"/>
       <w:r>
         <w:t>13.1 Mise en service : liste de contrôle</w:t>
       </w:r>
@@ -13899,7 +13997,7 @@
         <w:pStyle w:val="Titre1"/>
         <w:pageBreakBefore/>
       </w:pPr>
-      <w:bookmarkStart w:id="35" w:name="_Toc241882523"/>
+      <w:bookmarkStart w:id="35" w:name="_Toc242017390"/>
       <w:r>
         <w:lastRenderedPageBreak/>
         <w:t>14. État d’avancement</w:t>
@@ -13921,7 +14019,7 @@
           <w:left w:w="10" w:type="dxa"/>
           <w:right w:w="10" w:type="dxa"/>
         </w:tblCellMar>
-        <w:tblLook w:val="04A0" w:firstRow="1" w:lastRow="0" w:firstColumn="1" w:lastColumn="0" w:noHBand="0" w:noVBand="1"/>
+        <w:tblLook w:val="0000" w:firstRow="0" w:lastRow="0" w:firstColumn="0" w:lastColumn="0" w:noHBand="0" w:noVBand="0"/>
       </w:tblPr>
       <w:tblGrid>
         <w:gridCol w:w="4151"/>
@@ -14649,7 +14747,7 @@
                 <w:sz w:val="19"/>
                 <w:szCs w:val="19"/>
               </w:rPr>
-              <w:t>Facturation : liste, devis, annulations</w:t>
+              <w:t>Facturation : liste, devis, remises, annulations</w:t>
             </w:r>
           </w:p>
         </w:tc>
@@ -14707,7 +14805,7 @@
                 <w:sz w:val="19"/>
                 <w:szCs w:val="19"/>
               </w:rPr>
-              <w:t>Client : opérationnel. Pro : écran à construire</w:t>
+              <w:t>Opérationnel</w:t>
             </w:r>
           </w:p>
         </w:tc>
@@ -15032,7 +15130,7 @@
         <w:pStyle w:val="Titre1"/>
         <w:pageBreakBefore/>
       </w:pPr>
-      <w:bookmarkStart w:id="36" w:name="_Toc241882524"/>
+      <w:bookmarkStart w:id="36" w:name="_Toc242017391"/>
       <w:r>
         <w:lastRenderedPageBreak/>
         <w:t>Annexe — Repères techniques</w:t>
@@ -15054,7 +15152,7 @@
           <w:left w:w="10" w:type="dxa"/>
           <w:right w:w="10" w:type="dxa"/>
         </w:tblCellMar>
-        <w:tblLook w:val="04A0" w:firstRow="1" w:lastRow="0" w:firstColumn="1" w:lastColumn="0" w:noHBand="0" w:noVBand="1"/>
+        <w:tblLook w:val="0000" w:firstRow="0" w:lastRow="0" w:firstColumn="0" w:lastColumn="0" w:noHBand="0" w:noVBand="0"/>
       </w:tblPr>
       <w:tblGrid>
         <w:gridCol w:w="2527"/>
@@ -15615,7 +15713,7 @@
       <w:pPr>
         <w:pStyle w:val="Titre2"/>
       </w:pPr>
-      <w:bookmarkStart w:id="37" w:name="_Toc241882525"/>
+      <w:bookmarkStart w:id="37" w:name="_Toc242017392"/>
       <w:r>
         <w:t>Mode démonstration</w:t>
       </w:r>
@@ -15809,10 +15907,10 @@
 <file path=word/numbering.xml><?xml version="1.0" encoding="utf-8"?>
 <w:numbering xmlns:wpc="http://schemas.microsoft.com/office/word/2010/wordprocessingCanvas" xmlns:cx="http://schemas.microsoft.com/office/drawing/2014/chartex" xmlns:cx1="http://schemas.microsoft.com/office/drawing/2015/9/8/chartex" xmlns:cx2="http://schemas.microsoft.com/office/drawing/2015/10/21/chartex" xmlns:cx3="http://schemas.microsoft.com/office/drawing/2016/5/9/chartex" xmlns:cx4="http://schemas.microsoft.com/office/drawing/2016/5/10/chartex" xmlns:cx5="http://schemas.microsoft.com/office/drawing/2016/5/11/chartex" xmlns:cx6="http://schemas.microsoft.com/office/drawing/2016/5/12/chartex" xmlns:cx7="http://schemas.microsoft.com/office/drawing/2016/5/13/chartex" xmlns:cx8="http://schemas.microsoft.com/office/drawing/2016/5/14/chartex" xmlns:mc="http://schemas.openxmlformats.org/markup-compatibility/2006" xmlns:aink="http://schemas.microsoft.com/office/drawing/2016/ink" xmlns:am3d="http://schemas.microsoft.com/office/drawing/2017/model3d" xmlns:o="urn:schemas-microsoft-com:office:office" xmlns:oel="http://schemas.microsoft.com/office/2019/extlst" xmlns:r="http://schemas.openxmlformats.org/officeDocument/2006/relationships" xmlns:m="http://schemas.openxmlformats.org/officeDocument/2006/math" xmlns:v="urn:schemas-microsoft-com:vml" xmlns:wp14="http://schemas.microsoft.com/office/word/2010/wordprocessingDrawing" xmlns:wp="http://schemas.openxmlformats.org/drawingml/2006/wordprocessingDrawing" xmlns:w10="urn:schemas-microsoft-com:office:word" xmlns:w="http://schemas.openxmlformats.org/wordprocessingml/2006/main" xmlns:w14="http://schemas.microsoft.com/office/word/2010/wordml" xmlns:w15="http://schemas.microsoft.com/office/word/2012/wordml" xmlns:w16cex="http://schemas.microsoft.com/office/word/2018/wordml/cex" xmlns:w16cid="http://schemas.microsoft.com/office/word/2016/wordml/cid" xmlns:w16="http://schemas.microsoft.com/office/word/2018/wordml" xmlns:w16du="http://schemas.microsoft.com/office/word/2023/wordml/word16du" xmlns:w16sdtdh="http://schemas.microsoft.com/office/word/2020/wordml/sdtdatahash" xmlns:w16sdtfl="http://schemas.microsoft.com/office/word/2024/wordml/sdtformatlock" xmlns:w16se="http://schemas.microsoft.com/office/word/2015/wordml/symex" xmlns:wpg="http://schemas.microsoft.com/office/word/2010/wordprocessingGroup" xmlns:wpi="http://schemas.microsoft.com/office/word/2010/wordprocessingInk" xmlns:wne="http://schemas.microsoft.com/office/word/2006/wordml" xmlns:wps="http://schemas.microsoft.com/office/word/2010/wordprocessingShape" mc:Ignorable="w14 w15 w16se w16cid w16 w16cex w16sdtdh w16sdtfl w16du wp14">
   <w:abstractNum w:abstractNumId="0" w15:restartNumberingAfterBreak="0">
-    <w:nsid w:val="34CB7D9B"/>
+    <w:nsid w:val="0FE33106"/>
     <w:multiLevelType w:val="hybridMultilevel"/>
-    <w:tmpl w:val="CDF0F27C"/>
-    <w:lvl w:ilvl="0" w:tplc="24845CDE">
+    <w:tmpl w:val="F95AA470"/>
+    <w:lvl w:ilvl="0" w:tplc="DD8E28A0">
       <w:start w:val="1"/>
       <w:numFmt w:val="decimal"/>
       <w:lvlText w:val="%1."/>
@@ -15821,52 +15919,52 @@
         <w:ind w:left="360" w:hanging="300"/>
       </w:pPr>
     </w:lvl>
-    <w:lvl w:ilvl="1" w:tplc="32DEDFC4">
+    <w:lvl w:ilvl="1" w:tplc="E8E64774">
       <w:numFmt w:val="decimal"/>
       <w:lvlText w:val=""/>
       <w:lvlJc w:val="left"/>
     </w:lvl>
-    <w:lvl w:ilvl="2" w:tplc="0E483FB4">
+    <w:lvl w:ilvl="2" w:tplc="7BF029EA">
       <w:numFmt w:val="decimal"/>
       <w:lvlText w:val=""/>
       <w:lvlJc w:val="left"/>
     </w:lvl>
-    <w:lvl w:ilvl="3" w:tplc="4FE2E042">
+    <w:lvl w:ilvl="3" w:tplc="787818C2">
       <w:numFmt w:val="decimal"/>
       <w:lvlText w:val=""/>
       <w:lvlJc w:val="left"/>
     </w:lvl>
-    <w:lvl w:ilvl="4" w:tplc="DE08765E">
+    <w:lvl w:ilvl="4" w:tplc="36BE8294">
       <w:numFmt w:val="decimal"/>
       <w:lvlText w:val=""/>
       <w:lvlJc w:val="left"/>
     </w:lvl>
-    <w:lvl w:ilvl="5" w:tplc="65FAC598">
+    <w:lvl w:ilvl="5" w:tplc="CABAE856">
       <w:numFmt w:val="decimal"/>
       <w:lvlText w:val=""/>
       <w:lvlJc w:val="left"/>
     </w:lvl>
-    <w:lvl w:ilvl="6" w:tplc="04F68FFE">
+    <w:lvl w:ilvl="6" w:tplc="E0F0DD00">
       <w:numFmt w:val="decimal"/>
       <w:lvlText w:val=""/>
       <w:lvlJc w:val="left"/>
     </w:lvl>
-    <w:lvl w:ilvl="7" w:tplc="6F8CE0A6">
+    <w:lvl w:ilvl="7" w:tplc="C16A98A8">
       <w:numFmt w:val="decimal"/>
       <w:lvlText w:val=""/>
       <w:lvlJc w:val="left"/>
     </w:lvl>
-    <w:lvl w:ilvl="8" w:tplc="EE8CEFF8">
+    <w:lvl w:ilvl="8" w:tplc="F2564EB8">
       <w:numFmt w:val="decimal"/>
       <w:lvlText w:val=""/>
       <w:lvlJc w:val="left"/>
     </w:lvl>
   </w:abstractNum>
   <w:abstractNum w:abstractNumId="1" w15:restartNumberingAfterBreak="0">
-    <w:nsid w:val="4E9B59A4"/>
+    <w:nsid w:val="2F435284"/>
     <w:multiLevelType w:val="hybridMultilevel"/>
-    <w:tmpl w:val="038EB794"/>
-    <w:lvl w:ilvl="0" w:tplc="3CF85860" w:tentative="1">
+    <w:tmpl w:val="38208DEA"/>
+    <w:lvl w:ilvl="0" w:tplc="B7CCC67E" w:tentative="1">
       <w:start w:val="1"/>
       <w:numFmt w:val="bullet"/>
       <w:lvlText w:val="●"/>
@@ -15875,7 +15973,7 @@
         <w:ind w:left="720" w:hanging="360"/>
       </w:pPr>
     </w:lvl>
-    <w:lvl w:ilvl="1" w:tplc="BEA40F84" w:tentative="1">
+    <w:lvl w:ilvl="1" w:tplc="70807B50" w:tentative="1">
       <w:start w:val="1"/>
       <w:numFmt w:val="bullet"/>
       <w:lvlText w:val="○"/>
@@ -15884,7 +15982,7 @@
         <w:ind w:left="1440" w:hanging="360"/>
       </w:pPr>
     </w:lvl>
-    <w:lvl w:ilvl="2" w:tplc="796EE5B6" w:tentative="1">
+    <w:lvl w:ilvl="2" w:tplc="455EBAE6" w:tentative="1">
       <w:start w:val="1"/>
       <w:numFmt w:val="bullet"/>
       <w:lvlText w:val="■"/>
@@ -15893,7 +15991,7 @@
         <w:ind w:left="2160" w:hanging="360"/>
       </w:pPr>
     </w:lvl>
-    <w:lvl w:ilvl="3" w:tplc="FEA6BE2E" w:tentative="1">
+    <w:lvl w:ilvl="3" w:tplc="87F8A336" w:tentative="1">
       <w:start w:val="1"/>
       <w:numFmt w:val="bullet"/>
       <w:lvlText w:val="●"/>
@@ -15902,7 +16000,7 @@
         <w:ind w:left="2880" w:hanging="360"/>
       </w:pPr>
     </w:lvl>
-    <w:lvl w:ilvl="4" w:tplc="7FE01BD2" w:tentative="1">
+    <w:lvl w:ilvl="4" w:tplc="F1447CB4" w:tentative="1">
       <w:start w:val="1"/>
       <w:numFmt w:val="bullet"/>
       <w:lvlText w:val="○"/>
@@ -15911,7 +16009,7 @@
         <w:ind w:left="3600" w:hanging="360"/>
       </w:pPr>
     </w:lvl>
-    <w:lvl w:ilvl="5" w:tplc="D124F8BE" w:tentative="1">
+    <w:lvl w:ilvl="5" w:tplc="95F66B18" w:tentative="1">
       <w:start w:val="1"/>
       <w:numFmt w:val="bullet"/>
       <w:lvlText w:val="■"/>
@@ -15920,7 +16018,7 @@
         <w:ind w:left="4320" w:hanging="360"/>
       </w:pPr>
     </w:lvl>
-    <w:lvl w:ilvl="6" w:tplc="468A7724" w:tentative="1">
+    <w:lvl w:ilvl="6" w:tplc="DC7ACC88" w:tentative="1">
       <w:start w:val="1"/>
       <w:numFmt w:val="bullet"/>
       <w:lvlText w:val="●"/>
@@ -15929,7 +16027,7 @@
         <w:ind w:left="5040" w:hanging="360"/>
       </w:pPr>
     </w:lvl>
-    <w:lvl w:ilvl="7" w:tplc="FE78F2CA" w:tentative="1">
+    <w:lvl w:ilvl="7" w:tplc="3AA8CD46" w:tentative="1">
       <w:start w:val="1"/>
       <w:numFmt w:val="bullet"/>
       <w:lvlText w:val="●"/>
@@ -15938,7 +16036,7 @@
         <w:ind w:left="5760" w:hanging="360"/>
       </w:pPr>
     </w:lvl>
-    <w:lvl w:ilvl="8" w:tplc="B308D686" w:tentative="1">
+    <w:lvl w:ilvl="8" w:tplc="83C233B2" w:tentative="1">
       <w:start w:val="1"/>
       <w:numFmt w:val="bullet"/>
       <w:lvlText w:val="●"/>
@@ -15949,10 +16047,10 @@
     </w:lvl>
   </w:abstractNum>
   <w:abstractNum w:abstractNumId="2" w15:restartNumberingAfterBreak="0">
-    <w:nsid w:val="51FF62BA"/>
+    <w:nsid w:val="4BD74BE4"/>
     <w:multiLevelType w:val="hybridMultilevel"/>
-    <w:tmpl w:val="7B281C32"/>
-    <w:lvl w:ilvl="0" w:tplc="25A801D6">
+    <w:tmpl w:val="82160E32"/>
+    <w:lvl w:ilvl="0" w:tplc="EF8C7076">
       <w:start w:val="1"/>
       <w:numFmt w:val="decimal"/>
       <w:lvlText w:val="%1."/>
@@ -15961,185 +16059,185 @@
         <w:ind w:left="360" w:hanging="300"/>
       </w:pPr>
     </w:lvl>
-    <w:lvl w:ilvl="1" w:tplc="D8302372">
+    <w:lvl w:ilvl="1" w:tplc="DF902876">
       <w:numFmt w:val="decimal"/>
       <w:lvlText w:val=""/>
       <w:lvlJc w:val="left"/>
     </w:lvl>
-    <w:lvl w:ilvl="2" w:tplc="4CDAC128">
+    <w:lvl w:ilvl="2" w:tplc="A7609E1E">
       <w:numFmt w:val="decimal"/>
       <w:lvlText w:val=""/>
       <w:lvlJc w:val="left"/>
     </w:lvl>
-    <w:lvl w:ilvl="3" w:tplc="D72C6E72">
+    <w:lvl w:ilvl="3" w:tplc="91726E9A">
       <w:numFmt w:val="decimal"/>
       <w:lvlText w:val=""/>
       <w:lvlJc w:val="left"/>
     </w:lvl>
-    <w:lvl w:ilvl="4" w:tplc="AED24744">
+    <w:lvl w:ilvl="4" w:tplc="AACA70AE">
       <w:numFmt w:val="decimal"/>
       <w:lvlText w:val=""/>
       <w:lvlJc w:val="left"/>
     </w:lvl>
-    <w:lvl w:ilvl="5" w:tplc="7D9A198A">
+    <w:lvl w:ilvl="5" w:tplc="5462A29C">
       <w:numFmt w:val="decimal"/>
       <w:lvlText w:val=""/>
       <w:lvlJc w:val="left"/>
     </w:lvl>
-    <w:lvl w:ilvl="6" w:tplc="1BCE2742">
+    <w:lvl w:ilvl="6" w:tplc="C966C4EC">
       <w:numFmt w:val="decimal"/>
       <w:lvlText w:val=""/>
       <w:lvlJc w:val="left"/>
     </w:lvl>
-    <w:lvl w:ilvl="7" w:tplc="9718F5DA">
+    <w:lvl w:ilvl="7" w:tplc="11DED392">
       <w:numFmt w:val="decimal"/>
       <w:lvlText w:val=""/>
       <w:lvlJc w:val="left"/>
     </w:lvl>
-    <w:lvl w:ilvl="8" w:tplc="612684A0">
+    <w:lvl w:ilvl="8" w:tplc="255A74FC">
       <w:numFmt w:val="decimal"/>
       <w:lvlText w:val=""/>
       <w:lvlJc w:val="left"/>
     </w:lvl>
   </w:abstractNum>
   <w:abstractNum w:abstractNumId="3" w15:restartNumberingAfterBreak="0">
-    <w:nsid w:val="5D2D6488"/>
+    <w:nsid w:val="65A93E8C"/>
     <w:multiLevelType w:val="hybridMultilevel"/>
-    <w:tmpl w:val="E104DEA4"/>
-    <w:lvl w:ilvl="0" w:tplc="EA64ACDC">
+    <w:tmpl w:val="65B659C6"/>
+    <w:lvl w:ilvl="0" w:tplc="6622C23E">
       <w:start w:val="1"/>
-      <w:numFmt w:val="decimal"/>
-      <w:lvlText w:val="%1."/>
+      <w:numFmt w:val="bullet"/>
+      <w:lvlText w:val="•"/>
       <w:lvlJc w:val="left"/>
       <w:pPr>
-        <w:ind w:left="360" w:hanging="300"/>
+        <w:ind w:left="360" w:hanging="240"/>
       </w:pPr>
     </w:lvl>
-    <w:lvl w:ilvl="1" w:tplc="F28EDBCE">
+    <w:lvl w:ilvl="1" w:tplc="7152CC28" w:tentative="1">
+      <w:start w:val="1"/>
+      <w:numFmt w:val="bullet"/>
+      <w:lvlText w:val="–"/>
+      <w:lvlJc w:val="left"/>
+      <w:pPr>
+        <w:ind w:left="720" w:hanging="240"/>
+      </w:pPr>
+    </w:lvl>
+    <w:lvl w:ilvl="2" w:tplc="A84CFA5C">
       <w:numFmt w:val="decimal"/>
       <w:lvlText w:val=""/>
       <w:lvlJc w:val="left"/>
     </w:lvl>
-    <w:lvl w:ilvl="2" w:tplc="F91AE534">
+    <w:lvl w:ilvl="3" w:tplc="690C5DF4">
       <w:numFmt w:val="decimal"/>
       <w:lvlText w:val=""/>
       <w:lvlJc w:val="left"/>
     </w:lvl>
-    <w:lvl w:ilvl="3" w:tplc="AF527EF2">
+    <w:lvl w:ilvl="4" w:tplc="EC6A57DA">
       <w:numFmt w:val="decimal"/>
       <w:lvlText w:val=""/>
       <w:lvlJc w:val="left"/>
     </w:lvl>
-    <w:lvl w:ilvl="4" w:tplc="7ABE2B5C">
+    <w:lvl w:ilvl="5" w:tplc="A4E0CB16">
       <w:numFmt w:val="decimal"/>
       <w:lvlText w:val=""/>
       <w:lvlJc w:val="left"/>
     </w:lvl>
-    <w:lvl w:ilvl="5" w:tplc="C36A5382">
+    <w:lvl w:ilvl="6" w:tplc="B6A69628">
       <w:numFmt w:val="decimal"/>
       <w:lvlText w:val=""/>
       <w:lvlJc w:val="left"/>
     </w:lvl>
-    <w:lvl w:ilvl="6" w:tplc="2C0052F8">
+    <w:lvl w:ilvl="7" w:tplc="1B26C8CC">
       <w:numFmt w:val="decimal"/>
       <w:lvlText w:val=""/>
       <w:lvlJc w:val="left"/>
     </w:lvl>
-    <w:lvl w:ilvl="7" w:tplc="7DB4F63A">
-      <w:numFmt w:val="decimal"/>
-      <w:lvlText w:val=""/>
-      <w:lvlJc w:val="left"/>
-    </w:lvl>
-    <w:lvl w:ilvl="8" w:tplc="C8C02348">
+    <w:lvl w:ilvl="8" w:tplc="EA904F4E">
       <w:numFmt w:val="decimal"/>
       <w:lvlText w:val=""/>
       <w:lvlJc w:val="left"/>
     </w:lvl>
   </w:abstractNum>
   <w:abstractNum w:abstractNumId="4" w15:restartNumberingAfterBreak="0">
-    <w:nsid w:val="606B431C"/>
+    <w:nsid w:val="7E752E4B"/>
     <w:multiLevelType w:val="hybridMultilevel"/>
-    <w:tmpl w:val="B31836C0"/>
-    <w:lvl w:ilvl="0" w:tplc="ACAA8CF4">
+    <w:tmpl w:val="3946A258"/>
+    <w:lvl w:ilvl="0" w:tplc="9ADC5FB4">
       <w:start w:val="1"/>
-      <w:numFmt w:val="bullet"/>
-      <w:lvlText w:val="•"/>
+      <w:numFmt w:val="decimal"/>
+      <w:lvlText w:val="%1."/>
       <w:lvlJc w:val="left"/>
       <w:pPr>
-        <w:ind w:left="360" w:hanging="240"/>
+        <w:ind w:left="360" w:hanging="300"/>
       </w:pPr>
     </w:lvl>
-    <w:lvl w:ilvl="1" w:tplc="0AD62B28" w:tentative="1">
-      <w:start w:val="1"/>
-      <w:numFmt w:val="bullet"/>
-      <w:lvlText w:val="–"/>
-      <w:lvlJc w:val="left"/>
-      <w:pPr>
-        <w:ind w:left="720" w:hanging="240"/>
-      </w:pPr>
-    </w:lvl>
-    <w:lvl w:ilvl="2" w:tplc="1560785A">
+    <w:lvl w:ilvl="1" w:tplc="09DA47A8">
       <w:numFmt w:val="decimal"/>
       <w:lvlText w:val=""/>
       <w:lvlJc w:val="left"/>
     </w:lvl>
-    <w:lvl w:ilvl="3" w:tplc="779AD264">
+    <w:lvl w:ilvl="2" w:tplc="43D26546">
       <w:numFmt w:val="decimal"/>
       <w:lvlText w:val=""/>
       <w:lvlJc w:val="left"/>
     </w:lvl>
-    <w:lvl w:ilvl="4" w:tplc="FC226B2A">
+    <w:lvl w:ilvl="3" w:tplc="CB8C3EF8">
       <w:numFmt w:val="decimal"/>
       <w:lvlText w:val=""/>
       <w:lvlJc w:val="left"/>
     </w:lvl>
-    <w:lvl w:ilvl="5" w:tplc="C8EC80DA">
+    <w:lvl w:ilvl="4" w:tplc="2844292E">
       <w:numFmt w:val="decimal"/>
       <w:lvlText w:val=""/>
       <w:lvlJc w:val="left"/>
     </w:lvl>
-    <w:lvl w:ilvl="6" w:tplc="B4D4DEEE">
+    <w:lvl w:ilvl="5" w:tplc="17627FA6">
       <w:numFmt w:val="decimal"/>
       <w:lvlText w:val=""/>
       <w:lvlJc w:val="left"/>
     </w:lvl>
-    <w:lvl w:ilvl="7" w:tplc="CB46B83E">
+    <w:lvl w:ilvl="6" w:tplc="A26C8E70">
       <w:numFmt w:val="decimal"/>
       <w:lvlText w:val=""/>
       <w:lvlJc w:val="left"/>
     </w:lvl>
-    <w:lvl w:ilvl="8" w:tplc="B21442A8">
+    <w:lvl w:ilvl="7" w:tplc="F502002A">
+      <w:numFmt w:val="decimal"/>
+      <w:lvlText w:val=""/>
+      <w:lvlJc w:val="left"/>
+    </w:lvl>
+    <w:lvl w:ilvl="8" w:tplc="A4748ADE">
       <w:numFmt w:val="decimal"/>
       <w:lvlText w:val=""/>
       <w:lvlJc w:val="left"/>
     </w:lvl>
   </w:abstractNum>
-  <w:num w:numId="1" w16cid:durableId="237525010">
+  <w:num w:numId="1" w16cid:durableId="32928760">
     <w:abstractNumId w:val="1"/>
     <w:lvlOverride w:ilvl="0">
       <w:startOverride w:val="1"/>
     </w:lvlOverride>
   </w:num>
-  <w:num w:numId="2" w16cid:durableId="164057759">
+  <w:num w:numId="2" w16cid:durableId="1855219564">
+    <w:abstractNumId w:val="3"/>
+    <w:lvlOverride w:ilvl="0">
+      <w:startOverride w:val="1"/>
+    </w:lvlOverride>
+  </w:num>
+  <w:num w:numId="3" w16cid:durableId="1258490277">
     <w:abstractNumId w:val="4"/>
     <w:lvlOverride w:ilvl="0">
       <w:startOverride w:val="1"/>
     </w:lvlOverride>
   </w:num>
-  <w:num w:numId="3" w16cid:durableId="1562786339">
-    <w:abstractNumId w:val="0"/>
-    <w:lvlOverride w:ilvl="0">
-      <w:startOverride w:val="1"/>
-    </w:lvlOverride>
-  </w:num>
-  <w:num w:numId="4" w16cid:durableId="493954630">
+  <w:num w:numId="4" w16cid:durableId="820149586">
     <w:abstractNumId w:val="2"/>
     <w:lvlOverride w:ilvl="0">
       <w:startOverride w:val="1"/>
     </w:lvlOverride>
   </w:num>
-  <w:num w:numId="5" w16cid:durableId="1816604148">
-    <w:abstractNumId w:val="3"/>
+  <w:num w:numId="5" w16cid:durableId="2073497787">
+    <w:abstractNumId w:val="0"/>
     <w:lvlOverride w:ilvl="0">
       <w:startOverride w:val="1"/>
     </w:lvlOverride>
@@ -16785,7 +16883,7 @@
     <w:autoRedefine/>
     <w:uiPriority w:val="39"/>
     <w:unhideWhenUsed/>
-    <w:rsid w:val="009215DD"/>
+    <w:rsid w:val="00FB4EA0"/>
     <w:pPr>
       <w:spacing w:after="100"/>
     </w:pPr>
@@ -16797,7 +16895,7 @@
     <w:autoRedefine/>
     <w:uiPriority w:val="39"/>
     <w:unhideWhenUsed/>
-    <w:rsid w:val="009215DD"/>
+    <w:rsid w:val="00FB4EA0"/>
     <w:pPr>
       <w:spacing w:after="100"/>
       <w:ind w:left="210"/>

</xml_diff>

<commit_message>
Écran Statistiques du manager
- Période : 7 jours, 30 jours, 90 jours, 12 mois ou dates libres ;
  regroupement automatique par jour, semaine ou mois
- Indicateurs : chiffre d'affaires encaissé, rendez-vous, taux
  d'annulation, nouveaux clients, clients récurrents, véhicules traités
- Chiffre d'affaires dans le temps (colonnes, périodes vides incluses),
  infobulle au survol et au clavier, vue tableau
- Encaissements par moyen de paiement, prestations populaires,
  rendez-vous par statut ; exports CSV
- Une seule teinte (or #B87D24, contraste validé >= 3:1 sur blanc) ;
  aucun débordement de 320 à 1280 px
- README et guide de fonctionnement à jour

Co-Authored-By: Claude Opus 5.5 <noreply@anthropic.com>
</commit_message>
<xml_diff>
--- a/docs/guide-fonctionnement.docx
+++ b/docs/guide-fonctionnement.docx
@@ -109,7 +109,7 @@
     <w:sdt>
       <w:sdtPr>
         <w:alias w:val="Sommaire"/>
-        <w:id w:val="-164858589"/>
+        <w:id w:val="734356676"/>
       </w:sdtPr>
       <w:sdtEndPr/>
       <w:sdtContent>
@@ -138,7 +138,7 @@
           <w:r>
             <w:fldChar w:fldCharType="separate"/>
           </w:r>
-          <w:hyperlink w:anchor="_Toc242017355" w:history="1">
+          <w:hyperlink w:anchor="_Toc242018178" w:history="1">
             <w:r>
               <w:rPr>
                 <w:rStyle w:val="Lienhypertexte"/>
@@ -162,7 +162,7 @@
               <w:rPr>
                 <w:noProof/>
               </w:rPr>
-              <w:instrText xml:space="preserve"> PAGEREF _Toc242017355 \h </w:instrText>
+              <w:instrText xml:space="preserve"> PAGEREF _Toc242018178 \h </w:instrText>
             </w:r>
             <w:r>
               <w:rPr>
@@ -205,7 +205,7 @@
               <w14:ligatures w14:val="standardContextual"/>
             </w:rPr>
           </w:pPr>
-          <w:hyperlink w:anchor="_Toc242017356" w:history="1">
+          <w:hyperlink w:anchor="_Toc242018179" w:history="1">
             <w:r>
               <w:rPr>
                 <w:rStyle w:val="Lienhypertexte"/>
@@ -229,7 +229,7 @@
               <w:rPr>
                 <w:noProof/>
               </w:rPr>
-              <w:instrText xml:space="preserve"> PAGEREF _Toc242017356 \h </w:instrText>
+              <w:instrText xml:space="preserve"> PAGEREF _Toc242018179 \h </w:instrText>
             </w:r>
             <w:r>
               <w:rPr>
@@ -272,7 +272,7 @@
               <w14:ligatures w14:val="standardContextual"/>
             </w:rPr>
           </w:pPr>
-          <w:hyperlink w:anchor="_Toc242017357" w:history="1">
+          <w:hyperlink w:anchor="_Toc242018180" w:history="1">
             <w:r>
               <w:rPr>
                 <w:rStyle w:val="Lienhypertexte"/>
@@ -296,7 +296,7 @@
               <w:rPr>
                 <w:noProof/>
               </w:rPr>
-              <w:instrText xml:space="preserve"> PAGEREF _Toc242017357 \h </w:instrText>
+              <w:instrText xml:space="preserve"> PAGEREF _Toc242018180 \h </w:instrText>
             </w:r>
             <w:r>
               <w:rPr>
@@ -339,7 +339,7 @@
               <w14:ligatures w14:val="standardContextual"/>
             </w:rPr>
           </w:pPr>
-          <w:hyperlink w:anchor="_Toc242017358" w:history="1">
+          <w:hyperlink w:anchor="_Toc242018181" w:history="1">
             <w:r>
               <w:rPr>
                 <w:rStyle w:val="Lienhypertexte"/>
@@ -363,7 +363,7 @@
               <w:rPr>
                 <w:noProof/>
               </w:rPr>
-              <w:instrText xml:space="preserve"> PAGEREF _Toc242017358 \h </w:instrText>
+              <w:instrText xml:space="preserve"> PAGEREF _Toc242018181 \h </w:instrText>
             </w:r>
             <w:r>
               <w:rPr>
@@ -406,7 +406,7 @@
               <w14:ligatures w14:val="standardContextual"/>
             </w:rPr>
           </w:pPr>
-          <w:hyperlink w:anchor="_Toc242017359" w:history="1">
+          <w:hyperlink w:anchor="_Toc242018182" w:history="1">
             <w:r>
               <w:rPr>
                 <w:rStyle w:val="Lienhypertexte"/>
@@ -430,7 +430,7 @@
               <w:rPr>
                 <w:noProof/>
               </w:rPr>
-              <w:instrText xml:space="preserve"> PAGEREF _Toc242017359 \h </w:instrText>
+              <w:instrText xml:space="preserve"> PAGEREF _Toc242018182 \h </w:instrText>
             </w:r>
             <w:r>
               <w:rPr>
@@ -473,7 +473,7 @@
               <w14:ligatures w14:val="standardContextual"/>
             </w:rPr>
           </w:pPr>
-          <w:hyperlink w:anchor="_Toc242017360" w:history="1">
+          <w:hyperlink w:anchor="_Toc242018183" w:history="1">
             <w:r>
               <w:rPr>
                 <w:rStyle w:val="Lienhypertexte"/>
@@ -497,7 +497,7 @@
               <w:rPr>
                 <w:noProof/>
               </w:rPr>
-              <w:instrText xml:space="preserve"> PAGEREF _Toc242017360 \h </w:instrText>
+              <w:instrText xml:space="preserve"> PAGEREF _Toc242018183 \h </w:instrText>
             </w:r>
             <w:r>
               <w:rPr>
@@ -540,7 +540,7 @@
               <w14:ligatures w14:val="standardContextual"/>
             </w:rPr>
           </w:pPr>
-          <w:hyperlink w:anchor="_Toc242017361" w:history="1">
+          <w:hyperlink w:anchor="_Toc242018184" w:history="1">
             <w:r>
               <w:rPr>
                 <w:rStyle w:val="Lienhypertexte"/>
@@ -564,7 +564,7 @@
               <w:rPr>
                 <w:noProof/>
               </w:rPr>
-              <w:instrText xml:space="preserve"> PAGEREF _Toc242017361 \h </w:instrText>
+              <w:instrText xml:space="preserve"> PAGEREF _Toc242018184 \h </w:instrText>
             </w:r>
             <w:r>
               <w:rPr>
@@ -607,7 +607,7 @@
               <w14:ligatures w14:val="standardContextual"/>
             </w:rPr>
           </w:pPr>
-          <w:hyperlink w:anchor="_Toc242017362" w:history="1">
+          <w:hyperlink w:anchor="_Toc242018185" w:history="1">
             <w:r>
               <w:rPr>
                 <w:rStyle w:val="Lienhypertexte"/>
@@ -631,7 +631,7 @@
               <w:rPr>
                 <w:noProof/>
               </w:rPr>
-              <w:instrText xml:space="preserve"> PAGEREF _Toc242017362 \h </w:instrText>
+              <w:instrText xml:space="preserve"> PAGEREF _Toc242018185 \h </w:instrText>
             </w:r>
             <w:r>
               <w:rPr>
@@ -674,7 +674,7 @@
               <w14:ligatures w14:val="standardContextual"/>
             </w:rPr>
           </w:pPr>
-          <w:hyperlink w:anchor="_Toc242017363" w:history="1">
+          <w:hyperlink w:anchor="_Toc242018186" w:history="1">
             <w:r>
               <w:rPr>
                 <w:rStyle w:val="Lienhypertexte"/>
@@ -698,7 +698,7 @@
               <w:rPr>
                 <w:noProof/>
               </w:rPr>
-              <w:instrText xml:space="preserve"> PAGEREF _Toc242017363 \h </w:instrText>
+              <w:instrText xml:space="preserve"> PAGEREF _Toc242018186 \h </w:instrText>
             </w:r>
             <w:r>
               <w:rPr>
@@ -741,7 +741,7 @@
               <w14:ligatures w14:val="standardContextual"/>
             </w:rPr>
           </w:pPr>
-          <w:hyperlink w:anchor="_Toc242017364" w:history="1">
+          <w:hyperlink w:anchor="_Toc242018187" w:history="1">
             <w:r>
               <w:rPr>
                 <w:rStyle w:val="Lienhypertexte"/>
@@ -765,7 +765,7 @@
               <w:rPr>
                 <w:noProof/>
               </w:rPr>
-              <w:instrText xml:space="preserve"> PAGEREF _Toc242017364 \h </w:instrText>
+              <w:instrText xml:space="preserve"> PAGEREF _Toc242018187 \h </w:instrText>
             </w:r>
             <w:r>
               <w:rPr>
@@ -808,7 +808,7 @@
               <w14:ligatures w14:val="standardContextual"/>
             </w:rPr>
           </w:pPr>
-          <w:hyperlink w:anchor="_Toc242017365" w:history="1">
+          <w:hyperlink w:anchor="_Toc242018188" w:history="1">
             <w:r>
               <w:rPr>
                 <w:rStyle w:val="Lienhypertexte"/>
@@ -832,7 +832,7 @@
               <w:rPr>
                 <w:noProof/>
               </w:rPr>
-              <w:instrText xml:space="preserve"> PAGEREF _Toc242017365 \h </w:instrText>
+              <w:instrText xml:space="preserve"> PAGEREF _Toc242018188 \h </w:instrText>
             </w:r>
             <w:r>
               <w:rPr>
@@ -875,7 +875,7 @@
               <w14:ligatures w14:val="standardContextual"/>
             </w:rPr>
           </w:pPr>
-          <w:hyperlink w:anchor="_Toc242017366" w:history="1">
+          <w:hyperlink w:anchor="_Toc242018189" w:history="1">
             <w:r>
               <w:rPr>
                 <w:rStyle w:val="Lienhypertexte"/>
@@ -899,7 +899,7 @@
               <w:rPr>
                 <w:noProof/>
               </w:rPr>
-              <w:instrText xml:space="preserve"> PAGEREF _Toc242017366 \h </w:instrText>
+              <w:instrText xml:space="preserve"> PAGEREF _Toc242018189 \h </w:instrText>
             </w:r>
             <w:r>
               <w:rPr>
@@ -942,7 +942,7 @@
               <w14:ligatures w14:val="standardContextual"/>
             </w:rPr>
           </w:pPr>
-          <w:hyperlink w:anchor="_Toc242017367" w:history="1">
+          <w:hyperlink w:anchor="_Toc242018190" w:history="1">
             <w:r>
               <w:rPr>
                 <w:rStyle w:val="Lienhypertexte"/>
@@ -966,7 +966,7 @@
               <w:rPr>
                 <w:noProof/>
               </w:rPr>
-              <w:instrText xml:space="preserve"> PAGEREF _Toc242017367 \h </w:instrText>
+              <w:instrText xml:space="preserve"> PAGEREF _Toc242018190 \h </w:instrText>
             </w:r>
             <w:r>
               <w:rPr>
@@ -1009,7 +1009,7 @@
               <w14:ligatures w14:val="standardContextual"/>
             </w:rPr>
           </w:pPr>
-          <w:hyperlink w:anchor="_Toc242017368" w:history="1">
+          <w:hyperlink w:anchor="_Toc242018191" w:history="1">
             <w:r>
               <w:rPr>
                 <w:rStyle w:val="Lienhypertexte"/>
@@ -1033,7 +1033,7 @@
               <w:rPr>
                 <w:noProof/>
               </w:rPr>
-              <w:instrText xml:space="preserve"> PAGEREF _Toc242017368 \h </w:instrText>
+              <w:instrText xml:space="preserve"> PAGEREF _Toc242018191 \h </w:instrText>
             </w:r>
             <w:r>
               <w:rPr>
@@ -1076,7 +1076,7 @@
               <w14:ligatures w14:val="standardContextual"/>
             </w:rPr>
           </w:pPr>
-          <w:hyperlink w:anchor="_Toc242017369" w:history="1">
+          <w:hyperlink w:anchor="_Toc242018192" w:history="1">
             <w:r>
               <w:rPr>
                 <w:rStyle w:val="Lienhypertexte"/>
@@ -1100,7 +1100,7 @@
               <w:rPr>
                 <w:noProof/>
               </w:rPr>
-              <w:instrText xml:space="preserve"> PAGEREF _Toc242017369 \h </w:instrText>
+              <w:instrText xml:space="preserve"> PAGEREF _Toc242018192 \h </w:instrText>
             </w:r>
             <w:r>
               <w:rPr>
@@ -1143,7 +1143,7 @@
               <w14:ligatures w14:val="standardContextual"/>
             </w:rPr>
           </w:pPr>
-          <w:hyperlink w:anchor="_Toc242017370" w:history="1">
+          <w:hyperlink w:anchor="_Toc242018193" w:history="1">
             <w:r>
               <w:rPr>
                 <w:rStyle w:val="Lienhypertexte"/>
@@ -1167,7 +1167,7 @@
               <w:rPr>
                 <w:noProof/>
               </w:rPr>
-              <w:instrText xml:space="preserve"> PAGEREF _Toc242017370 \h </w:instrText>
+              <w:instrText xml:space="preserve"> PAGEREF _Toc242018193 \h </w:instrText>
             </w:r>
             <w:r>
               <w:rPr>
@@ -1210,7 +1210,7 @@
               <w14:ligatures w14:val="standardContextual"/>
             </w:rPr>
           </w:pPr>
-          <w:hyperlink w:anchor="_Toc242017371" w:history="1">
+          <w:hyperlink w:anchor="_Toc242018194" w:history="1">
             <w:r>
               <w:rPr>
                 <w:rStyle w:val="Lienhypertexte"/>
@@ -1234,7 +1234,7 @@
               <w:rPr>
                 <w:noProof/>
               </w:rPr>
-              <w:instrText xml:space="preserve"> PAGEREF _Toc242017371 \h </w:instrText>
+              <w:instrText xml:space="preserve"> PAGEREF _Toc242018194 \h </w:instrText>
             </w:r>
             <w:r>
               <w:rPr>
@@ -1277,7 +1277,7 @@
               <w14:ligatures w14:val="standardContextual"/>
             </w:rPr>
           </w:pPr>
-          <w:hyperlink w:anchor="_Toc242017372" w:history="1">
+          <w:hyperlink w:anchor="_Toc242018195" w:history="1">
             <w:r>
               <w:rPr>
                 <w:rStyle w:val="Lienhypertexte"/>
@@ -1301,7 +1301,7 @@
               <w:rPr>
                 <w:noProof/>
               </w:rPr>
-              <w:instrText xml:space="preserve"> PAGEREF _Toc242017372 \h </w:instrText>
+              <w:instrText xml:space="preserve"> PAGEREF _Toc242018195 \h </w:instrText>
             </w:r>
             <w:r>
               <w:rPr>
@@ -1344,7 +1344,7 @@
               <w14:ligatures w14:val="standardContextual"/>
             </w:rPr>
           </w:pPr>
-          <w:hyperlink w:anchor="_Toc242017373" w:history="1">
+          <w:hyperlink w:anchor="_Toc242018196" w:history="1">
             <w:r>
               <w:rPr>
                 <w:rStyle w:val="Lienhypertexte"/>
@@ -1368,7 +1368,7 @@
               <w:rPr>
                 <w:noProof/>
               </w:rPr>
-              <w:instrText xml:space="preserve"> PAGEREF _Toc242017373 \h </w:instrText>
+              <w:instrText xml:space="preserve"> PAGEREF _Toc242018196 \h </w:instrText>
             </w:r>
             <w:r>
               <w:rPr>
@@ -1411,7 +1411,7 @@
               <w14:ligatures w14:val="standardContextual"/>
             </w:rPr>
           </w:pPr>
-          <w:hyperlink w:anchor="_Toc242017374" w:history="1">
+          <w:hyperlink w:anchor="_Toc242018197" w:history="1">
             <w:r>
               <w:rPr>
                 <w:rStyle w:val="Lienhypertexte"/>
@@ -1435,7 +1435,7 @@
               <w:rPr>
                 <w:noProof/>
               </w:rPr>
-              <w:instrText xml:space="preserve"> PAGEREF _Toc242017374 \h </w:instrText>
+              <w:instrText xml:space="preserve"> PAGEREF _Toc242018197 \h </w:instrText>
             </w:r>
             <w:r>
               <w:rPr>
@@ -1478,7 +1478,7 @@
               <w14:ligatures w14:val="standardContextual"/>
             </w:rPr>
           </w:pPr>
-          <w:hyperlink w:anchor="_Toc242017375" w:history="1">
+          <w:hyperlink w:anchor="_Toc242018198" w:history="1">
             <w:r>
               <w:rPr>
                 <w:rStyle w:val="Lienhypertexte"/>
@@ -1502,7 +1502,7 @@
               <w:rPr>
                 <w:noProof/>
               </w:rPr>
-              <w:instrText xml:space="preserve"> PAGEREF _Toc242017375 \h </w:instrText>
+              <w:instrText xml:space="preserve"> PAGEREF _Toc242018198 \h </w:instrText>
             </w:r>
             <w:r>
               <w:rPr>
@@ -1545,7 +1545,7 @@
               <w14:ligatures w14:val="standardContextual"/>
             </w:rPr>
           </w:pPr>
-          <w:hyperlink w:anchor="_Toc242017376" w:history="1">
+          <w:hyperlink w:anchor="_Toc242018199" w:history="1">
             <w:r>
               <w:rPr>
                 <w:rStyle w:val="Lienhypertexte"/>
@@ -1569,7 +1569,7 @@
               <w:rPr>
                 <w:noProof/>
               </w:rPr>
-              <w:instrText xml:space="preserve"> PAGEREF _Toc242017376 \h </w:instrText>
+              <w:instrText xml:space="preserve"> PAGEREF _Toc242018199 \h </w:instrText>
             </w:r>
             <w:r>
               <w:rPr>
@@ -1612,7 +1612,7 @@
               <w14:ligatures w14:val="standardContextual"/>
             </w:rPr>
           </w:pPr>
-          <w:hyperlink w:anchor="_Toc242017377" w:history="1">
+          <w:hyperlink w:anchor="_Toc242018200" w:history="1">
             <w:r>
               <w:rPr>
                 <w:rStyle w:val="Lienhypertexte"/>
@@ -1636,7 +1636,7 @@
               <w:rPr>
                 <w:noProof/>
               </w:rPr>
-              <w:instrText xml:space="preserve"> PAGEREF _Toc242017377 \h </w:instrText>
+              <w:instrText xml:space="preserve"> PAGEREF _Toc242018200 \h </w:instrText>
             </w:r>
             <w:r>
               <w:rPr>
@@ -1679,7 +1679,7 @@
               <w14:ligatures w14:val="standardContextual"/>
             </w:rPr>
           </w:pPr>
-          <w:hyperlink w:anchor="_Toc242017378" w:history="1">
+          <w:hyperlink w:anchor="_Toc242018201" w:history="1">
             <w:r>
               <w:rPr>
                 <w:rStyle w:val="Lienhypertexte"/>
@@ -1703,7 +1703,7 @@
               <w:rPr>
                 <w:noProof/>
               </w:rPr>
-              <w:instrText xml:space="preserve"> PAGEREF _Toc242017378 \h </w:instrText>
+              <w:instrText xml:space="preserve"> PAGEREF _Toc242018201 \h </w:instrText>
             </w:r>
             <w:r>
               <w:rPr>
@@ -1746,7 +1746,7 @@
               <w14:ligatures w14:val="standardContextual"/>
             </w:rPr>
           </w:pPr>
-          <w:hyperlink w:anchor="_Toc242017379" w:history="1">
+          <w:hyperlink w:anchor="_Toc242018202" w:history="1">
             <w:r>
               <w:rPr>
                 <w:rStyle w:val="Lienhypertexte"/>
@@ -1770,7 +1770,7 @@
               <w:rPr>
                 <w:noProof/>
               </w:rPr>
-              <w:instrText xml:space="preserve"> PAGEREF _Toc242017379 \h </w:instrText>
+              <w:instrText xml:space="preserve"> PAGEREF _Toc242018202 \h </w:instrText>
             </w:r>
             <w:r>
               <w:rPr>
@@ -1813,7 +1813,7 @@
               <w14:ligatures w14:val="standardContextual"/>
             </w:rPr>
           </w:pPr>
-          <w:hyperlink w:anchor="_Toc242017380" w:history="1">
+          <w:hyperlink w:anchor="_Toc242018203" w:history="1">
             <w:r>
               <w:rPr>
                 <w:rStyle w:val="Lienhypertexte"/>
@@ -1837,7 +1837,7 @@
               <w:rPr>
                 <w:noProof/>
               </w:rPr>
-              <w:instrText xml:space="preserve"> PAGEREF _Toc242017380 \h </w:instrText>
+              <w:instrText xml:space="preserve"> PAGEREF _Toc242018203 \h </w:instrText>
             </w:r>
             <w:r>
               <w:rPr>
@@ -1880,7 +1880,7 @@
               <w14:ligatures w14:val="standardContextual"/>
             </w:rPr>
           </w:pPr>
-          <w:hyperlink w:anchor="_Toc242017381" w:history="1">
+          <w:hyperlink w:anchor="_Toc242018204" w:history="1">
             <w:r>
               <w:rPr>
                 <w:rStyle w:val="Lienhypertexte"/>
@@ -1904,7 +1904,7 @@
               <w:rPr>
                 <w:noProof/>
               </w:rPr>
-              <w:instrText xml:space="preserve"> PAGEREF _Toc242017381 \h </w:instrText>
+              <w:instrText xml:space="preserve"> PAGEREF _Toc242018204 \h </w:instrText>
             </w:r>
             <w:r>
               <w:rPr>
@@ -1947,7 +1947,7 @@
               <w14:ligatures w14:val="standardContextual"/>
             </w:rPr>
           </w:pPr>
-          <w:hyperlink w:anchor="_Toc242017382" w:history="1">
+          <w:hyperlink w:anchor="_Toc242018205" w:history="1">
             <w:r>
               <w:rPr>
                 <w:rStyle w:val="Lienhypertexte"/>
@@ -1971,7 +1971,7 @@
               <w:rPr>
                 <w:noProof/>
               </w:rPr>
-              <w:instrText xml:space="preserve"> PAGEREF _Toc242017382 \h </w:instrText>
+              <w:instrText xml:space="preserve"> PAGEREF _Toc242018205 \h </w:instrText>
             </w:r>
             <w:r>
               <w:rPr>
@@ -2014,7 +2014,7 @@
               <w14:ligatures w14:val="standardContextual"/>
             </w:rPr>
           </w:pPr>
-          <w:hyperlink w:anchor="_Toc242017383" w:history="1">
+          <w:hyperlink w:anchor="_Toc242018206" w:history="1">
             <w:r>
               <w:rPr>
                 <w:rStyle w:val="Lienhypertexte"/>
@@ -2038,7 +2038,7 @@
               <w:rPr>
                 <w:noProof/>
               </w:rPr>
-              <w:instrText xml:space="preserve"> PAGEREF _Toc242017383 \h </w:instrText>
+              <w:instrText xml:space="preserve"> PAGEREF _Toc242018206 \h </w:instrText>
             </w:r>
             <w:r>
               <w:rPr>
@@ -2081,7 +2081,7 @@
               <w14:ligatures w14:val="standardContextual"/>
             </w:rPr>
           </w:pPr>
-          <w:hyperlink w:anchor="_Toc242017384" w:history="1">
+          <w:hyperlink w:anchor="_Toc242018207" w:history="1">
             <w:r>
               <w:rPr>
                 <w:rStyle w:val="Lienhypertexte"/>
@@ -2105,7 +2105,7 @@
               <w:rPr>
                 <w:noProof/>
               </w:rPr>
-              <w:instrText xml:space="preserve"> PAGEREF _Toc242017384 \h </w:instrText>
+              <w:instrText xml:space="preserve"> PAGEREF _Toc242018207 \h </w:instrText>
             </w:r>
             <w:r>
               <w:rPr>
@@ -2148,7 +2148,7 @@
               <w14:ligatures w14:val="standardContextual"/>
             </w:rPr>
           </w:pPr>
-          <w:hyperlink w:anchor="_Toc242017385" w:history="1">
+          <w:hyperlink w:anchor="_Toc242018208" w:history="1">
             <w:r>
               <w:rPr>
                 <w:rStyle w:val="Lienhypertexte"/>
@@ -2172,7 +2172,7 @@
               <w:rPr>
                 <w:noProof/>
               </w:rPr>
-              <w:instrText xml:space="preserve"> PAGEREF _Toc242017385 \h </w:instrText>
+              <w:instrText xml:space="preserve"> PAGEREF _Toc242018208 \h </w:instrText>
             </w:r>
             <w:r>
               <w:rPr>
@@ -2215,7 +2215,7 @@
               <w14:ligatures w14:val="standardContextual"/>
             </w:rPr>
           </w:pPr>
-          <w:hyperlink w:anchor="_Toc242017386" w:history="1">
+          <w:hyperlink w:anchor="_Toc242018209" w:history="1">
             <w:r>
               <w:rPr>
                 <w:rStyle w:val="Lienhypertexte"/>
@@ -2239,7 +2239,7 @@
               <w:rPr>
                 <w:noProof/>
               </w:rPr>
-              <w:instrText xml:space="preserve"> PAGEREF _Toc242017386 \h </w:instrText>
+              <w:instrText xml:space="preserve"> PAGEREF _Toc242018209 \h </w:instrText>
             </w:r>
             <w:r>
               <w:rPr>
@@ -2282,7 +2282,7 @@
               <w14:ligatures w14:val="standardContextual"/>
             </w:rPr>
           </w:pPr>
-          <w:hyperlink w:anchor="_Toc242017387" w:history="1">
+          <w:hyperlink w:anchor="_Toc242018210" w:history="1">
             <w:r>
               <w:rPr>
                 <w:rStyle w:val="Lienhypertexte"/>
@@ -2306,7 +2306,7 @@
               <w:rPr>
                 <w:noProof/>
               </w:rPr>
-              <w:instrText xml:space="preserve"> PAGEREF _Toc242017387 \h </w:instrText>
+              <w:instrText xml:space="preserve"> PAGEREF _Toc242018210 \h </w:instrText>
             </w:r>
             <w:r>
               <w:rPr>
@@ -2349,7 +2349,7 @@
               <w14:ligatures w14:val="standardContextual"/>
             </w:rPr>
           </w:pPr>
-          <w:hyperlink w:anchor="_Toc242017388" w:history="1">
+          <w:hyperlink w:anchor="_Toc242018211" w:history="1">
             <w:r>
               <w:rPr>
                 <w:rStyle w:val="Lienhypertexte"/>
@@ -2373,7 +2373,7 @@
               <w:rPr>
                 <w:noProof/>
               </w:rPr>
-              <w:instrText xml:space="preserve"> PAGEREF _Toc242017388 \h </w:instrText>
+              <w:instrText xml:space="preserve"> PAGEREF _Toc242018211 \h </w:instrText>
             </w:r>
             <w:r>
               <w:rPr>
@@ -2416,7 +2416,7 @@
               <w14:ligatures w14:val="standardContextual"/>
             </w:rPr>
           </w:pPr>
-          <w:hyperlink w:anchor="_Toc242017389" w:history="1">
+          <w:hyperlink w:anchor="_Toc242018212" w:history="1">
             <w:r>
               <w:rPr>
                 <w:rStyle w:val="Lienhypertexte"/>
@@ -2440,7 +2440,7 @@
               <w:rPr>
                 <w:noProof/>
               </w:rPr>
-              <w:instrText xml:space="preserve"> PAGEREF _Toc242017389 \h </w:instrText>
+              <w:instrText xml:space="preserve"> PAGEREF _Toc242018212 \h </w:instrText>
             </w:r>
             <w:r>
               <w:rPr>
@@ -2483,7 +2483,7 @@
               <w14:ligatures w14:val="standardContextual"/>
             </w:rPr>
           </w:pPr>
-          <w:hyperlink w:anchor="_Toc242017390" w:history="1">
+          <w:hyperlink w:anchor="_Toc242018213" w:history="1">
             <w:r>
               <w:rPr>
                 <w:rStyle w:val="Lienhypertexte"/>
@@ -2507,7 +2507,7 @@
               <w:rPr>
                 <w:noProof/>
               </w:rPr>
-              <w:instrText xml:space="preserve"> PAGEREF _Toc242017390 \h </w:instrText>
+              <w:instrText xml:space="preserve"> PAGEREF _Toc242018213 \h </w:instrText>
             </w:r>
             <w:r>
               <w:rPr>
@@ -2550,7 +2550,7 @@
               <w14:ligatures w14:val="standardContextual"/>
             </w:rPr>
           </w:pPr>
-          <w:hyperlink w:anchor="_Toc242017391" w:history="1">
+          <w:hyperlink w:anchor="_Toc242018214" w:history="1">
             <w:r>
               <w:rPr>
                 <w:rStyle w:val="Lienhypertexte"/>
@@ -2574,7 +2574,7 @@
               <w:rPr>
                 <w:noProof/>
               </w:rPr>
-              <w:instrText xml:space="preserve"> PAGEREF _Toc242017391 \h </w:instrText>
+              <w:instrText xml:space="preserve"> PAGEREF _Toc242018214 \h </w:instrText>
             </w:r>
             <w:r>
               <w:rPr>
@@ -2617,7 +2617,7 @@
               <w14:ligatures w14:val="standardContextual"/>
             </w:rPr>
           </w:pPr>
-          <w:hyperlink w:anchor="_Toc242017392" w:history="1">
+          <w:hyperlink w:anchor="_Toc242018215" w:history="1">
             <w:r>
               <w:rPr>
                 <w:rStyle w:val="Lienhypertexte"/>
@@ -2641,7 +2641,7 @@
               <w:rPr>
                 <w:noProof/>
               </w:rPr>
-              <w:instrText xml:space="preserve"> PAGEREF _Toc242017392 \h </w:instrText>
+              <w:instrText xml:space="preserve"> PAGEREF _Toc242018215 \h </w:instrText>
             </w:r>
             <w:r>
               <w:rPr>
@@ -2681,7 +2681,7 @@
         <w:pStyle w:val="Titre1"/>
         <w:pageBreakBefore/>
       </w:pPr>
-      <w:bookmarkStart w:id="0" w:name="_Toc242017355"/>
+      <w:bookmarkStart w:id="0" w:name="_Toc242018178"/>
       <w:r>
         <w:lastRenderedPageBreak/>
         <w:t>1. Présentation de la plateforme</w:t>
@@ -3132,7 +3132,7 @@
       <w:pPr>
         <w:pStyle w:val="Titre2"/>
       </w:pPr>
-      <w:bookmarkStart w:id="1" w:name="_Toc242017356"/>
+      <w:bookmarkStart w:id="1" w:name="_Toc242018179"/>
       <w:r>
         <w:t>1.1 Une seule connexion</w:t>
       </w:r>
@@ -3160,7 +3160,7 @@
       <w:pPr>
         <w:pStyle w:val="Titre2"/>
       </w:pPr>
-      <w:bookmarkStart w:id="2" w:name="_Toc242017357"/>
+      <w:bookmarkStart w:id="2" w:name="_Toc242018180"/>
       <w:r>
         <w:t>1.2 Principes de fonctionnement</w:t>
       </w:r>
@@ -3251,7 +3251,7 @@
         <w:pStyle w:val="Titre1"/>
         <w:pageBreakBefore/>
       </w:pPr>
-      <w:bookmarkStart w:id="3" w:name="_Toc242017358"/>
+      <w:bookmarkStart w:id="3" w:name="_Toc242018181"/>
       <w:r>
         <w:lastRenderedPageBreak/>
         <w:t>2. Les rôles et leurs droits</w:t>
@@ -4075,7 +4075,7 @@
       <w:pPr>
         <w:pStyle w:val="Titre2"/>
       </w:pPr>
-      <w:bookmarkStart w:id="4" w:name="_Toc242017359"/>
+      <w:bookmarkStart w:id="4" w:name="_Toc242018182"/>
       <w:r>
         <w:t>2.1 Visiteur</w:t>
       </w:r>
@@ -4185,7 +4185,7 @@
       <w:pPr>
         <w:pStyle w:val="Titre2"/>
       </w:pPr>
-      <w:bookmarkStart w:id="5" w:name="_Toc242017360"/>
+      <w:bookmarkStart w:id="5" w:name="_Toc242018183"/>
       <w:r>
         <w:t>2.2 Client</w:t>
       </w:r>
@@ -4399,7 +4399,7 @@
       <w:pPr>
         <w:pStyle w:val="Titre2"/>
       </w:pPr>
-      <w:bookmarkStart w:id="6" w:name="_Toc242017361"/>
+      <w:bookmarkStart w:id="6" w:name="_Toc242018184"/>
       <w:r>
         <w:lastRenderedPageBreak/>
         <w:t>2.3 Technicien</w:t>
@@ -4923,7 +4923,7 @@
       <w:pPr>
         <w:pStyle w:val="Titre2"/>
       </w:pPr>
-      <w:bookmarkStart w:id="7" w:name="_Toc242017362"/>
+      <w:bookmarkStart w:id="7" w:name="_Toc242018185"/>
       <w:r>
         <w:t>2.4 Manager</w:t>
       </w:r>
@@ -5176,7 +5176,7 @@
       <w:pPr>
         <w:pStyle w:val="Titre2"/>
       </w:pPr>
-      <w:bookmarkStart w:id="8" w:name="_Toc242017363"/>
+      <w:bookmarkStart w:id="8" w:name="_Toc242018186"/>
       <w:r>
         <w:t>2.5 Administrateur</w:t>
       </w:r>
@@ -5286,7 +5286,7 @@
         <w:pStyle w:val="Titre1"/>
         <w:pageBreakBefore/>
       </w:pPr>
-      <w:bookmarkStart w:id="9" w:name="_Toc242017364"/>
+      <w:bookmarkStart w:id="9" w:name="_Toc242018187"/>
       <w:r>
         <w:lastRenderedPageBreak/>
         <w:t>3. Le parcours d’un rendez-vous</w:t>
@@ -6377,7 +6377,7 @@
       <w:pPr>
         <w:pStyle w:val="Titre2"/>
       </w:pPr>
-      <w:bookmarkStart w:id="10" w:name="_Toc242017365"/>
+      <w:bookmarkStart w:id="10" w:name="_Toc242018188"/>
       <w:r>
         <w:t>3.1 Situations particulières</w:t>
       </w:r>
@@ -7027,7 +7027,7 @@
       <w:pPr>
         <w:pStyle w:val="Titre2"/>
       </w:pPr>
-      <w:bookmarkStart w:id="11" w:name="_Toc242017366"/>
+      <w:bookmarkStart w:id="11" w:name="_Toc242018189"/>
       <w:r>
         <w:t>3.2 Restitution et paiement au comptoir</w:t>
       </w:r>
@@ -7120,7 +7120,7 @@
       <w:pPr>
         <w:pStyle w:val="Titre2"/>
       </w:pPr>
-      <w:bookmarkStart w:id="12" w:name="_Toc242017367"/>
+      <w:bookmarkStart w:id="12" w:name="_Toc242018190"/>
       <w:r>
         <w:t>3.3 L’avancement affiché au client</w:t>
       </w:r>
@@ -7149,7 +7149,7 @@
         <w:pStyle w:val="Titre1"/>
         <w:pageBreakBefore/>
       </w:pPr>
-      <w:bookmarkStart w:id="13" w:name="_Toc242017368"/>
+      <w:bookmarkStart w:id="13" w:name="_Toc242018191"/>
       <w:r>
         <w:lastRenderedPageBreak/>
         <w:t>4. Réservation en ligne et disponibilités</w:t>
@@ -7160,7 +7160,7 @@
       <w:pPr>
         <w:pStyle w:val="Titre2"/>
       </w:pPr>
-      <w:bookmarkStart w:id="14" w:name="_Toc242017369"/>
+      <w:bookmarkStart w:id="14" w:name="_Toc242018192"/>
       <w:r>
         <w:t>4.1 Le tunnel de réservation</w:t>
       </w:r>
@@ -7320,7 +7320,7 @@
       <w:pPr>
         <w:pStyle w:val="Titre2"/>
       </w:pPr>
-      <w:bookmarkStart w:id="15" w:name="_Toc242017370"/>
+      <w:bookmarkStart w:id="15" w:name="_Toc242018193"/>
       <w:r>
         <w:t>4.2 Comment les créneaux sont calculés</w:t>
       </w:r>
@@ -8280,7 +8280,7 @@
         <w:pStyle w:val="Titre1"/>
         <w:pageBreakBefore/>
       </w:pPr>
-      <w:bookmarkStart w:id="16" w:name="_Toc242017371"/>
+      <w:bookmarkStart w:id="16" w:name="_Toc242018194"/>
       <w:r>
         <w:lastRenderedPageBreak/>
         <w:t>5. L’espace client</w:t>
@@ -8863,7 +8863,7 @@
       <w:pPr>
         <w:pStyle w:val="Titre2"/>
       </w:pPr>
-      <w:bookmarkStart w:id="17" w:name="_Toc242017372"/>
+      <w:bookmarkStart w:id="17" w:name="_Toc242018195"/>
       <w:r>
         <w:t>5.1 Photo du véhicule</w:t>
       </w:r>
@@ -8943,7 +8943,7 @@
         <w:pStyle w:val="Titre1"/>
         <w:pageBreakBefore/>
       </w:pPr>
-      <w:bookmarkStart w:id="18" w:name="_Toc242017373"/>
+      <w:bookmarkStart w:id="18" w:name="_Toc242018196"/>
       <w:r>
         <w:lastRenderedPageBreak/>
         <w:t>6. L’espace professionnel</w:t>
@@ -9411,7 +9411,7 @@
                 <w:sz w:val="19"/>
                 <w:szCs w:val="19"/>
               </w:rPr>
-              <w:t>Factures</w:t>
+              <w:t>Statistiques</w:t>
             </w:r>
           </w:p>
         </w:tc>
@@ -9471,7 +9471,7 @@
                 <w:sz w:val="19"/>
                 <w:szCs w:val="19"/>
               </w:rPr>
-              <w:t>Toutes les factures (recherche, filtres par statut, reste à encaisser), établissement des factures sur devis avec lignes libres et remise, encaissement, remboursement, annulation, PDF.</w:t>
+              <w:t>Période au choix (7 jours à 12 mois), chiffre d’affaires encaissé dans le temps, moyens de paiement, prestations populaires, rendez-vous par statut, taux d’annulation, clients nouveaux et récurrents, exports CSV.</w:t>
             </w:r>
           </w:p>
         </w:tc>
@@ -9508,7 +9508,7 @@
                 <w:sz w:val="19"/>
                 <w:szCs w:val="19"/>
               </w:rPr>
-              <w:t>Notifications</w:t>
+              <w:t>Factures</w:t>
             </w:r>
           </w:p>
         </w:tc>
@@ -9537,7 +9537,7 @@
                 <w:sz w:val="19"/>
                 <w:szCs w:val="19"/>
               </w:rPr>
-              <w:t>Toute l’équipe</w:t>
+              <w:t>Manager, admin</w:t>
             </w:r>
           </w:p>
         </w:tc>
@@ -9566,7 +9566,7 @@
                 <w:sz w:val="19"/>
                 <w:szCs w:val="19"/>
               </w:rPr>
-              <w:t>Ce qui demande une action (nouvelle demande, contrôle à valider, prestation affectée…).</w:t>
+              <w:t>Toutes les factures (recherche, filtres par statut, reste à encaisser), établissement des factures sur devis avec lignes libres et remise, encaissement, remboursement, annulation, PDF.</w:t>
             </w:r>
           </w:p>
         </w:tc>
@@ -9604,7 +9604,7 @@
                 <w:sz w:val="19"/>
                 <w:szCs w:val="19"/>
               </w:rPr>
-              <w:t>Rendez-vous</w:t>
+              <w:t>Notifications</w:t>
             </w:r>
           </w:p>
         </w:tc>
@@ -9664,7 +9664,7 @@
                 <w:sz w:val="19"/>
                 <w:szCs w:val="19"/>
               </w:rPr>
-              <w:t>Liste filtrable (statut, date). Seules les actions autorisées pour le rôle et l’étape sont proposées. Fiche « Gérer » : affectation, notes internes, report, historique complet.</w:t>
+              <w:t>Ce qui demande une action (nouvelle demande, contrôle à valider, prestation affectée…).</w:t>
             </w:r>
           </w:p>
         </w:tc>
@@ -9701,7 +9701,7 @@
                 <w:sz w:val="19"/>
                 <w:szCs w:val="19"/>
               </w:rPr>
-              <w:t>Clients</w:t>
+              <w:t>Rendez-vous</w:t>
             </w:r>
           </w:p>
         </w:tc>
@@ -9730,7 +9730,7 @@
                 <w:sz w:val="19"/>
                 <w:szCs w:val="19"/>
               </w:rPr>
-              <w:t>Toute l’équipe (modification : manager)</w:t>
+              <w:t>Toute l’équipe</w:t>
             </w:r>
           </w:p>
         </w:tc>
@@ -9759,7 +9759,7 @@
                 <w:sz w:val="19"/>
                 <w:szCs w:val="19"/>
               </w:rPr>
-              <w:t>Recherche par nom, téléphone, email ou immatriculation ; fiche avec véhicules, rendez-vous, montant des prestations, segment et notes internes.</w:t>
+              <w:t>Liste filtrable (statut, date). Seules les actions autorisées pour le rôle et l’étape sont proposées. Fiche « Gérer » : affectation, notes internes, report, historique complet.</w:t>
             </w:r>
           </w:p>
         </w:tc>
@@ -9797,7 +9797,7 @@
                 <w:sz w:val="19"/>
                 <w:szCs w:val="19"/>
               </w:rPr>
-              <w:t>Véhicules</w:t>
+              <w:t>Clients</w:t>
             </w:r>
           </w:p>
         </w:tc>
@@ -9827,7 +9827,7 @@
                 <w:sz w:val="19"/>
                 <w:szCs w:val="19"/>
               </w:rPr>
-              <w:t>Toute l’équipe</w:t>
+              <w:t>Toute l’équipe (modification : manager)</w:t>
             </w:r>
           </w:p>
         </w:tc>
@@ -9857,7 +9857,7 @@
                 <w:sz w:val="19"/>
                 <w:szCs w:val="19"/>
               </w:rPr>
-              <w:t>Tous les véhicules enregistrés et leur propriétaire.</w:t>
+              <w:t>Recherche par nom, téléphone, email ou immatriculation ; fiche avec véhicules, rendez-vous, montant des prestations, segment et notes internes.</w:t>
             </w:r>
           </w:p>
         </w:tc>
@@ -9894,7 +9894,7 @@
                 <w:sz w:val="19"/>
                 <w:szCs w:val="19"/>
               </w:rPr>
-              <w:t>Prestations</w:t>
+              <w:t>Véhicules</w:t>
             </w:r>
           </w:p>
         </w:tc>
@@ -9923,7 +9923,7 @@
                 <w:sz w:val="19"/>
                 <w:szCs w:val="19"/>
               </w:rPr>
-              <w:t>Manager, admin</w:t>
+              <w:t>Toute l’équipe</w:t>
             </w:r>
           </w:p>
         </w:tc>
@@ -9952,7 +9952,7 @@
                 <w:sz w:val="19"/>
                 <w:szCs w:val="19"/>
               </w:rPr>
-              <w:t>Création et modification (tarif fixe, « à partir de » ou sur devis ; durée bloquée au planning), suspension.</w:t>
+              <w:t>Tous les véhicules enregistrés et leur propriétaire.</w:t>
             </w:r>
           </w:p>
         </w:tc>
@@ -9990,6 +9990,103 @@
                 <w:sz w:val="19"/>
                 <w:szCs w:val="19"/>
               </w:rPr>
+              <w:t>Prestations</w:t>
+            </w:r>
+          </w:p>
+        </w:tc>
+        <w:tc>
+          <w:tcPr>
+            <w:tcW w:w="1985" w:type="dxa"/>
+            <w:tcBorders>
+              <w:top w:val="single" w:sz="4" w:space="0" w:color="D9D9D9"/>
+              <w:left w:val="single" w:sz="4" w:space="0" w:color="D9D9D9"/>
+              <w:bottom w:val="single" w:sz="4" w:space="0" w:color="D9D9D9"/>
+              <w:right w:val="single" w:sz="4" w:space="0" w:color="D9D9D9"/>
+            </w:tcBorders>
+            <w:shd w:val="clear" w:color="auto" w:fill="FAF7F2"/>
+            <w:tcMar>
+              <w:top w:w="70" w:type="dxa"/>
+              <w:left w:w="110" w:type="dxa"/>
+              <w:bottom w:w="70" w:type="dxa"/>
+              <w:right w:w="110" w:type="dxa"/>
+            </w:tcMar>
+          </w:tcPr>
+          <w:p>
+            <w:pPr>
+              <w:spacing w:line="252" w:lineRule="auto"/>
+            </w:pPr>
+            <w:r>
+              <w:rPr>
+                <w:sz w:val="19"/>
+                <w:szCs w:val="19"/>
+              </w:rPr>
+              <w:t>Manager, admin</w:t>
+            </w:r>
+          </w:p>
+        </w:tc>
+        <w:tc>
+          <w:tcPr>
+            <w:tcW w:w="5417" w:type="dxa"/>
+            <w:tcBorders>
+              <w:top w:val="single" w:sz="4" w:space="0" w:color="D9D9D9"/>
+              <w:left w:val="single" w:sz="4" w:space="0" w:color="D9D9D9"/>
+              <w:bottom w:val="single" w:sz="4" w:space="0" w:color="D9D9D9"/>
+              <w:right w:val="single" w:sz="4" w:space="0" w:color="D9D9D9"/>
+            </w:tcBorders>
+            <w:shd w:val="clear" w:color="auto" w:fill="FAF7F2"/>
+            <w:tcMar>
+              <w:top w:w="70" w:type="dxa"/>
+              <w:left w:w="110" w:type="dxa"/>
+              <w:bottom w:w="70" w:type="dxa"/>
+              <w:right w:w="110" w:type="dxa"/>
+            </w:tcMar>
+          </w:tcPr>
+          <w:p>
+            <w:pPr>
+              <w:spacing w:line="252" w:lineRule="auto"/>
+            </w:pPr>
+            <w:r>
+              <w:rPr>
+                <w:sz w:val="19"/>
+                <w:szCs w:val="19"/>
+              </w:rPr>
+              <w:t>Création et modification (tarif fixe, « à partir de » ou sur devis ; durée bloquée au planning), suspension.</w:t>
+            </w:r>
+          </w:p>
+        </w:tc>
+      </w:tr>
+      <w:tr>
+        <w:tblPrEx>
+          <w:tblCellMar>
+            <w:top w:w="0" w:type="dxa"/>
+            <w:bottom w:w="0" w:type="dxa"/>
+          </w:tblCellMar>
+        </w:tblPrEx>
+        <w:tc>
+          <w:tcPr>
+            <w:tcW w:w="1624" w:type="dxa"/>
+            <w:tcBorders>
+              <w:top w:val="single" w:sz="4" w:space="0" w:color="D9D9D9"/>
+              <w:left w:val="single" w:sz="4" w:space="0" w:color="D9D9D9"/>
+              <w:bottom w:val="single" w:sz="4" w:space="0" w:color="D9D9D9"/>
+              <w:right w:val="single" w:sz="4" w:space="0" w:color="D9D9D9"/>
+            </w:tcBorders>
+            <w:tcMar>
+              <w:top w:w="70" w:type="dxa"/>
+              <w:left w:w="110" w:type="dxa"/>
+              <w:bottom w:w="70" w:type="dxa"/>
+              <w:right w:w="110" w:type="dxa"/>
+            </w:tcMar>
+          </w:tcPr>
+          <w:p>
+            <w:pPr>
+              <w:spacing w:line="252" w:lineRule="auto"/>
+            </w:pPr>
+            <w:r>
+              <w:rPr>
+                <w:sz w:val="19"/>
+                <w:szCs w:val="19"/>
+              </w:rPr>
               <w:t>Équipe</w:t>
             </w:r>
           </w:p>
@@ -10003,7 +10100,6 @@
               <w:bottom w:val="single" w:sz="4" w:space="0" w:color="D9D9D9"/>
               <w:right w:val="single" w:sz="4" w:space="0" w:color="D9D9D9"/>
             </w:tcBorders>
-            <w:shd w:val="clear" w:color="auto" w:fill="FAF7F2"/>
             <w:tcMar>
               <w:top w:w="70" w:type="dxa"/>
               <w:left w:w="110" w:type="dxa"/>
@@ -10033,7 +10129,6 @@
               <w:bottom w:val="single" w:sz="4" w:space="0" w:color="D9D9D9"/>
               <w:right w:val="single" w:sz="4" w:space="0" w:color="D9D9D9"/>
             </w:tcBorders>
-            <w:shd w:val="clear" w:color="auto" w:fill="FAF7F2"/>
             <w:tcMar>
               <w:top w:w="70" w:type="dxa"/>
               <w:left w:w="110" w:type="dxa"/>
@@ -10076,10 +10171,10 @@
           <w:bCs/>
           <w:color w:val="B87D24"/>
         </w:rPr>
-        <w:t xml:space="preserve">Écrans en cours de réalisation : </w:t>
-      </w:r>
-      <w:r>
-        <w:t>la gestion de la galerie et les statistiques sont opérationnelles côté serveur et testées ; leurs écrans restent à construire. En attendant, ces rubriques affichent « prévu prochainement » et l’administrateur dispose du back-office.</w:t>
+        <w:t xml:space="preserve">Écran en cours de réalisation : </w:t>
+      </w:r>
+      <w:r>
+        <w:t>la gestion de la galerie (réalisations, avis, chiffres clés) est opérationnelle côté serveur et testée ; son écran reste à construire. En attendant, l’administrateur la gère dans le back-office.</w:t>
       </w:r>
     </w:p>
     <w:p>
@@ -10087,7 +10182,7 @@
         <w:pStyle w:val="Titre1"/>
         <w:pageBreakBefore/>
       </w:pPr>
-      <w:bookmarkStart w:id="19" w:name="_Toc242017374"/>
+      <w:bookmarkStart w:id="19" w:name="_Toc242018197"/>
       <w:r>
         <w:lastRenderedPageBreak/>
         <w:t>7. Le suivi atelier</w:t>
@@ -10098,7 +10193,7 @@
       <w:pPr>
         <w:pStyle w:val="Titre2"/>
       </w:pPr>
-      <w:bookmarkStart w:id="20" w:name="_Toc242017375"/>
+      <w:bookmarkStart w:id="20" w:name="_Toc242018198"/>
       <w:r>
         <w:t>7.1 Étapes de traitement</w:t>
       </w:r>
@@ -10187,7 +10282,7 @@
       <w:pPr>
         <w:pStyle w:val="Titre2"/>
       </w:pPr>
-      <w:bookmarkStart w:id="21" w:name="_Toc242017376"/>
+      <w:bookmarkStart w:id="21" w:name="_Toc242018199"/>
       <w:r>
         <w:t>7.2 Photos d’intervention</w:t>
       </w:r>
@@ -10538,7 +10633,7 @@
         <w:pStyle w:val="Titre1"/>
         <w:pageBreakBefore/>
       </w:pPr>
-      <w:bookmarkStart w:id="22" w:name="_Toc242017377"/>
+      <w:bookmarkStart w:id="22" w:name="_Toc242018200"/>
       <w:r>
         <w:lastRenderedPageBreak/>
         <w:t>8. Facturation et paiements</w:t>
@@ -10549,7 +10644,7 @@
       <w:pPr>
         <w:pStyle w:val="Titre2"/>
       </w:pPr>
-      <w:bookmarkStart w:id="23" w:name="_Toc242017378"/>
+      <w:bookmarkStart w:id="23" w:name="_Toc242018201"/>
       <w:r>
         <w:t>8.1 Les factures</w:t>
       </w:r>
@@ -10665,7 +10760,7 @@
       <w:pPr>
         <w:pStyle w:val="Titre2"/>
       </w:pPr>
-      <w:bookmarkStart w:id="24" w:name="_Toc242017379"/>
+      <w:bookmarkStart w:id="24" w:name="_Toc242018202"/>
       <w:r>
         <w:t>8.2 Les paiements</w:t>
       </w:r>
@@ -10810,7 +10905,7 @@
       <w:pPr>
         <w:pStyle w:val="Titre2"/>
       </w:pPr>
-      <w:bookmarkStart w:id="25" w:name="_Toc242017380"/>
+      <w:bookmarkStart w:id="25" w:name="_Toc242018203"/>
       <w:r>
         <w:t>8.3 Le journal de caisse</w:t>
       </w:r>
@@ -10858,7 +10953,7 @@
       <w:pPr>
         <w:pStyle w:val="Titre2"/>
       </w:pPr>
-      <w:bookmarkStart w:id="26" w:name="_Toc242017381"/>
+      <w:bookmarkStart w:id="26" w:name="_Toc242018204"/>
       <w:r>
         <w:t>8.4 Statut d’une facture</w:t>
       </w:r>
@@ -11320,7 +11415,7 @@
         <w:pStyle w:val="Titre1"/>
         <w:pageBreakBefore/>
       </w:pPr>
-      <w:bookmarkStart w:id="27" w:name="_Toc242017382"/>
+      <w:bookmarkStart w:id="27" w:name="_Toc242018205"/>
       <w:r>
         <w:lastRenderedPageBreak/>
         <w:t>9. Les notifications</w:t>
@@ -11331,7 +11426,7 @@
       <w:pPr>
         <w:pStyle w:val="Titre2"/>
       </w:pPr>
-      <w:bookmarkStart w:id="28" w:name="_Toc242017383"/>
+      <w:bookmarkStart w:id="28" w:name="_Toc242018206"/>
       <w:r>
         <w:t>9.1 Pour le client</w:t>
       </w:r>
@@ -11999,7 +12094,7 @@
       <w:pPr>
         <w:pStyle w:val="Titre2"/>
       </w:pPr>
-      <w:bookmarkStart w:id="29" w:name="_Toc242017384"/>
+      <w:bookmarkStart w:id="29" w:name="_Toc242018207"/>
       <w:r>
         <w:t>9.2 Pour l’équipe</w:t>
       </w:r>
@@ -12477,7 +12572,7 @@
         <w:pStyle w:val="Titre1"/>
         <w:pageBreakBefore/>
       </w:pPr>
-      <w:bookmarkStart w:id="30" w:name="_Toc242017385"/>
+      <w:bookmarkStart w:id="30" w:name="_Toc242018208"/>
       <w:r>
         <w:lastRenderedPageBreak/>
         <w:t>10. Contenus publics du site</w:t>
@@ -12913,7 +13008,7 @@
         <w:pStyle w:val="Titre1"/>
         <w:pageBreakBefore/>
       </w:pPr>
-      <w:bookmarkStart w:id="31" w:name="_Toc242017386"/>
+      <w:bookmarkStart w:id="31" w:name="_Toc242018209"/>
       <w:r>
         <w:lastRenderedPageBreak/>
         <w:t>11. Statistiques et exports</w:t>
@@ -13546,7 +13641,7 @@
         <w:pStyle w:val="Titre1"/>
         <w:pageBreakBefore/>
       </w:pPr>
-      <w:bookmarkStart w:id="32" w:name="_Toc242017387"/>
+      <w:bookmarkStart w:id="32" w:name="_Toc242018210"/>
       <w:r>
         <w:lastRenderedPageBreak/>
         <w:t>12. Sécurité et confidentialité</w:t>
@@ -13708,7 +13803,7 @@
         <w:pStyle w:val="Titre1"/>
         <w:pageBreakBefore/>
       </w:pPr>
-      <w:bookmarkStart w:id="33" w:name="_Toc242017388"/>
+      <w:bookmarkStart w:id="33" w:name="_Toc242018211"/>
       <w:r>
         <w:lastRenderedPageBreak/>
         <w:t>13. Administration</w:t>
@@ -13845,7 +13940,7 @@
       <w:pPr>
         <w:pStyle w:val="Titre2"/>
       </w:pPr>
-      <w:bookmarkStart w:id="34" w:name="_Toc242017389"/>
+      <w:bookmarkStart w:id="34" w:name="_Toc242018212"/>
       <w:r>
         <w:t>13.1 Mise en service : liste de contrôle</w:t>
       </w:r>
@@ -13997,7 +14092,7 @@
         <w:pStyle w:val="Titre1"/>
         <w:pageBreakBefore/>
       </w:pPr>
-      <w:bookmarkStart w:id="35" w:name="_Toc242017390"/>
+      <w:bookmarkStart w:id="35" w:name="_Toc242018213"/>
       <w:r>
         <w:lastRenderedPageBreak/>
         <w:t>14. État d’avancement</w:t>
@@ -14998,7 +15093,7 @@
                 <w:sz w:val="19"/>
                 <w:szCs w:val="19"/>
               </w:rPr>
-              <w:t>Écrans pro à construire</w:t>
+              <w:t>Opérationnel</w:t>
             </w:r>
           </w:p>
         </w:tc>
@@ -15130,7 +15225,7 @@
         <w:pStyle w:val="Titre1"/>
         <w:pageBreakBefore/>
       </w:pPr>
-      <w:bookmarkStart w:id="36" w:name="_Toc242017391"/>
+      <w:bookmarkStart w:id="36" w:name="_Toc242018214"/>
       <w:r>
         <w:lastRenderedPageBreak/>
         <w:t>Annexe — Repères techniques</w:t>
@@ -15713,7 +15808,7 @@
       <w:pPr>
         <w:pStyle w:val="Titre2"/>
       </w:pPr>
-      <w:bookmarkStart w:id="37" w:name="_Toc242017392"/>
+      <w:bookmarkStart w:id="37" w:name="_Toc242018215"/>
       <w:r>
         <w:t>Mode démonstration</w:t>
       </w:r>
@@ -15907,10 +16002,96 @@
 <file path=word/numbering.xml><?xml version="1.0" encoding="utf-8"?>
 <w:numbering xmlns:wpc="http://schemas.microsoft.com/office/word/2010/wordprocessingCanvas" xmlns:cx="http://schemas.microsoft.com/office/drawing/2014/chartex" xmlns:cx1="http://schemas.microsoft.com/office/drawing/2015/9/8/chartex" xmlns:cx2="http://schemas.microsoft.com/office/drawing/2015/10/21/chartex" xmlns:cx3="http://schemas.microsoft.com/office/drawing/2016/5/9/chartex" xmlns:cx4="http://schemas.microsoft.com/office/drawing/2016/5/10/chartex" xmlns:cx5="http://schemas.microsoft.com/office/drawing/2016/5/11/chartex" xmlns:cx6="http://schemas.microsoft.com/office/drawing/2016/5/12/chartex" xmlns:cx7="http://schemas.microsoft.com/office/drawing/2016/5/13/chartex" xmlns:cx8="http://schemas.microsoft.com/office/drawing/2016/5/14/chartex" xmlns:mc="http://schemas.openxmlformats.org/markup-compatibility/2006" xmlns:aink="http://schemas.microsoft.com/office/drawing/2016/ink" xmlns:am3d="http://schemas.microsoft.com/office/drawing/2017/model3d" xmlns:o="urn:schemas-microsoft-com:office:office" xmlns:oel="http://schemas.microsoft.com/office/2019/extlst" xmlns:r="http://schemas.openxmlformats.org/officeDocument/2006/relationships" xmlns:m="http://schemas.openxmlformats.org/officeDocument/2006/math" xmlns:v="urn:schemas-microsoft-com:vml" xmlns:wp14="http://schemas.microsoft.com/office/word/2010/wordprocessingDrawing" xmlns:wp="http://schemas.openxmlformats.org/drawingml/2006/wordprocessingDrawing" xmlns:w10="urn:schemas-microsoft-com:office:word" xmlns:w="http://schemas.openxmlformats.org/wordprocessingml/2006/main" xmlns:w14="http://schemas.microsoft.com/office/word/2010/wordml" xmlns:w15="http://schemas.microsoft.com/office/word/2012/wordml" xmlns:w16cex="http://schemas.microsoft.com/office/word/2018/wordml/cex" xmlns:w16cid="http://schemas.microsoft.com/office/word/2016/wordml/cid" xmlns:w16="http://schemas.microsoft.com/office/word/2018/wordml" xmlns:w16du="http://schemas.microsoft.com/office/word/2023/wordml/word16du" xmlns:w16sdtdh="http://schemas.microsoft.com/office/word/2020/wordml/sdtdatahash" xmlns:w16sdtfl="http://schemas.microsoft.com/office/word/2024/wordml/sdtformatlock" xmlns:w16se="http://schemas.microsoft.com/office/word/2015/wordml/symex" xmlns:wpg="http://schemas.microsoft.com/office/word/2010/wordprocessingGroup" xmlns:wpi="http://schemas.microsoft.com/office/word/2010/wordprocessingInk" xmlns:wne="http://schemas.microsoft.com/office/word/2006/wordml" xmlns:wps="http://schemas.microsoft.com/office/word/2010/wordprocessingShape" mc:Ignorable="w14 w15 w16se w16cid w16 w16cex w16sdtdh w16sdtfl w16du wp14">
   <w:abstractNum w:abstractNumId="0" w15:restartNumberingAfterBreak="0">
-    <w:nsid w:val="0FE33106"/>
+    <w:nsid w:val="0D022C6C"/>
     <w:multiLevelType w:val="hybridMultilevel"/>
-    <w:tmpl w:val="F95AA470"/>
-    <w:lvl w:ilvl="0" w:tplc="DD8E28A0">
+    <w:tmpl w:val="01069324"/>
+    <w:lvl w:ilvl="0" w:tplc="75FE2470" w:tentative="1">
+      <w:start w:val="1"/>
+      <w:numFmt w:val="bullet"/>
+      <w:lvlText w:val="●"/>
+      <w:lvlJc w:val="left"/>
+      <w:pPr>
+        <w:ind w:left="720" w:hanging="360"/>
+      </w:pPr>
+    </w:lvl>
+    <w:lvl w:ilvl="1" w:tplc="289EB3A6" w:tentative="1">
+      <w:start w:val="1"/>
+      <w:numFmt w:val="bullet"/>
+      <w:lvlText w:val="○"/>
+      <w:lvlJc w:val="left"/>
+      <w:pPr>
+        <w:ind w:left="1440" w:hanging="360"/>
+      </w:pPr>
+    </w:lvl>
+    <w:lvl w:ilvl="2" w:tplc="94FE55A0" w:tentative="1">
+      <w:start w:val="1"/>
+      <w:numFmt w:val="bullet"/>
+      <w:lvlText w:val="■"/>
+      <w:lvlJc w:val="left"/>
+      <w:pPr>
+        <w:ind w:left="2160" w:hanging="360"/>
+      </w:pPr>
+    </w:lvl>
+    <w:lvl w:ilvl="3" w:tplc="532E78D6" w:tentative="1">
+      <w:start w:val="1"/>
+      <w:numFmt w:val="bullet"/>
+      <w:lvlText w:val="●"/>
+      <w:lvlJc w:val="left"/>
+      <w:pPr>
+        <w:ind w:left="2880" w:hanging="360"/>
+      </w:pPr>
+    </w:lvl>
+    <w:lvl w:ilvl="4" w:tplc="2E4A3F72" w:tentative="1">
+      <w:start w:val="1"/>
+      <w:numFmt w:val="bullet"/>
+      <w:lvlText w:val="○"/>
+      <w:lvlJc w:val="left"/>
+      <w:pPr>
+        <w:ind w:left="3600" w:hanging="360"/>
+      </w:pPr>
+    </w:lvl>
+    <w:lvl w:ilvl="5" w:tplc="6AA47E1E" w:tentative="1">
+      <w:start w:val="1"/>
+      <w:numFmt w:val="bullet"/>
+      <w:lvlText w:val="■"/>
+      <w:lvlJc w:val="left"/>
+      <w:pPr>
+        <w:ind w:left="4320" w:hanging="360"/>
+      </w:pPr>
+    </w:lvl>
+    <w:lvl w:ilvl="6" w:tplc="D8746560" w:tentative="1">
+      <w:start w:val="1"/>
+      <w:numFmt w:val="bullet"/>
+      <w:lvlText w:val="●"/>
+      <w:lvlJc w:val="left"/>
+      <w:pPr>
+        <w:ind w:left="5040" w:hanging="360"/>
+      </w:pPr>
+    </w:lvl>
+    <w:lvl w:ilvl="7" w:tplc="9DBA663C" w:tentative="1">
+      <w:start w:val="1"/>
+      <w:numFmt w:val="bullet"/>
+      <w:lvlText w:val="●"/>
+      <w:lvlJc w:val="left"/>
+      <w:pPr>
+        <w:ind w:left="5760" w:hanging="360"/>
+      </w:pPr>
+    </w:lvl>
+    <w:lvl w:ilvl="8" w:tplc="81D09968" w:tentative="1">
+      <w:start w:val="1"/>
+      <w:numFmt w:val="bullet"/>
+      <w:lvlText w:val="●"/>
+      <w:lvlJc w:val="left"/>
+      <w:pPr>
+        <w:ind w:left="6480" w:hanging="360"/>
+      </w:pPr>
+    </w:lvl>
+  </w:abstractNum>
+  <w:abstractNum w:abstractNumId="1" w15:restartNumberingAfterBreak="0">
+    <w:nsid w:val="3522068B"/>
+    <w:multiLevelType w:val="hybridMultilevel"/>
+    <w:tmpl w:val="581EE1C0"/>
+    <w:lvl w:ilvl="0" w:tplc="171AA272">
       <w:start w:val="1"/>
       <w:numFmt w:val="decimal"/>
       <w:lvlText w:val="%1."/>
@@ -15919,138 +16100,52 @@
         <w:ind w:left="360" w:hanging="300"/>
       </w:pPr>
     </w:lvl>
-    <w:lvl w:ilvl="1" w:tplc="E8E64774">
+    <w:lvl w:ilvl="1" w:tplc="6636BEA8">
       <w:numFmt w:val="decimal"/>
       <w:lvlText w:val=""/>
       <w:lvlJc w:val="left"/>
     </w:lvl>
-    <w:lvl w:ilvl="2" w:tplc="7BF029EA">
+    <w:lvl w:ilvl="2" w:tplc="DFA674DA">
       <w:numFmt w:val="decimal"/>
       <w:lvlText w:val=""/>
       <w:lvlJc w:val="left"/>
     </w:lvl>
-    <w:lvl w:ilvl="3" w:tplc="787818C2">
+    <w:lvl w:ilvl="3" w:tplc="584842C2">
       <w:numFmt w:val="decimal"/>
       <w:lvlText w:val=""/>
       <w:lvlJc w:val="left"/>
     </w:lvl>
-    <w:lvl w:ilvl="4" w:tplc="36BE8294">
+    <w:lvl w:ilvl="4" w:tplc="88BE6910">
       <w:numFmt w:val="decimal"/>
       <w:lvlText w:val=""/>
       <w:lvlJc w:val="left"/>
     </w:lvl>
-    <w:lvl w:ilvl="5" w:tplc="CABAE856">
+    <w:lvl w:ilvl="5" w:tplc="028E72F0">
       <w:numFmt w:val="decimal"/>
       <w:lvlText w:val=""/>
       <w:lvlJc w:val="left"/>
     </w:lvl>
-    <w:lvl w:ilvl="6" w:tplc="E0F0DD00">
+    <w:lvl w:ilvl="6" w:tplc="BB22AF38">
       <w:numFmt w:val="decimal"/>
       <w:lvlText w:val=""/>
       <w:lvlJc w:val="left"/>
     </w:lvl>
-    <w:lvl w:ilvl="7" w:tplc="C16A98A8">
+    <w:lvl w:ilvl="7" w:tplc="78C48B40">
       <w:numFmt w:val="decimal"/>
       <w:lvlText w:val=""/>
       <w:lvlJc w:val="left"/>
     </w:lvl>
-    <w:lvl w:ilvl="8" w:tplc="F2564EB8">
+    <w:lvl w:ilvl="8" w:tplc="9D2E5994">
       <w:numFmt w:val="decimal"/>
       <w:lvlText w:val=""/>
       <w:lvlJc w:val="left"/>
     </w:lvl>
   </w:abstractNum>
-  <w:abstractNum w:abstractNumId="1" w15:restartNumberingAfterBreak="0">
-    <w:nsid w:val="2F435284"/>
+  <w:abstractNum w:abstractNumId="2" w15:restartNumberingAfterBreak="0">
+    <w:nsid w:val="4D14340C"/>
     <w:multiLevelType w:val="hybridMultilevel"/>
-    <w:tmpl w:val="38208DEA"/>
-    <w:lvl w:ilvl="0" w:tplc="B7CCC67E" w:tentative="1">
-      <w:start w:val="1"/>
-      <w:numFmt w:val="bullet"/>
-      <w:lvlText w:val="●"/>
-      <w:lvlJc w:val="left"/>
-      <w:pPr>
-        <w:ind w:left="720" w:hanging="360"/>
-      </w:pPr>
-    </w:lvl>
-    <w:lvl w:ilvl="1" w:tplc="70807B50" w:tentative="1">
-      <w:start w:val="1"/>
-      <w:numFmt w:val="bullet"/>
-      <w:lvlText w:val="○"/>
-      <w:lvlJc w:val="left"/>
-      <w:pPr>
-        <w:ind w:left="1440" w:hanging="360"/>
-      </w:pPr>
-    </w:lvl>
-    <w:lvl w:ilvl="2" w:tplc="455EBAE6" w:tentative="1">
-      <w:start w:val="1"/>
-      <w:numFmt w:val="bullet"/>
-      <w:lvlText w:val="■"/>
-      <w:lvlJc w:val="left"/>
-      <w:pPr>
-        <w:ind w:left="2160" w:hanging="360"/>
-      </w:pPr>
-    </w:lvl>
-    <w:lvl w:ilvl="3" w:tplc="87F8A336" w:tentative="1">
-      <w:start w:val="1"/>
-      <w:numFmt w:val="bullet"/>
-      <w:lvlText w:val="●"/>
-      <w:lvlJc w:val="left"/>
-      <w:pPr>
-        <w:ind w:left="2880" w:hanging="360"/>
-      </w:pPr>
-    </w:lvl>
-    <w:lvl w:ilvl="4" w:tplc="F1447CB4" w:tentative="1">
-      <w:start w:val="1"/>
-      <w:numFmt w:val="bullet"/>
-      <w:lvlText w:val="○"/>
-      <w:lvlJc w:val="left"/>
-      <w:pPr>
-        <w:ind w:left="3600" w:hanging="360"/>
-      </w:pPr>
-    </w:lvl>
-    <w:lvl w:ilvl="5" w:tplc="95F66B18" w:tentative="1">
-      <w:start w:val="1"/>
-      <w:numFmt w:val="bullet"/>
-      <w:lvlText w:val="■"/>
-      <w:lvlJc w:val="left"/>
-      <w:pPr>
-        <w:ind w:left="4320" w:hanging="360"/>
-      </w:pPr>
-    </w:lvl>
-    <w:lvl w:ilvl="6" w:tplc="DC7ACC88" w:tentative="1">
-      <w:start w:val="1"/>
-      <w:numFmt w:val="bullet"/>
-      <w:lvlText w:val="●"/>
-      <w:lvlJc w:val="left"/>
-      <w:pPr>
-        <w:ind w:left="5040" w:hanging="360"/>
-      </w:pPr>
-    </w:lvl>
-    <w:lvl w:ilvl="7" w:tplc="3AA8CD46" w:tentative="1">
-      <w:start w:val="1"/>
-      <w:numFmt w:val="bullet"/>
-      <w:lvlText w:val="●"/>
-      <w:lvlJc w:val="left"/>
-      <w:pPr>
-        <w:ind w:left="5760" w:hanging="360"/>
-      </w:pPr>
-    </w:lvl>
-    <w:lvl w:ilvl="8" w:tplc="83C233B2" w:tentative="1">
-      <w:start w:val="1"/>
-      <w:numFmt w:val="bullet"/>
-      <w:lvlText w:val="●"/>
-      <w:lvlJc w:val="left"/>
-      <w:pPr>
-        <w:ind w:left="6480" w:hanging="360"/>
-      </w:pPr>
-    </w:lvl>
-  </w:abstractNum>
-  <w:abstractNum w:abstractNumId="2" w15:restartNumberingAfterBreak="0">
-    <w:nsid w:val="4BD74BE4"/>
-    <w:multiLevelType w:val="hybridMultilevel"/>
-    <w:tmpl w:val="82160E32"/>
-    <w:lvl w:ilvl="0" w:tplc="EF8C7076">
+    <w:tmpl w:val="D2FA7EB0"/>
+    <w:lvl w:ilvl="0" w:tplc="B3DA6816">
       <w:start w:val="1"/>
       <w:numFmt w:val="decimal"/>
       <w:lvlText w:val="%1."/>
@@ -16059,185 +16154,185 @@
         <w:ind w:left="360" w:hanging="300"/>
       </w:pPr>
     </w:lvl>
-    <w:lvl w:ilvl="1" w:tplc="DF902876">
+    <w:lvl w:ilvl="1" w:tplc="9AB46054">
       <w:numFmt w:val="decimal"/>
       <w:lvlText w:val=""/>
       <w:lvlJc w:val="left"/>
     </w:lvl>
-    <w:lvl w:ilvl="2" w:tplc="A7609E1E">
+    <w:lvl w:ilvl="2" w:tplc="DCEA90C6">
       <w:numFmt w:val="decimal"/>
       <w:lvlText w:val=""/>
       <w:lvlJc w:val="left"/>
     </w:lvl>
-    <w:lvl w:ilvl="3" w:tplc="91726E9A">
+    <w:lvl w:ilvl="3" w:tplc="9DA414A4">
       <w:numFmt w:val="decimal"/>
       <w:lvlText w:val=""/>
       <w:lvlJc w:val="left"/>
     </w:lvl>
-    <w:lvl w:ilvl="4" w:tplc="AACA70AE">
+    <w:lvl w:ilvl="4" w:tplc="48B6E3FE">
       <w:numFmt w:val="decimal"/>
       <w:lvlText w:val=""/>
       <w:lvlJc w:val="left"/>
     </w:lvl>
-    <w:lvl w:ilvl="5" w:tplc="5462A29C">
+    <w:lvl w:ilvl="5" w:tplc="480A2FB8">
       <w:numFmt w:val="decimal"/>
       <w:lvlText w:val=""/>
       <w:lvlJc w:val="left"/>
     </w:lvl>
-    <w:lvl w:ilvl="6" w:tplc="C966C4EC">
+    <w:lvl w:ilvl="6" w:tplc="2EA4B222">
       <w:numFmt w:val="decimal"/>
       <w:lvlText w:val=""/>
       <w:lvlJc w:val="left"/>
     </w:lvl>
-    <w:lvl w:ilvl="7" w:tplc="11DED392">
+    <w:lvl w:ilvl="7" w:tplc="40C0760E">
       <w:numFmt w:val="decimal"/>
       <w:lvlText w:val=""/>
       <w:lvlJc w:val="left"/>
     </w:lvl>
-    <w:lvl w:ilvl="8" w:tplc="255A74FC">
+    <w:lvl w:ilvl="8" w:tplc="6BEEE8B2">
       <w:numFmt w:val="decimal"/>
       <w:lvlText w:val=""/>
       <w:lvlJc w:val="left"/>
     </w:lvl>
   </w:abstractNum>
   <w:abstractNum w:abstractNumId="3" w15:restartNumberingAfterBreak="0">
-    <w:nsid w:val="65A93E8C"/>
+    <w:nsid w:val="53ED64E0"/>
     <w:multiLevelType w:val="hybridMultilevel"/>
-    <w:tmpl w:val="65B659C6"/>
-    <w:lvl w:ilvl="0" w:tplc="6622C23E">
+    <w:tmpl w:val="6CF68922"/>
+    <w:lvl w:ilvl="0" w:tplc="56009DDC">
       <w:start w:val="1"/>
-      <w:numFmt w:val="bullet"/>
-      <w:lvlText w:val="•"/>
+      <w:numFmt w:val="decimal"/>
+      <w:lvlText w:val="%1."/>
       <w:lvlJc w:val="left"/>
       <w:pPr>
-        <w:ind w:left="360" w:hanging="240"/>
+        <w:ind w:left="360" w:hanging="300"/>
       </w:pPr>
     </w:lvl>
-    <w:lvl w:ilvl="1" w:tplc="7152CC28" w:tentative="1">
-      <w:start w:val="1"/>
-      <w:numFmt w:val="bullet"/>
-      <w:lvlText w:val="–"/>
-      <w:lvlJc w:val="left"/>
-      <w:pPr>
-        <w:ind w:left="720" w:hanging="240"/>
-      </w:pPr>
-    </w:lvl>
-    <w:lvl w:ilvl="2" w:tplc="A84CFA5C">
+    <w:lvl w:ilvl="1" w:tplc="987AEE14">
       <w:numFmt w:val="decimal"/>
       <w:lvlText w:val=""/>
       <w:lvlJc w:val="left"/>
     </w:lvl>
-    <w:lvl w:ilvl="3" w:tplc="690C5DF4">
+    <w:lvl w:ilvl="2" w:tplc="2B801600">
       <w:numFmt w:val="decimal"/>
       <w:lvlText w:val=""/>
       <w:lvlJc w:val="left"/>
     </w:lvl>
-    <w:lvl w:ilvl="4" w:tplc="EC6A57DA">
+    <w:lvl w:ilvl="3" w:tplc="493A8C48">
       <w:numFmt w:val="decimal"/>
       <w:lvlText w:val=""/>
       <w:lvlJc w:val="left"/>
     </w:lvl>
-    <w:lvl w:ilvl="5" w:tplc="A4E0CB16">
+    <w:lvl w:ilvl="4" w:tplc="498287FC">
       <w:numFmt w:val="decimal"/>
       <w:lvlText w:val=""/>
       <w:lvlJc w:val="left"/>
     </w:lvl>
-    <w:lvl w:ilvl="6" w:tplc="B6A69628">
+    <w:lvl w:ilvl="5" w:tplc="4482914C">
       <w:numFmt w:val="decimal"/>
       <w:lvlText w:val=""/>
       <w:lvlJc w:val="left"/>
     </w:lvl>
-    <w:lvl w:ilvl="7" w:tplc="1B26C8CC">
+    <w:lvl w:ilvl="6" w:tplc="B6F0B97E">
       <w:numFmt w:val="decimal"/>
       <w:lvlText w:val=""/>
       <w:lvlJc w:val="left"/>
     </w:lvl>
-    <w:lvl w:ilvl="8" w:tplc="EA904F4E">
+    <w:lvl w:ilvl="7" w:tplc="A030C8A4">
+      <w:numFmt w:val="decimal"/>
+      <w:lvlText w:val=""/>
+      <w:lvlJc w:val="left"/>
+    </w:lvl>
+    <w:lvl w:ilvl="8" w:tplc="F8A21050">
       <w:numFmt w:val="decimal"/>
       <w:lvlText w:val=""/>
       <w:lvlJc w:val="left"/>
     </w:lvl>
   </w:abstractNum>
   <w:abstractNum w:abstractNumId="4" w15:restartNumberingAfterBreak="0">
-    <w:nsid w:val="7E752E4B"/>
+    <w:nsid w:val="598807F8"/>
     <w:multiLevelType w:val="hybridMultilevel"/>
-    <w:tmpl w:val="3946A258"/>
-    <w:lvl w:ilvl="0" w:tplc="9ADC5FB4">
+    <w:tmpl w:val="D4B01086"/>
+    <w:lvl w:ilvl="0" w:tplc="29E24252">
       <w:start w:val="1"/>
-      <w:numFmt w:val="decimal"/>
-      <w:lvlText w:val="%1."/>
+      <w:numFmt w:val="bullet"/>
+      <w:lvlText w:val="•"/>
       <w:lvlJc w:val="left"/>
       <w:pPr>
-        <w:ind w:left="360" w:hanging="300"/>
+        <w:ind w:left="360" w:hanging="240"/>
       </w:pPr>
     </w:lvl>
-    <w:lvl w:ilvl="1" w:tplc="09DA47A8">
+    <w:lvl w:ilvl="1" w:tplc="BC8E34F0" w:tentative="1">
+      <w:start w:val="1"/>
+      <w:numFmt w:val="bullet"/>
+      <w:lvlText w:val="–"/>
+      <w:lvlJc w:val="left"/>
+      <w:pPr>
+        <w:ind w:left="720" w:hanging="240"/>
+      </w:pPr>
+    </w:lvl>
+    <w:lvl w:ilvl="2" w:tplc="26F01152">
       <w:numFmt w:val="decimal"/>
       <w:lvlText w:val=""/>
       <w:lvlJc w:val="left"/>
     </w:lvl>
-    <w:lvl w:ilvl="2" w:tplc="43D26546">
+    <w:lvl w:ilvl="3" w:tplc="B72E0504">
       <w:numFmt w:val="decimal"/>
       <w:lvlText w:val=""/>
       <w:lvlJc w:val="left"/>
     </w:lvl>
-    <w:lvl w:ilvl="3" w:tplc="CB8C3EF8">
+    <w:lvl w:ilvl="4" w:tplc="C50601AE">
       <w:numFmt w:val="decimal"/>
       <w:lvlText w:val=""/>
       <w:lvlJc w:val="left"/>
     </w:lvl>
-    <w:lvl w:ilvl="4" w:tplc="2844292E">
+    <w:lvl w:ilvl="5" w:tplc="A7B209FA">
       <w:numFmt w:val="decimal"/>
       <w:lvlText w:val=""/>
       <w:lvlJc w:val="left"/>
     </w:lvl>
-    <w:lvl w:ilvl="5" w:tplc="17627FA6">
+    <w:lvl w:ilvl="6" w:tplc="3A38071A">
       <w:numFmt w:val="decimal"/>
       <w:lvlText w:val=""/>
       <w:lvlJc w:val="left"/>
     </w:lvl>
-    <w:lvl w:ilvl="6" w:tplc="A26C8E70">
+    <w:lvl w:ilvl="7" w:tplc="CA0CC38C">
       <w:numFmt w:val="decimal"/>
       <w:lvlText w:val=""/>
       <w:lvlJc w:val="left"/>
     </w:lvl>
-    <w:lvl w:ilvl="7" w:tplc="F502002A">
-      <w:numFmt w:val="decimal"/>
-      <w:lvlText w:val=""/>
-      <w:lvlJc w:val="left"/>
-    </w:lvl>
-    <w:lvl w:ilvl="8" w:tplc="A4748ADE">
+    <w:lvl w:ilvl="8" w:tplc="7EF2B0F4">
       <w:numFmt w:val="decimal"/>
       <w:lvlText w:val=""/>
       <w:lvlJc w:val="left"/>
     </w:lvl>
   </w:abstractNum>
-  <w:num w:numId="1" w16cid:durableId="32928760">
+  <w:num w:numId="1" w16cid:durableId="2062556843">
+    <w:abstractNumId w:val="0"/>
+    <w:lvlOverride w:ilvl="0">
+      <w:startOverride w:val="1"/>
+    </w:lvlOverride>
+  </w:num>
+  <w:num w:numId="2" w16cid:durableId="1210413106">
+    <w:abstractNumId w:val="4"/>
+    <w:lvlOverride w:ilvl="0">
+      <w:startOverride w:val="1"/>
+    </w:lvlOverride>
+  </w:num>
+  <w:num w:numId="3" w16cid:durableId="146098553">
     <w:abstractNumId w:val="1"/>
     <w:lvlOverride w:ilvl="0">
       <w:startOverride w:val="1"/>
     </w:lvlOverride>
   </w:num>
-  <w:num w:numId="2" w16cid:durableId="1855219564">
-    <w:abstractNumId w:val="3"/>
-    <w:lvlOverride w:ilvl="0">
-      <w:startOverride w:val="1"/>
-    </w:lvlOverride>
-  </w:num>
-  <w:num w:numId="3" w16cid:durableId="1258490277">
-    <w:abstractNumId w:val="4"/>
-    <w:lvlOverride w:ilvl="0">
-      <w:startOverride w:val="1"/>
-    </w:lvlOverride>
-  </w:num>
-  <w:num w:numId="4" w16cid:durableId="820149586">
+  <w:num w:numId="4" w16cid:durableId="888885763">
     <w:abstractNumId w:val="2"/>
     <w:lvlOverride w:ilvl="0">
       <w:startOverride w:val="1"/>
     </w:lvlOverride>
   </w:num>
-  <w:num w:numId="5" w16cid:durableId="2073497787">
-    <w:abstractNumId w:val="0"/>
+  <w:num w:numId="5" w16cid:durableId="1578436693">
+    <w:abstractNumId w:val="3"/>
     <w:lvlOverride w:ilvl="0">
       <w:startOverride w:val="1"/>
     </w:lvlOverride>
@@ -16883,7 +16978,7 @@
     <w:autoRedefine/>
     <w:uiPriority w:val="39"/>
     <w:unhideWhenUsed/>
-    <w:rsid w:val="00FB4EA0"/>
+    <w:rsid w:val="00551D81"/>
     <w:pPr>
       <w:spacing w:after="100"/>
     </w:pPr>
@@ -16895,7 +16990,7 @@
     <w:autoRedefine/>
     <w:uiPriority w:val="39"/>
     <w:unhideWhenUsed/>
-    <w:rsid w:val="00FB4EA0"/>
+    <w:rsid w:val="00551D81"/>
     <w:pPr>
       <w:spacing w:after="100"/>
       <w:ind w:left="210"/>

</xml_diff>

<commit_message>
Écran Galerie et contenus du manager
- Réalisations Avant / Après : ajout avec photos (accord du propriétaire
  exigé), publication / dépublication, mise en avant, modification avec
  comparateur, suppression
- Avis clients : publication impossible sans l'accord du client
- Chiffres clés : ajoutés en brouillon, publiés après confirmation
- Site public : plus de séparateur orphelin quand la date ou la durée
  d'une réalisation est absente
- README et guide de fonctionnement à jour : tous les écrans de l'espace
  pro sont en place (paramètres via /admin/)

Co-Authored-By: Claude Opus 5.5 <noreply@anthropic.com>
</commit_message>
<xml_diff>
--- a/docs/guide-fonctionnement.docx
+++ b/docs/guide-fonctionnement.docx
@@ -109,7 +109,7 @@
     <w:sdt>
       <w:sdtPr>
         <w:alias w:val="Sommaire"/>
-        <w:id w:val="734356676"/>
+        <w:id w:val="288330438"/>
       </w:sdtPr>
       <w:sdtEndPr/>
       <w:sdtContent>
@@ -138,7 +138,7 @@
           <w:r>
             <w:fldChar w:fldCharType="separate"/>
           </w:r>
-          <w:hyperlink w:anchor="_Toc242018178" w:history="1">
+          <w:hyperlink w:anchor="_Toc242018668" w:history="1">
             <w:r>
               <w:rPr>
                 <w:rStyle w:val="Lienhypertexte"/>
@@ -162,7 +162,7 @@
               <w:rPr>
                 <w:noProof/>
               </w:rPr>
-              <w:instrText xml:space="preserve"> PAGEREF _Toc242018178 \h </w:instrText>
+              <w:instrText xml:space="preserve"> PAGEREF _Toc242018668 \h </w:instrText>
             </w:r>
             <w:r>
               <w:rPr>
@@ -205,7 +205,7 @@
               <w14:ligatures w14:val="standardContextual"/>
             </w:rPr>
           </w:pPr>
-          <w:hyperlink w:anchor="_Toc242018179" w:history="1">
+          <w:hyperlink w:anchor="_Toc242018669" w:history="1">
             <w:r>
               <w:rPr>
                 <w:rStyle w:val="Lienhypertexte"/>
@@ -229,7 +229,7 @@
               <w:rPr>
                 <w:noProof/>
               </w:rPr>
-              <w:instrText xml:space="preserve"> PAGEREF _Toc242018179 \h </w:instrText>
+              <w:instrText xml:space="preserve"> PAGEREF _Toc242018669 \h </w:instrText>
             </w:r>
             <w:r>
               <w:rPr>
@@ -272,7 +272,7 @@
               <w14:ligatures w14:val="standardContextual"/>
             </w:rPr>
           </w:pPr>
-          <w:hyperlink w:anchor="_Toc242018180" w:history="1">
+          <w:hyperlink w:anchor="_Toc242018670" w:history="1">
             <w:r>
               <w:rPr>
                 <w:rStyle w:val="Lienhypertexte"/>
@@ -296,7 +296,7 @@
               <w:rPr>
                 <w:noProof/>
               </w:rPr>
-              <w:instrText xml:space="preserve"> PAGEREF _Toc242018180 \h </w:instrText>
+              <w:instrText xml:space="preserve"> PAGEREF _Toc242018670 \h </w:instrText>
             </w:r>
             <w:r>
               <w:rPr>
@@ -339,7 +339,7 @@
               <w14:ligatures w14:val="standardContextual"/>
             </w:rPr>
           </w:pPr>
-          <w:hyperlink w:anchor="_Toc242018181" w:history="1">
+          <w:hyperlink w:anchor="_Toc242018671" w:history="1">
             <w:r>
               <w:rPr>
                 <w:rStyle w:val="Lienhypertexte"/>
@@ -363,7 +363,7 @@
               <w:rPr>
                 <w:noProof/>
               </w:rPr>
-              <w:instrText xml:space="preserve"> PAGEREF _Toc242018181 \h </w:instrText>
+              <w:instrText xml:space="preserve"> PAGEREF _Toc242018671 \h </w:instrText>
             </w:r>
             <w:r>
               <w:rPr>
@@ -406,7 +406,7 @@
               <w14:ligatures w14:val="standardContextual"/>
             </w:rPr>
           </w:pPr>
-          <w:hyperlink w:anchor="_Toc242018182" w:history="1">
+          <w:hyperlink w:anchor="_Toc242018672" w:history="1">
             <w:r>
               <w:rPr>
                 <w:rStyle w:val="Lienhypertexte"/>
@@ -430,7 +430,7 @@
               <w:rPr>
                 <w:noProof/>
               </w:rPr>
-              <w:instrText xml:space="preserve"> PAGEREF _Toc242018182 \h </w:instrText>
+              <w:instrText xml:space="preserve"> PAGEREF _Toc242018672 \h </w:instrText>
             </w:r>
             <w:r>
               <w:rPr>
@@ -473,7 +473,7 @@
               <w14:ligatures w14:val="standardContextual"/>
             </w:rPr>
           </w:pPr>
-          <w:hyperlink w:anchor="_Toc242018183" w:history="1">
+          <w:hyperlink w:anchor="_Toc242018673" w:history="1">
             <w:r>
               <w:rPr>
                 <w:rStyle w:val="Lienhypertexte"/>
@@ -497,7 +497,7 @@
               <w:rPr>
                 <w:noProof/>
               </w:rPr>
-              <w:instrText xml:space="preserve"> PAGEREF _Toc242018183 \h </w:instrText>
+              <w:instrText xml:space="preserve"> PAGEREF _Toc242018673 \h </w:instrText>
             </w:r>
             <w:r>
               <w:rPr>
@@ -540,7 +540,7 @@
               <w14:ligatures w14:val="standardContextual"/>
             </w:rPr>
           </w:pPr>
-          <w:hyperlink w:anchor="_Toc242018184" w:history="1">
+          <w:hyperlink w:anchor="_Toc242018674" w:history="1">
             <w:r>
               <w:rPr>
                 <w:rStyle w:val="Lienhypertexte"/>
@@ -564,7 +564,7 @@
               <w:rPr>
                 <w:noProof/>
               </w:rPr>
-              <w:instrText xml:space="preserve"> PAGEREF _Toc242018184 \h </w:instrText>
+              <w:instrText xml:space="preserve"> PAGEREF _Toc242018674 \h </w:instrText>
             </w:r>
             <w:r>
               <w:rPr>
@@ -607,7 +607,7 @@
               <w14:ligatures w14:val="standardContextual"/>
             </w:rPr>
           </w:pPr>
-          <w:hyperlink w:anchor="_Toc242018185" w:history="1">
+          <w:hyperlink w:anchor="_Toc242018675" w:history="1">
             <w:r>
               <w:rPr>
                 <w:rStyle w:val="Lienhypertexte"/>
@@ -631,7 +631,7 @@
               <w:rPr>
                 <w:noProof/>
               </w:rPr>
-              <w:instrText xml:space="preserve"> PAGEREF _Toc242018185 \h </w:instrText>
+              <w:instrText xml:space="preserve"> PAGEREF _Toc242018675 \h </w:instrText>
             </w:r>
             <w:r>
               <w:rPr>
@@ -674,7 +674,7 @@
               <w14:ligatures w14:val="standardContextual"/>
             </w:rPr>
           </w:pPr>
-          <w:hyperlink w:anchor="_Toc242018186" w:history="1">
+          <w:hyperlink w:anchor="_Toc242018676" w:history="1">
             <w:r>
               <w:rPr>
                 <w:rStyle w:val="Lienhypertexte"/>
@@ -698,7 +698,7 @@
               <w:rPr>
                 <w:noProof/>
               </w:rPr>
-              <w:instrText xml:space="preserve"> PAGEREF _Toc242018186 \h </w:instrText>
+              <w:instrText xml:space="preserve"> PAGEREF _Toc242018676 \h </w:instrText>
             </w:r>
             <w:r>
               <w:rPr>
@@ -741,7 +741,7 @@
               <w14:ligatures w14:val="standardContextual"/>
             </w:rPr>
           </w:pPr>
-          <w:hyperlink w:anchor="_Toc242018187" w:history="1">
+          <w:hyperlink w:anchor="_Toc242018677" w:history="1">
             <w:r>
               <w:rPr>
                 <w:rStyle w:val="Lienhypertexte"/>
@@ -765,7 +765,7 @@
               <w:rPr>
                 <w:noProof/>
               </w:rPr>
-              <w:instrText xml:space="preserve"> PAGEREF _Toc242018187 \h </w:instrText>
+              <w:instrText xml:space="preserve"> PAGEREF _Toc242018677 \h </w:instrText>
             </w:r>
             <w:r>
               <w:rPr>
@@ -808,7 +808,7 @@
               <w14:ligatures w14:val="standardContextual"/>
             </w:rPr>
           </w:pPr>
-          <w:hyperlink w:anchor="_Toc242018188" w:history="1">
+          <w:hyperlink w:anchor="_Toc242018678" w:history="1">
             <w:r>
               <w:rPr>
                 <w:rStyle w:val="Lienhypertexte"/>
@@ -832,7 +832,7 @@
               <w:rPr>
                 <w:noProof/>
               </w:rPr>
-              <w:instrText xml:space="preserve"> PAGEREF _Toc242018188 \h </w:instrText>
+              <w:instrText xml:space="preserve"> PAGEREF _Toc242018678 \h </w:instrText>
             </w:r>
             <w:r>
               <w:rPr>
@@ -875,7 +875,7 @@
               <w14:ligatures w14:val="standardContextual"/>
             </w:rPr>
           </w:pPr>
-          <w:hyperlink w:anchor="_Toc242018189" w:history="1">
+          <w:hyperlink w:anchor="_Toc242018679" w:history="1">
             <w:r>
               <w:rPr>
                 <w:rStyle w:val="Lienhypertexte"/>
@@ -899,7 +899,7 @@
               <w:rPr>
                 <w:noProof/>
               </w:rPr>
-              <w:instrText xml:space="preserve"> PAGEREF _Toc242018189 \h </w:instrText>
+              <w:instrText xml:space="preserve"> PAGEREF _Toc242018679 \h </w:instrText>
             </w:r>
             <w:r>
               <w:rPr>
@@ -942,7 +942,7 @@
               <w14:ligatures w14:val="standardContextual"/>
             </w:rPr>
           </w:pPr>
-          <w:hyperlink w:anchor="_Toc242018190" w:history="1">
+          <w:hyperlink w:anchor="_Toc242018680" w:history="1">
             <w:r>
               <w:rPr>
                 <w:rStyle w:val="Lienhypertexte"/>
@@ -966,7 +966,7 @@
               <w:rPr>
                 <w:noProof/>
               </w:rPr>
-              <w:instrText xml:space="preserve"> PAGEREF _Toc242018190 \h </w:instrText>
+              <w:instrText xml:space="preserve"> PAGEREF _Toc242018680 \h </w:instrText>
             </w:r>
             <w:r>
               <w:rPr>
@@ -1009,7 +1009,7 @@
               <w14:ligatures w14:val="standardContextual"/>
             </w:rPr>
           </w:pPr>
-          <w:hyperlink w:anchor="_Toc242018191" w:history="1">
+          <w:hyperlink w:anchor="_Toc242018681" w:history="1">
             <w:r>
               <w:rPr>
                 <w:rStyle w:val="Lienhypertexte"/>
@@ -1033,7 +1033,7 @@
               <w:rPr>
                 <w:noProof/>
               </w:rPr>
-              <w:instrText xml:space="preserve"> PAGEREF _Toc242018191 \h </w:instrText>
+              <w:instrText xml:space="preserve"> PAGEREF _Toc242018681 \h </w:instrText>
             </w:r>
             <w:r>
               <w:rPr>
@@ -1076,7 +1076,7 @@
               <w14:ligatures w14:val="standardContextual"/>
             </w:rPr>
           </w:pPr>
-          <w:hyperlink w:anchor="_Toc242018192" w:history="1">
+          <w:hyperlink w:anchor="_Toc242018682" w:history="1">
             <w:r>
               <w:rPr>
                 <w:rStyle w:val="Lienhypertexte"/>
@@ -1100,7 +1100,7 @@
               <w:rPr>
                 <w:noProof/>
               </w:rPr>
-              <w:instrText xml:space="preserve"> PAGEREF _Toc242018192 \h </w:instrText>
+              <w:instrText xml:space="preserve"> PAGEREF _Toc242018682 \h </w:instrText>
             </w:r>
             <w:r>
               <w:rPr>
@@ -1143,7 +1143,7 @@
               <w14:ligatures w14:val="standardContextual"/>
             </w:rPr>
           </w:pPr>
-          <w:hyperlink w:anchor="_Toc242018193" w:history="1">
+          <w:hyperlink w:anchor="_Toc242018683" w:history="1">
             <w:r>
               <w:rPr>
                 <w:rStyle w:val="Lienhypertexte"/>
@@ -1167,7 +1167,7 @@
               <w:rPr>
                 <w:noProof/>
               </w:rPr>
-              <w:instrText xml:space="preserve"> PAGEREF _Toc242018193 \h </w:instrText>
+              <w:instrText xml:space="preserve"> PAGEREF _Toc242018683 \h </w:instrText>
             </w:r>
             <w:r>
               <w:rPr>
@@ -1210,7 +1210,7 @@
               <w14:ligatures w14:val="standardContextual"/>
             </w:rPr>
           </w:pPr>
-          <w:hyperlink w:anchor="_Toc242018194" w:history="1">
+          <w:hyperlink w:anchor="_Toc242018684" w:history="1">
             <w:r>
               <w:rPr>
                 <w:rStyle w:val="Lienhypertexte"/>
@@ -1234,7 +1234,7 @@
               <w:rPr>
                 <w:noProof/>
               </w:rPr>
-              <w:instrText xml:space="preserve"> PAGEREF _Toc242018194 \h </w:instrText>
+              <w:instrText xml:space="preserve"> PAGEREF _Toc242018684 \h </w:instrText>
             </w:r>
             <w:r>
               <w:rPr>
@@ -1277,7 +1277,7 @@
               <w14:ligatures w14:val="standardContextual"/>
             </w:rPr>
           </w:pPr>
-          <w:hyperlink w:anchor="_Toc242018195" w:history="1">
+          <w:hyperlink w:anchor="_Toc242018685" w:history="1">
             <w:r>
               <w:rPr>
                 <w:rStyle w:val="Lienhypertexte"/>
@@ -1301,7 +1301,7 @@
               <w:rPr>
                 <w:noProof/>
               </w:rPr>
-              <w:instrText xml:space="preserve"> PAGEREF _Toc242018195 \h </w:instrText>
+              <w:instrText xml:space="preserve"> PAGEREF _Toc242018685 \h </w:instrText>
             </w:r>
             <w:r>
               <w:rPr>
@@ -1344,7 +1344,7 @@
               <w14:ligatures w14:val="standardContextual"/>
             </w:rPr>
           </w:pPr>
-          <w:hyperlink w:anchor="_Toc242018196" w:history="1">
+          <w:hyperlink w:anchor="_Toc242018686" w:history="1">
             <w:r>
               <w:rPr>
                 <w:rStyle w:val="Lienhypertexte"/>
@@ -1368,7 +1368,7 @@
               <w:rPr>
                 <w:noProof/>
               </w:rPr>
-              <w:instrText xml:space="preserve"> PAGEREF _Toc242018196 \h </w:instrText>
+              <w:instrText xml:space="preserve"> PAGEREF _Toc242018686 \h </w:instrText>
             </w:r>
             <w:r>
               <w:rPr>
@@ -1411,7 +1411,7 @@
               <w14:ligatures w14:val="standardContextual"/>
             </w:rPr>
           </w:pPr>
-          <w:hyperlink w:anchor="_Toc242018197" w:history="1">
+          <w:hyperlink w:anchor="_Toc242018687" w:history="1">
             <w:r>
               <w:rPr>
                 <w:rStyle w:val="Lienhypertexte"/>
@@ -1435,7 +1435,7 @@
               <w:rPr>
                 <w:noProof/>
               </w:rPr>
-              <w:instrText xml:space="preserve"> PAGEREF _Toc242018197 \h </w:instrText>
+              <w:instrText xml:space="preserve"> PAGEREF _Toc242018687 \h </w:instrText>
             </w:r>
             <w:r>
               <w:rPr>
@@ -1478,7 +1478,7 @@
               <w14:ligatures w14:val="standardContextual"/>
             </w:rPr>
           </w:pPr>
-          <w:hyperlink w:anchor="_Toc242018198" w:history="1">
+          <w:hyperlink w:anchor="_Toc242018688" w:history="1">
             <w:r>
               <w:rPr>
                 <w:rStyle w:val="Lienhypertexte"/>
@@ -1502,7 +1502,7 @@
               <w:rPr>
                 <w:noProof/>
               </w:rPr>
-              <w:instrText xml:space="preserve"> PAGEREF _Toc242018198 \h </w:instrText>
+              <w:instrText xml:space="preserve"> PAGEREF _Toc242018688 \h </w:instrText>
             </w:r>
             <w:r>
               <w:rPr>
@@ -1545,7 +1545,7 @@
               <w14:ligatures w14:val="standardContextual"/>
             </w:rPr>
           </w:pPr>
-          <w:hyperlink w:anchor="_Toc242018199" w:history="1">
+          <w:hyperlink w:anchor="_Toc242018689" w:history="1">
             <w:r>
               <w:rPr>
                 <w:rStyle w:val="Lienhypertexte"/>
@@ -1569,7 +1569,7 @@
               <w:rPr>
                 <w:noProof/>
               </w:rPr>
-              <w:instrText xml:space="preserve"> PAGEREF _Toc242018199 \h </w:instrText>
+              <w:instrText xml:space="preserve"> PAGEREF _Toc242018689 \h </w:instrText>
             </w:r>
             <w:r>
               <w:rPr>
@@ -1612,7 +1612,7 @@
               <w14:ligatures w14:val="standardContextual"/>
             </w:rPr>
           </w:pPr>
-          <w:hyperlink w:anchor="_Toc242018200" w:history="1">
+          <w:hyperlink w:anchor="_Toc242018690" w:history="1">
             <w:r>
               <w:rPr>
                 <w:rStyle w:val="Lienhypertexte"/>
@@ -1636,7 +1636,7 @@
               <w:rPr>
                 <w:noProof/>
               </w:rPr>
-              <w:instrText xml:space="preserve"> PAGEREF _Toc242018200 \h </w:instrText>
+              <w:instrText xml:space="preserve"> PAGEREF _Toc242018690 \h </w:instrText>
             </w:r>
             <w:r>
               <w:rPr>
@@ -1679,7 +1679,7 @@
               <w14:ligatures w14:val="standardContextual"/>
             </w:rPr>
           </w:pPr>
-          <w:hyperlink w:anchor="_Toc242018201" w:history="1">
+          <w:hyperlink w:anchor="_Toc242018691" w:history="1">
             <w:r>
               <w:rPr>
                 <w:rStyle w:val="Lienhypertexte"/>
@@ -1703,7 +1703,7 @@
               <w:rPr>
                 <w:noProof/>
               </w:rPr>
-              <w:instrText xml:space="preserve"> PAGEREF _Toc242018201 \h </w:instrText>
+              <w:instrText xml:space="preserve"> PAGEREF _Toc242018691 \h </w:instrText>
             </w:r>
             <w:r>
               <w:rPr>
@@ -1746,7 +1746,7 @@
               <w14:ligatures w14:val="standardContextual"/>
             </w:rPr>
           </w:pPr>
-          <w:hyperlink w:anchor="_Toc242018202" w:history="1">
+          <w:hyperlink w:anchor="_Toc242018692" w:history="1">
             <w:r>
               <w:rPr>
                 <w:rStyle w:val="Lienhypertexte"/>
@@ -1770,7 +1770,7 @@
               <w:rPr>
                 <w:noProof/>
               </w:rPr>
-              <w:instrText xml:space="preserve"> PAGEREF _Toc242018202 \h </w:instrText>
+              <w:instrText xml:space="preserve"> PAGEREF _Toc242018692 \h </w:instrText>
             </w:r>
             <w:r>
               <w:rPr>
@@ -1813,7 +1813,7 @@
               <w14:ligatures w14:val="standardContextual"/>
             </w:rPr>
           </w:pPr>
-          <w:hyperlink w:anchor="_Toc242018203" w:history="1">
+          <w:hyperlink w:anchor="_Toc242018693" w:history="1">
             <w:r>
               <w:rPr>
                 <w:rStyle w:val="Lienhypertexte"/>
@@ -1837,7 +1837,7 @@
               <w:rPr>
                 <w:noProof/>
               </w:rPr>
-              <w:instrText xml:space="preserve"> PAGEREF _Toc242018203 \h </w:instrText>
+              <w:instrText xml:space="preserve"> PAGEREF _Toc242018693 \h </w:instrText>
             </w:r>
             <w:r>
               <w:rPr>
@@ -1880,7 +1880,7 @@
               <w14:ligatures w14:val="standardContextual"/>
             </w:rPr>
           </w:pPr>
-          <w:hyperlink w:anchor="_Toc242018204" w:history="1">
+          <w:hyperlink w:anchor="_Toc242018694" w:history="1">
             <w:r>
               <w:rPr>
                 <w:rStyle w:val="Lienhypertexte"/>
@@ -1904,7 +1904,7 @@
               <w:rPr>
                 <w:noProof/>
               </w:rPr>
-              <w:instrText xml:space="preserve"> PAGEREF _Toc242018204 \h </w:instrText>
+              <w:instrText xml:space="preserve"> PAGEREF _Toc242018694 \h </w:instrText>
             </w:r>
             <w:r>
               <w:rPr>
@@ -1947,7 +1947,7 @@
               <w14:ligatures w14:val="standardContextual"/>
             </w:rPr>
           </w:pPr>
-          <w:hyperlink w:anchor="_Toc242018205" w:history="1">
+          <w:hyperlink w:anchor="_Toc242018695" w:history="1">
             <w:r>
               <w:rPr>
                 <w:rStyle w:val="Lienhypertexte"/>
@@ -1971,7 +1971,7 @@
               <w:rPr>
                 <w:noProof/>
               </w:rPr>
-              <w:instrText xml:space="preserve"> PAGEREF _Toc242018205 \h </w:instrText>
+              <w:instrText xml:space="preserve"> PAGEREF _Toc242018695 \h </w:instrText>
             </w:r>
             <w:r>
               <w:rPr>
@@ -2014,7 +2014,7 @@
               <w14:ligatures w14:val="standardContextual"/>
             </w:rPr>
           </w:pPr>
-          <w:hyperlink w:anchor="_Toc242018206" w:history="1">
+          <w:hyperlink w:anchor="_Toc242018696" w:history="1">
             <w:r>
               <w:rPr>
                 <w:rStyle w:val="Lienhypertexte"/>
@@ -2038,7 +2038,7 @@
               <w:rPr>
                 <w:noProof/>
               </w:rPr>
-              <w:instrText xml:space="preserve"> PAGEREF _Toc242018206 \h </w:instrText>
+              <w:instrText xml:space="preserve"> PAGEREF _Toc242018696 \h </w:instrText>
             </w:r>
             <w:r>
               <w:rPr>
@@ -2081,7 +2081,7 @@
               <w14:ligatures w14:val="standardContextual"/>
             </w:rPr>
           </w:pPr>
-          <w:hyperlink w:anchor="_Toc242018207" w:history="1">
+          <w:hyperlink w:anchor="_Toc242018697" w:history="1">
             <w:r>
               <w:rPr>
                 <w:rStyle w:val="Lienhypertexte"/>
@@ -2105,7 +2105,7 @@
               <w:rPr>
                 <w:noProof/>
               </w:rPr>
-              <w:instrText xml:space="preserve"> PAGEREF _Toc242018207 \h </w:instrText>
+              <w:instrText xml:space="preserve"> PAGEREF _Toc242018697 \h </w:instrText>
             </w:r>
             <w:r>
               <w:rPr>
@@ -2148,7 +2148,7 @@
               <w14:ligatures w14:val="standardContextual"/>
             </w:rPr>
           </w:pPr>
-          <w:hyperlink w:anchor="_Toc242018208" w:history="1">
+          <w:hyperlink w:anchor="_Toc242018698" w:history="1">
             <w:r>
               <w:rPr>
                 <w:rStyle w:val="Lienhypertexte"/>
@@ -2172,7 +2172,7 @@
               <w:rPr>
                 <w:noProof/>
               </w:rPr>
-              <w:instrText xml:space="preserve"> PAGEREF _Toc242018208 \h </w:instrText>
+              <w:instrText xml:space="preserve"> PAGEREF _Toc242018698 \h </w:instrText>
             </w:r>
             <w:r>
               <w:rPr>
@@ -2215,7 +2215,7 @@
               <w14:ligatures w14:val="standardContextual"/>
             </w:rPr>
           </w:pPr>
-          <w:hyperlink w:anchor="_Toc242018209" w:history="1">
+          <w:hyperlink w:anchor="_Toc242018699" w:history="1">
             <w:r>
               <w:rPr>
                 <w:rStyle w:val="Lienhypertexte"/>
@@ -2239,7 +2239,7 @@
               <w:rPr>
                 <w:noProof/>
               </w:rPr>
-              <w:instrText xml:space="preserve"> PAGEREF _Toc242018209 \h </w:instrText>
+              <w:instrText xml:space="preserve"> PAGEREF _Toc242018699 \h </w:instrText>
             </w:r>
             <w:r>
               <w:rPr>
@@ -2282,7 +2282,7 @@
               <w14:ligatures w14:val="standardContextual"/>
             </w:rPr>
           </w:pPr>
-          <w:hyperlink w:anchor="_Toc242018210" w:history="1">
+          <w:hyperlink w:anchor="_Toc242018700" w:history="1">
             <w:r>
               <w:rPr>
                 <w:rStyle w:val="Lienhypertexte"/>
@@ -2306,7 +2306,7 @@
               <w:rPr>
                 <w:noProof/>
               </w:rPr>
-              <w:instrText xml:space="preserve"> PAGEREF _Toc242018210 \h </w:instrText>
+              <w:instrText xml:space="preserve"> PAGEREF _Toc242018700 \h </w:instrText>
             </w:r>
             <w:r>
               <w:rPr>
@@ -2349,7 +2349,7 @@
               <w14:ligatures w14:val="standardContextual"/>
             </w:rPr>
           </w:pPr>
-          <w:hyperlink w:anchor="_Toc242018211" w:history="1">
+          <w:hyperlink w:anchor="_Toc242018701" w:history="1">
             <w:r>
               <w:rPr>
                 <w:rStyle w:val="Lienhypertexte"/>
@@ -2373,7 +2373,7 @@
               <w:rPr>
                 <w:noProof/>
               </w:rPr>
-              <w:instrText xml:space="preserve"> PAGEREF _Toc242018211 \h </w:instrText>
+              <w:instrText xml:space="preserve"> PAGEREF _Toc242018701 \h </w:instrText>
             </w:r>
             <w:r>
               <w:rPr>
@@ -2416,7 +2416,7 @@
               <w14:ligatures w14:val="standardContextual"/>
             </w:rPr>
           </w:pPr>
-          <w:hyperlink w:anchor="_Toc242018212" w:history="1">
+          <w:hyperlink w:anchor="_Toc242018702" w:history="1">
             <w:r>
               <w:rPr>
                 <w:rStyle w:val="Lienhypertexte"/>
@@ -2440,7 +2440,7 @@
               <w:rPr>
                 <w:noProof/>
               </w:rPr>
-              <w:instrText xml:space="preserve"> PAGEREF _Toc242018212 \h </w:instrText>
+              <w:instrText xml:space="preserve"> PAGEREF _Toc242018702 \h </w:instrText>
             </w:r>
             <w:r>
               <w:rPr>
@@ -2483,7 +2483,7 @@
               <w14:ligatures w14:val="standardContextual"/>
             </w:rPr>
           </w:pPr>
-          <w:hyperlink w:anchor="_Toc242018213" w:history="1">
+          <w:hyperlink w:anchor="_Toc242018703" w:history="1">
             <w:r>
               <w:rPr>
                 <w:rStyle w:val="Lienhypertexte"/>
@@ -2507,7 +2507,7 @@
               <w:rPr>
                 <w:noProof/>
               </w:rPr>
-              <w:instrText xml:space="preserve"> PAGEREF _Toc242018213 \h </w:instrText>
+              <w:instrText xml:space="preserve"> PAGEREF _Toc242018703 \h </w:instrText>
             </w:r>
             <w:r>
               <w:rPr>
@@ -2550,7 +2550,7 @@
               <w14:ligatures w14:val="standardContextual"/>
             </w:rPr>
           </w:pPr>
-          <w:hyperlink w:anchor="_Toc242018214" w:history="1">
+          <w:hyperlink w:anchor="_Toc242018704" w:history="1">
             <w:r>
               <w:rPr>
                 <w:rStyle w:val="Lienhypertexte"/>
@@ -2574,7 +2574,7 @@
               <w:rPr>
                 <w:noProof/>
               </w:rPr>
-              <w:instrText xml:space="preserve"> PAGEREF _Toc242018214 \h </w:instrText>
+              <w:instrText xml:space="preserve"> PAGEREF _Toc242018704 \h </w:instrText>
             </w:r>
             <w:r>
               <w:rPr>
@@ -2617,7 +2617,7 @@
               <w14:ligatures w14:val="standardContextual"/>
             </w:rPr>
           </w:pPr>
-          <w:hyperlink w:anchor="_Toc242018215" w:history="1">
+          <w:hyperlink w:anchor="_Toc242018705" w:history="1">
             <w:r>
               <w:rPr>
                 <w:rStyle w:val="Lienhypertexte"/>
@@ -2641,7 +2641,7 @@
               <w:rPr>
                 <w:noProof/>
               </w:rPr>
-              <w:instrText xml:space="preserve"> PAGEREF _Toc242018215 \h </w:instrText>
+              <w:instrText xml:space="preserve"> PAGEREF _Toc242018705 \h </w:instrText>
             </w:r>
             <w:r>
               <w:rPr>
@@ -2681,7 +2681,7 @@
         <w:pStyle w:val="Titre1"/>
         <w:pageBreakBefore/>
       </w:pPr>
-      <w:bookmarkStart w:id="0" w:name="_Toc242018178"/>
+      <w:bookmarkStart w:id="0" w:name="_Toc242018668"/>
       <w:r>
         <w:lastRenderedPageBreak/>
         <w:t>1. Présentation de la plateforme</w:t>
@@ -3132,7 +3132,7 @@
       <w:pPr>
         <w:pStyle w:val="Titre2"/>
       </w:pPr>
-      <w:bookmarkStart w:id="1" w:name="_Toc242018179"/>
+      <w:bookmarkStart w:id="1" w:name="_Toc242018669"/>
       <w:r>
         <w:t>1.1 Une seule connexion</w:t>
       </w:r>
@@ -3160,7 +3160,7 @@
       <w:pPr>
         <w:pStyle w:val="Titre2"/>
       </w:pPr>
-      <w:bookmarkStart w:id="2" w:name="_Toc242018180"/>
+      <w:bookmarkStart w:id="2" w:name="_Toc242018670"/>
       <w:r>
         <w:t>1.2 Principes de fonctionnement</w:t>
       </w:r>
@@ -3251,7 +3251,7 @@
         <w:pStyle w:val="Titre1"/>
         <w:pageBreakBefore/>
       </w:pPr>
-      <w:bookmarkStart w:id="3" w:name="_Toc242018181"/>
+      <w:bookmarkStart w:id="3" w:name="_Toc242018671"/>
       <w:r>
         <w:lastRenderedPageBreak/>
         <w:t>2. Les rôles et leurs droits</w:t>
@@ -4075,7 +4075,7 @@
       <w:pPr>
         <w:pStyle w:val="Titre2"/>
       </w:pPr>
-      <w:bookmarkStart w:id="4" w:name="_Toc242018182"/>
+      <w:bookmarkStart w:id="4" w:name="_Toc242018672"/>
       <w:r>
         <w:t>2.1 Visiteur</w:t>
       </w:r>
@@ -4185,7 +4185,7 @@
       <w:pPr>
         <w:pStyle w:val="Titre2"/>
       </w:pPr>
-      <w:bookmarkStart w:id="5" w:name="_Toc242018183"/>
+      <w:bookmarkStart w:id="5" w:name="_Toc242018673"/>
       <w:r>
         <w:t>2.2 Client</w:t>
       </w:r>
@@ -4399,7 +4399,7 @@
       <w:pPr>
         <w:pStyle w:val="Titre2"/>
       </w:pPr>
-      <w:bookmarkStart w:id="6" w:name="_Toc242018184"/>
+      <w:bookmarkStart w:id="6" w:name="_Toc242018674"/>
       <w:r>
         <w:lastRenderedPageBreak/>
         <w:t>2.3 Technicien</w:t>
@@ -4923,7 +4923,7 @@
       <w:pPr>
         <w:pStyle w:val="Titre2"/>
       </w:pPr>
-      <w:bookmarkStart w:id="7" w:name="_Toc242018185"/>
+      <w:bookmarkStart w:id="7" w:name="_Toc242018675"/>
       <w:r>
         <w:t>2.4 Manager</w:t>
       </w:r>
@@ -5176,7 +5176,7 @@
       <w:pPr>
         <w:pStyle w:val="Titre2"/>
       </w:pPr>
-      <w:bookmarkStart w:id="8" w:name="_Toc242018186"/>
+      <w:bookmarkStart w:id="8" w:name="_Toc242018676"/>
       <w:r>
         <w:t>2.5 Administrateur</w:t>
       </w:r>
@@ -5286,7 +5286,7 @@
         <w:pStyle w:val="Titre1"/>
         <w:pageBreakBefore/>
       </w:pPr>
-      <w:bookmarkStart w:id="9" w:name="_Toc242018187"/>
+      <w:bookmarkStart w:id="9" w:name="_Toc242018677"/>
       <w:r>
         <w:lastRenderedPageBreak/>
         <w:t>3. Le parcours d’un rendez-vous</w:t>
@@ -6377,7 +6377,7 @@
       <w:pPr>
         <w:pStyle w:val="Titre2"/>
       </w:pPr>
-      <w:bookmarkStart w:id="10" w:name="_Toc242018188"/>
+      <w:bookmarkStart w:id="10" w:name="_Toc242018678"/>
       <w:r>
         <w:t>3.1 Situations particulières</w:t>
       </w:r>
@@ -7027,7 +7027,7 @@
       <w:pPr>
         <w:pStyle w:val="Titre2"/>
       </w:pPr>
-      <w:bookmarkStart w:id="11" w:name="_Toc242018189"/>
+      <w:bookmarkStart w:id="11" w:name="_Toc242018679"/>
       <w:r>
         <w:t>3.2 Restitution et paiement au comptoir</w:t>
       </w:r>
@@ -7120,7 +7120,7 @@
       <w:pPr>
         <w:pStyle w:val="Titre2"/>
       </w:pPr>
-      <w:bookmarkStart w:id="12" w:name="_Toc242018190"/>
+      <w:bookmarkStart w:id="12" w:name="_Toc242018680"/>
       <w:r>
         <w:t>3.3 L’avancement affiché au client</w:t>
       </w:r>
@@ -7149,7 +7149,7 @@
         <w:pStyle w:val="Titre1"/>
         <w:pageBreakBefore/>
       </w:pPr>
-      <w:bookmarkStart w:id="13" w:name="_Toc242018191"/>
+      <w:bookmarkStart w:id="13" w:name="_Toc242018681"/>
       <w:r>
         <w:lastRenderedPageBreak/>
         <w:t>4. Réservation en ligne et disponibilités</w:t>
@@ -7160,7 +7160,7 @@
       <w:pPr>
         <w:pStyle w:val="Titre2"/>
       </w:pPr>
-      <w:bookmarkStart w:id="14" w:name="_Toc242018192"/>
+      <w:bookmarkStart w:id="14" w:name="_Toc242018682"/>
       <w:r>
         <w:t>4.1 Le tunnel de réservation</w:t>
       </w:r>
@@ -7320,7 +7320,7 @@
       <w:pPr>
         <w:pStyle w:val="Titre2"/>
       </w:pPr>
-      <w:bookmarkStart w:id="15" w:name="_Toc242018193"/>
+      <w:bookmarkStart w:id="15" w:name="_Toc242018683"/>
       <w:r>
         <w:t>4.2 Comment les créneaux sont calculés</w:t>
       </w:r>
@@ -8280,7 +8280,7 @@
         <w:pStyle w:val="Titre1"/>
         <w:pageBreakBefore/>
       </w:pPr>
-      <w:bookmarkStart w:id="16" w:name="_Toc242018194"/>
+      <w:bookmarkStart w:id="16" w:name="_Toc242018684"/>
       <w:r>
         <w:lastRenderedPageBreak/>
         <w:t>5. L’espace client</w:t>
@@ -8863,7 +8863,7 @@
       <w:pPr>
         <w:pStyle w:val="Titre2"/>
       </w:pPr>
-      <w:bookmarkStart w:id="17" w:name="_Toc242018195"/>
+      <w:bookmarkStart w:id="17" w:name="_Toc242018685"/>
       <w:r>
         <w:t>5.1 Photo du véhicule</w:t>
       </w:r>
@@ -8943,7 +8943,7 @@
         <w:pStyle w:val="Titre1"/>
         <w:pageBreakBefore/>
       </w:pPr>
-      <w:bookmarkStart w:id="18" w:name="_Toc242018196"/>
+      <w:bookmarkStart w:id="18" w:name="_Toc242018686"/>
       <w:r>
         <w:lastRenderedPageBreak/>
         <w:t>6. L’espace professionnel</w:t>
@@ -10182,7 +10182,7 @@
         <w:pStyle w:val="Titre1"/>
         <w:pageBreakBefore/>
       </w:pPr>
-      <w:bookmarkStart w:id="19" w:name="_Toc242018197"/>
+      <w:bookmarkStart w:id="19" w:name="_Toc242018687"/>
       <w:r>
         <w:lastRenderedPageBreak/>
         <w:t>7. Le suivi atelier</w:t>
@@ -10193,7 +10193,7 @@
       <w:pPr>
         <w:pStyle w:val="Titre2"/>
       </w:pPr>
-      <w:bookmarkStart w:id="20" w:name="_Toc242018198"/>
+      <w:bookmarkStart w:id="20" w:name="_Toc242018688"/>
       <w:r>
         <w:t>7.1 Étapes de traitement</w:t>
       </w:r>
@@ -10282,7 +10282,7 @@
       <w:pPr>
         <w:pStyle w:val="Titre2"/>
       </w:pPr>
-      <w:bookmarkStart w:id="21" w:name="_Toc242018199"/>
+      <w:bookmarkStart w:id="21" w:name="_Toc242018689"/>
       <w:r>
         <w:t>7.2 Photos d’intervention</w:t>
       </w:r>
@@ -10633,7 +10633,7 @@
         <w:pStyle w:val="Titre1"/>
         <w:pageBreakBefore/>
       </w:pPr>
-      <w:bookmarkStart w:id="22" w:name="_Toc242018200"/>
+      <w:bookmarkStart w:id="22" w:name="_Toc242018690"/>
       <w:r>
         <w:lastRenderedPageBreak/>
         <w:t>8. Facturation et paiements</w:t>
@@ -10644,7 +10644,7 @@
       <w:pPr>
         <w:pStyle w:val="Titre2"/>
       </w:pPr>
-      <w:bookmarkStart w:id="23" w:name="_Toc242018201"/>
+      <w:bookmarkStart w:id="23" w:name="_Toc242018691"/>
       <w:r>
         <w:t>8.1 Les factures</w:t>
       </w:r>
@@ -10760,7 +10760,7 @@
       <w:pPr>
         <w:pStyle w:val="Titre2"/>
       </w:pPr>
-      <w:bookmarkStart w:id="24" w:name="_Toc242018202"/>
+      <w:bookmarkStart w:id="24" w:name="_Toc242018692"/>
       <w:r>
         <w:t>8.2 Les paiements</w:t>
       </w:r>
@@ -10905,7 +10905,7 @@
       <w:pPr>
         <w:pStyle w:val="Titre2"/>
       </w:pPr>
-      <w:bookmarkStart w:id="25" w:name="_Toc242018203"/>
+      <w:bookmarkStart w:id="25" w:name="_Toc242018693"/>
       <w:r>
         <w:t>8.3 Le journal de caisse</w:t>
       </w:r>
@@ -10953,7 +10953,7 @@
       <w:pPr>
         <w:pStyle w:val="Titre2"/>
       </w:pPr>
-      <w:bookmarkStart w:id="26" w:name="_Toc242018204"/>
+      <w:bookmarkStart w:id="26" w:name="_Toc242018694"/>
       <w:r>
         <w:t>8.4 Statut d’une facture</w:t>
       </w:r>
@@ -11415,7 +11415,7 @@
         <w:pStyle w:val="Titre1"/>
         <w:pageBreakBefore/>
       </w:pPr>
-      <w:bookmarkStart w:id="27" w:name="_Toc242018205"/>
+      <w:bookmarkStart w:id="27" w:name="_Toc242018695"/>
       <w:r>
         <w:lastRenderedPageBreak/>
         <w:t>9. Les notifications</w:t>
@@ -11426,7 +11426,7 @@
       <w:pPr>
         <w:pStyle w:val="Titre2"/>
       </w:pPr>
-      <w:bookmarkStart w:id="28" w:name="_Toc242018206"/>
+      <w:bookmarkStart w:id="28" w:name="_Toc242018696"/>
       <w:r>
         <w:t>9.1 Pour le client</w:t>
       </w:r>
@@ -12094,7 +12094,7 @@
       <w:pPr>
         <w:pStyle w:val="Titre2"/>
       </w:pPr>
-      <w:bookmarkStart w:id="29" w:name="_Toc242018207"/>
+      <w:bookmarkStart w:id="29" w:name="_Toc242018697"/>
       <w:r>
         <w:t>9.2 Pour l’équipe</w:t>
       </w:r>
@@ -12572,7 +12572,7 @@
         <w:pStyle w:val="Titre1"/>
         <w:pageBreakBefore/>
       </w:pPr>
-      <w:bookmarkStart w:id="30" w:name="_Toc242018208"/>
+      <w:bookmarkStart w:id="30" w:name="_Toc242018698"/>
       <w:r>
         <w:lastRenderedPageBreak/>
         <w:t>10. Contenus publics du site</w:t>
@@ -13008,7 +13008,7 @@
         <w:pStyle w:val="Titre1"/>
         <w:pageBreakBefore/>
       </w:pPr>
-      <w:bookmarkStart w:id="31" w:name="_Toc242018209"/>
+      <w:bookmarkStart w:id="31" w:name="_Toc242018699"/>
       <w:r>
         <w:lastRenderedPageBreak/>
         <w:t>11. Statistiques et exports</w:t>
@@ -13641,7 +13641,7 @@
         <w:pStyle w:val="Titre1"/>
         <w:pageBreakBefore/>
       </w:pPr>
-      <w:bookmarkStart w:id="32" w:name="_Toc242018210"/>
+      <w:bookmarkStart w:id="32" w:name="_Toc242018700"/>
       <w:r>
         <w:lastRenderedPageBreak/>
         <w:t>12. Sécurité et confidentialité</w:t>
@@ -13803,7 +13803,7 @@
         <w:pStyle w:val="Titre1"/>
         <w:pageBreakBefore/>
       </w:pPr>
-      <w:bookmarkStart w:id="33" w:name="_Toc242018211"/>
+      <w:bookmarkStart w:id="33" w:name="_Toc242018701"/>
       <w:r>
         <w:lastRenderedPageBreak/>
         <w:t>13. Administration</w:t>
@@ -13940,7 +13940,7 @@
       <w:pPr>
         <w:pStyle w:val="Titre2"/>
       </w:pPr>
-      <w:bookmarkStart w:id="34" w:name="_Toc242018212"/>
+      <w:bookmarkStart w:id="34" w:name="_Toc242018702"/>
       <w:r>
         <w:t>13.1 Mise en service : liste de contrôle</w:t>
       </w:r>
@@ -14092,7 +14092,7 @@
         <w:pStyle w:val="Titre1"/>
         <w:pageBreakBefore/>
       </w:pPr>
-      <w:bookmarkStart w:id="35" w:name="_Toc242018213"/>
+      <w:bookmarkStart w:id="35" w:name="_Toc242018703"/>
       <w:r>
         <w:lastRenderedPageBreak/>
         <w:t>14. État d’avancement</w:t>
@@ -15225,7 +15225,7 @@
         <w:pStyle w:val="Titre1"/>
         <w:pageBreakBefore/>
       </w:pPr>
-      <w:bookmarkStart w:id="36" w:name="_Toc242018214"/>
+      <w:bookmarkStart w:id="36" w:name="_Toc242018704"/>
       <w:r>
         <w:lastRenderedPageBreak/>
         <w:t>Annexe — Repères techniques</w:t>
@@ -15808,7 +15808,7 @@
       <w:pPr>
         <w:pStyle w:val="Titre2"/>
       </w:pPr>
-      <w:bookmarkStart w:id="37" w:name="_Toc242018215"/>
+      <w:bookmarkStart w:id="37" w:name="_Toc242018705"/>
       <w:r>
         <w:t>Mode démonstration</w:t>
       </w:r>
@@ -16002,96 +16002,10 @@
 <file path=word/numbering.xml><?xml version="1.0" encoding="utf-8"?>
 <w:numbering xmlns:wpc="http://schemas.microsoft.com/office/word/2010/wordprocessingCanvas" xmlns:cx="http://schemas.microsoft.com/office/drawing/2014/chartex" xmlns:cx1="http://schemas.microsoft.com/office/drawing/2015/9/8/chartex" xmlns:cx2="http://schemas.microsoft.com/office/drawing/2015/10/21/chartex" xmlns:cx3="http://schemas.microsoft.com/office/drawing/2016/5/9/chartex" xmlns:cx4="http://schemas.microsoft.com/office/drawing/2016/5/10/chartex" xmlns:cx5="http://schemas.microsoft.com/office/drawing/2016/5/11/chartex" xmlns:cx6="http://schemas.microsoft.com/office/drawing/2016/5/12/chartex" xmlns:cx7="http://schemas.microsoft.com/office/drawing/2016/5/13/chartex" xmlns:cx8="http://schemas.microsoft.com/office/drawing/2016/5/14/chartex" xmlns:mc="http://schemas.openxmlformats.org/markup-compatibility/2006" xmlns:aink="http://schemas.microsoft.com/office/drawing/2016/ink" xmlns:am3d="http://schemas.microsoft.com/office/drawing/2017/model3d" xmlns:o="urn:schemas-microsoft-com:office:office" xmlns:oel="http://schemas.microsoft.com/office/2019/extlst" xmlns:r="http://schemas.openxmlformats.org/officeDocument/2006/relationships" xmlns:m="http://schemas.openxmlformats.org/officeDocument/2006/math" xmlns:v="urn:schemas-microsoft-com:vml" xmlns:wp14="http://schemas.microsoft.com/office/word/2010/wordprocessingDrawing" xmlns:wp="http://schemas.openxmlformats.org/drawingml/2006/wordprocessingDrawing" xmlns:w10="urn:schemas-microsoft-com:office:word" xmlns:w="http://schemas.openxmlformats.org/wordprocessingml/2006/main" xmlns:w14="http://schemas.microsoft.com/office/word/2010/wordml" xmlns:w15="http://schemas.microsoft.com/office/word/2012/wordml" xmlns:w16cex="http://schemas.microsoft.com/office/word/2018/wordml/cex" xmlns:w16cid="http://schemas.microsoft.com/office/word/2016/wordml/cid" xmlns:w16="http://schemas.microsoft.com/office/word/2018/wordml" xmlns:w16du="http://schemas.microsoft.com/office/word/2023/wordml/word16du" xmlns:w16sdtdh="http://schemas.microsoft.com/office/word/2020/wordml/sdtdatahash" xmlns:w16sdtfl="http://schemas.microsoft.com/office/word/2024/wordml/sdtformatlock" xmlns:w16se="http://schemas.microsoft.com/office/word/2015/wordml/symex" xmlns:wpg="http://schemas.microsoft.com/office/word/2010/wordprocessingGroup" xmlns:wpi="http://schemas.microsoft.com/office/word/2010/wordprocessingInk" xmlns:wne="http://schemas.microsoft.com/office/word/2006/wordml" xmlns:wps="http://schemas.microsoft.com/office/word/2010/wordprocessingShape" mc:Ignorable="w14 w15 w16se w16cid w16 w16cex w16sdtdh w16sdtfl w16du wp14">
   <w:abstractNum w:abstractNumId="0" w15:restartNumberingAfterBreak="0">
-    <w:nsid w:val="0D022C6C"/>
+    <w:nsid w:val="3FCA5AEE"/>
     <w:multiLevelType w:val="hybridMultilevel"/>
-    <w:tmpl w:val="01069324"/>
-    <w:lvl w:ilvl="0" w:tplc="75FE2470" w:tentative="1">
-      <w:start w:val="1"/>
-      <w:numFmt w:val="bullet"/>
-      <w:lvlText w:val="●"/>
-      <w:lvlJc w:val="left"/>
-      <w:pPr>
-        <w:ind w:left="720" w:hanging="360"/>
-      </w:pPr>
-    </w:lvl>
-    <w:lvl w:ilvl="1" w:tplc="289EB3A6" w:tentative="1">
-      <w:start w:val="1"/>
-      <w:numFmt w:val="bullet"/>
-      <w:lvlText w:val="○"/>
-      <w:lvlJc w:val="left"/>
-      <w:pPr>
-        <w:ind w:left="1440" w:hanging="360"/>
-      </w:pPr>
-    </w:lvl>
-    <w:lvl w:ilvl="2" w:tplc="94FE55A0" w:tentative="1">
-      <w:start w:val="1"/>
-      <w:numFmt w:val="bullet"/>
-      <w:lvlText w:val="■"/>
-      <w:lvlJc w:val="left"/>
-      <w:pPr>
-        <w:ind w:left="2160" w:hanging="360"/>
-      </w:pPr>
-    </w:lvl>
-    <w:lvl w:ilvl="3" w:tplc="532E78D6" w:tentative="1">
-      <w:start w:val="1"/>
-      <w:numFmt w:val="bullet"/>
-      <w:lvlText w:val="●"/>
-      <w:lvlJc w:val="left"/>
-      <w:pPr>
-        <w:ind w:left="2880" w:hanging="360"/>
-      </w:pPr>
-    </w:lvl>
-    <w:lvl w:ilvl="4" w:tplc="2E4A3F72" w:tentative="1">
-      <w:start w:val="1"/>
-      <w:numFmt w:val="bullet"/>
-      <w:lvlText w:val="○"/>
-      <w:lvlJc w:val="left"/>
-      <w:pPr>
-        <w:ind w:left="3600" w:hanging="360"/>
-      </w:pPr>
-    </w:lvl>
-    <w:lvl w:ilvl="5" w:tplc="6AA47E1E" w:tentative="1">
-      <w:start w:val="1"/>
-      <w:numFmt w:val="bullet"/>
-      <w:lvlText w:val="■"/>
-      <w:lvlJc w:val="left"/>
-      <w:pPr>
-        <w:ind w:left="4320" w:hanging="360"/>
-      </w:pPr>
-    </w:lvl>
-    <w:lvl w:ilvl="6" w:tplc="D8746560" w:tentative="1">
-      <w:start w:val="1"/>
-      <w:numFmt w:val="bullet"/>
-      <w:lvlText w:val="●"/>
-      <w:lvlJc w:val="left"/>
-      <w:pPr>
-        <w:ind w:left="5040" w:hanging="360"/>
-      </w:pPr>
-    </w:lvl>
-    <w:lvl w:ilvl="7" w:tplc="9DBA663C" w:tentative="1">
-      <w:start w:val="1"/>
-      <w:numFmt w:val="bullet"/>
-      <w:lvlText w:val="●"/>
-      <w:lvlJc w:val="left"/>
-      <w:pPr>
-        <w:ind w:left="5760" w:hanging="360"/>
-      </w:pPr>
-    </w:lvl>
-    <w:lvl w:ilvl="8" w:tplc="81D09968" w:tentative="1">
-      <w:start w:val="1"/>
-      <w:numFmt w:val="bullet"/>
-      <w:lvlText w:val="●"/>
-      <w:lvlJc w:val="left"/>
-      <w:pPr>
-        <w:ind w:left="6480" w:hanging="360"/>
-      </w:pPr>
-    </w:lvl>
-  </w:abstractNum>
-  <w:abstractNum w:abstractNumId="1" w15:restartNumberingAfterBreak="0">
-    <w:nsid w:val="3522068B"/>
-    <w:multiLevelType w:val="hybridMultilevel"/>
-    <w:tmpl w:val="581EE1C0"/>
-    <w:lvl w:ilvl="0" w:tplc="171AA272">
+    <w:tmpl w:val="319ED714"/>
+    <w:lvl w:ilvl="0" w:tplc="AF2CD552">
       <w:start w:val="1"/>
       <w:numFmt w:val="decimal"/>
       <w:lvlText w:val="%1."/>
@@ -16100,239 +16014,325 @@
         <w:ind w:left="360" w:hanging="300"/>
       </w:pPr>
     </w:lvl>
-    <w:lvl w:ilvl="1" w:tplc="6636BEA8">
+    <w:lvl w:ilvl="1" w:tplc="610A359C">
       <w:numFmt w:val="decimal"/>
       <w:lvlText w:val=""/>
       <w:lvlJc w:val="left"/>
     </w:lvl>
-    <w:lvl w:ilvl="2" w:tplc="DFA674DA">
+    <w:lvl w:ilvl="2" w:tplc="0FF43FD0">
       <w:numFmt w:val="decimal"/>
       <w:lvlText w:val=""/>
       <w:lvlJc w:val="left"/>
     </w:lvl>
-    <w:lvl w:ilvl="3" w:tplc="584842C2">
+    <w:lvl w:ilvl="3" w:tplc="7BD07262">
       <w:numFmt w:val="decimal"/>
       <w:lvlText w:val=""/>
       <w:lvlJc w:val="left"/>
     </w:lvl>
-    <w:lvl w:ilvl="4" w:tplc="88BE6910">
+    <w:lvl w:ilvl="4" w:tplc="AEB8702C">
       <w:numFmt w:val="decimal"/>
       <w:lvlText w:val=""/>
       <w:lvlJc w:val="left"/>
     </w:lvl>
-    <w:lvl w:ilvl="5" w:tplc="028E72F0">
+    <w:lvl w:ilvl="5" w:tplc="C2061B56">
       <w:numFmt w:val="decimal"/>
       <w:lvlText w:val=""/>
       <w:lvlJc w:val="left"/>
     </w:lvl>
-    <w:lvl w:ilvl="6" w:tplc="BB22AF38">
+    <w:lvl w:ilvl="6" w:tplc="0DE44758">
       <w:numFmt w:val="decimal"/>
       <w:lvlText w:val=""/>
       <w:lvlJc w:val="left"/>
     </w:lvl>
-    <w:lvl w:ilvl="7" w:tplc="78C48B40">
+    <w:lvl w:ilvl="7" w:tplc="4A981ED4">
       <w:numFmt w:val="decimal"/>
       <w:lvlText w:val=""/>
       <w:lvlJc w:val="left"/>
     </w:lvl>
-    <w:lvl w:ilvl="8" w:tplc="9D2E5994">
+    <w:lvl w:ilvl="8" w:tplc="2C7C17D0">
+      <w:numFmt w:val="decimal"/>
+      <w:lvlText w:val=""/>
+      <w:lvlJc w:val="left"/>
+    </w:lvl>
+  </w:abstractNum>
+  <w:abstractNum w:abstractNumId="1" w15:restartNumberingAfterBreak="0">
+    <w:nsid w:val="4BC17CAC"/>
+    <w:multiLevelType w:val="hybridMultilevel"/>
+    <w:tmpl w:val="470C088C"/>
+    <w:lvl w:ilvl="0" w:tplc="435C8CB8">
+      <w:start w:val="1"/>
+      <w:numFmt w:val="decimal"/>
+      <w:lvlText w:val="%1."/>
+      <w:lvlJc w:val="left"/>
+      <w:pPr>
+        <w:ind w:left="360" w:hanging="300"/>
+      </w:pPr>
+    </w:lvl>
+    <w:lvl w:ilvl="1" w:tplc="E1B460D4">
+      <w:numFmt w:val="decimal"/>
+      <w:lvlText w:val=""/>
+      <w:lvlJc w:val="left"/>
+    </w:lvl>
+    <w:lvl w:ilvl="2" w:tplc="2C12F77E">
+      <w:numFmt w:val="decimal"/>
+      <w:lvlText w:val=""/>
+      <w:lvlJc w:val="left"/>
+    </w:lvl>
+    <w:lvl w:ilvl="3" w:tplc="2D0818EE">
+      <w:numFmt w:val="decimal"/>
+      <w:lvlText w:val=""/>
+      <w:lvlJc w:val="left"/>
+    </w:lvl>
+    <w:lvl w:ilvl="4" w:tplc="A5BEE496">
+      <w:numFmt w:val="decimal"/>
+      <w:lvlText w:val=""/>
+      <w:lvlJc w:val="left"/>
+    </w:lvl>
+    <w:lvl w:ilvl="5" w:tplc="CCFC55E4">
+      <w:numFmt w:val="decimal"/>
+      <w:lvlText w:val=""/>
+      <w:lvlJc w:val="left"/>
+    </w:lvl>
+    <w:lvl w:ilvl="6" w:tplc="65FE194A">
+      <w:numFmt w:val="decimal"/>
+      <w:lvlText w:val=""/>
+      <w:lvlJc w:val="left"/>
+    </w:lvl>
+    <w:lvl w:ilvl="7" w:tplc="9DDC8174">
+      <w:numFmt w:val="decimal"/>
+      <w:lvlText w:val=""/>
+      <w:lvlJc w:val="left"/>
+    </w:lvl>
+    <w:lvl w:ilvl="8" w:tplc="B17E9A94">
       <w:numFmt w:val="decimal"/>
       <w:lvlText w:val=""/>
       <w:lvlJc w:val="left"/>
     </w:lvl>
   </w:abstractNum>
   <w:abstractNum w:abstractNumId="2" w15:restartNumberingAfterBreak="0">
-    <w:nsid w:val="4D14340C"/>
+    <w:nsid w:val="4E683424"/>
     <w:multiLevelType w:val="hybridMultilevel"/>
-    <w:tmpl w:val="D2FA7EB0"/>
-    <w:lvl w:ilvl="0" w:tplc="B3DA6816">
+    <w:tmpl w:val="FA24BE4A"/>
+    <w:lvl w:ilvl="0" w:tplc="CF404FB2" w:tentative="1">
       <w:start w:val="1"/>
-      <w:numFmt w:val="decimal"/>
-      <w:lvlText w:val="%1."/>
+      <w:numFmt w:val="bullet"/>
+      <w:lvlText w:val="●"/>
       <w:lvlJc w:val="left"/>
       <w:pPr>
-        <w:ind w:left="360" w:hanging="300"/>
+        <w:ind w:left="720" w:hanging="360"/>
       </w:pPr>
     </w:lvl>
-    <w:lvl w:ilvl="1" w:tplc="9AB46054">
+    <w:lvl w:ilvl="1" w:tplc="EDB6E5D8" w:tentative="1">
+      <w:start w:val="1"/>
+      <w:numFmt w:val="bullet"/>
+      <w:lvlText w:val="○"/>
+      <w:lvlJc w:val="left"/>
+      <w:pPr>
+        <w:ind w:left="1440" w:hanging="360"/>
+      </w:pPr>
+    </w:lvl>
+    <w:lvl w:ilvl="2" w:tplc="13CE454C" w:tentative="1">
+      <w:start w:val="1"/>
+      <w:numFmt w:val="bullet"/>
+      <w:lvlText w:val="■"/>
+      <w:lvlJc w:val="left"/>
+      <w:pPr>
+        <w:ind w:left="2160" w:hanging="360"/>
+      </w:pPr>
+    </w:lvl>
+    <w:lvl w:ilvl="3" w:tplc="C53C0B7C" w:tentative="1">
+      <w:start w:val="1"/>
+      <w:numFmt w:val="bullet"/>
+      <w:lvlText w:val="●"/>
+      <w:lvlJc w:val="left"/>
+      <w:pPr>
+        <w:ind w:left="2880" w:hanging="360"/>
+      </w:pPr>
+    </w:lvl>
+    <w:lvl w:ilvl="4" w:tplc="0EE0FFEC" w:tentative="1">
+      <w:start w:val="1"/>
+      <w:numFmt w:val="bullet"/>
+      <w:lvlText w:val="○"/>
+      <w:lvlJc w:val="left"/>
+      <w:pPr>
+        <w:ind w:left="3600" w:hanging="360"/>
+      </w:pPr>
+    </w:lvl>
+    <w:lvl w:ilvl="5" w:tplc="B40A83D4" w:tentative="1">
+      <w:start w:val="1"/>
+      <w:numFmt w:val="bullet"/>
+      <w:lvlText w:val="■"/>
+      <w:lvlJc w:val="left"/>
+      <w:pPr>
+        <w:ind w:left="4320" w:hanging="360"/>
+      </w:pPr>
+    </w:lvl>
+    <w:lvl w:ilvl="6" w:tplc="BC5E1686" w:tentative="1">
+      <w:start w:val="1"/>
+      <w:numFmt w:val="bullet"/>
+      <w:lvlText w:val="●"/>
+      <w:lvlJc w:val="left"/>
+      <w:pPr>
+        <w:ind w:left="5040" w:hanging="360"/>
+      </w:pPr>
+    </w:lvl>
+    <w:lvl w:ilvl="7" w:tplc="593E0DA6" w:tentative="1">
+      <w:start w:val="1"/>
+      <w:numFmt w:val="bullet"/>
+      <w:lvlText w:val="●"/>
+      <w:lvlJc w:val="left"/>
+      <w:pPr>
+        <w:ind w:left="5760" w:hanging="360"/>
+      </w:pPr>
+    </w:lvl>
+    <w:lvl w:ilvl="8" w:tplc="D3A84F8A" w:tentative="1">
+      <w:start w:val="1"/>
+      <w:numFmt w:val="bullet"/>
+      <w:lvlText w:val="●"/>
+      <w:lvlJc w:val="left"/>
+      <w:pPr>
+        <w:ind w:left="6480" w:hanging="360"/>
+      </w:pPr>
+    </w:lvl>
+  </w:abstractNum>
+  <w:abstractNum w:abstractNumId="3" w15:restartNumberingAfterBreak="0">
+    <w:nsid w:val="5D595DD0"/>
+    <w:multiLevelType w:val="hybridMultilevel"/>
+    <w:tmpl w:val="989C2386"/>
+    <w:lvl w:ilvl="0" w:tplc="2B5E2AEE">
+      <w:start w:val="1"/>
+      <w:numFmt w:val="bullet"/>
+      <w:lvlText w:val="•"/>
+      <w:lvlJc w:val="left"/>
+      <w:pPr>
+        <w:ind w:left="360" w:hanging="240"/>
+      </w:pPr>
+    </w:lvl>
+    <w:lvl w:ilvl="1" w:tplc="75966406" w:tentative="1">
+      <w:start w:val="1"/>
+      <w:numFmt w:val="bullet"/>
+      <w:lvlText w:val="–"/>
+      <w:lvlJc w:val="left"/>
+      <w:pPr>
+        <w:ind w:left="720" w:hanging="240"/>
+      </w:pPr>
+    </w:lvl>
+    <w:lvl w:ilvl="2" w:tplc="92E4A71C">
       <w:numFmt w:val="decimal"/>
       <w:lvlText w:val=""/>
       <w:lvlJc w:val="left"/>
     </w:lvl>
-    <w:lvl w:ilvl="2" w:tplc="DCEA90C6">
+    <w:lvl w:ilvl="3" w:tplc="5E0EA258">
       <w:numFmt w:val="decimal"/>
       <w:lvlText w:val=""/>
       <w:lvlJc w:val="left"/>
     </w:lvl>
-    <w:lvl w:ilvl="3" w:tplc="9DA414A4">
+    <w:lvl w:ilvl="4" w:tplc="8C622C94">
       <w:numFmt w:val="decimal"/>
       <w:lvlText w:val=""/>
       <w:lvlJc w:val="left"/>
     </w:lvl>
-    <w:lvl w:ilvl="4" w:tplc="48B6E3FE">
+    <w:lvl w:ilvl="5" w:tplc="B148CD04">
       <w:numFmt w:val="decimal"/>
       <w:lvlText w:val=""/>
       <w:lvlJc w:val="left"/>
     </w:lvl>
-    <w:lvl w:ilvl="5" w:tplc="480A2FB8">
+    <w:lvl w:ilvl="6" w:tplc="A9B89F26">
       <w:numFmt w:val="decimal"/>
       <w:lvlText w:val=""/>
       <w:lvlJc w:val="left"/>
     </w:lvl>
-    <w:lvl w:ilvl="6" w:tplc="2EA4B222">
+    <w:lvl w:ilvl="7" w:tplc="E37A7562">
       <w:numFmt w:val="decimal"/>
       <w:lvlText w:val=""/>
       <w:lvlJc w:val="left"/>
     </w:lvl>
-    <w:lvl w:ilvl="7" w:tplc="40C0760E">
-      <w:numFmt w:val="decimal"/>
-      <w:lvlText w:val=""/>
-      <w:lvlJc w:val="left"/>
-    </w:lvl>
-    <w:lvl w:ilvl="8" w:tplc="6BEEE8B2">
-      <w:numFmt w:val="decimal"/>
-      <w:lvlText w:val=""/>
-      <w:lvlJc w:val="left"/>
-    </w:lvl>
-  </w:abstractNum>
-  <w:abstractNum w:abstractNumId="3" w15:restartNumberingAfterBreak="0">
-    <w:nsid w:val="53ED64E0"/>
-    <w:multiLevelType w:val="hybridMultilevel"/>
-    <w:tmpl w:val="6CF68922"/>
-    <w:lvl w:ilvl="0" w:tplc="56009DDC">
-      <w:start w:val="1"/>
-      <w:numFmt w:val="decimal"/>
-      <w:lvlText w:val="%1."/>
-      <w:lvlJc w:val="left"/>
-      <w:pPr>
-        <w:ind w:left="360" w:hanging="300"/>
-      </w:pPr>
-    </w:lvl>
-    <w:lvl w:ilvl="1" w:tplc="987AEE14">
-      <w:numFmt w:val="decimal"/>
-      <w:lvlText w:val=""/>
-      <w:lvlJc w:val="left"/>
-    </w:lvl>
-    <w:lvl w:ilvl="2" w:tplc="2B801600">
-      <w:numFmt w:val="decimal"/>
-      <w:lvlText w:val=""/>
-      <w:lvlJc w:val="left"/>
-    </w:lvl>
-    <w:lvl w:ilvl="3" w:tplc="493A8C48">
-      <w:numFmt w:val="decimal"/>
-      <w:lvlText w:val=""/>
-      <w:lvlJc w:val="left"/>
-    </w:lvl>
-    <w:lvl w:ilvl="4" w:tplc="498287FC">
-      <w:numFmt w:val="decimal"/>
-      <w:lvlText w:val=""/>
-      <w:lvlJc w:val="left"/>
-    </w:lvl>
-    <w:lvl w:ilvl="5" w:tplc="4482914C">
-      <w:numFmt w:val="decimal"/>
-      <w:lvlText w:val=""/>
-      <w:lvlJc w:val="left"/>
-    </w:lvl>
-    <w:lvl w:ilvl="6" w:tplc="B6F0B97E">
-      <w:numFmt w:val="decimal"/>
-      <w:lvlText w:val=""/>
-      <w:lvlJc w:val="left"/>
-    </w:lvl>
-    <w:lvl w:ilvl="7" w:tplc="A030C8A4">
-      <w:numFmt w:val="decimal"/>
-      <w:lvlText w:val=""/>
-      <w:lvlJc w:val="left"/>
-    </w:lvl>
-    <w:lvl w:ilvl="8" w:tplc="F8A21050">
+    <w:lvl w:ilvl="8" w:tplc="D42EAAAA">
       <w:numFmt w:val="decimal"/>
       <w:lvlText w:val=""/>
       <w:lvlJc w:val="left"/>
     </w:lvl>
   </w:abstractNum>
   <w:abstractNum w:abstractNumId="4" w15:restartNumberingAfterBreak="0">
-    <w:nsid w:val="598807F8"/>
+    <w:nsid w:val="63DA5DC5"/>
     <w:multiLevelType w:val="hybridMultilevel"/>
-    <w:tmpl w:val="D4B01086"/>
-    <w:lvl w:ilvl="0" w:tplc="29E24252">
+    <w:tmpl w:val="1198730C"/>
+    <w:lvl w:ilvl="0" w:tplc="F61E81B0">
       <w:start w:val="1"/>
-      <w:numFmt w:val="bullet"/>
-      <w:lvlText w:val="•"/>
+      <w:numFmt w:val="decimal"/>
+      <w:lvlText w:val="%1."/>
       <w:lvlJc w:val="left"/>
       <w:pPr>
-        <w:ind w:left="360" w:hanging="240"/>
+        <w:ind w:left="360" w:hanging="300"/>
       </w:pPr>
     </w:lvl>
-    <w:lvl w:ilvl="1" w:tplc="BC8E34F0" w:tentative="1">
-      <w:start w:val="1"/>
-      <w:numFmt w:val="bullet"/>
-      <w:lvlText w:val="–"/>
-      <w:lvlJc w:val="left"/>
-      <w:pPr>
-        <w:ind w:left="720" w:hanging="240"/>
-      </w:pPr>
-    </w:lvl>
-    <w:lvl w:ilvl="2" w:tplc="26F01152">
+    <w:lvl w:ilvl="1" w:tplc="9FCE5114">
       <w:numFmt w:val="decimal"/>
       <w:lvlText w:val=""/>
       <w:lvlJc w:val="left"/>
     </w:lvl>
-    <w:lvl w:ilvl="3" w:tplc="B72E0504">
+    <w:lvl w:ilvl="2" w:tplc="EA0EB81E">
       <w:numFmt w:val="decimal"/>
       <w:lvlText w:val=""/>
       <w:lvlJc w:val="left"/>
     </w:lvl>
-    <w:lvl w:ilvl="4" w:tplc="C50601AE">
+    <w:lvl w:ilvl="3" w:tplc="F1D2C038">
       <w:numFmt w:val="decimal"/>
       <w:lvlText w:val=""/>
       <w:lvlJc w:val="left"/>
     </w:lvl>
-    <w:lvl w:ilvl="5" w:tplc="A7B209FA">
+    <w:lvl w:ilvl="4" w:tplc="B3100C36">
       <w:numFmt w:val="decimal"/>
       <w:lvlText w:val=""/>
       <w:lvlJc w:val="left"/>
     </w:lvl>
-    <w:lvl w:ilvl="6" w:tplc="3A38071A">
+    <w:lvl w:ilvl="5" w:tplc="BF243ADE">
       <w:numFmt w:val="decimal"/>
       <w:lvlText w:val=""/>
       <w:lvlJc w:val="left"/>
     </w:lvl>
-    <w:lvl w:ilvl="7" w:tplc="CA0CC38C">
+    <w:lvl w:ilvl="6" w:tplc="A52E515E">
       <w:numFmt w:val="decimal"/>
       <w:lvlText w:val=""/>
       <w:lvlJc w:val="left"/>
     </w:lvl>
-    <w:lvl w:ilvl="8" w:tplc="7EF2B0F4">
+    <w:lvl w:ilvl="7" w:tplc="D4EC10F8">
+      <w:numFmt w:val="decimal"/>
+      <w:lvlText w:val=""/>
+      <w:lvlJc w:val="left"/>
+    </w:lvl>
+    <w:lvl w:ilvl="8" w:tplc="630402F2">
       <w:numFmt w:val="decimal"/>
       <w:lvlText w:val=""/>
       <w:lvlJc w:val="left"/>
     </w:lvl>
   </w:abstractNum>
-  <w:num w:numId="1" w16cid:durableId="2062556843">
-    <w:abstractNumId w:val="0"/>
+  <w:num w:numId="1" w16cid:durableId="158619714">
+    <w:abstractNumId w:val="2"/>
     <w:lvlOverride w:ilvl="0">
       <w:startOverride w:val="1"/>
     </w:lvlOverride>
   </w:num>
-  <w:num w:numId="2" w16cid:durableId="1210413106">
+  <w:num w:numId="2" w16cid:durableId="1676808475">
+    <w:abstractNumId w:val="3"/>
+    <w:lvlOverride w:ilvl="0">
+      <w:startOverride w:val="1"/>
+    </w:lvlOverride>
+  </w:num>
+  <w:num w:numId="3" w16cid:durableId="1207598531">
     <w:abstractNumId w:val="4"/>
     <w:lvlOverride w:ilvl="0">
       <w:startOverride w:val="1"/>
     </w:lvlOverride>
   </w:num>
-  <w:num w:numId="3" w16cid:durableId="146098553">
+  <w:num w:numId="4" w16cid:durableId="698359561">
     <w:abstractNumId w:val="1"/>
     <w:lvlOverride w:ilvl="0">
       <w:startOverride w:val="1"/>
     </w:lvlOverride>
   </w:num>
-  <w:num w:numId="4" w16cid:durableId="888885763">
-    <w:abstractNumId w:val="2"/>
-    <w:lvlOverride w:ilvl="0">
-      <w:startOverride w:val="1"/>
-    </w:lvlOverride>
-  </w:num>
-  <w:num w:numId="5" w16cid:durableId="1578436693">
-    <w:abstractNumId w:val="3"/>
+  <w:num w:numId="5" w16cid:durableId="1777673977">
+    <w:abstractNumId w:val="0"/>
     <w:lvlOverride w:ilvl="0">
       <w:startOverride w:val="1"/>
     </w:lvlOverride>
@@ -16978,7 +16978,7 @@
     <w:autoRedefine/>
     <w:uiPriority w:val="39"/>
     <w:unhideWhenUsed/>
-    <w:rsid w:val="00551D81"/>
+    <w:rsid w:val="00D0017A"/>
     <w:pPr>
       <w:spacing w:after="100"/>
     </w:pPr>
@@ -16990,7 +16990,7 @@
     <w:autoRedefine/>
     <w:uiPriority w:val="39"/>
     <w:unhideWhenUsed/>
-    <w:rsid w:val="00551D81"/>
+    <w:rsid w:val="00D0017A"/>
     <w:pPr>
       <w:spacing w:after="100"/>
       <w:ind w:left="210"/>

</xml_diff>

<commit_message>
README et guide : écran Galerie en place
Mise à jour qui avait échoué dans le commit précédent : tableau
d'avancement (phase 4 terminée côté interface) et guide de fonctionnement
(rubrique Galerie et contenus, paramètres via /admin/).

Co-Authored-By: Claude Opus 5.5 <noreply@anthropic.com>
</commit_message>
<xml_diff>
--- a/docs/guide-fonctionnement.docx
+++ b/docs/guide-fonctionnement.docx
@@ -109,7 +109,7 @@
     <w:sdt>
       <w:sdtPr>
         <w:alias w:val="Sommaire"/>
-        <w:id w:val="288330438"/>
+        <w:id w:val="-919249627"/>
       </w:sdtPr>
       <w:sdtEndPr/>
       <w:sdtContent>
@@ -138,7 +138,7 @@
           <w:r>
             <w:fldChar w:fldCharType="separate"/>
           </w:r>
-          <w:hyperlink w:anchor="_Toc242018668" w:history="1">
+          <w:hyperlink w:anchor="_Toc242018780" w:history="1">
             <w:r>
               <w:rPr>
                 <w:rStyle w:val="Lienhypertexte"/>
@@ -162,7 +162,7 @@
               <w:rPr>
                 <w:noProof/>
               </w:rPr>
-              <w:instrText xml:space="preserve"> PAGEREF _Toc242018668 \h </w:instrText>
+              <w:instrText xml:space="preserve"> PAGEREF _Toc242018780 \h </w:instrText>
             </w:r>
             <w:r>
               <w:rPr>
@@ -205,7 +205,7 @@
               <w14:ligatures w14:val="standardContextual"/>
             </w:rPr>
           </w:pPr>
-          <w:hyperlink w:anchor="_Toc242018669" w:history="1">
+          <w:hyperlink w:anchor="_Toc242018781" w:history="1">
             <w:r>
               <w:rPr>
                 <w:rStyle w:val="Lienhypertexte"/>
@@ -229,7 +229,7 @@
               <w:rPr>
                 <w:noProof/>
               </w:rPr>
-              <w:instrText xml:space="preserve"> PAGEREF _Toc242018669 \h </w:instrText>
+              <w:instrText xml:space="preserve"> PAGEREF _Toc242018781 \h </w:instrText>
             </w:r>
             <w:r>
               <w:rPr>
@@ -272,7 +272,7 @@
               <w14:ligatures w14:val="standardContextual"/>
             </w:rPr>
           </w:pPr>
-          <w:hyperlink w:anchor="_Toc242018670" w:history="1">
+          <w:hyperlink w:anchor="_Toc242018782" w:history="1">
             <w:r>
               <w:rPr>
                 <w:rStyle w:val="Lienhypertexte"/>
@@ -296,7 +296,7 @@
               <w:rPr>
                 <w:noProof/>
               </w:rPr>
-              <w:instrText xml:space="preserve"> PAGEREF _Toc242018670 \h </w:instrText>
+              <w:instrText xml:space="preserve"> PAGEREF _Toc242018782 \h </w:instrText>
             </w:r>
             <w:r>
               <w:rPr>
@@ -339,7 +339,7 @@
               <w14:ligatures w14:val="standardContextual"/>
             </w:rPr>
           </w:pPr>
-          <w:hyperlink w:anchor="_Toc242018671" w:history="1">
+          <w:hyperlink w:anchor="_Toc242018783" w:history="1">
             <w:r>
               <w:rPr>
                 <w:rStyle w:val="Lienhypertexte"/>
@@ -363,7 +363,7 @@
               <w:rPr>
                 <w:noProof/>
               </w:rPr>
-              <w:instrText xml:space="preserve"> PAGEREF _Toc242018671 \h </w:instrText>
+              <w:instrText xml:space="preserve"> PAGEREF _Toc242018783 \h </w:instrText>
             </w:r>
             <w:r>
               <w:rPr>
@@ -406,7 +406,7 @@
               <w14:ligatures w14:val="standardContextual"/>
             </w:rPr>
           </w:pPr>
-          <w:hyperlink w:anchor="_Toc242018672" w:history="1">
+          <w:hyperlink w:anchor="_Toc242018784" w:history="1">
             <w:r>
               <w:rPr>
                 <w:rStyle w:val="Lienhypertexte"/>
@@ -430,7 +430,7 @@
               <w:rPr>
                 <w:noProof/>
               </w:rPr>
-              <w:instrText xml:space="preserve"> PAGEREF _Toc242018672 \h </w:instrText>
+              <w:instrText xml:space="preserve"> PAGEREF _Toc242018784 \h </w:instrText>
             </w:r>
             <w:r>
               <w:rPr>
@@ -473,7 +473,7 @@
               <w14:ligatures w14:val="standardContextual"/>
             </w:rPr>
           </w:pPr>
-          <w:hyperlink w:anchor="_Toc242018673" w:history="1">
+          <w:hyperlink w:anchor="_Toc242018785" w:history="1">
             <w:r>
               <w:rPr>
                 <w:rStyle w:val="Lienhypertexte"/>
@@ -497,7 +497,7 @@
               <w:rPr>
                 <w:noProof/>
               </w:rPr>
-              <w:instrText xml:space="preserve"> PAGEREF _Toc242018673 \h </w:instrText>
+              <w:instrText xml:space="preserve"> PAGEREF _Toc242018785 \h </w:instrText>
             </w:r>
             <w:r>
               <w:rPr>
@@ -540,7 +540,7 @@
               <w14:ligatures w14:val="standardContextual"/>
             </w:rPr>
           </w:pPr>
-          <w:hyperlink w:anchor="_Toc242018674" w:history="1">
+          <w:hyperlink w:anchor="_Toc242018786" w:history="1">
             <w:r>
               <w:rPr>
                 <w:rStyle w:val="Lienhypertexte"/>
@@ -564,7 +564,7 @@
               <w:rPr>
                 <w:noProof/>
               </w:rPr>
-              <w:instrText xml:space="preserve"> PAGEREF _Toc242018674 \h </w:instrText>
+              <w:instrText xml:space="preserve"> PAGEREF _Toc242018786 \h </w:instrText>
             </w:r>
             <w:r>
               <w:rPr>
@@ -607,7 +607,7 @@
               <w14:ligatures w14:val="standardContextual"/>
             </w:rPr>
           </w:pPr>
-          <w:hyperlink w:anchor="_Toc242018675" w:history="1">
+          <w:hyperlink w:anchor="_Toc242018787" w:history="1">
             <w:r>
               <w:rPr>
                 <w:rStyle w:val="Lienhypertexte"/>
@@ -631,7 +631,7 @@
               <w:rPr>
                 <w:noProof/>
               </w:rPr>
-              <w:instrText xml:space="preserve"> PAGEREF _Toc242018675 \h </w:instrText>
+              <w:instrText xml:space="preserve"> PAGEREF _Toc242018787 \h </w:instrText>
             </w:r>
             <w:r>
               <w:rPr>
@@ -674,7 +674,7 @@
               <w14:ligatures w14:val="standardContextual"/>
             </w:rPr>
           </w:pPr>
-          <w:hyperlink w:anchor="_Toc242018676" w:history="1">
+          <w:hyperlink w:anchor="_Toc242018788" w:history="1">
             <w:r>
               <w:rPr>
                 <w:rStyle w:val="Lienhypertexte"/>
@@ -698,7 +698,7 @@
               <w:rPr>
                 <w:noProof/>
               </w:rPr>
-              <w:instrText xml:space="preserve"> PAGEREF _Toc242018676 \h </w:instrText>
+              <w:instrText xml:space="preserve"> PAGEREF _Toc242018788 \h </w:instrText>
             </w:r>
             <w:r>
               <w:rPr>
@@ -741,7 +741,7 @@
               <w14:ligatures w14:val="standardContextual"/>
             </w:rPr>
           </w:pPr>
-          <w:hyperlink w:anchor="_Toc242018677" w:history="1">
+          <w:hyperlink w:anchor="_Toc242018789" w:history="1">
             <w:r>
               <w:rPr>
                 <w:rStyle w:val="Lienhypertexte"/>
@@ -765,7 +765,7 @@
               <w:rPr>
                 <w:noProof/>
               </w:rPr>
-              <w:instrText xml:space="preserve"> PAGEREF _Toc242018677 \h </w:instrText>
+              <w:instrText xml:space="preserve"> PAGEREF _Toc242018789 \h </w:instrText>
             </w:r>
             <w:r>
               <w:rPr>
@@ -808,7 +808,7 @@
               <w14:ligatures w14:val="standardContextual"/>
             </w:rPr>
           </w:pPr>
-          <w:hyperlink w:anchor="_Toc242018678" w:history="1">
+          <w:hyperlink w:anchor="_Toc242018790" w:history="1">
             <w:r>
               <w:rPr>
                 <w:rStyle w:val="Lienhypertexte"/>
@@ -832,7 +832,7 @@
               <w:rPr>
                 <w:noProof/>
               </w:rPr>
-              <w:instrText xml:space="preserve"> PAGEREF _Toc242018678 \h </w:instrText>
+              <w:instrText xml:space="preserve"> PAGEREF _Toc242018790 \h </w:instrText>
             </w:r>
             <w:r>
               <w:rPr>
@@ -875,7 +875,7 @@
               <w14:ligatures w14:val="standardContextual"/>
             </w:rPr>
           </w:pPr>
-          <w:hyperlink w:anchor="_Toc242018679" w:history="1">
+          <w:hyperlink w:anchor="_Toc242018791" w:history="1">
             <w:r>
               <w:rPr>
                 <w:rStyle w:val="Lienhypertexte"/>
@@ -899,7 +899,7 @@
               <w:rPr>
                 <w:noProof/>
               </w:rPr>
-              <w:instrText xml:space="preserve"> PAGEREF _Toc242018679 \h </w:instrText>
+              <w:instrText xml:space="preserve"> PAGEREF _Toc242018791 \h </w:instrText>
             </w:r>
             <w:r>
               <w:rPr>
@@ -942,7 +942,7 @@
               <w14:ligatures w14:val="standardContextual"/>
             </w:rPr>
           </w:pPr>
-          <w:hyperlink w:anchor="_Toc242018680" w:history="1">
+          <w:hyperlink w:anchor="_Toc242018792" w:history="1">
             <w:r>
               <w:rPr>
                 <w:rStyle w:val="Lienhypertexte"/>
@@ -966,7 +966,7 @@
               <w:rPr>
                 <w:noProof/>
               </w:rPr>
-              <w:instrText xml:space="preserve"> PAGEREF _Toc242018680 \h </w:instrText>
+              <w:instrText xml:space="preserve"> PAGEREF _Toc242018792 \h </w:instrText>
             </w:r>
             <w:r>
               <w:rPr>
@@ -1009,7 +1009,7 @@
               <w14:ligatures w14:val="standardContextual"/>
             </w:rPr>
           </w:pPr>
-          <w:hyperlink w:anchor="_Toc242018681" w:history="1">
+          <w:hyperlink w:anchor="_Toc242018793" w:history="1">
             <w:r>
               <w:rPr>
                 <w:rStyle w:val="Lienhypertexte"/>
@@ -1033,7 +1033,7 @@
               <w:rPr>
                 <w:noProof/>
               </w:rPr>
-              <w:instrText xml:space="preserve"> PAGEREF _Toc242018681 \h </w:instrText>
+              <w:instrText xml:space="preserve"> PAGEREF _Toc242018793 \h </w:instrText>
             </w:r>
             <w:r>
               <w:rPr>
@@ -1076,7 +1076,7 @@
               <w14:ligatures w14:val="standardContextual"/>
             </w:rPr>
           </w:pPr>
-          <w:hyperlink w:anchor="_Toc242018682" w:history="1">
+          <w:hyperlink w:anchor="_Toc242018794" w:history="1">
             <w:r>
               <w:rPr>
                 <w:rStyle w:val="Lienhypertexte"/>
@@ -1100,7 +1100,7 @@
               <w:rPr>
                 <w:noProof/>
               </w:rPr>
-              <w:instrText xml:space="preserve"> PAGEREF _Toc242018682 \h </w:instrText>
+              <w:instrText xml:space="preserve"> PAGEREF _Toc242018794 \h </w:instrText>
             </w:r>
             <w:r>
               <w:rPr>
@@ -1143,7 +1143,7 @@
               <w14:ligatures w14:val="standardContextual"/>
             </w:rPr>
           </w:pPr>
-          <w:hyperlink w:anchor="_Toc242018683" w:history="1">
+          <w:hyperlink w:anchor="_Toc242018795" w:history="1">
             <w:r>
               <w:rPr>
                 <w:rStyle w:val="Lienhypertexte"/>
@@ -1167,7 +1167,7 @@
               <w:rPr>
                 <w:noProof/>
               </w:rPr>
-              <w:instrText xml:space="preserve"> PAGEREF _Toc242018683 \h </w:instrText>
+              <w:instrText xml:space="preserve"> PAGEREF _Toc242018795 \h </w:instrText>
             </w:r>
             <w:r>
               <w:rPr>
@@ -1210,7 +1210,7 @@
               <w14:ligatures w14:val="standardContextual"/>
             </w:rPr>
           </w:pPr>
-          <w:hyperlink w:anchor="_Toc242018684" w:history="1">
+          <w:hyperlink w:anchor="_Toc242018796" w:history="1">
             <w:r>
               <w:rPr>
                 <w:rStyle w:val="Lienhypertexte"/>
@@ -1234,7 +1234,7 @@
               <w:rPr>
                 <w:noProof/>
               </w:rPr>
-              <w:instrText xml:space="preserve"> PAGEREF _Toc242018684 \h </w:instrText>
+              <w:instrText xml:space="preserve"> PAGEREF _Toc242018796 \h </w:instrText>
             </w:r>
             <w:r>
               <w:rPr>
@@ -1277,7 +1277,7 @@
               <w14:ligatures w14:val="standardContextual"/>
             </w:rPr>
           </w:pPr>
-          <w:hyperlink w:anchor="_Toc242018685" w:history="1">
+          <w:hyperlink w:anchor="_Toc242018797" w:history="1">
             <w:r>
               <w:rPr>
                 <w:rStyle w:val="Lienhypertexte"/>
@@ -1301,7 +1301,7 @@
               <w:rPr>
                 <w:noProof/>
               </w:rPr>
-              <w:instrText xml:space="preserve"> PAGEREF _Toc242018685 \h </w:instrText>
+              <w:instrText xml:space="preserve"> PAGEREF _Toc242018797 \h </w:instrText>
             </w:r>
             <w:r>
               <w:rPr>
@@ -1344,7 +1344,7 @@
               <w14:ligatures w14:val="standardContextual"/>
             </w:rPr>
           </w:pPr>
-          <w:hyperlink w:anchor="_Toc242018686" w:history="1">
+          <w:hyperlink w:anchor="_Toc242018798" w:history="1">
             <w:r>
               <w:rPr>
                 <w:rStyle w:val="Lienhypertexte"/>
@@ -1368,7 +1368,7 @@
               <w:rPr>
                 <w:noProof/>
               </w:rPr>
-              <w:instrText xml:space="preserve"> PAGEREF _Toc242018686 \h </w:instrText>
+              <w:instrText xml:space="preserve"> PAGEREF _Toc242018798 \h </w:instrText>
             </w:r>
             <w:r>
               <w:rPr>
@@ -1411,7 +1411,7 @@
               <w14:ligatures w14:val="standardContextual"/>
             </w:rPr>
           </w:pPr>
-          <w:hyperlink w:anchor="_Toc242018687" w:history="1">
+          <w:hyperlink w:anchor="_Toc242018799" w:history="1">
             <w:r>
               <w:rPr>
                 <w:rStyle w:val="Lienhypertexte"/>
@@ -1435,7 +1435,7 @@
               <w:rPr>
                 <w:noProof/>
               </w:rPr>
-              <w:instrText xml:space="preserve"> PAGEREF _Toc242018687 \h </w:instrText>
+              <w:instrText xml:space="preserve"> PAGEREF _Toc242018799 \h </w:instrText>
             </w:r>
             <w:r>
               <w:rPr>
@@ -1478,7 +1478,7 @@
               <w14:ligatures w14:val="standardContextual"/>
             </w:rPr>
           </w:pPr>
-          <w:hyperlink w:anchor="_Toc242018688" w:history="1">
+          <w:hyperlink w:anchor="_Toc242018800" w:history="1">
             <w:r>
               <w:rPr>
                 <w:rStyle w:val="Lienhypertexte"/>
@@ -1502,7 +1502,7 @@
               <w:rPr>
                 <w:noProof/>
               </w:rPr>
-              <w:instrText xml:space="preserve"> PAGEREF _Toc242018688 \h </w:instrText>
+              <w:instrText xml:space="preserve"> PAGEREF _Toc242018800 \h </w:instrText>
             </w:r>
             <w:r>
               <w:rPr>
@@ -1545,7 +1545,7 @@
               <w14:ligatures w14:val="standardContextual"/>
             </w:rPr>
           </w:pPr>
-          <w:hyperlink w:anchor="_Toc242018689" w:history="1">
+          <w:hyperlink w:anchor="_Toc242018801" w:history="1">
             <w:r>
               <w:rPr>
                 <w:rStyle w:val="Lienhypertexte"/>
@@ -1569,7 +1569,7 @@
               <w:rPr>
                 <w:noProof/>
               </w:rPr>
-              <w:instrText xml:space="preserve"> PAGEREF _Toc242018689 \h </w:instrText>
+              <w:instrText xml:space="preserve"> PAGEREF _Toc242018801 \h </w:instrText>
             </w:r>
             <w:r>
               <w:rPr>
@@ -1612,7 +1612,7 @@
               <w14:ligatures w14:val="standardContextual"/>
             </w:rPr>
           </w:pPr>
-          <w:hyperlink w:anchor="_Toc242018690" w:history="1">
+          <w:hyperlink w:anchor="_Toc242018802" w:history="1">
             <w:r>
               <w:rPr>
                 <w:rStyle w:val="Lienhypertexte"/>
@@ -1636,7 +1636,7 @@
               <w:rPr>
                 <w:noProof/>
               </w:rPr>
-              <w:instrText xml:space="preserve"> PAGEREF _Toc242018690 \h </w:instrText>
+              <w:instrText xml:space="preserve"> PAGEREF _Toc242018802 \h </w:instrText>
             </w:r>
             <w:r>
               <w:rPr>
@@ -1679,7 +1679,7 @@
               <w14:ligatures w14:val="standardContextual"/>
             </w:rPr>
           </w:pPr>
-          <w:hyperlink w:anchor="_Toc242018691" w:history="1">
+          <w:hyperlink w:anchor="_Toc242018803" w:history="1">
             <w:r>
               <w:rPr>
                 <w:rStyle w:val="Lienhypertexte"/>
@@ -1703,7 +1703,7 @@
               <w:rPr>
                 <w:noProof/>
               </w:rPr>
-              <w:instrText xml:space="preserve"> PAGEREF _Toc242018691 \h </w:instrText>
+              <w:instrText xml:space="preserve"> PAGEREF _Toc242018803 \h </w:instrText>
             </w:r>
             <w:r>
               <w:rPr>
@@ -1746,7 +1746,7 @@
               <w14:ligatures w14:val="standardContextual"/>
             </w:rPr>
           </w:pPr>
-          <w:hyperlink w:anchor="_Toc242018692" w:history="1">
+          <w:hyperlink w:anchor="_Toc242018804" w:history="1">
             <w:r>
               <w:rPr>
                 <w:rStyle w:val="Lienhypertexte"/>
@@ -1770,7 +1770,7 @@
               <w:rPr>
                 <w:noProof/>
               </w:rPr>
-              <w:instrText xml:space="preserve"> PAGEREF _Toc242018692 \h </w:instrText>
+              <w:instrText xml:space="preserve"> PAGEREF _Toc242018804 \h </w:instrText>
             </w:r>
             <w:r>
               <w:rPr>
@@ -1813,7 +1813,7 @@
               <w14:ligatures w14:val="standardContextual"/>
             </w:rPr>
           </w:pPr>
-          <w:hyperlink w:anchor="_Toc242018693" w:history="1">
+          <w:hyperlink w:anchor="_Toc242018805" w:history="1">
             <w:r>
               <w:rPr>
                 <w:rStyle w:val="Lienhypertexte"/>
@@ -1837,7 +1837,7 @@
               <w:rPr>
                 <w:noProof/>
               </w:rPr>
-              <w:instrText xml:space="preserve"> PAGEREF _Toc242018693 \h </w:instrText>
+              <w:instrText xml:space="preserve"> PAGEREF _Toc242018805 \h </w:instrText>
             </w:r>
             <w:r>
               <w:rPr>
@@ -1880,7 +1880,7 @@
               <w14:ligatures w14:val="standardContextual"/>
             </w:rPr>
           </w:pPr>
-          <w:hyperlink w:anchor="_Toc242018694" w:history="1">
+          <w:hyperlink w:anchor="_Toc242018806" w:history="1">
             <w:r>
               <w:rPr>
                 <w:rStyle w:val="Lienhypertexte"/>
@@ -1904,7 +1904,7 @@
               <w:rPr>
                 <w:noProof/>
               </w:rPr>
-              <w:instrText xml:space="preserve"> PAGEREF _Toc242018694 \h </w:instrText>
+              <w:instrText xml:space="preserve"> PAGEREF _Toc242018806 \h </w:instrText>
             </w:r>
             <w:r>
               <w:rPr>
@@ -1947,7 +1947,7 @@
               <w14:ligatures w14:val="standardContextual"/>
             </w:rPr>
           </w:pPr>
-          <w:hyperlink w:anchor="_Toc242018695" w:history="1">
+          <w:hyperlink w:anchor="_Toc242018807" w:history="1">
             <w:r>
               <w:rPr>
                 <w:rStyle w:val="Lienhypertexte"/>
@@ -1971,7 +1971,7 @@
               <w:rPr>
                 <w:noProof/>
               </w:rPr>
-              <w:instrText xml:space="preserve"> PAGEREF _Toc242018695 \h </w:instrText>
+              <w:instrText xml:space="preserve"> PAGEREF _Toc242018807 \h </w:instrText>
             </w:r>
             <w:r>
               <w:rPr>
@@ -2014,7 +2014,7 @@
               <w14:ligatures w14:val="standardContextual"/>
             </w:rPr>
           </w:pPr>
-          <w:hyperlink w:anchor="_Toc242018696" w:history="1">
+          <w:hyperlink w:anchor="_Toc242018808" w:history="1">
             <w:r>
               <w:rPr>
                 <w:rStyle w:val="Lienhypertexte"/>
@@ -2038,7 +2038,7 @@
               <w:rPr>
                 <w:noProof/>
               </w:rPr>
-              <w:instrText xml:space="preserve"> PAGEREF _Toc242018696 \h </w:instrText>
+              <w:instrText xml:space="preserve"> PAGEREF _Toc242018808 \h </w:instrText>
             </w:r>
             <w:r>
               <w:rPr>
@@ -2081,7 +2081,7 @@
               <w14:ligatures w14:val="standardContextual"/>
             </w:rPr>
           </w:pPr>
-          <w:hyperlink w:anchor="_Toc242018697" w:history="1">
+          <w:hyperlink w:anchor="_Toc242018809" w:history="1">
             <w:r>
               <w:rPr>
                 <w:rStyle w:val="Lienhypertexte"/>
@@ -2105,7 +2105,7 @@
               <w:rPr>
                 <w:noProof/>
               </w:rPr>
-              <w:instrText xml:space="preserve"> PAGEREF _Toc242018697 \h </w:instrText>
+              <w:instrText xml:space="preserve"> PAGEREF _Toc242018809 \h </w:instrText>
             </w:r>
             <w:r>
               <w:rPr>
@@ -2148,7 +2148,7 @@
               <w14:ligatures w14:val="standardContextual"/>
             </w:rPr>
           </w:pPr>
-          <w:hyperlink w:anchor="_Toc242018698" w:history="1">
+          <w:hyperlink w:anchor="_Toc242018810" w:history="1">
             <w:r>
               <w:rPr>
                 <w:rStyle w:val="Lienhypertexte"/>
@@ -2172,7 +2172,7 @@
               <w:rPr>
                 <w:noProof/>
               </w:rPr>
-              <w:instrText xml:space="preserve"> PAGEREF _Toc242018698 \h </w:instrText>
+              <w:instrText xml:space="preserve"> PAGEREF _Toc242018810 \h </w:instrText>
             </w:r>
             <w:r>
               <w:rPr>
@@ -2215,7 +2215,7 @@
               <w14:ligatures w14:val="standardContextual"/>
             </w:rPr>
           </w:pPr>
-          <w:hyperlink w:anchor="_Toc242018699" w:history="1">
+          <w:hyperlink w:anchor="_Toc242018811" w:history="1">
             <w:r>
               <w:rPr>
                 <w:rStyle w:val="Lienhypertexte"/>
@@ -2239,7 +2239,7 @@
               <w:rPr>
                 <w:noProof/>
               </w:rPr>
-              <w:instrText xml:space="preserve"> PAGEREF _Toc242018699 \h </w:instrText>
+              <w:instrText xml:space="preserve"> PAGEREF _Toc242018811 \h </w:instrText>
             </w:r>
             <w:r>
               <w:rPr>
@@ -2282,7 +2282,7 @@
               <w14:ligatures w14:val="standardContextual"/>
             </w:rPr>
           </w:pPr>
-          <w:hyperlink w:anchor="_Toc242018700" w:history="1">
+          <w:hyperlink w:anchor="_Toc242018812" w:history="1">
             <w:r>
               <w:rPr>
                 <w:rStyle w:val="Lienhypertexte"/>
@@ -2306,7 +2306,7 @@
               <w:rPr>
                 <w:noProof/>
               </w:rPr>
-              <w:instrText xml:space="preserve"> PAGEREF _Toc242018700 \h </w:instrText>
+              <w:instrText xml:space="preserve"> PAGEREF _Toc242018812 \h </w:instrText>
             </w:r>
             <w:r>
               <w:rPr>
@@ -2349,7 +2349,7 @@
               <w14:ligatures w14:val="standardContextual"/>
             </w:rPr>
           </w:pPr>
-          <w:hyperlink w:anchor="_Toc242018701" w:history="1">
+          <w:hyperlink w:anchor="_Toc242018813" w:history="1">
             <w:r>
               <w:rPr>
                 <w:rStyle w:val="Lienhypertexte"/>
@@ -2373,7 +2373,7 @@
               <w:rPr>
                 <w:noProof/>
               </w:rPr>
-              <w:instrText xml:space="preserve"> PAGEREF _Toc242018701 \h </w:instrText>
+              <w:instrText xml:space="preserve"> PAGEREF _Toc242018813 \h </w:instrText>
             </w:r>
             <w:r>
               <w:rPr>
@@ -2416,7 +2416,7 @@
               <w14:ligatures w14:val="standardContextual"/>
             </w:rPr>
           </w:pPr>
-          <w:hyperlink w:anchor="_Toc242018702" w:history="1">
+          <w:hyperlink w:anchor="_Toc242018814" w:history="1">
             <w:r>
               <w:rPr>
                 <w:rStyle w:val="Lienhypertexte"/>
@@ -2440,7 +2440,7 @@
               <w:rPr>
                 <w:noProof/>
               </w:rPr>
-              <w:instrText xml:space="preserve"> PAGEREF _Toc242018702 \h </w:instrText>
+              <w:instrText xml:space="preserve"> PAGEREF _Toc242018814 \h </w:instrText>
             </w:r>
             <w:r>
               <w:rPr>
@@ -2483,7 +2483,7 @@
               <w14:ligatures w14:val="standardContextual"/>
             </w:rPr>
           </w:pPr>
-          <w:hyperlink w:anchor="_Toc242018703" w:history="1">
+          <w:hyperlink w:anchor="_Toc242018815" w:history="1">
             <w:r>
               <w:rPr>
                 <w:rStyle w:val="Lienhypertexte"/>
@@ -2507,7 +2507,7 @@
               <w:rPr>
                 <w:noProof/>
               </w:rPr>
-              <w:instrText xml:space="preserve"> PAGEREF _Toc242018703 \h </w:instrText>
+              <w:instrText xml:space="preserve"> PAGEREF _Toc242018815 \h </w:instrText>
             </w:r>
             <w:r>
               <w:rPr>
@@ -2550,7 +2550,7 @@
               <w14:ligatures w14:val="standardContextual"/>
             </w:rPr>
           </w:pPr>
-          <w:hyperlink w:anchor="_Toc242018704" w:history="1">
+          <w:hyperlink w:anchor="_Toc242018816" w:history="1">
             <w:r>
               <w:rPr>
                 <w:rStyle w:val="Lienhypertexte"/>
@@ -2574,7 +2574,7 @@
               <w:rPr>
                 <w:noProof/>
               </w:rPr>
-              <w:instrText xml:space="preserve"> PAGEREF _Toc242018704 \h </w:instrText>
+              <w:instrText xml:space="preserve"> PAGEREF _Toc242018816 \h </w:instrText>
             </w:r>
             <w:r>
               <w:rPr>
@@ -2617,7 +2617,7 @@
               <w14:ligatures w14:val="standardContextual"/>
             </w:rPr>
           </w:pPr>
-          <w:hyperlink w:anchor="_Toc242018705" w:history="1">
+          <w:hyperlink w:anchor="_Toc242018817" w:history="1">
             <w:r>
               <w:rPr>
                 <w:rStyle w:val="Lienhypertexte"/>
@@ -2641,7 +2641,7 @@
               <w:rPr>
                 <w:noProof/>
               </w:rPr>
-              <w:instrText xml:space="preserve"> PAGEREF _Toc242018705 \h </w:instrText>
+              <w:instrText xml:space="preserve"> PAGEREF _Toc242018817 \h </w:instrText>
             </w:r>
             <w:r>
               <w:rPr>
@@ -2681,7 +2681,7 @@
         <w:pStyle w:val="Titre1"/>
         <w:pageBreakBefore/>
       </w:pPr>
-      <w:bookmarkStart w:id="0" w:name="_Toc242018668"/>
+      <w:bookmarkStart w:id="0" w:name="_Toc242018780"/>
       <w:r>
         <w:lastRenderedPageBreak/>
         <w:t>1. Présentation de la plateforme</w:t>
@@ -3132,7 +3132,7 @@
       <w:pPr>
         <w:pStyle w:val="Titre2"/>
       </w:pPr>
-      <w:bookmarkStart w:id="1" w:name="_Toc242018669"/>
+      <w:bookmarkStart w:id="1" w:name="_Toc242018781"/>
       <w:r>
         <w:t>1.1 Une seule connexion</w:t>
       </w:r>
@@ -3160,7 +3160,7 @@
       <w:pPr>
         <w:pStyle w:val="Titre2"/>
       </w:pPr>
-      <w:bookmarkStart w:id="2" w:name="_Toc242018670"/>
+      <w:bookmarkStart w:id="2" w:name="_Toc242018782"/>
       <w:r>
         <w:t>1.2 Principes de fonctionnement</w:t>
       </w:r>
@@ -3251,7 +3251,7 @@
         <w:pStyle w:val="Titre1"/>
         <w:pageBreakBefore/>
       </w:pPr>
-      <w:bookmarkStart w:id="3" w:name="_Toc242018671"/>
+      <w:bookmarkStart w:id="3" w:name="_Toc242018783"/>
       <w:r>
         <w:lastRenderedPageBreak/>
         <w:t>2. Les rôles et leurs droits</w:t>
@@ -4075,7 +4075,7 @@
       <w:pPr>
         <w:pStyle w:val="Titre2"/>
       </w:pPr>
-      <w:bookmarkStart w:id="4" w:name="_Toc242018672"/>
+      <w:bookmarkStart w:id="4" w:name="_Toc242018784"/>
       <w:r>
         <w:t>2.1 Visiteur</w:t>
       </w:r>
@@ -4185,7 +4185,7 @@
       <w:pPr>
         <w:pStyle w:val="Titre2"/>
       </w:pPr>
-      <w:bookmarkStart w:id="5" w:name="_Toc242018673"/>
+      <w:bookmarkStart w:id="5" w:name="_Toc242018785"/>
       <w:r>
         <w:t>2.2 Client</w:t>
       </w:r>
@@ -4399,7 +4399,7 @@
       <w:pPr>
         <w:pStyle w:val="Titre2"/>
       </w:pPr>
-      <w:bookmarkStart w:id="6" w:name="_Toc242018674"/>
+      <w:bookmarkStart w:id="6" w:name="_Toc242018786"/>
       <w:r>
         <w:lastRenderedPageBreak/>
         <w:t>2.3 Technicien</w:t>
@@ -4923,7 +4923,7 @@
       <w:pPr>
         <w:pStyle w:val="Titre2"/>
       </w:pPr>
-      <w:bookmarkStart w:id="7" w:name="_Toc242018675"/>
+      <w:bookmarkStart w:id="7" w:name="_Toc242018787"/>
       <w:r>
         <w:t>2.4 Manager</w:t>
       </w:r>
@@ -5176,7 +5176,7 @@
       <w:pPr>
         <w:pStyle w:val="Titre2"/>
       </w:pPr>
-      <w:bookmarkStart w:id="8" w:name="_Toc242018676"/>
+      <w:bookmarkStart w:id="8" w:name="_Toc242018788"/>
       <w:r>
         <w:t>2.5 Administrateur</w:t>
       </w:r>
@@ -5286,7 +5286,7 @@
         <w:pStyle w:val="Titre1"/>
         <w:pageBreakBefore/>
       </w:pPr>
-      <w:bookmarkStart w:id="9" w:name="_Toc242018677"/>
+      <w:bookmarkStart w:id="9" w:name="_Toc242018789"/>
       <w:r>
         <w:lastRenderedPageBreak/>
         <w:t>3. Le parcours d’un rendez-vous</w:t>
@@ -6377,7 +6377,7 @@
       <w:pPr>
         <w:pStyle w:val="Titre2"/>
       </w:pPr>
-      <w:bookmarkStart w:id="10" w:name="_Toc242018678"/>
+      <w:bookmarkStart w:id="10" w:name="_Toc242018790"/>
       <w:r>
         <w:t>3.1 Situations particulières</w:t>
       </w:r>
@@ -7027,7 +7027,7 @@
       <w:pPr>
         <w:pStyle w:val="Titre2"/>
       </w:pPr>
-      <w:bookmarkStart w:id="11" w:name="_Toc242018679"/>
+      <w:bookmarkStart w:id="11" w:name="_Toc242018791"/>
       <w:r>
         <w:t>3.2 Restitution et paiement au comptoir</w:t>
       </w:r>
@@ -7120,7 +7120,7 @@
       <w:pPr>
         <w:pStyle w:val="Titre2"/>
       </w:pPr>
-      <w:bookmarkStart w:id="12" w:name="_Toc242018680"/>
+      <w:bookmarkStart w:id="12" w:name="_Toc242018792"/>
       <w:r>
         <w:t>3.3 L’avancement affiché au client</w:t>
       </w:r>
@@ -7149,7 +7149,7 @@
         <w:pStyle w:val="Titre1"/>
         <w:pageBreakBefore/>
       </w:pPr>
-      <w:bookmarkStart w:id="13" w:name="_Toc242018681"/>
+      <w:bookmarkStart w:id="13" w:name="_Toc242018793"/>
       <w:r>
         <w:lastRenderedPageBreak/>
         <w:t>4. Réservation en ligne et disponibilités</w:t>
@@ -7160,7 +7160,7 @@
       <w:pPr>
         <w:pStyle w:val="Titre2"/>
       </w:pPr>
-      <w:bookmarkStart w:id="14" w:name="_Toc242018682"/>
+      <w:bookmarkStart w:id="14" w:name="_Toc242018794"/>
       <w:r>
         <w:t>4.1 Le tunnel de réservation</w:t>
       </w:r>
@@ -7320,7 +7320,7 @@
       <w:pPr>
         <w:pStyle w:val="Titre2"/>
       </w:pPr>
-      <w:bookmarkStart w:id="15" w:name="_Toc242018683"/>
+      <w:bookmarkStart w:id="15" w:name="_Toc242018795"/>
       <w:r>
         <w:t>4.2 Comment les créneaux sont calculés</w:t>
       </w:r>
@@ -8280,7 +8280,7 @@
         <w:pStyle w:val="Titre1"/>
         <w:pageBreakBefore/>
       </w:pPr>
-      <w:bookmarkStart w:id="16" w:name="_Toc242018684"/>
+      <w:bookmarkStart w:id="16" w:name="_Toc242018796"/>
       <w:r>
         <w:lastRenderedPageBreak/>
         <w:t>5. L’espace client</w:t>
@@ -8863,7 +8863,7 @@
       <w:pPr>
         <w:pStyle w:val="Titre2"/>
       </w:pPr>
-      <w:bookmarkStart w:id="17" w:name="_Toc242018685"/>
+      <w:bookmarkStart w:id="17" w:name="_Toc242018797"/>
       <w:r>
         <w:t>5.1 Photo du véhicule</w:t>
       </w:r>
@@ -8943,7 +8943,7 @@
         <w:pStyle w:val="Titre1"/>
         <w:pageBreakBefore/>
       </w:pPr>
-      <w:bookmarkStart w:id="18" w:name="_Toc242018686"/>
+      <w:bookmarkStart w:id="18" w:name="_Toc242018798"/>
       <w:r>
         <w:lastRenderedPageBreak/>
         <w:t>6. L’espace professionnel</w:t>
@@ -9411,7 +9411,7 @@
                 <w:sz w:val="19"/>
                 <w:szCs w:val="19"/>
               </w:rPr>
-              <w:t>Statistiques</w:t>
+              <w:t>Galerie et contenus</w:t>
             </w:r>
           </w:p>
         </w:tc>
@@ -9471,7 +9471,7 @@
                 <w:sz w:val="19"/>
                 <w:szCs w:val="19"/>
               </w:rPr>
-              <w:t>Période au choix (7 jours à 12 mois), chiffre d’affaires encaissé dans le temps, moyens de paiement, prestations populaires, rendez-vous par statut, taux d’annulation, clients nouveaux et récurrents, exports CSV.</w:t>
+              <w:t>Réalisations Avant / Après (ajout avec photos, publication, mise en avant), avis clients (publication impossible sans l’accord du client), chiffres clés (publiés une fois vérifiés).</w:t>
             </w:r>
           </w:p>
         </w:tc>
@@ -9508,7 +9508,7 @@
                 <w:sz w:val="19"/>
                 <w:szCs w:val="19"/>
               </w:rPr>
-              <w:t>Factures</w:t>
+              <w:t>Statistiques</w:t>
             </w:r>
           </w:p>
         </w:tc>
@@ -9566,7 +9566,7 @@
                 <w:sz w:val="19"/>
                 <w:szCs w:val="19"/>
               </w:rPr>
-              <w:t>Toutes les factures (recherche, filtres par statut, reste à encaisser), établissement des factures sur devis avec lignes libres et remise, encaissement, remboursement, annulation, PDF.</w:t>
+              <w:t>Période au choix (7 jours à 12 mois), chiffre d’affaires encaissé dans le temps, moyens de paiement, prestations populaires, rendez-vous par statut, taux d’annulation, clients nouveaux et récurrents, exports CSV.</w:t>
             </w:r>
           </w:p>
         </w:tc>
@@ -9604,7 +9604,7 @@
                 <w:sz w:val="19"/>
                 <w:szCs w:val="19"/>
               </w:rPr>
-              <w:t>Notifications</w:t>
+              <w:t>Factures</w:t>
             </w:r>
           </w:p>
         </w:tc>
@@ -9634,7 +9634,7 @@
                 <w:sz w:val="19"/>
                 <w:szCs w:val="19"/>
               </w:rPr>
-              <w:t>Toute l’équipe</w:t>
+              <w:t>Manager, admin</w:t>
             </w:r>
           </w:p>
         </w:tc>
@@ -9664,7 +9664,7 @@
                 <w:sz w:val="19"/>
                 <w:szCs w:val="19"/>
               </w:rPr>
-              <w:t>Ce qui demande une action (nouvelle demande, contrôle à valider, prestation affectée…).</w:t>
+              <w:t>Toutes les factures (recherche, filtres par statut, reste à encaisser), établissement des factures sur devis avec lignes libres et remise, encaissement, remboursement, annulation, PDF.</w:t>
             </w:r>
           </w:p>
         </w:tc>
@@ -9701,7 +9701,7 @@
                 <w:sz w:val="19"/>
                 <w:szCs w:val="19"/>
               </w:rPr>
-              <w:t>Rendez-vous</w:t>
+              <w:t>Notifications</w:t>
             </w:r>
           </w:p>
         </w:tc>
@@ -9759,7 +9759,7 @@
                 <w:sz w:val="19"/>
                 <w:szCs w:val="19"/>
               </w:rPr>
-              <w:t>Liste filtrable (statut, date). Seules les actions autorisées pour le rôle et l’étape sont proposées. Fiche « Gérer » : affectation, notes internes, report, historique complet.</w:t>
+              <w:t>Ce qui demande une action (nouvelle demande, contrôle à valider, prestation affectée…).</w:t>
             </w:r>
           </w:p>
         </w:tc>
@@ -9797,7 +9797,7 @@
                 <w:sz w:val="19"/>
                 <w:szCs w:val="19"/>
               </w:rPr>
-              <w:t>Clients</w:t>
+              <w:t>Rendez-vous</w:t>
             </w:r>
           </w:p>
         </w:tc>
@@ -9827,7 +9827,7 @@
                 <w:sz w:val="19"/>
                 <w:szCs w:val="19"/>
               </w:rPr>
-              <w:t>Toute l’équipe (modification : manager)</w:t>
+              <w:t>Toute l’équipe</w:t>
             </w:r>
           </w:p>
         </w:tc>
@@ -9857,7 +9857,7 @@
                 <w:sz w:val="19"/>
                 <w:szCs w:val="19"/>
               </w:rPr>
-              <w:t>Recherche par nom, téléphone, email ou immatriculation ; fiche avec véhicules, rendez-vous, montant des prestations, segment et notes internes.</w:t>
+              <w:t>Liste filtrable (statut, date). Seules les actions autorisées pour le rôle et l’étape sont proposées. Fiche « Gérer » : affectation, notes internes, report, historique complet.</w:t>
             </w:r>
           </w:p>
         </w:tc>
@@ -9894,7 +9894,7 @@
                 <w:sz w:val="19"/>
                 <w:szCs w:val="19"/>
               </w:rPr>
-              <w:t>Véhicules</w:t>
+              <w:t>Clients</w:t>
             </w:r>
           </w:p>
         </w:tc>
@@ -9923,7 +9923,7 @@
                 <w:sz w:val="19"/>
                 <w:szCs w:val="19"/>
               </w:rPr>
-              <w:t>Toute l’équipe</w:t>
+              <w:t>Toute l’équipe (modification : manager)</w:t>
             </w:r>
           </w:p>
         </w:tc>
@@ -9952,7 +9952,7 @@
                 <w:sz w:val="19"/>
                 <w:szCs w:val="19"/>
               </w:rPr>
-              <w:t>Tous les véhicules enregistrés et leur propriétaire.</w:t>
+              <w:t>Recherche par nom, téléphone, email ou immatriculation ; fiche avec véhicules, rendez-vous, montant des prestations, segment et notes internes.</w:t>
             </w:r>
           </w:p>
         </w:tc>
@@ -9990,7 +9990,7 @@
                 <w:sz w:val="19"/>
                 <w:szCs w:val="19"/>
               </w:rPr>
-              <w:t>Prestations</w:t>
+              <w:t>Véhicules</w:t>
             </w:r>
           </w:p>
         </w:tc>
@@ -10020,7 +10020,7 @@
                 <w:sz w:val="19"/>
                 <w:szCs w:val="19"/>
               </w:rPr>
-              <w:t>Manager, admin</w:t>
+              <w:t>Toute l’équipe</w:t>
             </w:r>
           </w:p>
         </w:tc>
@@ -10050,7 +10050,7 @@
                 <w:sz w:val="19"/>
                 <w:szCs w:val="19"/>
               </w:rPr>
-              <w:t>Création et modification (tarif fixe, « à partir de » ou sur devis ; durée bloquée au planning), suspension.</w:t>
+              <w:t>Tous les véhicules enregistrés et leur propriétaire.</w:t>
             </w:r>
           </w:p>
         </w:tc>
@@ -10087,6 +10087,102 @@
                 <w:sz w:val="19"/>
                 <w:szCs w:val="19"/>
               </w:rPr>
+              <w:t>Prestations</w:t>
+            </w:r>
+          </w:p>
+        </w:tc>
+        <w:tc>
+          <w:tcPr>
+            <w:tcW w:w="1985" w:type="dxa"/>
+            <w:tcBorders>
+              <w:top w:val="single" w:sz="4" w:space="0" w:color="D9D9D9"/>
+              <w:left w:val="single" w:sz="4" w:space="0" w:color="D9D9D9"/>
+              <w:bottom w:val="single" w:sz="4" w:space="0" w:color="D9D9D9"/>
+              <w:right w:val="single" w:sz="4" w:space="0" w:color="D9D9D9"/>
+            </w:tcBorders>
+            <w:tcMar>
+              <w:top w:w="70" w:type="dxa"/>
+              <w:left w:w="110" w:type="dxa"/>
+              <w:bottom w:w="70" w:type="dxa"/>
+              <w:right w:w="110" w:type="dxa"/>
+            </w:tcMar>
+          </w:tcPr>
+          <w:p>
+            <w:pPr>
+              <w:spacing w:line="252" w:lineRule="auto"/>
+            </w:pPr>
+            <w:r>
+              <w:rPr>
+                <w:sz w:val="19"/>
+                <w:szCs w:val="19"/>
+              </w:rPr>
+              <w:t>Manager, admin</w:t>
+            </w:r>
+          </w:p>
+        </w:tc>
+        <w:tc>
+          <w:tcPr>
+            <w:tcW w:w="5417" w:type="dxa"/>
+            <w:tcBorders>
+              <w:top w:val="single" w:sz="4" w:space="0" w:color="D9D9D9"/>
+              <w:left w:val="single" w:sz="4" w:space="0" w:color="D9D9D9"/>
+              <w:bottom w:val="single" w:sz="4" w:space="0" w:color="D9D9D9"/>
+              <w:right w:val="single" w:sz="4" w:space="0" w:color="D9D9D9"/>
+            </w:tcBorders>
+            <w:tcMar>
+              <w:top w:w="70" w:type="dxa"/>
+              <w:left w:w="110" w:type="dxa"/>
+              <w:bottom w:w="70" w:type="dxa"/>
+              <w:right w:w="110" w:type="dxa"/>
+            </w:tcMar>
+          </w:tcPr>
+          <w:p>
+            <w:pPr>
+              <w:spacing w:line="252" w:lineRule="auto"/>
+            </w:pPr>
+            <w:r>
+              <w:rPr>
+                <w:sz w:val="19"/>
+                <w:szCs w:val="19"/>
+              </w:rPr>
+              <w:t>Création et modification (tarif fixe, « à partir de » ou sur devis ; durée bloquée au planning), suspension.</w:t>
+            </w:r>
+          </w:p>
+        </w:tc>
+      </w:tr>
+      <w:tr>
+        <w:tblPrEx>
+          <w:tblCellMar>
+            <w:top w:w="0" w:type="dxa"/>
+            <w:bottom w:w="0" w:type="dxa"/>
+          </w:tblCellMar>
+        </w:tblPrEx>
+        <w:tc>
+          <w:tcPr>
+            <w:tcW w:w="1624" w:type="dxa"/>
+            <w:tcBorders>
+              <w:top w:val="single" w:sz="4" w:space="0" w:color="D9D9D9"/>
+              <w:left w:val="single" w:sz="4" w:space="0" w:color="D9D9D9"/>
+              <w:bottom w:val="single" w:sz="4" w:space="0" w:color="D9D9D9"/>
+              <w:right w:val="single" w:sz="4" w:space="0" w:color="D9D9D9"/>
+            </w:tcBorders>
+            <w:shd w:val="clear" w:color="auto" w:fill="FAF7F2"/>
+            <w:tcMar>
+              <w:top w:w="70" w:type="dxa"/>
+              <w:left w:w="110" w:type="dxa"/>
+              <w:bottom w:w="70" w:type="dxa"/>
+              <w:right w:w="110" w:type="dxa"/>
+            </w:tcMar>
+          </w:tcPr>
+          <w:p>
+            <w:pPr>
+              <w:spacing w:line="252" w:lineRule="auto"/>
+            </w:pPr>
+            <w:r>
+              <w:rPr>
+                <w:sz w:val="19"/>
+                <w:szCs w:val="19"/>
+              </w:rPr>
               <w:t>Équipe</w:t>
             </w:r>
           </w:p>
@@ -10100,6 +10196,7 @@
               <w:bottom w:val="single" w:sz="4" w:space="0" w:color="D9D9D9"/>
               <w:right w:val="single" w:sz="4" w:space="0" w:color="D9D9D9"/>
             </w:tcBorders>
+            <w:shd w:val="clear" w:color="auto" w:fill="FAF7F2"/>
             <w:tcMar>
               <w:top w:w="70" w:type="dxa"/>
               <w:left w:w="110" w:type="dxa"/>
@@ -10129,6 +10226,7 @@
               <w:bottom w:val="single" w:sz="4" w:space="0" w:color="D9D9D9"/>
               <w:right w:val="single" w:sz="4" w:space="0" w:color="D9D9D9"/>
             </w:tcBorders>
+            <w:shd w:val="clear" w:color="auto" w:fill="FAF7F2"/>
             <w:tcMar>
               <w:top w:w="70" w:type="dxa"/>
               <w:left w:w="110" w:type="dxa"/>
@@ -10171,10 +10269,10 @@
           <w:bCs/>
           <w:color w:val="B87D24"/>
         </w:rPr>
-        <w:t xml:space="preserve">Écran en cours de réalisation : </w:t>
-      </w:r>
-      <w:r>
-        <w:t>la gestion de la galerie (réalisations, avis, chiffres clés) est opérationnelle côté serveur et testée ; son écran reste à construire. En attendant, l’administrateur la gère dans le back-office.</w:t>
+        <w:t xml:space="preserve">Paramètres : </w:t>
+      </w:r>
+      <w:r>
+        <w:t>les horaires d’ouverture, les fermetures exceptionnelles et les comptes de l’équipe se règlent dans l’administration (/admin/), réservée à l’administrateur.</w:t>
       </w:r>
     </w:p>
     <w:p>
@@ -10182,7 +10280,7 @@
         <w:pStyle w:val="Titre1"/>
         <w:pageBreakBefore/>
       </w:pPr>
-      <w:bookmarkStart w:id="19" w:name="_Toc242018687"/>
+      <w:bookmarkStart w:id="19" w:name="_Toc242018799"/>
       <w:r>
         <w:lastRenderedPageBreak/>
         <w:t>7. Le suivi atelier</w:t>
@@ -10193,7 +10291,7 @@
       <w:pPr>
         <w:pStyle w:val="Titre2"/>
       </w:pPr>
-      <w:bookmarkStart w:id="20" w:name="_Toc242018688"/>
+      <w:bookmarkStart w:id="20" w:name="_Toc242018800"/>
       <w:r>
         <w:t>7.1 Étapes de traitement</w:t>
       </w:r>
@@ -10282,7 +10380,7 @@
       <w:pPr>
         <w:pStyle w:val="Titre2"/>
       </w:pPr>
-      <w:bookmarkStart w:id="21" w:name="_Toc242018689"/>
+      <w:bookmarkStart w:id="21" w:name="_Toc242018801"/>
       <w:r>
         <w:t>7.2 Photos d’intervention</w:t>
       </w:r>
@@ -10633,7 +10731,7 @@
         <w:pStyle w:val="Titre1"/>
         <w:pageBreakBefore/>
       </w:pPr>
-      <w:bookmarkStart w:id="22" w:name="_Toc242018690"/>
+      <w:bookmarkStart w:id="22" w:name="_Toc242018802"/>
       <w:r>
         <w:lastRenderedPageBreak/>
         <w:t>8. Facturation et paiements</w:t>
@@ -10644,7 +10742,7 @@
       <w:pPr>
         <w:pStyle w:val="Titre2"/>
       </w:pPr>
-      <w:bookmarkStart w:id="23" w:name="_Toc242018691"/>
+      <w:bookmarkStart w:id="23" w:name="_Toc242018803"/>
       <w:r>
         <w:t>8.1 Les factures</w:t>
       </w:r>
@@ -10760,7 +10858,7 @@
       <w:pPr>
         <w:pStyle w:val="Titre2"/>
       </w:pPr>
-      <w:bookmarkStart w:id="24" w:name="_Toc242018692"/>
+      <w:bookmarkStart w:id="24" w:name="_Toc242018804"/>
       <w:r>
         <w:t>8.2 Les paiements</w:t>
       </w:r>
@@ -10905,7 +11003,7 @@
       <w:pPr>
         <w:pStyle w:val="Titre2"/>
       </w:pPr>
-      <w:bookmarkStart w:id="25" w:name="_Toc242018693"/>
+      <w:bookmarkStart w:id="25" w:name="_Toc242018805"/>
       <w:r>
         <w:t>8.3 Le journal de caisse</w:t>
       </w:r>
@@ -10953,7 +11051,7 @@
       <w:pPr>
         <w:pStyle w:val="Titre2"/>
       </w:pPr>
-      <w:bookmarkStart w:id="26" w:name="_Toc242018694"/>
+      <w:bookmarkStart w:id="26" w:name="_Toc242018806"/>
       <w:r>
         <w:t>8.4 Statut d’une facture</w:t>
       </w:r>
@@ -11415,7 +11513,7 @@
         <w:pStyle w:val="Titre1"/>
         <w:pageBreakBefore/>
       </w:pPr>
-      <w:bookmarkStart w:id="27" w:name="_Toc242018695"/>
+      <w:bookmarkStart w:id="27" w:name="_Toc242018807"/>
       <w:r>
         <w:lastRenderedPageBreak/>
         <w:t>9. Les notifications</w:t>
@@ -11426,7 +11524,7 @@
       <w:pPr>
         <w:pStyle w:val="Titre2"/>
       </w:pPr>
-      <w:bookmarkStart w:id="28" w:name="_Toc242018696"/>
+      <w:bookmarkStart w:id="28" w:name="_Toc242018808"/>
       <w:r>
         <w:t>9.1 Pour le client</w:t>
       </w:r>
@@ -12094,7 +12192,7 @@
       <w:pPr>
         <w:pStyle w:val="Titre2"/>
       </w:pPr>
-      <w:bookmarkStart w:id="29" w:name="_Toc242018697"/>
+      <w:bookmarkStart w:id="29" w:name="_Toc242018809"/>
       <w:r>
         <w:t>9.2 Pour l’équipe</w:t>
       </w:r>
@@ -12572,7 +12670,7 @@
         <w:pStyle w:val="Titre1"/>
         <w:pageBreakBefore/>
       </w:pPr>
-      <w:bookmarkStart w:id="30" w:name="_Toc242018698"/>
+      <w:bookmarkStart w:id="30" w:name="_Toc242018810"/>
       <w:r>
         <w:lastRenderedPageBreak/>
         <w:t>10. Contenus publics du site</w:t>
@@ -13008,7 +13106,7 @@
         <w:pStyle w:val="Titre1"/>
         <w:pageBreakBefore/>
       </w:pPr>
-      <w:bookmarkStart w:id="31" w:name="_Toc242018699"/>
+      <w:bookmarkStart w:id="31" w:name="_Toc242018811"/>
       <w:r>
         <w:lastRenderedPageBreak/>
         <w:t>11. Statistiques et exports</w:t>
@@ -13641,7 +13739,7 @@
         <w:pStyle w:val="Titre1"/>
         <w:pageBreakBefore/>
       </w:pPr>
-      <w:bookmarkStart w:id="32" w:name="_Toc242018700"/>
+      <w:bookmarkStart w:id="32" w:name="_Toc242018812"/>
       <w:r>
         <w:lastRenderedPageBreak/>
         <w:t>12. Sécurité et confidentialité</w:t>
@@ -13803,7 +13901,7 @@
         <w:pStyle w:val="Titre1"/>
         <w:pageBreakBefore/>
       </w:pPr>
-      <w:bookmarkStart w:id="33" w:name="_Toc242018701"/>
+      <w:bookmarkStart w:id="33" w:name="_Toc242018813"/>
       <w:r>
         <w:lastRenderedPageBreak/>
         <w:t>13. Administration</w:t>
@@ -13940,7 +14038,7 @@
       <w:pPr>
         <w:pStyle w:val="Titre2"/>
       </w:pPr>
-      <w:bookmarkStart w:id="34" w:name="_Toc242018702"/>
+      <w:bookmarkStart w:id="34" w:name="_Toc242018814"/>
       <w:r>
         <w:t>13.1 Mise en service : liste de contrôle</w:t>
       </w:r>
@@ -14092,7 +14190,7 @@
         <w:pStyle w:val="Titre1"/>
         <w:pageBreakBefore/>
       </w:pPr>
-      <w:bookmarkStart w:id="35" w:name="_Toc242018703"/>
+      <w:bookmarkStart w:id="35" w:name="_Toc242018815"/>
       <w:r>
         <w:lastRenderedPageBreak/>
         <w:t>14. État d’avancement</w:t>
@@ -14998,7 +15096,7 @@
                 <w:sz w:val="19"/>
                 <w:szCs w:val="19"/>
               </w:rPr>
-              <w:t>Affichage public opérationnel. Gestion : écrans pro à construire</w:t>
+              <w:t>Opérationnel</w:t>
             </w:r>
           </w:p>
         </w:tc>
@@ -15225,7 +15323,7 @@
         <w:pStyle w:val="Titre1"/>
         <w:pageBreakBefore/>
       </w:pPr>
-      <w:bookmarkStart w:id="36" w:name="_Toc242018704"/>
+      <w:bookmarkStart w:id="36" w:name="_Toc242018816"/>
       <w:r>
         <w:lastRenderedPageBreak/>
         <w:t>Annexe — Repères techniques</w:t>
@@ -15808,7 +15906,7 @@
       <w:pPr>
         <w:pStyle w:val="Titre2"/>
       </w:pPr>
-      <w:bookmarkStart w:id="37" w:name="_Toc242018705"/>
+      <w:bookmarkStart w:id="37" w:name="_Toc242018817"/>
       <w:r>
         <w:t>Mode démonstration</w:t>
       </w:r>
@@ -16002,10 +16100,10 @@
 <file path=word/numbering.xml><?xml version="1.0" encoding="utf-8"?>
 <w:numbering xmlns:wpc="http://schemas.microsoft.com/office/word/2010/wordprocessingCanvas" xmlns:cx="http://schemas.microsoft.com/office/drawing/2014/chartex" xmlns:cx1="http://schemas.microsoft.com/office/drawing/2015/9/8/chartex" xmlns:cx2="http://schemas.microsoft.com/office/drawing/2015/10/21/chartex" xmlns:cx3="http://schemas.microsoft.com/office/drawing/2016/5/9/chartex" xmlns:cx4="http://schemas.microsoft.com/office/drawing/2016/5/10/chartex" xmlns:cx5="http://schemas.microsoft.com/office/drawing/2016/5/11/chartex" xmlns:cx6="http://schemas.microsoft.com/office/drawing/2016/5/12/chartex" xmlns:cx7="http://schemas.microsoft.com/office/drawing/2016/5/13/chartex" xmlns:cx8="http://schemas.microsoft.com/office/drawing/2016/5/14/chartex" xmlns:mc="http://schemas.openxmlformats.org/markup-compatibility/2006" xmlns:aink="http://schemas.microsoft.com/office/drawing/2016/ink" xmlns:am3d="http://schemas.microsoft.com/office/drawing/2017/model3d" xmlns:o="urn:schemas-microsoft-com:office:office" xmlns:oel="http://schemas.microsoft.com/office/2019/extlst" xmlns:r="http://schemas.openxmlformats.org/officeDocument/2006/relationships" xmlns:m="http://schemas.openxmlformats.org/officeDocument/2006/math" xmlns:v="urn:schemas-microsoft-com:vml" xmlns:wp14="http://schemas.microsoft.com/office/word/2010/wordprocessingDrawing" xmlns:wp="http://schemas.openxmlformats.org/drawingml/2006/wordprocessingDrawing" xmlns:w10="urn:schemas-microsoft-com:office:word" xmlns:w="http://schemas.openxmlformats.org/wordprocessingml/2006/main" xmlns:w14="http://schemas.microsoft.com/office/word/2010/wordml" xmlns:w15="http://schemas.microsoft.com/office/word/2012/wordml" xmlns:w16cex="http://schemas.microsoft.com/office/word/2018/wordml/cex" xmlns:w16cid="http://schemas.microsoft.com/office/word/2016/wordml/cid" xmlns:w16="http://schemas.microsoft.com/office/word/2018/wordml" xmlns:w16du="http://schemas.microsoft.com/office/word/2023/wordml/word16du" xmlns:w16sdtdh="http://schemas.microsoft.com/office/word/2020/wordml/sdtdatahash" xmlns:w16sdtfl="http://schemas.microsoft.com/office/word/2024/wordml/sdtformatlock" xmlns:w16se="http://schemas.microsoft.com/office/word/2015/wordml/symex" xmlns:wpg="http://schemas.microsoft.com/office/word/2010/wordprocessingGroup" xmlns:wpi="http://schemas.microsoft.com/office/word/2010/wordprocessingInk" xmlns:wne="http://schemas.microsoft.com/office/word/2006/wordml" xmlns:wps="http://schemas.microsoft.com/office/word/2010/wordprocessingShape" mc:Ignorable="w14 w15 w16se w16cid w16 w16cex w16sdtdh w16sdtfl w16du wp14">
   <w:abstractNum w:abstractNumId="0" w15:restartNumberingAfterBreak="0">
-    <w:nsid w:val="3FCA5AEE"/>
+    <w:nsid w:val="23A241F0"/>
     <w:multiLevelType w:val="hybridMultilevel"/>
-    <w:tmpl w:val="319ED714"/>
-    <w:lvl w:ilvl="0" w:tplc="AF2CD552">
+    <w:tmpl w:val="9C5C02FA"/>
+    <w:lvl w:ilvl="0" w:tplc="735283AC">
       <w:start w:val="1"/>
       <w:numFmt w:val="decimal"/>
       <w:lvlText w:val="%1."/>
@@ -16014,52 +16112,52 @@
         <w:ind w:left="360" w:hanging="300"/>
       </w:pPr>
     </w:lvl>
-    <w:lvl w:ilvl="1" w:tplc="610A359C">
+    <w:lvl w:ilvl="1" w:tplc="DDAE185A">
       <w:numFmt w:val="decimal"/>
       <w:lvlText w:val=""/>
       <w:lvlJc w:val="left"/>
     </w:lvl>
-    <w:lvl w:ilvl="2" w:tplc="0FF43FD0">
+    <w:lvl w:ilvl="2" w:tplc="A4F03692">
       <w:numFmt w:val="decimal"/>
       <w:lvlText w:val=""/>
       <w:lvlJc w:val="left"/>
     </w:lvl>
-    <w:lvl w:ilvl="3" w:tplc="7BD07262">
+    <w:lvl w:ilvl="3" w:tplc="0ADC0342">
       <w:numFmt w:val="decimal"/>
       <w:lvlText w:val=""/>
       <w:lvlJc w:val="left"/>
     </w:lvl>
-    <w:lvl w:ilvl="4" w:tplc="AEB8702C">
+    <w:lvl w:ilvl="4" w:tplc="5E509DAA">
       <w:numFmt w:val="decimal"/>
       <w:lvlText w:val=""/>
       <w:lvlJc w:val="left"/>
     </w:lvl>
-    <w:lvl w:ilvl="5" w:tplc="C2061B56">
+    <w:lvl w:ilvl="5" w:tplc="0A1ADE64">
       <w:numFmt w:val="decimal"/>
       <w:lvlText w:val=""/>
       <w:lvlJc w:val="left"/>
     </w:lvl>
-    <w:lvl w:ilvl="6" w:tplc="0DE44758">
+    <w:lvl w:ilvl="6" w:tplc="6362185E">
       <w:numFmt w:val="decimal"/>
       <w:lvlText w:val=""/>
       <w:lvlJc w:val="left"/>
     </w:lvl>
-    <w:lvl w:ilvl="7" w:tplc="4A981ED4">
+    <w:lvl w:ilvl="7" w:tplc="14FEC882">
       <w:numFmt w:val="decimal"/>
       <w:lvlText w:val=""/>
       <w:lvlJc w:val="left"/>
     </w:lvl>
-    <w:lvl w:ilvl="8" w:tplc="2C7C17D0">
+    <w:lvl w:ilvl="8" w:tplc="A882F228">
       <w:numFmt w:val="decimal"/>
       <w:lvlText w:val=""/>
       <w:lvlJc w:val="left"/>
     </w:lvl>
   </w:abstractNum>
   <w:abstractNum w:abstractNumId="1" w15:restartNumberingAfterBreak="0">
-    <w:nsid w:val="4BC17CAC"/>
+    <w:nsid w:val="2EA22CE3"/>
     <w:multiLevelType w:val="hybridMultilevel"/>
-    <w:tmpl w:val="470C088C"/>
-    <w:lvl w:ilvl="0" w:tplc="435C8CB8">
+    <w:tmpl w:val="887CA4F6"/>
+    <w:lvl w:ilvl="0" w:tplc="038ECD92">
       <w:start w:val="1"/>
       <w:numFmt w:val="decimal"/>
       <w:lvlText w:val="%1."/>
@@ -16068,52 +16166,52 @@
         <w:ind w:left="360" w:hanging="300"/>
       </w:pPr>
     </w:lvl>
-    <w:lvl w:ilvl="1" w:tplc="E1B460D4">
+    <w:lvl w:ilvl="1" w:tplc="E876BF0A">
       <w:numFmt w:val="decimal"/>
       <w:lvlText w:val=""/>
       <w:lvlJc w:val="left"/>
     </w:lvl>
-    <w:lvl w:ilvl="2" w:tplc="2C12F77E">
+    <w:lvl w:ilvl="2" w:tplc="5EE85808">
       <w:numFmt w:val="decimal"/>
       <w:lvlText w:val=""/>
       <w:lvlJc w:val="left"/>
     </w:lvl>
-    <w:lvl w:ilvl="3" w:tplc="2D0818EE">
+    <w:lvl w:ilvl="3" w:tplc="AB80C0C6">
       <w:numFmt w:val="decimal"/>
       <w:lvlText w:val=""/>
       <w:lvlJc w:val="left"/>
     </w:lvl>
-    <w:lvl w:ilvl="4" w:tplc="A5BEE496">
+    <w:lvl w:ilvl="4" w:tplc="F80EB49E">
       <w:numFmt w:val="decimal"/>
       <w:lvlText w:val=""/>
       <w:lvlJc w:val="left"/>
     </w:lvl>
-    <w:lvl w:ilvl="5" w:tplc="CCFC55E4">
+    <w:lvl w:ilvl="5" w:tplc="8F58BB76">
       <w:numFmt w:val="decimal"/>
       <w:lvlText w:val=""/>
       <w:lvlJc w:val="left"/>
     </w:lvl>
-    <w:lvl w:ilvl="6" w:tplc="65FE194A">
+    <w:lvl w:ilvl="6" w:tplc="524800D4">
       <w:numFmt w:val="decimal"/>
       <w:lvlText w:val=""/>
       <w:lvlJc w:val="left"/>
     </w:lvl>
-    <w:lvl w:ilvl="7" w:tplc="9DDC8174">
+    <w:lvl w:ilvl="7" w:tplc="341CA2D6">
       <w:numFmt w:val="decimal"/>
       <w:lvlText w:val=""/>
       <w:lvlJc w:val="left"/>
     </w:lvl>
-    <w:lvl w:ilvl="8" w:tplc="B17E9A94">
+    <w:lvl w:ilvl="8" w:tplc="9732BE6C">
       <w:numFmt w:val="decimal"/>
       <w:lvlText w:val=""/>
       <w:lvlJc w:val="left"/>
     </w:lvl>
   </w:abstractNum>
   <w:abstractNum w:abstractNumId="2" w15:restartNumberingAfterBreak="0">
-    <w:nsid w:val="4E683424"/>
+    <w:nsid w:val="5D42773A"/>
     <w:multiLevelType w:val="hybridMultilevel"/>
-    <w:tmpl w:val="FA24BE4A"/>
-    <w:lvl w:ilvl="0" w:tplc="CF404FB2" w:tentative="1">
+    <w:tmpl w:val="1FC41C0C"/>
+    <w:lvl w:ilvl="0" w:tplc="717E4B32" w:tentative="1">
       <w:start w:val="1"/>
       <w:numFmt w:val="bullet"/>
       <w:lvlText w:val="●"/>
@@ -16122,7 +16220,7 @@
         <w:ind w:left="720" w:hanging="360"/>
       </w:pPr>
     </w:lvl>
-    <w:lvl w:ilvl="1" w:tplc="EDB6E5D8" w:tentative="1">
+    <w:lvl w:ilvl="1" w:tplc="336625D8" w:tentative="1">
       <w:start w:val="1"/>
       <w:numFmt w:val="bullet"/>
       <w:lvlText w:val="○"/>
@@ -16131,7 +16229,7 @@
         <w:ind w:left="1440" w:hanging="360"/>
       </w:pPr>
     </w:lvl>
-    <w:lvl w:ilvl="2" w:tplc="13CE454C" w:tentative="1">
+    <w:lvl w:ilvl="2" w:tplc="5860E65C" w:tentative="1">
       <w:start w:val="1"/>
       <w:numFmt w:val="bullet"/>
       <w:lvlText w:val="■"/>
@@ -16140,7 +16238,7 @@
         <w:ind w:left="2160" w:hanging="360"/>
       </w:pPr>
     </w:lvl>
-    <w:lvl w:ilvl="3" w:tplc="C53C0B7C" w:tentative="1">
+    <w:lvl w:ilvl="3" w:tplc="000AD32E" w:tentative="1">
       <w:start w:val="1"/>
       <w:numFmt w:val="bullet"/>
       <w:lvlText w:val="●"/>
@@ -16149,7 +16247,7 @@
         <w:ind w:left="2880" w:hanging="360"/>
       </w:pPr>
     </w:lvl>
-    <w:lvl w:ilvl="4" w:tplc="0EE0FFEC" w:tentative="1">
+    <w:lvl w:ilvl="4" w:tplc="4328D2BA" w:tentative="1">
       <w:start w:val="1"/>
       <w:numFmt w:val="bullet"/>
       <w:lvlText w:val="○"/>
@@ -16158,7 +16256,7 @@
         <w:ind w:left="3600" w:hanging="360"/>
       </w:pPr>
     </w:lvl>
-    <w:lvl w:ilvl="5" w:tplc="B40A83D4" w:tentative="1">
+    <w:lvl w:ilvl="5" w:tplc="DB805E9C" w:tentative="1">
       <w:start w:val="1"/>
       <w:numFmt w:val="bullet"/>
       <w:lvlText w:val="■"/>
@@ -16167,7 +16265,7 @@
         <w:ind w:left="4320" w:hanging="360"/>
       </w:pPr>
     </w:lvl>
-    <w:lvl w:ilvl="6" w:tplc="BC5E1686" w:tentative="1">
+    <w:lvl w:ilvl="6" w:tplc="DDBE8150" w:tentative="1">
       <w:start w:val="1"/>
       <w:numFmt w:val="bullet"/>
       <w:lvlText w:val="●"/>
@@ -16176,7 +16274,7 @@
         <w:ind w:left="5040" w:hanging="360"/>
       </w:pPr>
     </w:lvl>
-    <w:lvl w:ilvl="7" w:tplc="593E0DA6" w:tentative="1">
+    <w:lvl w:ilvl="7" w:tplc="4F92E3C8" w:tentative="1">
       <w:start w:val="1"/>
       <w:numFmt w:val="bullet"/>
       <w:lvlText w:val="●"/>
@@ -16185,7 +16283,7 @@
         <w:ind w:left="5760" w:hanging="360"/>
       </w:pPr>
     </w:lvl>
-    <w:lvl w:ilvl="8" w:tplc="D3A84F8A" w:tentative="1">
+    <w:lvl w:ilvl="8" w:tplc="0DF01A46" w:tentative="1">
       <w:start w:val="1"/>
       <w:numFmt w:val="bullet"/>
       <w:lvlText w:val="●"/>
@@ -16196,10 +16294,64 @@
     </w:lvl>
   </w:abstractNum>
   <w:abstractNum w:abstractNumId="3" w15:restartNumberingAfterBreak="0">
-    <w:nsid w:val="5D595DD0"/>
+    <w:nsid w:val="6FFF67D8"/>
     <w:multiLevelType w:val="hybridMultilevel"/>
-    <w:tmpl w:val="989C2386"/>
-    <w:lvl w:ilvl="0" w:tplc="2B5E2AEE">
+    <w:tmpl w:val="1EEC9FCE"/>
+    <w:lvl w:ilvl="0" w:tplc="1C622D64">
+      <w:start w:val="1"/>
+      <w:numFmt w:val="decimal"/>
+      <w:lvlText w:val="%1."/>
+      <w:lvlJc w:val="left"/>
+      <w:pPr>
+        <w:ind w:left="360" w:hanging="300"/>
+      </w:pPr>
+    </w:lvl>
+    <w:lvl w:ilvl="1" w:tplc="A20EA034">
+      <w:numFmt w:val="decimal"/>
+      <w:lvlText w:val=""/>
+      <w:lvlJc w:val="left"/>
+    </w:lvl>
+    <w:lvl w:ilvl="2" w:tplc="6A1AFFC6">
+      <w:numFmt w:val="decimal"/>
+      <w:lvlText w:val=""/>
+      <w:lvlJc w:val="left"/>
+    </w:lvl>
+    <w:lvl w:ilvl="3" w:tplc="0E46ECEC">
+      <w:numFmt w:val="decimal"/>
+      <w:lvlText w:val=""/>
+      <w:lvlJc w:val="left"/>
+    </w:lvl>
+    <w:lvl w:ilvl="4" w:tplc="B0484B1E">
+      <w:numFmt w:val="decimal"/>
+      <w:lvlText w:val=""/>
+      <w:lvlJc w:val="left"/>
+    </w:lvl>
+    <w:lvl w:ilvl="5" w:tplc="565EDCAC">
+      <w:numFmt w:val="decimal"/>
+      <w:lvlText w:val=""/>
+      <w:lvlJc w:val="left"/>
+    </w:lvl>
+    <w:lvl w:ilvl="6" w:tplc="5232B6C2">
+      <w:numFmt w:val="decimal"/>
+      <w:lvlText w:val=""/>
+      <w:lvlJc w:val="left"/>
+    </w:lvl>
+    <w:lvl w:ilvl="7" w:tplc="E9EEF78C">
+      <w:numFmt w:val="decimal"/>
+      <w:lvlText w:val=""/>
+      <w:lvlJc w:val="left"/>
+    </w:lvl>
+    <w:lvl w:ilvl="8" w:tplc="39C82444">
+      <w:numFmt w:val="decimal"/>
+      <w:lvlText w:val=""/>
+      <w:lvlJc w:val="left"/>
+    </w:lvl>
+  </w:abstractNum>
+  <w:abstractNum w:abstractNumId="4" w15:restartNumberingAfterBreak="0">
+    <w:nsid w:val="7DE92CBF"/>
+    <w:multiLevelType w:val="hybridMultilevel"/>
+    <w:tmpl w:val="A2C4CC86"/>
+    <w:lvl w:ilvl="0" w:tplc="CE5ADBC8">
       <w:start w:val="1"/>
       <w:numFmt w:val="bullet"/>
       <w:lvlText w:val="•"/>
@@ -16208,7 +16360,7 @@
         <w:ind w:left="360" w:hanging="240"/>
       </w:pPr>
     </w:lvl>
-    <w:lvl w:ilvl="1" w:tplc="75966406" w:tentative="1">
+    <w:lvl w:ilvl="1" w:tplc="422C26F8" w:tentative="1">
       <w:start w:val="1"/>
       <w:numFmt w:val="bullet"/>
       <w:lvlText w:val="–"/>
@@ -16217,121 +16369,67 @@
         <w:ind w:left="720" w:hanging="240"/>
       </w:pPr>
     </w:lvl>
-    <w:lvl w:ilvl="2" w:tplc="92E4A71C">
+    <w:lvl w:ilvl="2" w:tplc="6E2E474E">
       <w:numFmt w:val="decimal"/>
       <w:lvlText w:val=""/>
       <w:lvlJc w:val="left"/>
     </w:lvl>
-    <w:lvl w:ilvl="3" w:tplc="5E0EA258">
+    <w:lvl w:ilvl="3" w:tplc="F36E83FC">
       <w:numFmt w:val="decimal"/>
       <w:lvlText w:val=""/>
       <w:lvlJc w:val="left"/>
     </w:lvl>
-    <w:lvl w:ilvl="4" w:tplc="8C622C94">
+    <w:lvl w:ilvl="4" w:tplc="E75AFEC2">
       <w:numFmt w:val="decimal"/>
       <w:lvlText w:val=""/>
       <w:lvlJc w:val="left"/>
     </w:lvl>
-    <w:lvl w:ilvl="5" w:tplc="B148CD04">
+    <w:lvl w:ilvl="5" w:tplc="E1DA275C">
       <w:numFmt w:val="decimal"/>
       <w:lvlText w:val=""/>
       <w:lvlJc w:val="left"/>
     </w:lvl>
-    <w:lvl w:ilvl="6" w:tplc="A9B89F26">
+    <w:lvl w:ilvl="6" w:tplc="5C1038C6">
       <w:numFmt w:val="decimal"/>
       <w:lvlText w:val=""/>
       <w:lvlJc w:val="left"/>
     </w:lvl>
-    <w:lvl w:ilvl="7" w:tplc="E37A7562">
+    <w:lvl w:ilvl="7" w:tplc="5EA8B27E">
       <w:numFmt w:val="decimal"/>
       <w:lvlText w:val=""/>
       <w:lvlJc w:val="left"/>
     </w:lvl>
-    <w:lvl w:ilvl="8" w:tplc="D42EAAAA">
+    <w:lvl w:ilvl="8" w:tplc="325E9F86">
       <w:numFmt w:val="decimal"/>
       <w:lvlText w:val=""/>
       <w:lvlJc w:val="left"/>
     </w:lvl>
   </w:abstractNum>
-  <w:abstractNum w:abstractNumId="4" w15:restartNumberingAfterBreak="0">
-    <w:nsid w:val="63DA5DC5"/>
-    <w:multiLevelType w:val="hybridMultilevel"/>
-    <w:tmpl w:val="1198730C"/>
-    <w:lvl w:ilvl="0" w:tplc="F61E81B0">
-      <w:start w:val="1"/>
-      <w:numFmt w:val="decimal"/>
-      <w:lvlText w:val="%1."/>
-      <w:lvlJc w:val="left"/>
-      <w:pPr>
-        <w:ind w:left="360" w:hanging="300"/>
-      </w:pPr>
-    </w:lvl>
-    <w:lvl w:ilvl="1" w:tplc="9FCE5114">
-      <w:numFmt w:val="decimal"/>
-      <w:lvlText w:val=""/>
-      <w:lvlJc w:val="left"/>
-    </w:lvl>
-    <w:lvl w:ilvl="2" w:tplc="EA0EB81E">
-      <w:numFmt w:val="decimal"/>
-      <w:lvlText w:val=""/>
-      <w:lvlJc w:val="left"/>
-    </w:lvl>
-    <w:lvl w:ilvl="3" w:tplc="F1D2C038">
-      <w:numFmt w:val="decimal"/>
-      <w:lvlText w:val=""/>
-      <w:lvlJc w:val="left"/>
-    </w:lvl>
-    <w:lvl w:ilvl="4" w:tplc="B3100C36">
-      <w:numFmt w:val="decimal"/>
-      <w:lvlText w:val=""/>
-      <w:lvlJc w:val="left"/>
-    </w:lvl>
-    <w:lvl w:ilvl="5" w:tplc="BF243ADE">
-      <w:numFmt w:val="decimal"/>
-      <w:lvlText w:val=""/>
-      <w:lvlJc w:val="left"/>
-    </w:lvl>
-    <w:lvl w:ilvl="6" w:tplc="A52E515E">
-      <w:numFmt w:val="decimal"/>
-      <w:lvlText w:val=""/>
-      <w:lvlJc w:val="left"/>
-    </w:lvl>
-    <w:lvl w:ilvl="7" w:tplc="D4EC10F8">
-      <w:numFmt w:val="decimal"/>
-      <w:lvlText w:val=""/>
-      <w:lvlJc w:val="left"/>
-    </w:lvl>
-    <w:lvl w:ilvl="8" w:tplc="630402F2">
-      <w:numFmt w:val="decimal"/>
-      <w:lvlText w:val=""/>
-      <w:lvlJc w:val="left"/>
-    </w:lvl>
-  </w:abstractNum>
-  <w:num w:numId="1" w16cid:durableId="158619714">
+  <w:num w:numId="1" w16cid:durableId="1059786597">
     <w:abstractNumId w:val="2"/>
     <w:lvlOverride w:ilvl="0">
       <w:startOverride w:val="1"/>
     </w:lvlOverride>
   </w:num>
-  <w:num w:numId="2" w16cid:durableId="1676808475">
+  <w:num w:numId="2" w16cid:durableId="1167331206">
+    <w:abstractNumId w:val="4"/>
+    <w:lvlOverride w:ilvl="0">
+      <w:startOverride w:val="1"/>
+    </w:lvlOverride>
+  </w:num>
+  <w:num w:numId="3" w16cid:durableId="1689788876">
+    <w:abstractNumId w:val="1"/>
+    <w:lvlOverride w:ilvl="0">
+      <w:startOverride w:val="1"/>
+    </w:lvlOverride>
+  </w:num>
+  <w:num w:numId="4" w16cid:durableId="1220359893">
     <w:abstractNumId w:val="3"/>
     <w:lvlOverride w:ilvl="0">
       <w:startOverride w:val="1"/>
     </w:lvlOverride>
   </w:num>
-  <w:num w:numId="3" w16cid:durableId="1207598531">
-    <w:abstractNumId w:val="4"/>
-    <w:lvlOverride w:ilvl="0">
-      <w:startOverride w:val="1"/>
-    </w:lvlOverride>
-  </w:num>
-  <w:num w:numId="4" w16cid:durableId="698359561">
-    <w:abstractNumId w:val="1"/>
-    <w:lvlOverride w:ilvl="0">
-      <w:startOverride w:val="1"/>
-    </w:lvlOverride>
-  </w:num>
-  <w:num w:numId="5" w16cid:durableId="1777673977">
+  <w:num w:numId="5" w16cid:durableId="162670615">
     <w:abstractNumId w:val="0"/>
     <w:lvlOverride w:ilvl="0">
       <w:startOverride w:val="1"/>
@@ -16978,7 +17076,7 @@
     <w:autoRedefine/>
     <w:uiPriority w:val="39"/>
     <w:unhideWhenUsed/>
-    <w:rsid w:val="00D0017A"/>
+    <w:rsid w:val="00B936D3"/>
     <w:pPr>
       <w:spacing w:after="100"/>
     </w:pPr>
@@ -16990,7 +17088,7 @@
     <w:autoRedefine/>
     <w:uiPriority w:val="39"/>
     <w:unhideWhenUsed/>
-    <w:rsid w:val="00D0017A"/>
+    <w:rsid w:val="00B936D3"/>
     <w:pPr>
       <w:spacing w:after="100"/>
       <w:ind w:left="210"/>

</xml_diff>

<commit_message>
Configuration de mise en ligne et plan de déploiement
- docker-compose.prod.yml : Caddy (HTTPS Let's Encrypt), cookies sécurisés,
  HSTS, base et site non exposés, sauvegarde quotidienne base + photos
- .env.prod.example : variables obligatoires (domaine, clé, SMTP, facturation)
- nginx : transmet le protocole d'origine derrière le relais HTTPS
- README : section « Mise en ligne »
- Guide Word/PDF : chapitre 15 (ce qu'il faut fournir, coûts, étapes, suivi)

Co-Authored-By: Claude Opus 5.5 <noreply@anthropic.com>
</commit_message>
<xml_diff>
--- a/docs/guide-fonctionnement.docx
+++ b/docs/guide-fonctionnement.docx
@@ -79,7 +79,7 @@
           <w:sz w:val="20"/>
           <w:szCs w:val="20"/>
         </w:rPr>
-        <w:t>Version 1.0 — octobre 2026</w:t>
+        <w:t>Version 1.1 — octobre 2026</w:t>
       </w:r>
     </w:p>
     <w:p>
@@ -109,7 +109,7 @@
     <w:sdt>
       <w:sdtPr>
         <w:alias w:val="Sommaire"/>
-        <w:id w:val="-919249627"/>
+        <w:id w:val="500856559"/>
       </w:sdtPr>
       <w:sdtEndPr/>
       <w:sdtContent>
@@ -138,7 +138,7 @@
           <w:r>
             <w:fldChar w:fldCharType="separate"/>
           </w:r>
-          <w:hyperlink w:anchor="_Toc242018780" w:history="1">
+          <w:hyperlink w:anchor="_Toc242021040" w:history="1">
             <w:r>
               <w:rPr>
                 <w:rStyle w:val="Lienhypertexte"/>
@@ -162,7 +162,7 @@
               <w:rPr>
                 <w:noProof/>
               </w:rPr>
-              <w:instrText xml:space="preserve"> PAGEREF _Toc242018780 \h </w:instrText>
+              <w:instrText xml:space="preserve"> PAGEREF _Toc242021040 \h </w:instrText>
             </w:r>
             <w:r>
               <w:rPr>
@@ -205,7 +205,7 @@
               <w14:ligatures w14:val="standardContextual"/>
             </w:rPr>
           </w:pPr>
-          <w:hyperlink w:anchor="_Toc242018781" w:history="1">
+          <w:hyperlink w:anchor="_Toc242021041" w:history="1">
             <w:r>
               <w:rPr>
                 <w:rStyle w:val="Lienhypertexte"/>
@@ -229,7 +229,7 @@
               <w:rPr>
                 <w:noProof/>
               </w:rPr>
-              <w:instrText xml:space="preserve"> PAGEREF _Toc242018781 \h </w:instrText>
+              <w:instrText xml:space="preserve"> PAGEREF _Toc242021041 \h </w:instrText>
             </w:r>
             <w:r>
               <w:rPr>
@@ -272,7 +272,7 @@
               <w14:ligatures w14:val="standardContextual"/>
             </w:rPr>
           </w:pPr>
-          <w:hyperlink w:anchor="_Toc242018782" w:history="1">
+          <w:hyperlink w:anchor="_Toc242021042" w:history="1">
             <w:r>
               <w:rPr>
                 <w:rStyle w:val="Lienhypertexte"/>
@@ -296,7 +296,7 @@
               <w:rPr>
                 <w:noProof/>
               </w:rPr>
-              <w:instrText xml:space="preserve"> PAGEREF _Toc242018782 \h </w:instrText>
+              <w:instrText xml:space="preserve"> PAGEREF _Toc242021042 \h </w:instrText>
             </w:r>
             <w:r>
               <w:rPr>
@@ -339,7 +339,7 @@
               <w14:ligatures w14:val="standardContextual"/>
             </w:rPr>
           </w:pPr>
-          <w:hyperlink w:anchor="_Toc242018783" w:history="1">
+          <w:hyperlink w:anchor="_Toc242021043" w:history="1">
             <w:r>
               <w:rPr>
                 <w:rStyle w:val="Lienhypertexte"/>
@@ -363,7 +363,7 @@
               <w:rPr>
                 <w:noProof/>
               </w:rPr>
-              <w:instrText xml:space="preserve"> PAGEREF _Toc242018783 \h </w:instrText>
+              <w:instrText xml:space="preserve"> PAGEREF _Toc242021043 \h </w:instrText>
             </w:r>
             <w:r>
               <w:rPr>
@@ -406,7 +406,7 @@
               <w14:ligatures w14:val="standardContextual"/>
             </w:rPr>
           </w:pPr>
-          <w:hyperlink w:anchor="_Toc242018784" w:history="1">
+          <w:hyperlink w:anchor="_Toc242021044" w:history="1">
             <w:r>
               <w:rPr>
                 <w:rStyle w:val="Lienhypertexte"/>
@@ -430,7 +430,7 @@
               <w:rPr>
                 <w:noProof/>
               </w:rPr>
-              <w:instrText xml:space="preserve"> PAGEREF _Toc242018784 \h </w:instrText>
+              <w:instrText xml:space="preserve"> PAGEREF _Toc242021044 \h </w:instrText>
             </w:r>
             <w:r>
               <w:rPr>
@@ -473,7 +473,7 @@
               <w14:ligatures w14:val="standardContextual"/>
             </w:rPr>
           </w:pPr>
-          <w:hyperlink w:anchor="_Toc242018785" w:history="1">
+          <w:hyperlink w:anchor="_Toc242021045" w:history="1">
             <w:r>
               <w:rPr>
                 <w:rStyle w:val="Lienhypertexte"/>
@@ -497,7 +497,7 @@
               <w:rPr>
                 <w:noProof/>
               </w:rPr>
-              <w:instrText xml:space="preserve"> PAGEREF _Toc242018785 \h </w:instrText>
+              <w:instrText xml:space="preserve"> PAGEREF _Toc242021045 \h </w:instrText>
             </w:r>
             <w:r>
               <w:rPr>
@@ -540,7 +540,7 @@
               <w14:ligatures w14:val="standardContextual"/>
             </w:rPr>
           </w:pPr>
-          <w:hyperlink w:anchor="_Toc242018786" w:history="1">
+          <w:hyperlink w:anchor="_Toc242021046" w:history="1">
             <w:r>
               <w:rPr>
                 <w:rStyle w:val="Lienhypertexte"/>
@@ -564,7 +564,7 @@
               <w:rPr>
                 <w:noProof/>
               </w:rPr>
-              <w:instrText xml:space="preserve"> PAGEREF _Toc242018786 \h </w:instrText>
+              <w:instrText xml:space="preserve"> PAGEREF _Toc242021046 \h </w:instrText>
             </w:r>
             <w:r>
               <w:rPr>
@@ -607,7 +607,7 @@
               <w14:ligatures w14:val="standardContextual"/>
             </w:rPr>
           </w:pPr>
-          <w:hyperlink w:anchor="_Toc242018787" w:history="1">
+          <w:hyperlink w:anchor="_Toc242021047" w:history="1">
             <w:r>
               <w:rPr>
                 <w:rStyle w:val="Lienhypertexte"/>
@@ -631,7 +631,7 @@
               <w:rPr>
                 <w:noProof/>
               </w:rPr>
-              <w:instrText xml:space="preserve"> PAGEREF _Toc242018787 \h </w:instrText>
+              <w:instrText xml:space="preserve"> PAGEREF _Toc242021047 \h </w:instrText>
             </w:r>
             <w:r>
               <w:rPr>
@@ -674,7 +674,7 @@
               <w14:ligatures w14:val="standardContextual"/>
             </w:rPr>
           </w:pPr>
-          <w:hyperlink w:anchor="_Toc242018788" w:history="1">
+          <w:hyperlink w:anchor="_Toc242021048" w:history="1">
             <w:r>
               <w:rPr>
                 <w:rStyle w:val="Lienhypertexte"/>
@@ -698,7 +698,7 @@
               <w:rPr>
                 <w:noProof/>
               </w:rPr>
-              <w:instrText xml:space="preserve"> PAGEREF _Toc242018788 \h </w:instrText>
+              <w:instrText xml:space="preserve"> PAGEREF _Toc242021048 \h </w:instrText>
             </w:r>
             <w:r>
               <w:rPr>
@@ -741,7 +741,7 @@
               <w14:ligatures w14:val="standardContextual"/>
             </w:rPr>
           </w:pPr>
-          <w:hyperlink w:anchor="_Toc242018789" w:history="1">
+          <w:hyperlink w:anchor="_Toc242021049" w:history="1">
             <w:r>
               <w:rPr>
                 <w:rStyle w:val="Lienhypertexte"/>
@@ -765,7 +765,7 @@
               <w:rPr>
                 <w:noProof/>
               </w:rPr>
-              <w:instrText xml:space="preserve"> PAGEREF _Toc242018789 \h </w:instrText>
+              <w:instrText xml:space="preserve"> PAGEREF _Toc242021049 \h </w:instrText>
             </w:r>
             <w:r>
               <w:rPr>
@@ -808,7 +808,7 @@
               <w14:ligatures w14:val="standardContextual"/>
             </w:rPr>
           </w:pPr>
-          <w:hyperlink w:anchor="_Toc242018790" w:history="1">
+          <w:hyperlink w:anchor="_Toc242021050" w:history="1">
             <w:r>
               <w:rPr>
                 <w:rStyle w:val="Lienhypertexte"/>
@@ -832,7 +832,7 @@
               <w:rPr>
                 <w:noProof/>
               </w:rPr>
-              <w:instrText xml:space="preserve"> PAGEREF _Toc242018790 \h </w:instrText>
+              <w:instrText xml:space="preserve"> PAGEREF _Toc242021050 \h </w:instrText>
             </w:r>
             <w:r>
               <w:rPr>
@@ -875,7 +875,7 @@
               <w14:ligatures w14:val="standardContextual"/>
             </w:rPr>
           </w:pPr>
-          <w:hyperlink w:anchor="_Toc242018791" w:history="1">
+          <w:hyperlink w:anchor="_Toc242021051" w:history="1">
             <w:r>
               <w:rPr>
                 <w:rStyle w:val="Lienhypertexte"/>
@@ -899,7 +899,7 @@
               <w:rPr>
                 <w:noProof/>
               </w:rPr>
-              <w:instrText xml:space="preserve"> PAGEREF _Toc242018791 \h </w:instrText>
+              <w:instrText xml:space="preserve"> PAGEREF _Toc242021051 \h </w:instrText>
             </w:r>
             <w:r>
               <w:rPr>
@@ -942,7 +942,7 @@
               <w14:ligatures w14:val="standardContextual"/>
             </w:rPr>
           </w:pPr>
-          <w:hyperlink w:anchor="_Toc242018792" w:history="1">
+          <w:hyperlink w:anchor="_Toc242021052" w:history="1">
             <w:r>
               <w:rPr>
                 <w:rStyle w:val="Lienhypertexte"/>
@@ -966,7 +966,7 @@
               <w:rPr>
                 <w:noProof/>
               </w:rPr>
-              <w:instrText xml:space="preserve"> PAGEREF _Toc242018792 \h </w:instrText>
+              <w:instrText xml:space="preserve"> PAGEREF _Toc242021052 \h </w:instrText>
             </w:r>
             <w:r>
               <w:rPr>
@@ -1009,7 +1009,7 @@
               <w14:ligatures w14:val="standardContextual"/>
             </w:rPr>
           </w:pPr>
-          <w:hyperlink w:anchor="_Toc242018793" w:history="1">
+          <w:hyperlink w:anchor="_Toc242021053" w:history="1">
             <w:r>
               <w:rPr>
                 <w:rStyle w:val="Lienhypertexte"/>
@@ -1033,7 +1033,7 @@
               <w:rPr>
                 <w:noProof/>
               </w:rPr>
-              <w:instrText xml:space="preserve"> PAGEREF _Toc242018793 \h </w:instrText>
+              <w:instrText xml:space="preserve"> PAGEREF _Toc242021053 \h </w:instrText>
             </w:r>
             <w:r>
               <w:rPr>
@@ -1076,7 +1076,7 @@
               <w14:ligatures w14:val="standardContextual"/>
             </w:rPr>
           </w:pPr>
-          <w:hyperlink w:anchor="_Toc242018794" w:history="1">
+          <w:hyperlink w:anchor="_Toc242021054" w:history="1">
             <w:r>
               <w:rPr>
                 <w:rStyle w:val="Lienhypertexte"/>
@@ -1100,7 +1100,7 @@
               <w:rPr>
                 <w:noProof/>
               </w:rPr>
-              <w:instrText xml:space="preserve"> PAGEREF _Toc242018794 \h </w:instrText>
+              <w:instrText xml:space="preserve"> PAGEREF _Toc242021054 \h </w:instrText>
             </w:r>
             <w:r>
               <w:rPr>
@@ -1143,7 +1143,7 @@
               <w14:ligatures w14:val="standardContextual"/>
             </w:rPr>
           </w:pPr>
-          <w:hyperlink w:anchor="_Toc242018795" w:history="1">
+          <w:hyperlink w:anchor="_Toc242021055" w:history="1">
             <w:r>
               <w:rPr>
                 <w:rStyle w:val="Lienhypertexte"/>
@@ -1167,7 +1167,7 @@
               <w:rPr>
                 <w:noProof/>
               </w:rPr>
-              <w:instrText xml:space="preserve"> PAGEREF _Toc242018795 \h </w:instrText>
+              <w:instrText xml:space="preserve"> PAGEREF _Toc242021055 \h </w:instrText>
             </w:r>
             <w:r>
               <w:rPr>
@@ -1210,7 +1210,7 @@
               <w14:ligatures w14:val="standardContextual"/>
             </w:rPr>
           </w:pPr>
-          <w:hyperlink w:anchor="_Toc242018796" w:history="1">
+          <w:hyperlink w:anchor="_Toc242021056" w:history="1">
             <w:r>
               <w:rPr>
                 <w:rStyle w:val="Lienhypertexte"/>
@@ -1234,7 +1234,7 @@
               <w:rPr>
                 <w:noProof/>
               </w:rPr>
-              <w:instrText xml:space="preserve"> PAGEREF _Toc242018796 \h </w:instrText>
+              <w:instrText xml:space="preserve"> PAGEREF _Toc242021056 \h </w:instrText>
             </w:r>
             <w:r>
               <w:rPr>
@@ -1277,7 +1277,7 @@
               <w14:ligatures w14:val="standardContextual"/>
             </w:rPr>
           </w:pPr>
-          <w:hyperlink w:anchor="_Toc242018797" w:history="1">
+          <w:hyperlink w:anchor="_Toc242021057" w:history="1">
             <w:r>
               <w:rPr>
                 <w:rStyle w:val="Lienhypertexte"/>
@@ -1301,7 +1301,7 @@
               <w:rPr>
                 <w:noProof/>
               </w:rPr>
-              <w:instrText xml:space="preserve"> PAGEREF _Toc242018797 \h </w:instrText>
+              <w:instrText xml:space="preserve"> PAGEREF _Toc242021057 \h </w:instrText>
             </w:r>
             <w:r>
               <w:rPr>
@@ -1344,7 +1344,7 @@
               <w14:ligatures w14:val="standardContextual"/>
             </w:rPr>
           </w:pPr>
-          <w:hyperlink w:anchor="_Toc242018798" w:history="1">
+          <w:hyperlink w:anchor="_Toc242021058" w:history="1">
             <w:r>
               <w:rPr>
                 <w:rStyle w:val="Lienhypertexte"/>
@@ -1368,7 +1368,7 @@
               <w:rPr>
                 <w:noProof/>
               </w:rPr>
-              <w:instrText xml:space="preserve"> PAGEREF _Toc242018798 \h </w:instrText>
+              <w:instrText xml:space="preserve"> PAGEREF _Toc242021058 \h </w:instrText>
             </w:r>
             <w:r>
               <w:rPr>
@@ -1411,7 +1411,7 @@
               <w14:ligatures w14:val="standardContextual"/>
             </w:rPr>
           </w:pPr>
-          <w:hyperlink w:anchor="_Toc242018799" w:history="1">
+          <w:hyperlink w:anchor="_Toc242021059" w:history="1">
             <w:r>
               <w:rPr>
                 <w:rStyle w:val="Lienhypertexte"/>
@@ -1435,7 +1435,7 @@
               <w:rPr>
                 <w:noProof/>
               </w:rPr>
-              <w:instrText xml:space="preserve"> PAGEREF _Toc242018799 \h </w:instrText>
+              <w:instrText xml:space="preserve"> PAGEREF _Toc242021059 \h </w:instrText>
             </w:r>
             <w:r>
               <w:rPr>
@@ -1478,7 +1478,7 @@
               <w14:ligatures w14:val="standardContextual"/>
             </w:rPr>
           </w:pPr>
-          <w:hyperlink w:anchor="_Toc242018800" w:history="1">
+          <w:hyperlink w:anchor="_Toc242021060" w:history="1">
             <w:r>
               <w:rPr>
                 <w:rStyle w:val="Lienhypertexte"/>
@@ -1502,7 +1502,7 @@
               <w:rPr>
                 <w:noProof/>
               </w:rPr>
-              <w:instrText xml:space="preserve"> PAGEREF _Toc242018800 \h </w:instrText>
+              <w:instrText xml:space="preserve"> PAGEREF _Toc242021060 \h </w:instrText>
             </w:r>
             <w:r>
               <w:rPr>
@@ -1545,7 +1545,7 @@
               <w14:ligatures w14:val="standardContextual"/>
             </w:rPr>
           </w:pPr>
-          <w:hyperlink w:anchor="_Toc242018801" w:history="1">
+          <w:hyperlink w:anchor="_Toc242021061" w:history="1">
             <w:r>
               <w:rPr>
                 <w:rStyle w:val="Lienhypertexte"/>
@@ -1569,7 +1569,7 @@
               <w:rPr>
                 <w:noProof/>
               </w:rPr>
-              <w:instrText xml:space="preserve"> PAGEREF _Toc242018801 \h </w:instrText>
+              <w:instrText xml:space="preserve"> PAGEREF _Toc242021061 \h </w:instrText>
             </w:r>
             <w:r>
               <w:rPr>
@@ -1612,7 +1612,7 @@
               <w14:ligatures w14:val="standardContextual"/>
             </w:rPr>
           </w:pPr>
-          <w:hyperlink w:anchor="_Toc242018802" w:history="1">
+          <w:hyperlink w:anchor="_Toc242021062" w:history="1">
             <w:r>
               <w:rPr>
                 <w:rStyle w:val="Lienhypertexte"/>
@@ -1636,7 +1636,7 @@
               <w:rPr>
                 <w:noProof/>
               </w:rPr>
-              <w:instrText xml:space="preserve"> PAGEREF _Toc242018802 \h </w:instrText>
+              <w:instrText xml:space="preserve"> PAGEREF _Toc242021062 \h </w:instrText>
             </w:r>
             <w:r>
               <w:rPr>
@@ -1679,7 +1679,7 @@
               <w14:ligatures w14:val="standardContextual"/>
             </w:rPr>
           </w:pPr>
-          <w:hyperlink w:anchor="_Toc242018803" w:history="1">
+          <w:hyperlink w:anchor="_Toc242021063" w:history="1">
             <w:r>
               <w:rPr>
                 <w:rStyle w:val="Lienhypertexte"/>
@@ -1703,7 +1703,7 @@
               <w:rPr>
                 <w:noProof/>
               </w:rPr>
-              <w:instrText xml:space="preserve"> PAGEREF _Toc242018803 \h </w:instrText>
+              <w:instrText xml:space="preserve"> PAGEREF _Toc242021063 \h </w:instrText>
             </w:r>
             <w:r>
               <w:rPr>
@@ -1746,7 +1746,7 @@
               <w14:ligatures w14:val="standardContextual"/>
             </w:rPr>
           </w:pPr>
-          <w:hyperlink w:anchor="_Toc242018804" w:history="1">
+          <w:hyperlink w:anchor="_Toc242021064" w:history="1">
             <w:r>
               <w:rPr>
                 <w:rStyle w:val="Lienhypertexte"/>
@@ -1770,7 +1770,7 @@
               <w:rPr>
                 <w:noProof/>
               </w:rPr>
-              <w:instrText xml:space="preserve"> PAGEREF _Toc242018804 \h </w:instrText>
+              <w:instrText xml:space="preserve"> PAGEREF _Toc242021064 \h </w:instrText>
             </w:r>
             <w:r>
               <w:rPr>
@@ -1813,7 +1813,7 @@
               <w14:ligatures w14:val="standardContextual"/>
             </w:rPr>
           </w:pPr>
-          <w:hyperlink w:anchor="_Toc242018805" w:history="1">
+          <w:hyperlink w:anchor="_Toc242021065" w:history="1">
             <w:r>
               <w:rPr>
                 <w:rStyle w:val="Lienhypertexte"/>
@@ -1837,7 +1837,7 @@
               <w:rPr>
                 <w:noProof/>
               </w:rPr>
-              <w:instrText xml:space="preserve"> PAGEREF _Toc242018805 \h </w:instrText>
+              <w:instrText xml:space="preserve"> PAGEREF _Toc242021065 \h </w:instrText>
             </w:r>
             <w:r>
               <w:rPr>
@@ -1880,7 +1880,7 @@
               <w14:ligatures w14:val="standardContextual"/>
             </w:rPr>
           </w:pPr>
-          <w:hyperlink w:anchor="_Toc242018806" w:history="1">
+          <w:hyperlink w:anchor="_Toc242021066" w:history="1">
             <w:r>
               <w:rPr>
                 <w:rStyle w:val="Lienhypertexte"/>
@@ -1904,7 +1904,7 @@
               <w:rPr>
                 <w:noProof/>
               </w:rPr>
-              <w:instrText xml:space="preserve"> PAGEREF _Toc242018806 \h </w:instrText>
+              <w:instrText xml:space="preserve"> PAGEREF _Toc242021066 \h </w:instrText>
             </w:r>
             <w:r>
               <w:rPr>
@@ -1947,7 +1947,7 @@
               <w14:ligatures w14:val="standardContextual"/>
             </w:rPr>
           </w:pPr>
-          <w:hyperlink w:anchor="_Toc242018807" w:history="1">
+          <w:hyperlink w:anchor="_Toc242021067" w:history="1">
             <w:r>
               <w:rPr>
                 <w:rStyle w:val="Lienhypertexte"/>
@@ -1971,7 +1971,7 @@
               <w:rPr>
                 <w:noProof/>
               </w:rPr>
-              <w:instrText xml:space="preserve"> PAGEREF _Toc242018807 \h </w:instrText>
+              <w:instrText xml:space="preserve"> PAGEREF _Toc242021067 \h </w:instrText>
             </w:r>
             <w:r>
               <w:rPr>
@@ -2014,7 +2014,7 @@
               <w14:ligatures w14:val="standardContextual"/>
             </w:rPr>
           </w:pPr>
-          <w:hyperlink w:anchor="_Toc242018808" w:history="1">
+          <w:hyperlink w:anchor="_Toc242021068" w:history="1">
             <w:r>
               <w:rPr>
                 <w:rStyle w:val="Lienhypertexte"/>
@@ -2038,7 +2038,7 @@
               <w:rPr>
                 <w:noProof/>
               </w:rPr>
-              <w:instrText xml:space="preserve"> PAGEREF _Toc242018808 \h </w:instrText>
+              <w:instrText xml:space="preserve"> PAGEREF _Toc242021068 \h </w:instrText>
             </w:r>
             <w:r>
               <w:rPr>
@@ -2081,7 +2081,7 @@
               <w14:ligatures w14:val="standardContextual"/>
             </w:rPr>
           </w:pPr>
-          <w:hyperlink w:anchor="_Toc242018809" w:history="1">
+          <w:hyperlink w:anchor="_Toc242021069" w:history="1">
             <w:r>
               <w:rPr>
                 <w:rStyle w:val="Lienhypertexte"/>
@@ -2105,7 +2105,7 @@
               <w:rPr>
                 <w:noProof/>
               </w:rPr>
-              <w:instrText xml:space="preserve"> PAGEREF _Toc242018809 \h </w:instrText>
+              <w:instrText xml:space="preserve"> PAGEREF _Toc242021069 \h </w:instrText>
             </w:r>
             <w:r>
               <w:rPr>
@@ -2148,7 +2148,7 @@
               <w14:ligatures w14:val="standardContextual"/>
             </w:rPr>
           </w:pPr>
-          <w:hyperlink w:anchor="_Toc242018810" w:history="1">
+          <w:hyperlink w:anchor="_Toc242021070" w:history="1">
             <w:r>
               <w:rPr>
                 <w:rStyle w:val="Lienhypertexte"/>
@@ -2172,7 +2172,7 @@
               <w:rPr>
                 <w:noProof/>
               </w:rPr>
-              <w:instrText xml:space="preserve"> PAGEREF _Toc242018810 \h </w:instrText>
+              <w:instrText xml:space="preserve"> PAGEREF _Toc242021070 \h </w:instrText>
             </w:r>
             <w:r>
               <w:rPr>
@@ -2215,7 +2215,7 @@
               <w14:ligatures w14:val="standardContextual"/>
             </w:rPr>
           </w:pPr>
-          <w:hyperlink w:anchor="_Toc242018811" w:history="1">
+          <w:hyperlink w:anchor="_Toc242021071" w:history="1">
             <w:r>
               <w:rPr>
                 <w:rStyle w:val="Lienhypertexte"/>
@@ -2239,7 +2239,7 @@
               <w:rPr>
                 <w:noProof/>
               </w:rPr>
-              <w:instrText xml:space="preserve"> PAGEREF _Toc242018811 \h </w:instrText>
+              <w:instrText xml:space="preserve"> PAGEREF _Toc242021071 \h </w:instrText>
             </w:r>
             <w:r>
               <w:rPr>
@@ -2282,7 +2282,7 @@
               <w14:ligatures w14:val="standardContextual"/>
             </w:rPr>
           </w:pPr>
-          <w:hyperlink w:anchor="_Toc242018812" w:history="1">
+          <w:hyperlink w:anchor="_Toc242021072" w:history="1">
             <w:r>
               <w:rPr>
                 <w:rStyle w:val="Lienhypertexte"/>
@@ -2306,7 +2306,7 @@
               <w:rPr>
                 <w:noProof/>
               </w:rPr>
-              <w:instrText xml:space="preserve"> PAGEREF _Toc242018812 \h </w:instrText>
+              <w:instrText xml:space="preserve"> PAGEREF _Toc242021072 \h </w:instrText>
             </w:r>
             <w:r>
               <w:rPr>
@@ -2349,7 +2349,7 @@
               <w14:ligatures w14:val="standardContextual"/>
             </w:rPr>
           </w:pPr>
-          <w:hyperlink w:anchor="_Toc242018813" w:history="1">
+          <w:hyperlink w:anchor="_Toc242021073" w:history="1">
             <w:r>
               <w:rPr>
                 <w:rStyle w:val="Lienhypertexte"/>
@@ -2373,7 +2373,7 @@
               <w:rPr>
                 <w:noProof/>
               </w:rPr>
-              <w:instrText xml:space="preserve"> PAGEREF _Toc242018813 \h </w:instrText>
+              <w:instrText xml:space="preserve"> PAGEREF _Toc242021073 \h </w:instrText>
             </w:r>
             <w:r>
               <w:rPr>
@@ -2416,7 +2416,7 @@
               <w14:ligatures w14:val="standardContextual"/>
             </w:rPr>
           </w:pPr>
-          <w:hyperlink w:anchor="_Toc242018814" w:history="1">
+          <w:hyperlink w:anchor="_Toc242021074" w:history="1">
             <w:r>
               <w:rPr>
                 <w:rStyle w:val="Lienhypertexte"/>
@@ -2440,7 +2440,7 @@
               <w:rPr>
                 <w:noProof/>
               </w:rPr>
-              <w:instrText xml:space="preserve"> PAGEREF _Toc242018814 \h </w:instrText>
+              <w:instrText xml:space="preserve"> PAGEREF _Toc242021074 \h </w:instrText>
             </w:r>
             <w:r>
               <w:rPr>
@@ -2483,7 +2483,7 @@
               <w14:ligatures w14:val="standardContextual"/>
             </w:rPr>
           </w:pPr>
-          <w:hyperlink w:anchor="_Toc242018815" w:history="1">
+          <w:hyperlink w:anchor="_Toc242021075" w:history="1">
             <w:r>
               <w:rPr>
                 <w:rStyle w:val="Lienhypertexte"/>
@@ -2507,7 +2507,7 @@
               <w:rPr>
                 <w:noProof/>
               </w:rPr>
-              <w:instrText xml:space="preserve"> PAGEREF _Toc242018815 \h </w:instrText>
+              <w:instrText xml:space="preserve"> PAGEREF _Toc242021075 \h </w:instrText>
             </w:r>
             <w:r>
               <w:rPr>
@@ -2550,13 +2550,13 @@
               <w14:ligatures w14:val="standardContextual"/>
             </w:rPr>
           </w:pPr>
-          <w:hyperlink w:anchor="_Toc242018816" w:history="1">
+          <w:hyperlink w:anchor="_Toc242021076" w:history="1">
             <w:r>
               <w:rPr>
                 <w:rStyle w:val="Lienhypertexte"/>
                 <w:noProof/>
               </w:rPr>
-              <w:t>Annexe — Repères techniques</w:t>
+              <w:t>15. Mise en ligne</w:t>
             </w:r>
             <w:r>
               <w:rPr>
@@ -2574,7 +2574,7 @@
               <w:rPr>
                 <w:noProof/>
               </w:rPr>
-              <w:instrText xml:space="preserve"> PAGEREF _Toc242018816 \h </w:instrText>
+              <w:instrText xml:space="preserve"> PAGEREF _Toc242021076 \h </w:instrText>
             </w:r>
             <w:r>
               <w:rPr>
@@ -2617,12 +2617,414 @@
               <w14:ligatures w14:val="standardContextual"/>
             </w:rPr>
           </w:pPr>
-          <w:hyperlink w:anchor="_Toc242018817" w:history="1">
+          <w:hyperlink w:anchor="_Toc242021077" w:history="1">
             <w:r>
               <w:rPr>
                 <w:rStyle w:val="Lienhypertexte"/>
                 <w:noProof/>
               </w:rPr>
+              <w:t>15.1 Ce qui est déjà prêt</w:t>
+            </w:r>
+            <w:r>
+              <w:rPr>
+                <w:noProof/>
+              </w:rPr>
+              <w:tab/>
+            </w:r>
+            <w:r>
+              <w:rPr>
+                <w:noProof/>
+              </w:rPr>
+              <w:fldChar w:fldCharType="begin"/>
+            </w:r>
+            <w:r>
+              <w:rPr>
+                <w:noProof/>
+              </w:rPr>
+              <w:instrText xml:space="preserve"> PAGEREF _Toc242021077 \h </w:instrText>
+            </w:r>
+            <w:r>
+              <w:rPr>
+                <w:noProof/>
+              </w:rPr>
+            </w:r>
+            <w:r>
+              <w:rPr>
+                <w:noProof/>
+              </w:rPr>
+              <w:fldChar w:fldCharType="separate"/>
+            </w:r>
+            <w:r>
+              <w:rPr>
+                <w:noProof/>
+              </w:rPr>
+              <w:t>20</w:t>
+            </w:r>
+            <w:r>
+              <w:rPr>
+                <w:noProof/>
+              </w:rPr>
+              <w:fldChar w:fldCharType="end"/>
+            </w:r>
+          </w:hyperlink>
+        </w:p>
+        <w:p>
+          <w:pPr>
+            <w:pStyle w:val="TM2"/>
+            <w:tabs>
+              <w:tab w:val="right" w:leader="dot" w:pos="9016"/>
+            </w:tabs>
+            <w:rPr>
+              <w:rFonts w:asciiTheme="minorHAnsi" w:eastAsiaTheme="minorEastAsia" w:hAnsiTheme="minorHAnsi" w:cstheme="minorBidi"/>
+              <w:noProof/>
+              <w:color w:val="auto"/>
+              <w:kern w:val="2"/>
+              <w:sz w:val="24"/>
+              <w:szCs w:val="24"/>
+              <w14:ligatures w14:val="standardContextual"/>
+            </w:rPr>
+          </w:pPr>
+          <w:hyperlink w:anchor="_Toc242021078" w:history="1">
+            <w:r>
+              <w:rPr>
+                <w:rStyle w:val="Lienhypertexte"/>
+                <w:noProof/>
+              </w:rPr>
+              <w:t>15.2 Ce que l’entreprise doit fournir</w:t>
+            </w:r>
+            <w:r>
+              <w:rPr>
+                <w:noProof/>
+              </w:rPr>
+              <w:tab/>
+            </w:r>
+            <w:r>
+              <w:rPr>
+                <w:noProof/>
+              </w:rPr>
+              <w:fldChar w:fldCharType="begin"/>
+            </w:r>
+            <w:r>
+              <w:rPr>
+                <w:noProof/>
+              </w:rPr>
+              <w:instrText xml:space="preserve"> PAGEREF _Toc242021078 \h </w:instrText>
+            </w:r>
+            <w:r>
+              <w:rPr>
+                <w:noProof/>
+              </w:rPr>
+            </w:r>
+            <w:r>
+              <w:rPr>
+                <w:noProof/>
+              </w:rPr>
+              <w:fldChar w:fldCharType="separate"/>
+            </w:r>
+            <w:r>
+              <w:rPr>
+                <w:noProof/>
+              </w:rPr>
+              <w:t>20</w:t>
+            </w:r>
+            <w:r>
+              <w:rPr>
+                <w:noProof/>
+              </w:rPr>
+              <w:fldChar w:fldCharType="end"/>
+            </w:r>
+          </w:hyperlink>
+        </w:p>
+        <w:p>
+          <w:pPr>
+            <w:pStyle w:val="TM2"/>
+            <w:tabs>
+              <w:tab w:val="right" w:leader="dot" w:pos="9016"/>
+            </w:tabs>
+            <w:rPr>
+              <w:rFonts w:asciiTheme="minorHAnsi" w:eastAsiaTheme="minorEastAsia" w:hAnsiTheme="minorHAnsi" w:cstheme="minorBidi"/>
+              <w:noProof/>
+              <w:color w:val="auto"/>
+              <w:kern w:val="2"/>
+              <w:sz w:val="24"/>
+              <w:szCs w:val="24"/>
+              <w14:ligatures w14:val="standardContextual"/>
+            </w:rPr>
+          </w:pPr>
+          <w:hyperlink w:anchor="_Toc242021079" w:history="1">
+            <w:r>
+              <w:rPr>
+                <w:rStyle w:val="Lienhypertexte"/>
+                <w:noProof/>
+              </w:rPr>
+              <w:t>15.3 Coûts indicatifs</w:t>
+            </w:r>
+            <w:r>
+              <w:rPr>
+                <w:noProof/>
+              </w:rPr>
+              <w:tab/>
+            </w:r>
+            <w:r>
+              <w:rPr>
+                <w:noProof/>
+              </w:rPr>
+              <w:fldChar w:fldCharType="begin"/>
+            </w:r>
+            <w:r>
+              <w:rPr>
+                <w:noProof/>
+              </w:rPr>
+              <w:instrText xml:space="preserve"> PAGEREF _Toc242021079 \h </w:instrText>
+            </w:r>
+            <w:r>
+              <w:rPr>
+                <w:noProof/>
+              </w:rPr>
+            </w:r>
+            <w:r>
+              <w:rPr>
+                <w:noProof/>
+              </w:rPr>
+              <w:fldChar w:fldCharType="separate"/>
+            </w:r>
+            <w:r>
+              <w:rPr>
+                <w:noProof/>
+              </w:rPr>
+              <w:t>21</w:t>
+            </w:r>
+            <w:r>
+              <w:rPr>
+                <w:noProof/>
+              </w:rPr>
+              <w:fldChar w:fldCharType="end"/>
+            </w:r>
+          </w:hyperlink>
+        </w:p>
+        <w:p>
+          <w:pPr>
+            <w:pStyle w:val="TM2"/>
+            <w:tabs>
+              <w:tab w:val="right" w:leader="dot" w:pos="9016"/>
+            </w:tabs>
+            <w:rPr>
+              <w:rFonts w:asciiTheme="minorHAnsi" w:eastAsiaTheme="minorEastAsia" w:hAnsiTheme="minorHAnsi" w:cstheme="minorBidi"/>
+              <w:noProof/>
+              <w:color w:val="auto"/>
+              <w:kern w:val="2"/>
+              <w:sz w:val="24"/>
+              <w:szCs w:val="24"/>
+              <w14:ligatures w14:val="standardContextual"/>
+            </w:rPr>
+          </w:pPr>
+          <w:hyperlink w:anchor="_Toc242021080" w:history="1">
+            <w:r>
+              <w:rPr>
+                <w:rStyle w:val="Lienhypertexte"/>
+                <w:noProof/>
+              </w:rPr>
+              <w:t>15.4 Étapes de mise en ligne</w:t>
+            </w:r>
+            <w:r>
+              <w:rPr>
+                <w:noProof/>
+              </w:rPr>
+              <w:tab/>
+            </w:r>
+            <w:r>
+              <w:rPr>
+                <w:noProof/>
+              </w:rPr>
+              <w:fldChar w:fldCharType="begin"/>
+            </w:r>
+            <w:r>
+              <w:rPr>
+                <w:noProof/>
+              </w:rPr>
+              <w:instrText xml:space="preserve"> PAGEREF _Toc242021080 \h </w:instrText>
+            </w:r>
+            <w:r>
+              <w:rPr>
+                <w:noProof/>
+              </w:rPr>
+            </w:r>
+            <w:r>
+              <w:rPr>
+                <w:noProof/>
+              </w:rPr>
+              <w:fldChar w:fldCharType="separate"/>
+            </w:r>
+            <w:r>
+              <w:rPr>
+                <w:noProof/>
+              </w:rPr>
+              <w:t>21</w:t>
+            </w:r>
+            <w:r>
+              <w:rPr>
+                <w:noProof/>
+              </w:rPr>
+              <w:fldChar w:fldCharType="end"/>
+            </w:r>
+          </w:hyperlink>
+        </w:p>
+        <w:p>
+          <w:pPr>
+            <w:pStyle w:val="TM2"/>
+            <w:tabs>
+              <w:tab w:val="right" w:leader="dot" w:pos="9016"/>
+            </w:tabs>
+            <w:rPr>
+              <w:rFonts w:asciiTheme="minorHAnsi" w:eastAsiaTheme="minorEastAsia" w:hAnsiTheme="minorHAnsi" w:cstheme="minorBidi"/>
+              <w:noProof/>
+              <w:color w:val="auto"/>
+              <w:kern w:val="2"/>
+              <w:sz w:val="24"/>
+              <w:szCs w:val="24"/>
+              <w14:ligatures w14:val="standardContextual"/>
+            </w:rPr>
+          </w:pPr>
+          <w:hyperlink w:anchor="_Toc242021081" w:history="1">
+            <w:r>
+              <w:rPr>
+                <w:rStyle w:val="Lienhypertexte"/>
+                <w:noProof/>
+              </w:rPr>
+              <w:t>15.5 Après la mise en ligne</w:t>
+            </w:r>
+            <w:r>
+              <w:rPr>
+                <w:noProof/>
+              </w:rPr>
+              <w:tab/>
+            </w:r>
+            <w:r>
+              <w:rPr>
+                <w:noProof/>
+              </w:rPr>
+              <w:fldChar w:fldCharType="begin"/>
+            </w:r>
+            <w:r>
+              <w:rPr>
+                <w:noProof/>
+              </w:rPr>
+              <w:instrText xml:space="preserve"> PAGEREF _Toc242021081 \h </w:instrText>
+            </w:r>
+            <w:r>
+              <w:rPr>
+                <w:noProof/>
+              </w:rPr>
+            </w:r>
+            <w:r>
+              <w:rPr>
+                <w:noProof/>
+              </w:rPr>
+              <w:fldChar w:fldCharType="separate"/>
+            </w:r>
+            <w:r>
+              <w:rPr>
+                <w:noProof/>
+              </w:rPr>
+              <w:t>21</w:t>
+            </w:r>
+            <w:r>
+              <w:rPr>
+                <w:noProof/>
+              </w:rPr>
+              <w:fldChar w:fldCharType="end"/>
+            </w:r>
+          </w:hyperlink>
+        </w:p>
+        <w:p>
+          <w:pPr>
+            <w:pStyle w:val="TM1"/>
+            <w:tabs>
+              <w:tab w:val="right" w:leader="dot" w:pos="9016"/>
+            </w:tabs>
+            <w:rPr>
+              <w:rFonts w:asciiTheme="minorHAnsi" w:eastAsiaTheme="minorEastAsia" w:hAnsiTheme="minorHAnsi" w:cstheme="minorBidi"/>
+              <w:noProof/>
+              <w:color w:val="auto"/>
+              <w:kern w:val="2"/>
+              <w:sz w:val="24"/>
+              <w:szCs w:val="24"/>
+              <w14:ligatures w14:val="standardContextual"/>
+            </w:rPr>
+          </w:pPr>
+          <w:hyperlink w:anchor="_Toc242021082" w:history="1">
+            <w:r>
+              <w:rPr>
+                <w:rStyle w:val="Lienhypertexte"/>
+                <w:noProof/>
+              </w:rPr>
+              <w:t>Annexe — Repères techniques</w:t>
+            </w:r>
+            <w:r>
+              <w:rPr>
+                <w:noProof/>
+              </w:rPr>
+              <w:tab/>
+            </w:r>
+            <w:r>
+              <w:rPr>
+                <w:noProof/>
+              </w:rPr>
+              <w:fldChar w:fldCharType="begin"/>
+            </w:r>
+            <w:r>
+              <w:rPr>
+                <w:noProof/>
+              </w:rPr>
+              <w:instrText xml:space="preserve"> PAGEREF _Toc242021082 \h </w:instrText>
+            </w:r>
+            <w:r>
+              <w:rPr>
+                <w:noProof/>
+              </w:rPr>
+            </w:r>
+            <w:r>
+              <w:rPr>
+                <w:noProof/>
+              </w:rPr>
+              <w:fldChar w:fldCharType="separate"/>
+            </w:r>
+            <w:r>
+              <w:rPr>
+                <w:noProof/>
+              </w:rPr>
+              <w:t>22</w:t>
+            </w:r>
+            <w:r>
+              <w:rPr>
+                <w:noProof/>
+              </w:rPr>
+              <w:fldChar w:fldCharType="end"/>
+            </w:r>
+          </w:hyperlink>
+        </w:p>
+        <w:p>
+          <w:pPr>
+            <w:pStyle w:val="TM2"/>
+            <w:tabs>
+              <w:tab w:val="right" w:leader="dot" w:pos="9016"/>
+            </w:tabs>
+            <w:rPr>
+              <w:rFonts w:asciiTheme="minorHAnsi" w:eastAsiaTheme="minorEastAsia" w:hAnsiTheme="minorHAnsi" w:cstheme="minorBidi"/>
+              <w:noProof/>
+              <w:color w:val="auto"/>
+              <w:kern w:val="2"/>
+              <w:sz w:val="24"/>
+              <w:szCs w:val="24"/>
+              <w14:ligatures w14:val="standardContextual"/>
+            </w:rPr>
+          </w:pPr>
+          <w:hyperlink w:anchor="_Toc242021083" w:history="1">
+            <w:r>
+              <w:rPr>
+                <w:rStyle w:val="Lienhypertexte"/>
+                <w:noProof/>
+              </w:rPr>
               <w:t>Mode démonstration</w:t>
             </w:r>
             <w:r>
@@ -2641,7 +3043,7 @@
               <w:rPr>
                 <w:noProof/>
               </w:rPr>
-              <w:instrText xml:space="preserve"> PAGEREF _Toc242018817 \h </w:instrText>
+              <w:instrText xml:space="preserve"> PAGEREF _Toc242021083 \h </w:instrText>
             </w:r>
             <w:r>
               <w:rPr>
@@ -2658,7 +3060,7 @@
               <w:rPr>
                 <w:noProof/>
               </w:rPr>
-              <w:t>20</w:t>
+              <w:t>22</w:t>
             </w:r>
             <w:r>
               <w:rPr>
@@ -2670,7 +3072,6 @@
         </w:p>
         <w:p>
           <w:r>
-            <w:lastRenderedPageBreak/>
             <w:fldChar w:fldCharType="end"/>
           </w:r>
         </w:p>
@@ -2681,7 +3082,7 @@
         <w:pStyle w:val="Titre1"/>
         <w:pageBreakBefore/>
       </w:pPr>
-      <w:bookmarkStart w:id="0" w:name="_Toc242018780"/>
+      <w:bookmarkStart w:id="0" w:name="_Toc242021040"/>
       <w:r>
         <w:lastRenderedPageBreak/>
         <w:t>1. Présentation de la plateforme</w:t>
@@ -3132,7 +3533,7 @@
       <w:pPr>
         <w:pStyle w:val="Titre2"/>
       </w:pPr>
-      <w:bookmarkStart w:id="1" w:name="_Toc242018781"/>
+      <w:bookmarkStart w:id="1" w:name="_Toc242021041"/>
       <w:r>
         <w:t>1.1 Une seule connexion</w:t>
       </w:r>
@@ -3160,7 +3561,7 @@
       <w:pPr>
         <w:pStyle w:val="Titre2"/>
       </w:pPr>
-      <w:bookmarkStart w:id="2" w:name="_Toc242018782"/>
+      <w:bookmarkStart w:id="2" w:name="_Toc242021042"/>
       <w:r>
         <w:t>1.2 Principes de fonctionnement</w:t>
       </w:r>
@@ -3251,7 +3652,7 @@
         <w:pStyle w:val="Titre1"/>
         <w:pageBreakBefore/>
       </w:pPr>
-      <w:bookmarkStart w:id="3" w:name="_Toc242018783"/>
+      <w:bookmarkStart w:id="3" w:name="_Toc242021043"/>
       <w:r>
         <w:lastRenderedPageBreak/>
         <w:t>2. Les rôles et leurs droits</w:t>
@@ -4075,7 +4476,7 @@
       <w:pPr>
         <w:pStyle w:val="Titre2"/>
       </w:pPr>
-      <w:bookmarkStart w:id="4" w:name="_Toc242018784"/>
+      <w:bookmarkStart w:id="4" w:name="_Toc242021044"/>
       <w:r>
         <w:t>2.1 Visiteur</w:t>
       </w:r>
@@ -4185,7 +4586,7 @@
       <w:pPr>
         <w:pStyle w:val="Titre2"/>
       </w:pPr>
-      <w:bookmarkStart w:id="5" w:name="_Toc242018785"/>
+      <w:bookmarkStart w:id="5" w:name="_Toc242021045"/>
       <w:r>
         <w:t>2.2 Client</w:t>
       </w:r>
@@ -4399,7 +4800,7 @@
       <w:pPr>
         <w:pStyle w:val="Titre2"/>
       </w:pPr>
-      <w:bookmarkStart w:id="6" w:name="_Toc242018786"/>
+      <w:bookmarkStart w:id="6" w:name="_Toc242021046"/>
       <w:r>
         <w:lastRenderedPageBreak/>
         <w:t>2.3 Technicien</w:t>
@@ -4923,7 +5324,7 @@
       <w:pPr>
         <w:pStyle w:val="Titre2"/>
       </w:pPr>
-      <w:bookmarkStart w:id="7" w:name="_Toc242018787"/>
+      <w:bookmarkStart w:id="7" w:name="_Toc242021047"/>
       <w:r>
         <w:t>2.4 Manager</w:t>
       </w:r>
@@ -5176,7 +5577,7 @@
       <w:pPr>
         <w:pStyle w:val="Titre2"/>
       </w:pPr>
-      <w:bookmarkStart w:id="8" w:name="_Toc242018788"/>
+      <w:bookmarkStart w:id="8" w:name="_Toc242021048"/>
       <w:r>
         <w:t>2.5 Administrateur</w:t>
       </w:r>
@@ -5286,7 +5687,7 @@
         <w:pStyle w:val="Titre1"/>
         <w:pageBreakBefore/>
       </w:pPr>
-      <w:bookmarkStart w:id="9" w:name="_Toc242018789"/>
+      <w:bookmarkStart w:id="9" w:name="_Toc242021049"/>
       <w:r>
         <w:lastRenderedPageBreak/>
         <w:t>3. Le parcours d’un rendez-vous</w:t>
@@ -6377,7 +6778,7 @@
       <w:pPr>
         <w:pStyle w:val="Titre2"/>
       </w:pPr>
-      <w:bookmarkStart w:id="10" w:name="_Toc242018790"/>
+      <w:bookmarkStart w:id="10" w:name="_Toc242021050"/>
       <w:r>
         <w:t>3.1 Situations particulières</w:t>
       </w:r>
@@ -7027,7 +7428,7 @@
       <w:pPr>
         <w:pStyle w:val="Titre2"/>
       </w:pPr>
-      <w:bookmarkStart w:id="11" w:name="_Toc242018791"/>
+      <w:bookmarkStart w:id="11" w:name="_Toc242021051"/>
       <w:r>
         <w:t>3.2 Restitution et paiement au comptoir</w:t>
       </w:r>
@@ -7120,7 +7521,7 @@
       <w:pPr>
         <w:pStyle w:val="Titre2"/>
       </w:pPr>
-      <w:bookmarkStart w:id="12" w:name="_Toc242018792"/>
+      <w:bookmarkStart w:id="12" w:name="_Toc242021052"/>
       <w:r>
         <w:t>3.3 L’avancement affiché au client</w:t>
       </w:r>
@@ -7149,7 +7550,7 @@
         <w:pStyle w:val="Titre1"/>
         <w:pageBreakBefore/>
       </w:pPr>
-      <w:bookmarkStart w:id="13" w:name="_Toc242018793"/>
+      <w:bookmarkStart w:id="13" w:name="_Toc242021053"/>
       <w:r>
         <w:lastRenderedPageBreak/>
         <w:t>4. Réservation en ligne et disponibilités</w:t>
@@ -7160,7 +7561,7 @@
       <w:pPr>
         <w:pStyle w:val="Titre2"/>
       </w:pPr>
-      <w:bookmarkStart w:id="14" w:name="_Toc242018794"/>
+      <w:bookmarkStart w:id="14" w:name="_Toc242021054"/>
       <w:r>
         <w:t>4.1 Le tunnel de réservation</w:t>
       </w:r>
@@ -7320,7 +7721,7 @@
       <w:pPr>
         <w:pStyle w:val="Titre2"/>
       </w:pPr>
-      <w:bookmarkStart w:id="15" w:name="_Toc242018795"/>
+      <w:bookmarkStart w:id="15" w:name="_Toc242021055"/>
       <w:r>
         <w:t>4.2 Comment les créneaux sont calculés</w:t>
       </w:r>
@@ -8280,7 +8681,7 @@
         <w:pStyle w:val="Titre1"/>
         <w:pageBreakBefore/>
       </w:pPr>
-      <w:bookmarkStart w:id="16" w:name="_Toc242018796"/>
+      <w:bookmarkStart w:id="16" w:name="_Toc242021056"/>
       <w:r>
         <w:lastRenderedPageBreak/>
         <w:t>5. L’espace client</w:t>
@@ -8863,7 +9264,7 @@
       <w:pPr>
         <w:pStyle w:val="Titre2"/>
       </w:pPr>
-      <w:bookmarkStart w:id="17" w:name="_Toc242018797"/>
+      <w:bookmarkStart w:id="17" w:name="_Toc242021057"/>
       <w:r>
         <w:t>5.1 Photo du véhicule</w:t>
       </w:r>
@@ -8943,7 +9344,7 @@
         <w:pStyle w:val="Titre1"/>
         <w:pageBreakBefore/>
       </w:pPr>
-      <w:bookmarkStart w:id="18" w:name="_Toc242018798"/>
+      <w:bookmarkStart w:id="18" w:name="_Toc242021058"/>
       <w:r>
         <w:lastRenderedPageBreak/>
         <w:t>6. L’espace professionnel</w:t>
@@ -10280,7 +10681,7 @@
         <w:pStyle w:val="Titre1"/>
         <w:pageBreakBefore/>
       </w:pPr>
-      <w:bookmarkStart w:id="19" w:name="_Toc242018799"/>
+      <w:bookmarkStart w:id="19" w:name="_Toc242021059"/>
       <w:r>
         <w:lastRenderedPageBreak/>
         <w:t>7. Le suivi atelier</w:t>
@@ -10291,7 +10692,7 @@
       <w:pPr>
         <w:pStyle w:val="Titre2"/>
       </w:pPr>
-      <w:bookmarkStart w:id="20" w:name="_Toc242018800"/>
+      <w:bookmarkStart w:id="20" w:name="_Toc242021060"/>
       <w:r>
         <w:t>7.1 Étapes de traitement</w:t>
       </w:r>
@@ -10380,7 +10781,7 @@
       <w:pPr>
         <w:pStyle w:val="Titre2"/>
       </w:pPr>
-      <w:bookmarkStart w:id="21" w:name="_Toc242018801"/>
+      <w:bookmarkStart w:id="21" w:name="_Toc242021061"/>
       <w:r>
         <w:t>7.2 Photos d’intervention</w:t>
       </w:r>
@@ -10731,7 +11132,7 @@
         <w:pStyle w:val="Titre1"/>
         <w:pageBreakBefore/>
       </w:pPr>
-      <w:bookmarkStart w:id="22" w:name="_Toc242018802"/>
+      <w:bookmarkStart w:id="22" w:name="_Toc242021062"/>
       <w:r>
         <w:lastRenderedPageBreak/>
         <w:t>8. Facturation et paiements</w:t>
@@ -10742,7 +11143,7 @@
       <w:pPr>
         <w:pStyle w:val="Titre2"/>
       </w:pPr>
-      <w:bookmarkStart w:id="23" w:name="_Toc242018803"/>
+      <w:bookmarkStart w:id="23" w:name="_Toc242021063"/>
       <w:r>
         <w:t>8.1 Les factures</w:t>
       </w:r>
@@ -10858,7 +11259,7 @@
       <w:pPr>
         <w:pStyle w:val="Titre2"/>
       </w:pPr>
-      <w:bookmarkStart w:id="24" w:name="_Toc242018804"/>
+      <w:bookmarkStart w:id="24" w:name="_Toc242021064"/>
       <w:r>
         <w:t>8.2 Les paiements</w:t>
       </w:r>
@@ -11003,7 +11404,7 @@
       <w:pPr>
         <w:pStyle w:val="Titre2"/>
       </w:pPr>
-      <w:bookmarkStart w:id="25" w:name="_Toc242018805"/>
+      <w:bookmarkStart w:id="25" w:name="_Toc242021065"/>
       <w:r>
         <w:t>8.3 Le journal de caisse</w:t>
       </w:r>
@@ -11051,7 +11452,7 @@
       <w:pPr>
         <w:pStyle w:val="Titre2"/>
       </w:pPr>
-      <w:bookmarkStart w:id="26" w:name="_Toc242018806"/>
+      <w:bookmarkStart w:id="26" w:name="_Toc242021066"/>
       <w:r>
         <w:t>8.4 Statut d’une facture</w:t>
       </w:r>
@@ -11513,7 +11914,7 @@
         <w:pStyle w:val="Titre1"/>
         <w:pageBreakBefore/>
       </w:pPr>
-      <w:bookmarkStart w:id="27" w:name="_Toc242018807"/>
+      <w:bookmarkStart w:id="27" w:name="_Toc242021067"/>
       <w:r>
         <w:lastRenderedPageBreak/>
         <w:t>9. Les notifications</w:t>
@@ -11524,7 +11925,7 @@
       <w:pPr>
         <w:pStyle w:val="Titre2"/>
       </w:pPr>
-      <w:bookmarkStart w:id="28" w:name="_Toc242018808"/>
+      <w:bookmarkStart w:id="28" w:name="_Toc242021068"/>
       <w:r>
         <w:t>9.1 Pour le client</w:t>
       </w:r>
@@ -12192,7 +12593,7 @@
       <w:pPr>
         <w:pStyle w:val="Titre2"/>
       </w:pPr>
-      <w:bookmarkStart w:id="29" w:name="_Toc242018809"/>
+      <w:bookmarkStart w:id="29" w:name="_Toc242021069"/>
       <w:r>
         <w:t>9.2 Pour l’équipe</w:t>
       </w:r>
@@ -12670,7 +13071,7 @@
         <w:pStyle w:val="Titre1"/>
         <w:pageBreakBefore/>
       </w:pPr>
-      <w:bookmarkStart w:id="30" w:name="_Toc242018810"/>
+      <w:bookmarkStart w:id="30" w:name="_Toc242021070"/>
       <w:r>
         <w:lastRenderedPageBreak/>
         <w:t>10. Contenus publics du site</w:t>
@@ -13106,7 +13507,7 @@
         <w:pStyle w:val="Titre1"/>
         <w:pageBreakBefore/>
       </w:pPr>
-      <w:bookmarkStart w:id="31" w:name="_Toc242018811"/>
+      <w:bookmarkStart w:id="31" w:name="_Toc242021071"/>
       <w:r>
         <w:lastRenderedPageBreak/>
         <w:t>11. Statistiques et exports</w:t>
@@ -13739,7 +14140,7 @@
         <w:pStyle w:val="Titre1"/>
         <w:pageBreakBefore/>
       </w:pPr>
-      <w:bookmarkStart w:id="32" w:name="_Toc242018812"/>
+      <w:bookmarkStart w:id="32" w:name="_Toc242021072"/>
       <w:r>
         <w:lastRenderedPageBreak/>
         <w:t>12. Sécurité et confidentialité</w:t>
@@ -13901,7 +14302,7 @@
         <w:pStyle w:val="Titre1"/>
         <w:pageBreakBefore/>
       </w:pPr>
-      <w:bookmarkStart w:id="33" w:name="_Toc242018813"/>
+      <w:bookmarkStart w:id="33" w:name="_Toc242021073"/>
       <w:r>
         <w:lastRenderedPageBreak/>
         <w:t>13. Administration</w:t>
@@ -14038,7 +14439,7 @@
       <w:pPr>
         <w:pStyle w:val="Titre2"/>
       </w:pPr>
-      <w:bookmarkStart w:id="34" w:name="_Toc242018814"/>
+      <w:bookmarkStart w:id="34" w:name="_Toc242021074"/>
       <w:r>
         <w:t>13.1 Mise en service : liste de contrôle</w:t>
       </w:r>
@@ -14190,7 +14591,7 @@
         <w:pStyle w:val="Titre1"/>
         <w:pageBreakBefore/>
       </w:pPr>
-      <w:bookmarkStart w:id="35" w:name="_Toc242018815"/>
+      <w:bookmarkStart w:id="35" w:name="_Toc242021075"/>
       <w:r>
         <w:lastRenderedPageBreak/>
         <w:t>14. État d’avancement</w:t>
@@ -15229,6 +15630,103 @@
                 <w:sz w:val="19"/>
                 <w:szCs w:val="19"/>
               </w:rPr>
+              <w:t>Mise en ligne : HTTPS, sécurité, sauvegardes automatiques</w:t>
+            </w:r>
+          </w:p>
+        </w:tc>
+        <w:tc>
+          <w:tcPr>
+            <w:tcW w:w="1805" w:type="dxa"/>
+            <w:tcBorders>
+              <w:top w:val="single" w:sz="4" w:space="0" w:color="D9D9D9"/>
+              <w:left w:val="single" w:sz="4" w:space="0" w:color="D9D9D9"/>
+              <w:bottom w:val="single" w:sz="4" w:space="0" w:color="D9D9D9"/>
+              <w:right w:val="single" w:sz="4" w:space="0" w:color="D9D9D9"/>
+            </w:tcBorders>
+            <w:shd w:val="clear" w:color="auto" w:fill="FAF7F2"/>
+            <w:tcMar>
+              <w:top w:w="70" w:type="dxa"/>
+              <w:left w:w="110" w:type="dxa"/>
+              <w:bottom w:w="70" w:type="dxa"/>
+              <w:right w:w="110" w:type="dxa"/>
+            </w:tcMar>
+          </w:tcPr>
+          <w:p>
+            <w:pPr>
+              <w:spacing w:line="252" w:lineRule="auto"/>
+            </w:pPr>
+            <w:r>
+              <w:rPr>
+                <w:sz w:val="19"/>
+                <w:szCs w:val="19"/>
+              </w:rPr>
+              <w:t>Prêt (serveur à louer)</w:t>
+            </w:r>
+          </w:p>
+        </w:tc>
+        <w:tc>
+          <w:tcPr>
+            <w:tcW w:w="3070" w:type="dxa"/>
+            <w:tcBorders>
+              <w:top w:val="single" w:sz="4" w:space="0" w:color="D9D9D9"/>
+              <w:left w:val="single" w:sz="4" w:space="0" w:color="D9D9D9"/>
+              <w:bottom w:val="single" w:sz="4" w:space="0" w:color="D9D9D9"/>
+              <w:right w:val="single" w:sz="4" w:space="0" w:color="D9D9D9"/>
+            </w:tcBorders>
+            <w:shd w:val="clear" w:color="auto" w:fill="FAF7F2"/>
+            <w:tcMar>
+              <w:top w:w="70" w:type="dxa"/>
+              <w:left w:w="110" w:type="dxa"/>
+              <w:bottom w:w="70" w:type="dxa"/>
+              <w:right w:w="110" w:type="dxa"/>
+            </w:tcMar>
+          </w:tcPr>
+          <w:p>
+            <w:pPr>
+              <w:spacing w:line="252" w:lineRule="auto"/>
+            </w:pPr>
+            <w:r>
+              <w:rPr>
+                <w:sz w:val="19"/>
+                <w:szCs w:val="19"/>
+              </w:rPr>
+              <w:t>Prêt</w:t>
+            </w:r>
+          </w:p>
+        </w:tc>
+      </w:tr>
+      <w:tr>
+        <w:tblPrEx>
+          <w:tblCellMar>
+            <w:top w:w="0" w:type="dxa"/>
+            <w:bottom w:w="0" w:type="dxa"/>
+          </w:tblCellMar>
+        </w:tblPrEx>
+        <w:tc>
+          <w:tcPr>
+            <w:tcW w:w="4151" w:type="dxa"/>
+            <w:tcBorders>
+              <w:top w:val="single" w:sz="4" w:space="0" w:color="D9D9D9"/>
+              <w:left w:val="single" w:sz="4" w:space="0" w:color="D9D9D9"/>
+              <w:bottom w:val="single" w:sz="4" w:space="0" w:color="D9D9D9"/>
+              <w:right w:val="single" w:sz="4" w:space="0" w:color="D9D9D9"/>
+            </w:tcBorders>
+            <w:tcMar>
+              <w:top w:w="70" w:type="dxa"/>
+              <w:left w:w="110" w:type="dxa"/>
+              <w:bottom w:w="70" w:type="dxa"/>
+              <w:right w:w="110" w:type="dxa"/>
+            </w:tcMar>
+          </w:tcPr>
+          <w:p>
+            <w:pPr>
+              <w:spacing w:line="252" w:lineRule="auto"/>
+            </w:pPr>
+            <w:r>
+              <w:rPr>
+                <w:sz w:val="19"/>
+                <w:szCs w:val="19"/>
+              </w:rPr>
               <w:t>Paiement en ligne (API Wave / Orange Money), WhatsApp / SMS, application mobile</w:t>
             </w:r>
           </w:p>
@@ -15242,7 +15740,6 @@
               <w:bottom w:val="single" w:sz="4" w:space="0" w:color="D9D9D9"/>
               <w:right w:val="single" w:sz="4" w:space="0" w:color="D9D9D9"/>
             </w:tcBorders>
-            <w:shd w:val="clear" w:color="auto" w:fill="FAF7F2"/>
             <w:tcMar>
               <w:top w:w="70" w:type="dxa"/>
               <w:left w:w="110" w:type="dxa"/>
@@ -15272,7 +15769,6 @@
               <w:bottom w:val="single" w:sz="4" w:space="0" w:color="D9D9D9"/>
               <w:right w:val="single" w:sz="4" w:space="0" w:color="D9D9D9"/>
             </w:tcBorders>
-            <w:shd w:val="clear" w:color="auto" w:fill="FAF7F2"/>
             <w:tcMar>
               <w:top w:w="70" w:type="dxa"/>
               <w:left w:w="110" w:type="dxa"/>
@@ -15323,12 +15819,2142 @@
         <w:pStyle w:val="Titre1"/>
         <w:pageBreakBefore/>
       </w:pPr>
-      <w:bookmarkStart w:id="36" w:name="_Toc242018816"/>
+      <w:bookmarkStart w:id="36" w:name="_Toc242021076"/>
+      <w:r>
+        <w:lastRenderedPageBreak/>
+        <w:t>15. Mise en ligne</w:t>
+      </w:r>
+      <w:bookmarkEnd w:id="36"/>
+    </w:p>
+    <w:p>
+      <w:pPr>
+        <w:spacing w:after="120" w:line="276" w:lineRule="auto"/>
+      </w:pPr>
+      <w:r>
+        <w:t xml:space="preserve">La plateforme est </w:t>
+      </w:r>
+      <w:r>
+        <w:rPr>
+          <w:b/>
+          <w:bCs/>
+        </w:rPr>
+        <w:t>prête à être mise en ligne</w:t>
+      </w:r>
+      <w:r>
+        <w:t xml:space="preserve"> : toute la configuration de production est livrée avec le code. Il reste à louer un serveur et un nom de domaine, puis à suivre les étapes ci-dessous (environ une demi-journée pour un informaticien).</w:t>
+      </w:r>
+    </w:p>
+    <w:p>
+      <w:pPr>
+        <w:pStyle w:val="Titre2"/>
+      </w:pPr>
+      <w:bookmarkStart w:id="37" w:name="_Toc242021077"/>
+      <w:r>
+        <w:t>15.1 Ce qui est déjà prêt</w:t>
+      </w:r>
+      <w:bookmarkEnd w:id="37"/>
+    </w:p>
+    <w:p>
+      <w:pPr>
+        <w:pStyle w:val="Paragraphedeliste"/>
+        <w:numPr>
+          <w:ilvl w:val="0"/>
+          <w:numId w:val="2"/>
+        </w:numPr>
+        <w:spacing w:after="60" w:line="264" w:lineRule="auto"/>
+      </w:pPr>
+      <w:r>
+        <w:rPr>
+          <w:b/>
+          <w:bCs/>
+        </w:rPr>
+        <w:t>HTTPS automatique</w:t>
+      </w:r>
+      <w:r>
+        <w:t xml:space="preserve"> : le certificat est obtenu et renouvelé sans intervention (Let’s Encrypt) ; toute visite en http est redirigée vers https, et « www » vers l’adresse principale.</w:t>
+      </w:r>
+    </w:p>
+    <w:p>
+      <w:pPr>
+        <w:pStyle w:val="Paragraphedeliste"/>
+        <w:numPr>
+          <w:ilvl w:val="0"/>
+          <w:numId w:val="2"/>
+        </w:numPr>
+        <w:spacing w:after="60" w:line="264" w:lineRule="auto"/>
+      </w:pPr>
+      <w:r>
+        <w:rPr>
+          <w:b/>
+          <w:bCs/>
+        </w:rPr>
+        <w:t>Protection renforcée</w:t>
+      </w:r>
+      <w:r>
+        <w:t xml:space="preserve"> : cookies sécurisés, en-tête HSTS, base de données et application non accessibles directement depuis Internet.</w:t>
+      </w:r>
+    </w:p>
+    <w:p>
+      <w:pPr>
+        <w:pStyle w:val="Paragraphedeliste"/>
+        <w:numPr>
+          <w:ilvl w:val="0"/>
+          <w:numId w:val="2"/>
+        </w:numPr>
+        <w:spacing w:after="60" w:line="264" w:lineRule="auto"/>
+      </w:pPr>
+      <w:r>
+        <w:rPr>
+          <w:b/>
+          <w:bCs/>
+        </w:rPr>
+        <w:t>Sauvegarde automatique chaque nuit</w:t>
+      </w:r>
+      <w:r>
+        <w:t xml:space="preserve"> de la base de données et des photos, conservée 14 jours sur le serveur.</w:t>
+      </w:r>
+    </w:p>
+    <w:p>
+      <w:pPr>
+        <w:pStyle w:val="Paragraphedeliste"/>
+        <w:numPr>
+          <w:ilvl w:val="0"/>
+          <w:numId w:val="2"/>
+        </w:numPr>
+        <w:spacing w:after="60" w:line="264" w:lineRule="auto"/>
+      </w:pPr>
+      <w:r>
+        <w:rPr>
+          <w:b/>
+          <w:bCs/>
+        </w:rPr>
+        <w:t>Mises à jour simples</w:t>
+      </w:r>
+      <w:r>
+        <w:t xml:space="preserve"> : une commande récupère la nouvelle version et applique les évolutions de la base sans perte de données.</w:t>
+      </w:r>
+    </w:p>
+    <w:p>
+      <w:pPr>
+        <w:pStyle w:val="Titre2"/>
+      </w:pPr>
+      <w:bookmarkStart w:id="38" w:name="_Toc242021078"/>
+      <w:r>
+        <w:t>15.2 Ce que l’entreprise doit fournir</w:t>
+      </w:r>
+      <w:bookmarkEnd w:id="38"/>
+    </w:p>
+    <w:tbl>
+      <w:tblPr>
+        <w:tblW w:w="9026" w:type="dxa"/>
+        <w:tblBorders>
+          <w:top w:val="single" w:sz="4" w:space="0" w:color="auto"/>
+          <w:left w:val="single" w:sz="4" w:space="0" w:color="auto"/>
+          <w:bottom w:val="single" w:sz="4" w:space="0" w:color="auto"/>
+          <w:right w:val="single" w:sz="4" w:space="0" w:color="auto"/>
+          <w:insideH w:val="single" w:sz="4" w:space="0" w:color="auto"/>
+          <w:insideV w:val="single" w:sz="4" w:space="0" w:color="auto"/>
+        </w:tblBorders>
+        <w:tblCellMar>
+          <w:left w:w="10" w:type="dxa"/>
+          <w:right w:w="10" w:type="dxa"/>
+        </w:tblCellMar>
+        <w:tblLook w:val="0000" w:firstRow="0" w:lastRow="0" w:firstColumn="0" w:lastColumn="0" w:noHBand="0" w:noVBand="0"/>
+      </w:tblPr>
+      <w:tblGrid>
+        <w:gridCol w:w="2707"/>
+        <w:gridCol w:w="2707"/>
+        <w:gridCol w:w="3612"/>
+      </w:tblGrid>
+      <w:tr>
+        <w:tblPrEx>
+          <w:tblCellMar>
+            <w:top w:w="0" w:type="dxa"/>
+            <w:bottom w:w="0" w:type="dxa"/>
+          </w:tblCellMar>
+        </w:tblPrEx>
+        <w:trPr>
+          <w:tblHeader/>
+        </w:trPr>
+        <w:tc>
+          <w:tcPr>
+            <w:tcW w:w="2707" w:type="dxa"/>
+            <w:tcBorders>
+              <w:top w:val="single" w:sz="4" w:space="0" w:color="D9D9D9"/>
+              <w:left w:val="single" w:sz="4" w:space="0" w:color="D9D9D9"/>
+              <w:bottom w:val="single" w:sz="4" w:space="0" w:color="D9D9D9"/>
+              <w:right w:val="single" w:sz="4" w:space="0" w:color="D9D9D9"/>
+            </w:tcBorders>
+            <w:shd w:val="clear" w:color="auto" w:fill="111317"/>
+            <w:tcMar>
+              <w:top w:w="70" w:type="dxa"/>
+              <w:left w:w="110" w:type="dxa"/>
+              <w:bottom w:w="70" w:type="dxa"/>
+              <w:right w:w="110" w:type="dxa"/>
+            </w:tcMar>
+          </w:tcPr>
+          <w:p>
+            <w:pPr>
+              <w:spacing w:line="252" w:lineRule="auto"/>
+            </w:pPr>
+            <w:r>
+              <w:rPr>
+                <w:b/>
+                <w:bCs/>
+                <w:color w:val="FFFFFF"/>
+                <w:sz w:val="19"/>
+                <w:szCs w:val="19"/>
+              </w:rPr>
+              <w:t>Élément</w:t>
+            </w:r>
+          </w:p>
+        </w:tc>
+        <w:tc>
+          <w:tcPr>
+            <w:tcW w:w="2707" w:type="dxa"/>
+            <w:tcBorders>
+              <w:top w:val="single" w:sz="4" w:space="0" w:color="D9D9D9"/>
+              <w:left w:val="single" w:sz="4" w:space="0" w:color="D9D9D9"/>
+              <w:bottom w:val="single" w:sz="4" w:space="0" w:color="D9D9D9"/>
+              <w:right w:val="single" w:sz="4" w:space="0" w:color="D9D9D9"/>
+            </w:tcBorders>
+            <w:shd w:val="clear" w:color="auto" w:fill="111317"/>
+            <w:tcMar>
+              <w:top w:w="70" w:type="dxa"/>
+              <w:left w:w="110" w:type="dxa"/>
+              <w:bottom w:w="70" w:type="dxa"/>
+              <w:right w:w="110" w:type="dxa"/>
+            </w:tcMar>
+          </w:tcPr>
+          <w:p>
+            <w:pPr>
+              <w:spacing w:line="252" w:lineRule="auto"/>
+            </w:pPr>
+            <w:r>
+              <w:rPr>
+                <w:b/>
+                <w:bCs/>
+                <w:color w:val="FFFFFF"/>
+                <w:sz w:val="19"/>
+                <w:szCs w:val="19"/>
+              </w:rPr>
+              <w:t>Pourquoi</w:t>
+            </w:r>
+          </w:p>
+        </w:tc>
+        <w:tc>
+          <w:tcPr>
+            <w:tcW w:w="3612" w:type="dxa"/>
+            <w:tcBorders>
+              <w:top w:val="single" w:sz="4" w:space="0" w:color="D9D9D9"/>
+              <w:left w:val="single" w:sz="4" w:space="0" w:color="D9D9D9"/>
+              <w:bottom w:val="single" w:sz="4" w:space="0" w:color="D9D9D9"/>
+              <w:right w:val="single" w:sz="4" w:space="0" w:color="D9D9D9"/>
+            </w:tcBorders>
+            <w:shd w:val="clear" w:color="auto" w:fill="111317"/>
+            <w:tcMar>
+              <w:top w:w="70" w:type="dxa"/>
+              <w:left w:w="110" w:type="dxa"/>
+              <w:bottom w:w="70" w:type="dxa"/>
+              <w:right w:w="110" w:type="dxa"/>
+            </w:tcMar>
+          </w:tcPr>
+          <w:p>
+            <w:pPr>
+              <w:spacing w:line="252" w:lineRule="auto"/>
+            </w:pPr>
+            <w:r>
+              <w:rPr>
+                <w:b/>
+                <w:bCs/>
+                <w:color w:val="FFFFFF"/>
+                <w:sz w:val="19"/>
+                <w:szCs w:val="19"/>
+              </w:rPr>
+              <w:t>Qui / comment</w:t>
+            </w:r>
+          </w:p>
+        </w:tc>
+      </w:tr>
+      <w:tr>
+        <w:tblPrEx>
+          <w:tblCellMar>
+            <w:top w:w="0" w:type="dxa"/>
+            <w:bottom w:w="0" w:type="dxa"/>
+          </w:tblCellMar>
+        </w:tblPrEx>
+        <w:tc>
+          <w:tcPr>
+            <w:tcW w:w="2707" w:type="dxa"/>
+            <w:tcBorders>
+              <w:top w:val="single" w:sz="4" w:space="0" w:color="D9D9D9"/>
+              <w:left w:val="single" w:sz="4" w:space="0" w:color="D9D9D9"/>
+              <w:bottom w:val="single" w:sz="4" w:space="0" w:color="D9D9D9"/>
+              <w:right w:val="single" w:sz="4" w:space="0" w:color="D9D9D9"/>
+            </w:tcBorders>
+            <w:tcMar>
+              <w:top w:w="70" w:type="dxa"/>
+              <w:left w:w="110" w:type="dxa"/>
+              <w:bottom w:w="70" w:type="dxa"/>
+              <w:right w:w="110" w:type="dxa"/>
+            </w:tcMar>
+          </w:tcPr>
+          <w:p>
+            <w:pPr>
+              <w:spacing w:line="252" w:lineRule="auto"/>
+            </w:pPr>
+            <w:r>
+              <w:rPr>
+                <w:sz w:val="19"/>
+                <w:szCs w:val="19"/>
+              </w:rPr>
+              <w:t>Nom de domaine (ex. perfection-detailing.com ou .sn)</w:t>
+            </w:r>
+          </w:p>
+        </w:tc>
+        <w:tc>
+          <w:tcPr>
+            <w:tcW w:w="2707" w:type="dxa"/>
+            <w:tcBorders>
+              <w:top w:val="single" w:sz="4" w:space="0" w:color="D9D9D9"/>
+              <w:left w:val="single" w:sz="4" w:space="0" w:color="D9D9D9"/>
+              <w:bottom w:val="single" w:sz="4" w:space="0" w:color="D9D9D9"/>
+              <w:right w:val="single" w:sz="4" w:space="0" w:color="D9D9D9"/>
+            </w:tcBorders>
+            <w:tcMar>
+              <w:top w:w="70" w:type="dxa"/>
+              <w:left w:w="110" w:type="dxa"/>
+              <w:bottom w:w="70" w:type="dxa"/>
+              <w:right w:w="110" w:type="dxa"/>
+            </w:tcMar>
+          </w:tcPr>
+          <w:p>
+            <w:pPr>
+              <w:spacing w:line="252" w:lineRule="auto"/>
+            </w:pPr>
+            <w:r>
+              <w:rPr>
+                <w:sz w:val="19"/>
+                <w:szCs w:val="19"/>
+              </w:rPr>
+              <w:t>Adresse du site, emails et certificat HTTPS</w:t>
+            </w:r>
+          </w:p>
+        </w:tc>
+        <w:tc>
+          <w:tcPr>
+            <w:tcW w:w="3612" w:type="dxa"/>
+            <w:tcBorders>
+              <w:top w:val="single" w:sz="4" w:space="0" w:color="D9D9D9"/>
+              <w:left w:val="single" w:sz="4" w:space="0" w:color="D9D9D9"/>
+              <w:bottom w:val="single" w:sz="4" w:space="0" w:color="D9D9D9"/>
+              <w:right w:val="single" w:sz="4" w:space="0" w:color="D9D9D9"/>
+            </w:tcBorders>
+            <w:tcMar>
+              <w:top w:w="70" w:type="dxa"/>
+              <w:left w:w="110" w:type="dxa"/>
+              <w:bottom w:w="70" w:type="dxa"/>
+              <w:right w:w="110" w:type="dxa"/>
+            </w:tcMar>
+          </w:tcPr>
+          <w:p>
+            <w:pPr>
+              <w:spacing w:line="252" w:lineRule="auto"/>
+            </w:pPr>
+            <w:r>
+              <w:rPr>
+                <w:sz w:val="19"/>
+                <w:szCs w:val="19"/>
+              </w:rPr>
+              <w:t>Achat chez un registraire ; pour un .sn : RCCM ou NINEA demandés</w:t>
+            </w:r>
+          </w:p>
+        </w:tc>
+      </w:tr>
+      <w:tr>
+        <w:tblPrEx>
+          <w:tblCellMar>
+            <w:top w:w="0" w:type="dxa"/>
+            <w:bottom w:w="0" w:type="dxa"/>
+          </w:tblCellMar>
+        </w:tblPrEx>
+        <w:tc>
+          <w:tcPr>
+            <w:tcW w:w="2707" w:type="dxa"/>
+            <w:tcBorders>
+              <w:top w:val="single" w:sz="4" w:space="0" w:color="D9D9D9"/>
+              <w:left w:val="single" w:sz="4" w:space="0" w:color="D9D9D9"/>
+              <w:bottom w:val="single" w:sz="4" w:space="0" w:color="D9D9D9"/>
+              <w:right w:val="single" w:sz="4" w:space="0" w:color="D9D9D9"/>
+            </w:tcBorders>
+            <w:shd w:val="clear" w:color="auto" w:fill="FAF7F2"/>
+            <w:tcMar>
+              <w:top w:w="70" w:type="dxa"/>
+              <w:left w:w="110" w:type="dxa"/>
+              <w:bottom w:w="70" w:type="dxa"/>
+              <w:right w:w="110" w:type="dxa"/>
+            </w:tcMar>
+          </w:tcPr>
+          <w:p>
+            <w:pPr>
+              <w:spacing w:line="252" w:lineRule="auto"/>
+            </w:pPr>
+            <w:r>
+              <w:rPr>
+                <w:sz w:val="19"/>
+                <w:szCs w:val="19"/>
+              </w:rPr>
+              <w:t>Serveur (VPS)</w:t>
+            </w:r>
+          </w:p>
+        </w:tc>
+        <w:tc>
+          <w:tcPr>
+            <w:tcW w:w="2707" w:type="dxa"/>
+            <w:tcBorders>
+              <w:top w:val="single" w:sz="4" w:space="0" w:color="D9D9D9"/>
+              <w:left w:val="single" w:sz="4" w:space="0" w:color="D9D9D9"/>
+              <w:bottom w:val="single" w:sz="4" w:space="0" w:color="D9D9D9"/>
+              <w:right w:val="single" w:sz="4" w:space="0" w:color="D9D9D9"/>
+            </w:tcBorders>
+            <w:shd w:val="clear" w:color="auto" w:fill="FAF7F2"/>
+            <w:tcMar>
+              <w:top w:w="70" w:type="dxa"/>
+              <w:left w:w="110" w:type="dxa"/>
+              <w:bottom w:w="70" w:type="dxa"/>
+              <w:right w:w="110" w:type="dxa"/>
+            </w:tcMar>
+          </w:tcPr>
+          <w:p>
+            <w:pPr>
+              <w:spacing w:line="252" w:lineRule="auto"/>
+            </w:pPr>
+            <w:r>
+              <w:rPr>
+                <w:sz w:val="19"/>
+                <w:szCs w:val="19"/>
+              </w:rPr>
+              <w:t>Héberge la plateforme</w:t>
+            </w:r>
+          </w:p>
+        </w:tc>
+        <w:tc>
+          <w:tcPr>
+            <w:tcW w:w="3612" w:type="dxa"/>
+            <w:tcBorders>
+              <w:top w:val="single" w:sz="4" w:space="0" w:color="D9D9D9"/>
+              <w:left w:val="single" w:sz="4" w:space="0" w:color="D9D9D9"/>
+              <w:bottom w:val="single" w:sz="4" w:space="0" w:color="D9D9D9"/>
+              <w:right w:val="single" w:sz="4" w:space="0" w:color="D9D9D9"/>
+            </w:tcBorders>
+            <w:shd w:val="clear" w:color="auto" w:fill="FAF7F2"/>
+            <w:tcMar>
+              <w:top w:w="70" w:type="dxa"/>
+              <w:left w:w="110" w:type="dxa"/>
+              <w:bottom w:w="70" w:type="dxa"/>
+              <w:right w:w="110" w:type="dxa"/>
+            </w:tcMar>
+          </w:tcPr>
+          <w:p>
+            <w:pPr>
+              <w:spacing w:line="252" w:lineRule="auto"/>
+            </w:pPr>
+            <w:r>
+              <w:rPr>
+                <w:sz w:val="19"/>
+                <w:szCs w:val="19"/>
+              </w:rPr>
+              <w:t>Location mensuelle ; carte bancaire au nom de l’entreprise</w:t>
+            </w:r>
+          </w:p>
+        </w:tc>
+      </w:tr>
+      <w:tr>
+        <w:tblPrEx>
+          <w:tblCellMar>
+            <w:top w:w="0" w:type="dxa"/>
+            <w:bottom w:w="0" w:type="dxa"/>
+          </w:tblCellMar>
+        </w:tblPrEx>
+        <w:tc>
+          <w:tcPr>
+            <w:tcW w:w="2707" w:type="dxa"/>
+            <w:tcBorders>
+              <w:top w:val="single" w:sz="4" w:space="0" w:color="D9D9D9"/>
+              <w:left w:val="single" w:sz="4" w:space="0" w:color="D9D9D9"/>
+              <w:bottom w:val="single" w:sz="4" w:space="0" w:color="D9D9D9"/>
+              <w:right w:val="single" w:sz="4" w:space="0" w:color="D9D9D9"/>
+            </w:tcBorders>
+            <w:tcMar>
+              <w:top w:w="70" w:type="dxa"/>
+              <w:left w:w="110" w:type="dxa"/>
+              <w:bottom w:w="70" w:type="dxa"/>
+              <w:right w:w="110" w:type="dxa"/>
+            </w:tcMar>
+          </w:tcPr>
+          <w:p>
+            <w:pPr>
+              <w:spacing w:line="252" w:lineRule="auto"/>
+            </w:pPr>
+            <w:r>
+              <w:rPr>
+                <w:sz w:val="19"/>
+                <w:szCs w:val="19"/>
+              </w:rPr>
+              <w:t>Compte d’envoi d’emails (SMTP)</w:t>
+            </w:r>
+          </w:p>
+        </w:tc>
+        <w:tc>
+          <w:tcPr>
+            <w:tcW w:w="2707" w:type="dxa"/>
+            <w:tcBorders>
+              <w:top w:val="single" w:sz="4" w:space="0" w:color="D9D9D9"/>
+              <w:left w:val="single" w:sz="4" w:space="0" w:color="D9D9D9"/>
+              <w:bottom w:val="single" w:sz="4" w:space="0" w:color="D9D9D9"/>
+              <w:right w:val="single" w:sz="4" w:space="0" w:color="D9D9D9"/>
+            </w:tcBorders>
+            <w:tcMar>
+              <w:top w:w="70" w:type="dxa"/>
+              <w:left w:w="110" w:type="dxa"/>
+              <w:bottom w:w="70" w:type="dxa"/>
+              <w:right w:w="110" w:type="dxa"/>
+            </w:tcMar>
+          </w:tcPr>
+          <w:p>
+            <w:pPr>
+              <w:spacing w:line="252" w:lineRule="auto"/>
+            </w:pPr>
+            <w:r>
+              <w:rPr>
+                <w:sz w:val="19"/>
+                <w:szCs w:val="19"/>
+              </w:rPr>
+              <w:t>Notifications clients, mot de passe oublié</w:t>
+            </w:r>
+          </w:p>
+        </w:tc>
+        <w:tc>
+          <w:tcPr>
+            <w:tcW w:w="3612" w:type="dxa"/>
+            <w:tcBorders>
+              <w:top w:val="single" w:sz="4" w:space="0" w:color="D9D9D9"/>
+              <w:left w:val="single" w:sz="4" w:space="0" w:color="D9D9D9"/>
+              <w:bottom w:val="single" w:sz="4" w:space="0" w:color="D9D9D9"/>
+              <w:right w:val="single" w:sz="4" w:space="0" w:color="D9D9D9"/>
+            </w:tcBorders>
+            <w:tcMar>
+              <w:top w:w="70" w:type="dxa"/>
+              <w:left w:w="110" w:type="dxa"/>
+              <w:bottom w:w="70" w:type="dxa"/>
+              <w:right w:w="110" w:type="dxa"/>
+            </w:tcMar>
+          </w:tcPr>
+          <w:p>
+            <w:pPr>
+              <w:spacing w:line="252" w:lineRule="auto"/>
+            </w:pPr>
+            <w:r>
+              <w:rPr>
+                <w:sz w:val="19"/>
+                <w:szCs w:val="19"/>
+              </w:rPr>
+              <w:t>Ex. Brevo (offre gratuite) ; vérifier le domaine</w:t>
+            </w:r>
+          </w:p>
+        </w:tc>
+      </w:tr>
+      <w:tr>
+        <w:tblPrEx>
+          <w:tblCellMar>
+            <w:top w:w="0" w:type="dxa"/>
+            <w:bottom w:w="0" w:type="dxa"/>
+          </w:tblCellMar>
+        </w:tblPrEx>
+        <w:tc>
+          <w:tcPr>
+            <w:tcW w:w="2707" w:type="dxa"/>
+            <w:tcBorders>
+              <w:top w:val="single" w:sz="4" w:space="0" w:color="D9D9D9"/>
+              <w:left w:val="single" w:sz="4" w:space="0" w:color="D9D9D9"/>
+              <w:bottom w:val="single" w:sz="4" w:space="0" w:color="D9D9D9"/>
+              <w:right w:val="single" w:sz="4" w:space="0" w:color="D9D9D9"/>
+            </w:tcBorders>
+            <w:shd w:val="clear" w:color="auto" w:fill="FAF7F2"/>
+            <w:tcMar>
+              <w:top w:w="70" w:type="dxa"/>
+              <w:left w:w="110" w:type="dxa"/>
+              <w:bottom w:w="70" w:type="dxa"/>
+              <w:right w:w="110" w:type="dxa"/>
+            </w:tcMar>
+          </w:tcPr>
+          <w:p>
+            <w:pPr>
+              <w:spacing w:line="252" w:lineRule="auto"/>
+            </w:pPr>
+            <w:r>
+              <w:rPr>
+                <w:sz w:val="19"/>
+                <w:szCs w:val="19"/>
+              </w:rPr>
+              <w:t>Identité de facturation</w:t>
+            </w:r>
+          </w:p>
+        </w:tc>
+        <w:tc>
+          <w:tcPr>
+            <w:tcW w:w="2707" w:type="dxa"/>
+            <w:tcBorders>
+              <w:top w:val="single" w:sz="4" w:space="0" w:color="D9D9D9"/>
+              <w:left w:val="single" w:sz="4" w:space="0" w:color="D9D9D9"/>
+              <w:bottom w:val="single" w:sz="4" w:space="0" w:color="D9D9D9"/>
+              <w:right w:val="single" w:sz="4" w:space="0" w:color="D9D9D9"/>
+            </w:tcBorders>
+            <w:shd w:val="clear" w:color="auto" w:fill="FAF7F2"/>
+            <w:tcMar>
+              <w:top w:w="70" w:type="dxa"/>
+              <w:left w:w="110" w:type="dxa"/>
+              <w:bottom w:w="70" w:type="dxa"/>
+              <w:right w:w="110" w:type="dxa"/>
+            </w:tcMar>
+          </w:tcPr>
+          <w:p>
+            <w:pPr>
+              <w:spacing w:line="252" w:lineRule="auto"/>
+            </w:pPr>
+            <w:r>
+              <w:rPr>
+                <w:sz w:val="19"/>
+                <w:szCs w:val="19"/>
+              </w:rPr>
+              <w:t>Imprimée sur chaque facture</w:t>
+            </w:r>
+          </w:p>
+        </w:tc>
+        <w:tc>
+          <w:tcPr>
+            <w:tcW w:w="3612" w:type="dxa"/>
+            <w:tcBorders>
+              <w:top w:val="single" w:sz="4" w:space="0" w:color="D9D9D9"/>
+              <w:left w:val="single" w:sz="4" w:space="0" w:color="D9D9D9"/>
+              <w:bottom w:val="single" w:sz="4" w:space="0" w:color="D9D9D9"/>
+              <w:right w:val="single" w:sz="4" w:space="0" w:color="D9D9D9"/>
+            </w:tcBorders>
+            <w:shd w:val="clear" w:color="auto" w:fill="FAF7F2"/>
+            <w:tcMar>
+              <w:top w:w="70" w:type="dxa"/>
+              <w:left w:w="110" w:type="dxa"/>
+              <w:bottom w:w="70" w:type="dxa"/>
+              <w:right w:w="110" w:type="dxa"/>
+            </w:tcMar>
+          </w:tcPr>
+          <w:p>
+            <w:pPr>
+              <w:spacing w:line="252" w:lineRule="auto"/>
+            </w:pPr>
+            <w:r>
+              <w:rPr>
+                <w:sz w:val="19"/>
+                <w:szCs w:val="19"/>
+              </w:rPr>
+              <w:t>Raison sociale, adresse, téléphone, email, NINEA</w:t>
+            </w:r>
+          </w:p>
+        </w:tc>
+      </w:tr>
+      <w:tr>
+        <w:tblPrEx>
+          <w:tblCellMar>
+            <w:top w:w="0" w:type="dxa"/>
+            <w:bottom w:w="0" w:type="dxa"/>
+          </w:tblCellMar>
+        </w:tblPrEx>
+        <w:tc>
+          <w:tcPr>
+            <w:tcW w:w="2707" w:type="dxa"/>
+            <w:tcBorders>
+              <w:top w:val="single" w:sz="4" w:space="0" w:color="D9D9D9"/>
+              <w:left w:val="single" w:sz="4" w:space="0" w:color="D9D9D9"/>
+              <w:bottom w:val="single" w:sz="4" w:space="0" w:color="D9D9D9"/>
+              <w:right w:val="single" w:sz="4" w:space="0" w:color="D9D9D9"/>
+            </w:tcBorders>
+            <w:tcMar>
+              <w:top w:w="70" w:type="dxa"/>
+              <w:left w:w="110" w:type="dxa"/>
+              <w:bottom w:w="70" w:type="dxa"/>
+              <w:right w:w="110" w:type="dxa"/>
+            </w:tcMar>
+          </w:tcPr>
+          <w:p>
+            <w:pPr>
+              <w:spacing w:line="252" w:lineRule="auto"/>
+            </w:pPr>
+            <w:r>
+              <w:rPr>
+                <w:sz w:val="19"/>
+                <w:szCs w:val="19"/>
+              </w:rPr>
+              <w:t>Coordonnées publiques</w:t>
+            </w:r>
+          </w:p>
+        </w:tc>
+        <w:tc>
+          <w:tcPr>
+            <w:tcW w:w="2707" w:type="dxa"/>
+            <w:tcBorders>
+              <w:top w:val="single" w:sz="4" w:space="0" w:color="D9D9D9"/>
+              <w:left w:val="single" w:sz="4" w:space="0" w:color="D9D9D9"/>
+              <w:bottom w:val="single" w:sz="4" w:space="0" w:color="D9D9D9"/>
+              <w:right w:val="single" w:sz="4" w:space="0" w:color="D9D9D9"/>
+            </w:tcBorders>
+            <w:tcMar>
+              <w:top w:w="70" w:type="dxa"/>
+              <w:left w:w="110" w:type="dxa"/>
+              <w:bottom w:w="70" w:type="dxa"/>
+              <w:right w:w="110" w:type="dxa"/>
+            </w:tcMar>
+          </w:tcPr>
+          <w:p>
+            <w:pPr>
+              <w:spacing w:line="252" w:lineRule="auto"/>
+            </w:pPr>
+            <w:r>
+              <w:rPr>
+                <w:sz w:val="19"/>
+                <w:szCs w:val="19"/>
+              </w:rPr>
+              <w:t>Affichées sur le site</w:t>
+            </w:r>
+          </w:p>
+        </w:tc>
+        <w:tc>
+          <w:tcPr>
+            <w:tcW w:w="3612" w:type="dxa"/>
+            <w:tcBorders>
+              <w:top w:val="single" w:sz="4" w:space="0" w:color="D9D9D9"/>
+              <w:left w:val="single" w:sz="4" w:space="0" w:color="D9D9D9"/>
+              <w:bottom w:val="single" w:sz="4" w:space="0" w:color="D9D9D9"/>
+              <w:right w:val="single" w:sz="4" w:space="0" w:color="D9D9D9"/>
+            </w:tcBorders>
+            <w:tcMar>
+              <w:top w:w="70" w:type="dxa"/>
+              <w:left w:w="110" w:type="dxa"/>
+              <w:bottom w:w="70" w:type="dxa"/>
+              <w:right w:w="110" w:type="dxa"/>
+            </w:tcMar>
+          </w:tcPr>
+          <w:p>
+            <w:pPr>
+              <w:spacing w:line="252" w:lineRule="auto"/>
+            </w:pPr>
+            <w:r>
+              <w:rPr>
+                <w:sz w:val="19"/>
+                <w:szCs w:val="19"/>
+              </w:rPr>
+              <w:t>Téléphone, numéro WhatsApp, adresse de l’atelier</w:t>
+            </w:r>
+          </w:p>
+        </w:tc>
+      </w:tr>
+      <w:tr>
+        <w:tblPrEx>
+          <w:tblCellMar>
+            <w:top w:w="0" w:type="dxa"/>
+            <w:bottom w:w="0" w:type="dxa"/>
+          </w:tblCellMar>
+        </w:tblPrEx>
+        <w:tc>
+          <w:tcPr>
+            <w:tcW w:w="2707" w:type="dxa"/>
+            <w:tcBorders>
+              <w:top w:val="single" w:sz="4" w:space="0" w:color="D9D9D9"/>
+              <w:left w:val="single" w:sz="4" w:space="0" w:color="D9D9D9"/>
+              <w:bottom w:val="single" w:sz="4" w:space="0" w:color="D9D9D9"/>
+              <w:right w:val="single" w:sz="4" w:space="0" w:color="D9D9D9"/>
+            </w:tcBorders>
+            <w:shd w:val="clear" w:color="auto" w:fill="FAF7F2"/>
+            <w:tcMar>
+              <w:top w:w="70" w:type="dxa"/>
+              <w:left w:w="110" w:type="dxa"/>
+              <w:bottom w:w="70" w:type="dxa"/>
+              <w:right w:w="110" w:type="dxa"/>
+            </w:tcMar>
+          </w:tcPr>
+          <w:p>
+            <w:pPr>
+              <w:spacing w:line="252" w:lineRule="auto"/>
+            </w:pPr>
+            <w:r>
+              <w:rPr>
+                <w:sz w:val="19"/>
+                <w:szCs w:val="19"/>
+              </w:rPr>
+              <w:t>Données de départ</w:t>
+            </w:r>
+          </w:p>
+        </w:tc>
+        <w:tc>
+          <w:tcPr>
+            <w:tcW w:w="2707" w:type="dxa"/>
+            <w:tcBorders>
+              <w:top w:val="single" w:sz="4" w:space="0" w:color="D9D9D9"/>
+              <w:left w:val="single" w:sz="4" w:space="0" w:color="D9D9D9"/>
+              <w:bottom w:val="single" w:sz="4" w:space="0" w:color="D9D9D9"/>
+              <w:right w:val="single" w:sz="4" w:space="0" w:color="D9D9D9"/>
+            </w:tcBorders>
+            <w:shd w:val="clear" w:color="auto" w:fill="FAF7F2"/>
+            <w:tcMar>
+              <w:top w:w="70" w:type="dxa"/>
+              <w:left w:w="110" w:type="dxa"/>
+              <w:bottom w:w="70" w:type="dxa"/>
+              <w:right w:w="110" w:type="dxa"/>
+            </w:tcMar>
+          </w:tcPr>
+          <w:p>
+            <w:pPr>
+              <w:spacing w:line="252" w:lineRule="auto"/>
+            </w:pPr>
+            <w:r>
+              <w:rPr>
+                <w:sz w:val="19"/>
+                <w:szCs w:val="19"/>
+              </w:rPr>
+              <w:t>Planning et catalogue exacts</w:t>
+            </w:r>
+          </w:p>
+        </w:tc>
+        <w:tc>
+          <w:tcPr>
+            <w:tcW w:w="3612" w:type="dxa"/>
+            <w:tcBorders>
+              <w:top w:val="single" w:sz="4" w:space="0" w:color="D9D9D9"/>
+              <w:left w:val="single" w:sz="4" w:space="0" w:color="D9D9D9"/>
+              <w:bottom w:val="single" w:sz="4" w:space="0" w:color="D9D9D9"/>
+              <w:right w:val="single" w:sz="4" w:space="0" w:color="D9D9D9"/>
+            </w:tcBorders>
+            <w:shd w:val="clear" w:color="auto" w:fill="FAF7F2"/>
+            <w:tcMar>
+              <w:top w:w="70" w:type="dxa"/>
+              <w:left w:w="110" w:type="dxa"/>
+              <w:bottom w:w="70" w:type="dxa"/>
+              <w:right w:w="110" w:type="dxa"/>
+            </w:tcMar>
+          </w:tcPr>
+          <w:p>
+            <w:pPr>
+              <w:spacing w:line="252" w:lineRule="auto"/>
+            </w:pPr>
+            <w:r>
+              <w:rPr>
+                <w:sz w:val="19"/>
+                <w:szCs w:val="19"/>
+              </w:rPr>
+              <w:t>Horaires, fermetures, tarifs et durées, liste de l’équipe</w:t>
+            </w:r>
+          </w:p>
+        </w:tc>
+      </w:tr>
+      <w:tr>
+        <w:tblPrEx>
+          <w:tblCellMar>
+            <w:top w:w="0" w:type="dxa"/>
+            <w:bottom w:w="0" w:type="dxa"/>
+          </w:tblCellMar>
+        </w:tblPrEx>
+        <w:tc>
+          <w:tcPr>
+            <w:tcW w:w="2707" w:type="dxa"/>
+            <w:tcBorders>
+              <w:top w:val="single" w:sz="4" w:space="0" w:color="D9D9D9"/>
+              <w:left w:val="single" w:sz="4" w:space="0" w:color="D9D9D9"/>
+              <w:bottom w:val="single" w:sz="4" w:space="0" w:color="D9D9D9"/>
+              <w:right w:val="single" w:sz="4" w:space="0" w:color="D9D9D9"/>
+            </w:tcBorders>
+            <w:tcMar>
+              <w:top w:w="70" w:type="dxa"/>
+              <w:left w:w="110" w:type="dxa"/>
+              <w:bottom w:w="70" w:type="dxa"/>
+              <w:right w:w="110" w:type="dxa"/>
+            </w:tcMar>
+          </w:tcPr>
+          <w:p>
+            <w:pPr>
+              <w:spacing w:line="252" w:lineRule="auto"/>
+            </w:pPr>
+            <w:r>
+              <w:rPr>
+                <w:sz w:val="19"/>
+                <w:szCs w:val="19"/>
+              </w:rPr>
+              <w:t>Contenus vérifiés</w:t>
+            </w:r>
+          </w:p>
+        </w:tc>
+        <w:tc>
+          <w:tcPr>
+            <w:tcW w:w="2707" w:type="dxa"/>
+            <w:tcBorders>
+              <w:top w:val="single" w:sz="4" w:space="0" w:color="D9D9D9"/>
+              <w:left w:val="single" w:sz="4" w:space="0" w:color="D9D9D9"/>
+              <w:bottom w:val="single" w:sz="4" w:space="0" w:color="D9D9D9"/>
+              <w:right w:val="single" w:sz="4" w:space="0" w:color="D9D9D9"/>
+            </w:tcBorders>
+            <w:tcMar>
+              <w:top w:w="70" w:type="dxa"/>
+              <w:left w:w="110" w:type="dxa"/>
+              <w:bottom w:w="70" w:type="dxa"/>
+              <w:right w:w="110" w:type="dxa"/>
+            </w:tcMar>
+          </w:tcPr>
+          <w:p>
+            <w:pPr>
+              <w:spacing w:line="252" w:lineRule="auto"/>
+            </w:pPr>
+            <w:r>
+              <w:rPr>
+                <w:sz w:val="19"/>
+                <w:szCs w:val="19"/>
+              </w:rPr>
+              <w:t>Galerie et avis</w:t>
+            </w:r>
+          </w:p>
+        </w:tc>
+        <w:tc>
+          <w:tcPr>
+            <w:tcW w:w="3612" w:type="dxa"/>
+            <w:tcBorders>
+              <w:top w:val="single" w:sz="4" w:space="0" w:color="D9D9D9"/>
+              <w:left w:val="single" w:sz="4" w:space="0" w:color="D9D9D9"/>
+              <w:bottom w:val="single" w:sz="4" w:space="0" w:color="D9D9D9"/>
+              <w:right w:val="single" w:sz="4" w:space="0" w:color="D9D9D9"/>
+            </w:tcBorders>
+            <w:tcMar>
+              <w:top w:w="70" w:type="dxa"/>
+              <w:left w:w="110" w:type="dxa"/>
+              <w:bottom w:w="70" w:type="dxa"/>
+              <w:right w:w="110" w:type="dxa"/>
+            </w:tcMar>
+          </w:tcPr>
+          <w:p>
+            <w:pPr>
+              <w:spacing w:line="252" w:lineRule="auto"/>
+            </w:pPr>
+            <w:r>
+              <w:rPr>
+                <w:sz w:val="19"/>
+                <w:szCs w:val="19"/>
+              </w:rPr>
+              <w:t>Photos Avant / Après et avis avec l’accord des clients</w:t>
+            </w:r>
+          </w:p>
+        </w:tc>
+      </w:tr>
+    </w:tbl>
+    <w:p>
+      <w:pPr>
+        <w:spacing w:after="80"/>
+      </w:pPr>
+    </w:p>
+    <w:p>
+      <w:pPr>
+        <w:pBdr>
+          <w:left w:val="single" w:sz="18" w:space="8" w:color="B87D24"/>
+        </w:pBdr>
+        <w:shd w:val="clear" w:color="auto" w:fill="F4EBDD"/>
+        <w:spacing w:before="120" w:after="160" w:line="264" w:lineRule="auto"/>
+        <w:ind w:left="200" w:right="200"/>
+      </w:pPr>
+      <w:r>
+        <w:rPr>
+          <w:b/>
+          <w:bCs/>
+          <w:color w:val="B87D24"/>
+        </w:rPr>
+        <w:t xml:space="preserve">Important : </w:t>
+      </w:r>
+      <w:r>
+        <w:t xml:space="preserve">les comptes (domaine, serveur, emails) doivent être ouverts </w:t>
+      </w:r>
+      <w:r>
+        <w:rPr>
+          <w:b/>
+          <w:bCs/>
+        </w:rPr>
+        <w:t>au nom de l’entreprise</w:t>
+      </w:r>
+      <w:r>
+        <w:t>, avec un email qu’elle contrôle. Le prestataire technique reçoit un accès, pas la propriété.</w:t>
+      </w:r>
+    </w:p>
+    <w:p>
+      <w:r>
+        <w:br w:type="page"/>
+      </w:r>
+    </w:p>
+    <w:p>
+      <w:pPr>
+        <w:pStyle w:val="Titre2"/>
+      </w:pPr>
+      <w:bookmarkStart w:id="39" w:name="_Toc242021079"/>
+      <w:r>
+        <w:lastRenderedPageBreak/>
+        <w:t>15.3 Coûts indicatifs</w:t>
+      </w:r>
+      <w:bookmarkEnd w:id="39"/>
+    </w:p>
+    <w:tbl>
+      <w:tblPr>
+        <w:tblW w:w="9026" w:type="dxa"/>
+        <w:tblBorders>
+          <w:top w:val="single" w:sz="4" w:space="0" w:color="auto"/>
+          <w:left w:val="single" w:sz="4" w:space="0" w:color="auto"/>
+          <w:bottom w:val="single" w:sz="4" w:space="0" w:color="auto"/>
+          <w:right w:val="single" w:sz="4" w:space="0" w:color="auto"/>
+          <w:insideH w:val="single" w:sz="4" w:space="0" w:color="auto"/>
+          <w:insideV w:val="single" w:sz="4" w:space="0" w:color="auto"/>
+        </w:tblBorders>
+        <w:tblCellMar>
+          <w:left w:w="10" w:type="dxa"/>
+          <w:right w:w="10" w:type="dxa"/>
+        </w:tblCellMar>
+        <w:tblLook w:val="0000" w:firstRow="0" w:lastRow="0" w:firstColumn="0" w:lastColumn="0" w:noHBand="0" w:noVBand="0"/>
+      </w:tblPr>
+      <w:tblGrid>
+        <w:gridCol w:w="3249"/>
+        <w:gridCol w:w="2527"/>
+        <w:gridCol w:w="3250"/>
+      </w:tblGrid>
+      <w:tr>
+        <w:tblPrEx>
+          <w:tblCellMar>
+            <w:top w:w="0" w:type="dxa"/>
+            <w:bottom w:w="0" w:type="dxa"/>
+          </w:tblCellMar>
+        </w:tblPrEx>
+        <w:trPr>
+          <w:tblHeader/>
+        </w:trPr>
+        <w:tc>
+          <w:tcPr>
+            <w:tcW w:w="3249" w:type="dxa"/>
+            <w:tcBorders>
+              <w:top w:val="single" w:sz="4" w:space="0" w:color="D9D9D9"/>
+              <w:left w:val="single" w:sz="4" w:space="0" w:color="D9D9D9"/>
+              <w:bottom w:val="single" w:sz="4" w:space="0" w:color="D9D9D9"/>
+              <w:right w:val="single" w:sz="4" w:space="0" w:color="D9D9D9"/>
+            </w:tcBorders>
+            <w:shd w:val="clear" w:color="auto" w:fill="111317"/>
+            <w:tcMar>
+              <w:top w:w="70" w:type="dxa"/>
+              <w:left w:w="110" w:type="dxa"/>
+              <w:bottom w:w="70" w:type="dxa"/>
+              <w:right w:w="110" w:type="dxa"/>
+            </w:tcMar>
+          </w:tcPr>
+          <w:p>
+            <w:pPr>
+              <w:spacing w:line="252" w:lineRule="auto"/>
+            </w:pPr>
+            <w:r>
+              <w:rPr>
+                <w:b/>
+                <w:bCs/>
+                <w:color w:val="FFFFFF"/>
+                <w:sz w:val="19"/>
+                <w:szCs w:val="19"/>
+              </w:rPr>
+              <w:t>Poste</w:t>
+            </w:r>
+          </w:p>
+        </w:tc>
+        <w:tc>
+          <w:tcPr>
+            <w:tcW w:w="2527" w:type="dxa"/>
+            <w:tcBorders>
+              <w:top w:val="single" w:sz="4" w:space="0" w:color="D9D9D9"/>
+              <w:left w:val="single" w:sz="4" w:space="0" w:color="D9D9D9"/>
+              <w:bottom w:val="single" w:sz="4" w:space="0" w:color="D9D9D9"/>
+              <w:right w:val="single" w:sz="4" w:space="0" w:color="D9D9D9"/>
+            </w:tcBorders>
+            <w:shd w:val="clear" w:color="auto" w:fill="111317"/>
+            <w:tcMar>
+              <w:top w:w="70" w:type="dxa"/>
+              <w:left w:w="110" w:type="dxa"/>
+              <w:bottom w:w="70" w:type="dxa"/>
+              <w:right w:w="110" w:type="dxa"/>
+            </w:tcMar>
+          </w:tcPr>
+          <w:p>
+            <w:pPr>
+              <w:spacing w:line="252" w:lineRule="auto"/>
+            </w:pPr>
+            <w:r>
+              <w:rPr>
+                <w:b/>
+                <w:bCs/>
+                <w:color w:val="FFFFFF"/>
+                <w:sz w:val="19"/>
+                <w:szCs w:val="19"/>
+              </w:rPr>
+              <w:t>Coût indicatif</w:t>
+            </w:r>
+          </w:p>
+        </w:tc>
+        <w:tc>
+          <w:tcPr>
+            <w:tcW w:w="3250" w:type="dxa"/>
+            <w:tcBorders>
+              <w:top w:val="single" w:sz="4" w:space="0" w:color="D9D9D9"/>
+              <w:left w:val="single" w:sz="4" w:space="0" w:color="D9D9D9"/>
+              <w:bottom w:val="single" w:sz="4" w:space="0" w:color="D9D9D9"/>
+              <w:right w:val="single" w:sz="4" w:space="0" w:color="D9D9D9"/>
+            </w:tcBorders>
+            <w:shd w:val="clear" w:color="auto" w:fill="111317"/>
+            <w:tcMar>
+              <w:top w:w="70" w:type="dxa"/>
+              <w:left w:w="110" w:type="dxa"/>
+              <w:bottom w:w="70" w:type="dxa"/>
+              <w:right w:w="110" w:type="dxa"/>
+            </w:tcMar>
+          </w:tcPr>
+          <w:p>
+            <w:pPr>
+              <w:spacing w:line="252" w:lineRule="auto"/>
+            </w:pPr>
+            <w:r>
+              <w:rPr>
+                <w:b/>
+                <w:bCs/>
+                <w:color w:val="FFFFFF"/>
+                <w:sz w:val="19"/>
+                <w:szCs w:val="19"/>
+              </w:rPr>
+              <w:t>Remarque</w:t>
+            </w:r>
+          </w:p>
+        </w:tc>
+      </w:tr>
+      <w:tr>
+        <w:tblPrEx>
+          <w:tblCellMar>
+            <w:top w:w="0" w:type="dxa"/>
+            <w:bottom w:w="0" w:type="dxa"/>
+          </w:tblCellMar>
+        </w:tblPrEx>
+        <w:tc>
+          <w:tcPr>
+            <w:tcW w:w="3249" w:type="dxa"/>
+            <w:tcBorders>
+              <w:top w:val="single" w:sz="4" w:space="0" w:color="D9D9D9"/>
+              <w:left w:val="single" w:sz="4" w:space="0" w:color="D9D9D9"/>
+              <w:bottom w:val="single" w:sz="4" w:space="0" w:color="D9D9D9"/>
+              <w:right w:val="single" w:sz="4" w:space="0" w:color="D9D9D9"/>
+            </w:tcBorders>
+            <w:tcMar>
+              <w:top w:w="70" w:type="dxa"/>
+              <w:left w:w="110" w:type="dxa"/>
+              <w:bottom w:w="70" w:type="dxa"/>
+              <w:right w:w="110" w:type="dxa"/>
+            </w:tcMar>
+          </w:tcPr>
+          <w:p>
+            <w:pPr>
+              <w:spacing w:line="252" w:lineRule="auto"/>
+            </w:pPr>
+            <w:r>
+              <w:rPr>
+                <w:sz w:val="19"/>
+                <w:szCs w:val="19"/>
+              </w:rPr>
+              <w:t>Serveur VPS 2 vCPU, 2 à 4 Go de RAM (Europe)</w:t>
+            </w:r>
+          </w:p>
+        </w:tc>
+        <w:tc>
+          <w:tcPr>
+            <w:tcW w:w="2527" w:type="dxa"/>
+            <w:tcBorders>
+              <w:top w:val="single" w:sz="4" w:space="0" w:color="D9D9D9"/>
+              <w:left w:val="single" w:sz="4" w:space="0" w:color="D9D9D9"/>
+              <w:bottom w:val="single" w:sz="4" w:space="0" w:color="D9D9D9"/>
+              <w:right w:val="single" w:sz="4" w:space="0" w:color="D9D9D9"/>
+            </w:tcBorders>
+            <w:tcMar>
+              <w:top w:w="70" w:type="dxa"/>
+              <w:left w:w="110" w:type="dxa"/>
+              <w:bottom w:w="70" w:type="dxa"/>
+              <w:right w:w="110" w:type="dxa"/>
+            </w:tcMar>
+          </w:tcPr>
+          <w:p>
+            <w:pPr>
+              <w:spacing w:line="252" w:lineRule="auto"/>
+            </w:pPr>
+            <w:r>
+              <w:rPr>
+                <w:sz w:val="19"/>
+                <w:szCs w:val="19"/>
+              </w:rPr>
+              <w:t>≈ 6 à 12 € / mois</w:t>
+            </w:r>
+          </w:p>
+          <w:p>
+            <w:pPr>
+              <w:spacing w:line="252" w:lineRule="auto"/>
+            </w:pPr>
+            <w:r>
+              <w:rPr>
+                <w:sz w:val="19"/>
+                <w:szCs w:val="19"/>
+              </w:rPr>
+              <w:t>(≈ 4 000 à 8 000 FCFA)</w:t>
+            </w:r>
+          </w:p>
+        </w:tc>
+        <w:tc>
+          <w:tcPr>
+            <w:tcW w:w="3250" w:type="dxa"/>
+            <w:tcBorders>
+              <w:top w:val="single" w:sz="4" w:space="0" w:color="D9D9D9"/>
+              <w:left w:val="single" w:sz="4" w:space="0" w:color="D9D9D9"/>
+              <w:bottom w:val="single" w:sz="4" w:space="0" w:color="D9D9D9"/>
+              <w:right w:val="single" w:sz="4" w:space="0" w:color="D9D9D9"/>
+            </w:tcBorders>
+            <w:tcMar>
+              <w:top w:w="70" w:type="dxa"/>
+              <w:left w:w="110" w:type="dxa"/>
+              <w:bottom w:w="70" w:type="dxa"/>
+              <w:right w:w="110" w:type="dxa"/>
+            </w:tcMar>
+          </w:tcPr>
+          <w:p>
+            <w:pPr>
+              <w:spacing w:line="252" w:lineRule="auto"/>
+            </w:pPr>
+            <w:r>
+              <w:rPr>
+                <w:sz w:val="19"/>
+                <w:szCs w:val="19"/>
+              </w:rPr>
+              <w:t>Hetzner ou DigitalOcean ; tarifs révisés plusieurs fois en 2026</w:t>
+            </w:r>
+          </w:p>
+        </w:tc>
+      </w:tr>
+      <w:tr>
+        <w:tblPrEx>
+          <w:tblCellMar>
+            <w:top w:w="0" w:type="dxa"/>
+            <w:bottom w:w="0" w:type="dxa"/>
+          </w:tblCellMar>
+        </w:tblPrEx>
+        <w:tc>
+          <w:tcPr>
+            <w:tcW w:w="3249" w:type="dxa"/>
+            <w:tcBorders>
+              <w:top w:val="single" w:sz="4" w:space="0" w:color="D9D9D9"/>
+              <w:left w:val="single" w:sz="4" w:space="0" w:color="D9D9D9"/>
+              <w:bottom w:val="single" w:sz="4" w:space="0" w:color="D9D9D9"/>
+              <w:right w:val="single" w:sz="4" w:space="0" w:color="D9D9D9"/>
+            </w:tcBorders>
+            <w:shd w:val="clear" w:color="auto" w:fill="FAF7F2"/>
+            <w:tcMar>
+              <w:top w:w="70" w:type="dxa"/>
+              <w:left w:w="110" w:type="dxa"/>
+              <w:bottom w:w="70" w:type="dxa"/>
+              <w:right w:w="110" w:type="dxa"/>
+            </w:tcMar>
+          </w:tcPr>
+          <w:p>
+            <w:pPr>
+              <w:spacing w:line="252" w:lineRule="auto"/>
+            </w:pPr>
+            <w:r>
+              <w:rPr>
+                <w:sz w:val="19"/>
+                <w:szCs w:val="19"/>
+              </w:rPr>
+              <w:t>Nom de domaine .com</w:t>
+            </w:r>
+          </w:p>
+        </w:tc>
+        <w:tc>
+          <w:tcPr>
+            <w:tcW w:w="2527" w:type="dxa"/>
+            <w:tcBorders>
+              <w:top w:val="single" w:sz="4" w:space="0" w:color="D9D9D9"/>
+              <w:left w:val="single" w:sz="4" w:space="0" w:color="D9D9D9"/>
+              <w:bottom w:val="single" w:sz="4" w:space="0" w:color="D9D9D9"/>
+              <w:right w:val="single" w:sz="4" w:space="0" w:color="D9D9D9"/>
+            </w:tcBorders>
+            <w:shd w:val="clear" w:color="auto" w:fill="FAF7F2"/>
+            <w:tcMar>
+              <w:top w:w="70" w:type="dxa"/>
+              <w:left w:w="110" w:type="dxa"/>
+              <w:bottom w:w="70" w:type="dxa"/>
+              <w:right w:w="110" w:type="dxa"/>
+            </w:tcMar>
+          </w:tcPr>
+          <w:p>
+            <w:pPr>
+              <w:spacing w:line="252" w:lineRule="auto"/>
+            </w:pPr>
+            <w:r>
+              <w:rPr>
+                <w:sz w:val="19"/>
+                <w:szCs w:val="19"/>
+              </w:rPr>
+              <w:t>≈ 10 à 15 € / an</w:t>
+            </w:r>
+          </w:p>
+        </w:tc>
+        <w:tc>
+          <w:tcPr>
+            <w:tcW w:w="3250" w:type="dxa"/>
+            <w:tcBorders>
+              <w:top w:val="single" w:sz="4" w:space="0" w:color="D9D9D9"/>
+              <w:left w:val="single" w:sz="4" w:space="0" w:color="D9D9D9"/>
+              <w:bottom w:val="single" w:sz="4" w:space="0" w:color="D9D9D9"/>
+              <w:right w:val="single" w:sz="4" w:space="0" w:color="D9D9D9"/>
+            </w:tcBorders>
+            <w:shd w:val="clear" w:color="auto" w:fill="FAF7F2"/>
+            <w:tcMar>
+              <w:top w:w="70" w:type="dxa"/>
+              <w:left w:w="110" w:type="dxa"/>
+              <w:bottom w:w="70" w:type="dxa"/>
+              <w:right w:w="110" w:type="dxa"/>
+            </w:tcMar>
+          </w:tcPr>
+          <w:p>
+            <w:pPr>
+              <w:spacing w:line="252" w:lineRule="auto"/>
+            </w:pPr>
+            <w:r>
+              <w:rPr>
+                <w:sz w:val="19"/>
+                <w:szCs w:val="19"/>
+              </w:rPr>
+              <w:t>Renouvellement annuel</w:t>
+            </w:r>
+          </w:p>
+        </w:tc>
+      </w:tr>
+      <w:tr>
+        <w:tblPrEx>
+          <w:tblCellMar>
+            <w:top w:w="0" w:type="dxa"/>
+            <w:bottom w:w="0" w:type="dxa"/>
+          </w:tblCellMar>
+        </w:tblPrEx>
+        <w:tc>
+          <w:tcPr>
+            <w:tcW w:w="3249" w:type="dxa"/>
+            <w:tcBorders>
+              <w:top w:val="single" w:sz="4" w:space="0" w:color="D9D9D9"/>
+              <w:left w:val="single" w:sz="4" w:space="0" w:color="D9D9D9"/>
+              <w:bottom w:val="single" w:sz="4" w:space="0" w:color="D9D9D9"/>
+              <w:right w:val="single" w:sz="4" w:space="0" w:color="D9D9D9"/>
+            </w:tcBorders>
+            <w:tcMar>
+              <w:top w:w="70" w:type="dxa"/>
+              <w:left w:w="110" w:type="dxa"/>
+              <w:bottom w:w="70" w:type="dxa"/>
+              <w:right w:w="110" w:type="dxa"/>
+            </w:tcMar>
+          </w:tcPr>
+          <w:p>
+            <w:pPr>
+              <w:spacing w:line="252" w:lineRule="auto"/>
+            </w:pPr>
+            <w:r>
+              <w:rPr>
+                <w:sz w:val="19"/>
+                <w:szCs w:val="19"/>
+              </w:rPr>
+              <w:t>Nom de domaine .sn</w:t>
+            </w:r>
+          </w:p>
+        </w:tc>
+        <w:tc>
+          <w:tcPr>
+            <w:tcW w:w="2527" w:type="dxa"/>
+            <w:tcBorders>
+              <w:top w:val="single" w:sz="4" w:space="0" w:color="D9D9D9"/>
+              <w:left w:val="single" w:sz="4" w:space="0" w:color="D9D9D9"/>
+              <w:bottom w:val="single" w:sz="4" w:space="0" w:color="D9D9D9"/>
+              <w:right w:val="single" w:sz="4" w:space="0" w:color="D9D9D9"/>
+            </w:tcBorders>
+            <w:tcMar>
+              <w:top w:w="70" w:type="dxa"/>
+              <w:left w:w="110" w:type="dxa"/>
+              <w:bottom w:w="70" w:type="dxa"/>
+              <w:right w:w="110" w:type="dxa"/>
+            </w:tcMar>
+          </w:tcPr>
+          <w:p>
+            <w:pPr>
+              <w:spacing w:line="252" w:lineRule="auto"/>
+            </w:pPr>
+            <w:r>
+              <w:rPr>
+                <w:sz w:val="19"/>
+                <w:szCs w:val="19"/>
+              </w:rPr>
+              <w:t>≈ 15 000 à 25 000 FCFA / an</w:t>
+            </w:r>
+          </w:p>
+        </w:tc>
+        <w:tc>
+          <w:tcPr>
+            <w:tcW w:w="3250" w:type="dxa"/>
+            <w:tcBorders>
+              <w:top w:val="single" w:sz="4" w:space="0" w:color="D9D9D9"/>
+              <w:left w:val="single" w:sz="4" w:space="0" w:color="D9D9D9"/>
+              <w:bottom w:val="single" w:sz="4" w:space="0" w:color="D9D9D9"/>
+              <w:right w:val="single" w:sz="4" w:space="0" w:color="D9D9D9"/>
+            </w:tcBorders>
+            <w:tcMar>
+              <w:top w:w="70" w:type="dxa"/>
+              <w:left w:w="110" w:type="dxa"/>
+              <w:bottom w:w="70" w:type="dxa"/>
+              <w:right w:w="110" w:type="dxa"/>
+            </w:tcMar>
+          </w:tcPr>
+          <w:p>
+            <w:pPr>
+              <w:spacing w:line="252" w:lineRule="auto"/>
+            </w:pPr>
+            <w:r>
+              <w:rPr>
+                <w:sz w:val="19"/>
+                <w:szCs w:val="19"/>
+              </w:rPr>
+              <w:t>Plafond NIC Sénégal annoncé : 18 000 FCFA TTC chez les registraires agréés</w:t>
+            </w:r>
+          </w:p>
+        </w:tc>
+      </w:tr>
+      <w:tr>
+        <w:tblPrEx>
+          <w:tblCellMar>
+            <w:top w:w="0" w:type="dxa"/>
+            <w:bottom w:w="0" w:type="dxa"/>
+          </w:tblCellMar>
+        </w:tblPrEx>
+        <w:tc>
+          <w:tcPr>
+            <w:tcW w:w="3249" w:type="dxa"/>
+            <w:tcBorders>
+              <w:top w:val="single" w:sz="4" w:space="0" w:color="D9D9D9"/>
+              <w:left w:val="single" w:sz="4" w:space="0" w:color="D9D9D9"/>
+              <w:bottom w:val="single" w:sz="4" w:space="0" w:color="D9D9D9"/>
+              <w:right w:val="single" w:sz="4" w:space="0" w:color="D9D9D9"/>
+            </w:tcBorders>
+            <w:shd w:val="clear" w:color="auto" w:fill="FAF7F2"/>
+            <w:tcMar>
+              <w:top w:w="70" w:type="dxa"/>
+              <w:left w:w="110" w:type="dxa"/>
+              <w:bottom w:w="70" w:type="dxa"/>
+              <w:right w:w="110" w:type="dxa"/>
+            </w:tcMar>
+          </w:tcPr>
+          <w:p>
+            <w:pPr>
+              <w:spacing w:line="252" w:lineRule="auto"/>
+            </w:pPr>
+            <w:r>
+              <w:rPr>
+                <w:sz w:val="19"/>
+                <w:szCs w:val="19"/>
+              </w:rPr>
+              <w:t>Emails (SMTP)</w:t>
+            </w:r>
+          </w:p>
+        </w:tc>
+        <w:tc>
+          <w:tcPr>
+            <w:tcW w:w="2527" w:type="dxa"/>
+            <w:tcBorders>
+              <w:top w:val="single" w:sz="4" w:space="0" w:color="D9D9D9"/>
+              <w:left w:val="single" w:sz="4" w:space="0" w:color="D9D9D9"/>
+              <w:bottom w:val="single" w:sz="4" w:space="0" w:color="D9D9D9"/>
+              <w:right w:val="single" w:sz="4" w:space="0" w:color="D9D9D9"/>
+            </w:tcBorders>
+            <w:shd w:val="clear" w:color="auto" w:fill="FAF7F2"/>
+            <w:tcMar>
+              <w:top w:w="70" w:type="dxa"/>
+              <w:left w:w="110" w:type="dxa"/>
+              <w:bottom w:w="70" w:type="dxa"/>
+              <w:right w:w="110" w:type="dxa"/>
+            </w:tcMar>
+          </w:tcPr>
+          <w:p>
+            <w:pPr>
+              <w:spacing w:line="252" w:lineRule="auto"/>
+            </w:pPr>
+            <w:r>
+              <w:rPr>
+                <w:sz w:val="19"/>
+                <w:szCs w:val="19"/>
+              </w:rPr>
+              <w:t>Gratuit jusqu’à 300 emails / jour</w:t>
+            </w:r>
+          </w:p>
+        </w:tc>
+        <w:tc>
+          <w:tcPr>
+            <w:tcW w:w="3250" w:type="dxa"/>
+            <w:tcBorders>
+              <w:top w:val="single" w:sz="4" w:space="0" w:color="D9D9D9"/>
+              <w:left w:val="single" w:sz="4" w:space="0" w:color="D9D9D9"/>
+              <w:bottom w:val="single" w:sz="4" w:space="0" w:color="D9D9D9"/>
+              <w:right w:val="single" w:sz="4" w:space="0" w:color="D9D9D9"/>
+            </w:tcBorders>
+            <w:shd w:val="clear" w:color="auto" w:fill="FAF7F2"/>
+            <w:tcMar>
+              <w:top w:w="70" w:type="dxa"/>
+              <w:left w:w="110" w:type="dxa"/>
+              <w:bottom w:w="70" w:type="dxa"/>
+              <w:right w:w="110" w:type="dxa"/>
+            </w:tcMar>
+          </w:tcPr>
+          <w:p>
+            <w:pPr>
+              <w:spacing w:line="252" w:lineRule="auto"/>
+            </w:pPr>
+            <w:r>
+              <w:rPr>
+                <w:sz w:val="19"/>
+                <w:szCs w:val="19"/>
+              </w:rPr>
+              <w:t>Offre gratuite Brevo ; formule payante si le volume augmente</w:t>
+            </w:r>
+          </w:p>
+        </w:tc>
+      </w:tr>
+      <w:tr>
+        <w:tblPrEx>
+          <w:tblCellMar>
+            <w:top w:w="0" w:type="dxa"/>
+            <w:bottom w:w="0" w:type="dxa"/>
+          </w:tblCellMar>
+        </w:tblPrEx>
+        <w:tc>
+          <w:tcPr>
+            <w:tcW w:w="3249" w:type="dxa"/>
+            <w:tcBorders>
+              <w:top w:val="single" w:sz="4" w:space="0" w:color="D9D9D9"/>
+              <w:left w:val="single" w:sz="4" w:space="0" w:color="D9D9D9"/>
+              <w:bottom w:val="single" w:sz="4" w:space="0" w:color="D9D9D9"/>
+              <w:right w:val="single" w:sz="4" w:space="0" w:color="D9D9D9"/>
+            </w:tcBorders>
+            <w:tcMar>
+              <w:top w:w="70" w:type="dxa"/>
+              <w:left w:w="110" w:type="dxa"/>
+              <w:bottom w:w="70" w:type="dxa"/>
+              <w:right w:w="110" w:type="dxa"/>
+            </w:tcMar>
+          </w:tcPr>
+          <w:p>
+            <w:pPr>
+              <w:spacing w:line="252" w:lineRule="auto"/>
+            </w:pPr>
+            <w:r>
+              <w:rPr>
+                <w:sz w:val="19"/>
+                <w:szCs w:val="19"/>
+              </w:rPr>
+              <w:t>Certificat HTTPS</w:t>
+            </w:r>
+          </w:p>
+        </w:tc>
+        <w:tc>
+          <w:tcPr>
+            <w:tcW w:w="2527" w:type="dxa"/>
+            <w:tcBorders>
+              <w:top w:val="single" w:sz="4" w:space="0" w:color="D9D9D9"/>
+              <w:left w:val="single" w:sz="4" w:space="0" w:color="D9D9D9"/>
+              <w:bottom w:val="single" w:sz="4" w:space="0" w:color="D9D9D9"/>
+              <w:right w:val="single" w:sz="4" w:space="0" w:color="D9D9D9"/>
+            </w:tcBorders>
+            <w:tcMar>
+              <w:top w:w="70" w:type="dxa"/>
+              <w:left w:w="110" w:type="dxa"/>
+              <w:bottom w:w="70" w:type="dxa"/>
+              <w:right w:w="110" w:type="dxa"/>
+            </w:tcMar>
+          </w:tcPr>
+          <w:p>
+            <w:pPr>
+              <w:spacing w:line="252" w:lineRule="auto"/>
+            </w:pPr>
+            <w:r>
+              <w:rPr>
+                <w:sz w:val="19"/>
+                <w:szCs w:val="19"/>
+              </w:rPr>
+              <w:t>Gratuit</w:t>
+            </w:r>
+          </w:p>
+        </w:tc>
+        <w:tc>
+          <w:tcPr>
+            <w:tcW w:w="3250" w:type="dxa"/>
+            <w:tcBorders>
+              <w:top w:val="single" w:sz="4" w:space="0" w:color="D9D9D9"/>
+              <w:left w:val="single" w:sz="4" w:space="0" w:color="D9D9D9"/>
+              <w:bottom w:val="single" w:sz="4" w:space="0" w:color="D9D9D9"/>
+              <w:right w:val="single" w:sz="4" w:space="0" w:color="D9D9D9"/>
+            </w:tcBorders>
+            <w:tcMar>
+              <w:top w:w="70" w:type="dxa"/>
+              <w:left w:w="110" w:type="dxa"/>
+              <w:bottom w:w="70" w:type="dxa"/>
+              <w:right w:w="110" w:type="dxa"/>
+            </w:tcMar>
+          </w:tcPr>
+          <w:p>
+            <w:pPr>
+              <w:spacing w:line="252" w:lineRule="auto"/>
+            </w:pPr>
+            <w:r>
+              <w:rPr>
+                <w:sz w:val="19"/>
+                <w:szCs w:val="19"/>
+              </w:rPr>
+              <w:t>Let’s Encrypt, automatique</w:t>
+            </w:r>
+          </w:p>
+        </w:tc>
+      </w:tr>
+      <w:tr>
+        <w:tblPrEx>
+          <w:tblCellMar>
+            <w:top w:w="0" w:type="dxa"/>
+            <w:bottom w:w="0" w:type="dxa"/>
+          </w:tblCellMar>
+        </w:tblPrEx>
+        <w:tc>
+          <w:tcPr>
+            <w:tcW w:w="3249" w:type="dxa"/>
+            <w:tcBorders>
+              <w:top w:val="single" w:sz="4" w:space="0" w:color="D9D9D9"/>
+              <w:left w:val="single" w:sz="4" w:space="0" w:color="D9D9D9"/>
+              <w:bottom w:val="single" w:sz="4" w:space="0" w:color="D9D9D9"/>
+              <w:right w:val="single" w:sz="4" w:space="0" w:color="D9D9D9"/>
+            </w:tcBorders>
+            <w:shd w:val="clear" w:color="auto" w:fill="FAF7F2"/>
+            <w:tcMar>
+              <w:top w:w="70" w:type="dxa"/>
+              <w:left w:w="110" w:type="dxa"/>
+              <w:bottom w:w="70" w:type="dxa"/>
+              <w:right w:w="110" w:type="dxa"/>
+            </w:tcMar>
+          </w:tcPr>
+          <w:p>
+            <w:pPr>
+              <w:spacing w:line="252" w:lineRule="auto"/>
+            </w:pPr>
+            <w:r>
+              <w:rPr>
+                <w:sz w:val="19"/>
+                <w:szCs w:val="19"/>
+              </w:rPr>
+              <w:t>Copie des sauvegardes hors du serveur</w:t>
+            </w:r>
+          </w:p>
+        </w:tc>
+        <w:tc>
+          <w:tcPr>
+            <w:tcW w:w="2527" w:type="dxa"/>
+            <w:tcBorders>
+              <w:top w:val="single" w:sz="4" w:space="0" w:color="D9D9D9"/>
+              <w:left w:val="single" w:sz="4" w:space="0" w:color="D9D9D9"/>
+              <w:bottom w:val="single" w:sz="4" w:space="0" w:color="D9D9D9"/>
+              <w:right w:val="single" w:sz="4" w:space="0" w:color="D9D9D9"/>
+            </w:tcBorders>
+            <w:shd w:val="clear" w:color="auto" w:fill="FAF7F2"/>
+            <w:tcMar>
+              <w:top w:w="70" w:type="dxa"/>
+              <w:left w:w="110" w:type="dxa"/>
+              <w:bottom w:w="70" w:type="dxa"/>
+              <w:right w:w="110" w:type="dxa"/>
+            </w:tcMar>
+          </w:tcPr>
+          <w:p>
+            <w:pPr>
+              <w:spacing w:line="252" w:lineRule="auto"/>
+            </w:pPr>
+            <w:r>
+              <w:rPr>
+                <w:sz w:val="19"/>
+                <w:szCs w:val="19"/>
+              </w:rPr>
+              <w:t>0 à 5 € / mois</w:t>
+            </w:r>
+          </w:p>
+        </w:tc>
+        <w:tc>
+          <w:tcPr>
+            <w:tcW w:w="3250" w:type="dxa"/>
+            <w:tcBorders>
+              <w:top w:val="single" w:sz="4" w:space="0" w:color="D9D9D9"/>
+              <w:left w:val="single" w:sz="4" w:space="0" w:color="D9D9D9"/>
+              <w:bottom w:val="single" w:sz="4" w:space="0" w:color="D9D9D9"/>
+              <w:right w:val="single" w:sz="4" w:space="0" w:color="D9D9D9"/>
+            </w:tcBorders>
+            <w:shd w:val="clear" w:color="auto" w:fill="FAF7F2"/>
+            <w:tcMar>
+              <w:top w:w="70" w:type="dxa"/>
+              <w:left w:w="110" w:type="dxa"/>
+              <w:bottom w:w="70" w:type="dxa"/>
+              <w:right w:w="110" w:type="dxa"/>
+            </w:tcMar>
+          </w:tcPr>
+          <w:p>
+            <w:pPr>
+              <w:spacing w:line="252" w:lineRule="auto"/>
+            </w:pPr>
+            <w:r>
+              <w:rPr>
+                <w:sz w:val="19"/>
+                <w:szCs w:val="19"/>
+              </w:rPr>
+              <w:t>Disque externe ou stockage en ligne</w:t>
+            </w:r>
+          </w:p>
+        </w:tc>
+      </w:tr>
+    </w:tbl>
+    <w:p>
+      <w:pPr>
+        <w:spacing w:after="80"/>
+      </w:pPr>
+    </w:p>
+    <w:p>
+      <w:pPr>
+        <w:spacing w:after="120" w:line="276" w:lineRule="auto"/>
+      </w:pPr>
+      <w:r>
+        <w:t xml:space="preserve">Budget de fonctionnement : </w:t>
+      </w:r>
+      <w:r>
+        <w:rPr>
+          <w:b/>
+          <w:bCs/>
+        </w:rPr>
+        <w:t>environ 5 000 à 10 000 FCFA par mois</w:t>
+      </w:r>
+      <w:r>
+        <w:t>, plus le domaine une fois par an. Les prix sont relevés en octobre 2026 et doivent être vérifiés au moment de la commande.</w:t>
+      </w:r>
+    </w:p>
+    <w:p>
+      <w:pPr>
+        <w:pStyle w:val="Titre2"/>
+      </w:pPr>
+      <w:bookmarkStart w:id="40" w:name="_Toc242021080"/>
+      <w:r>
+        <w:t>15.4 Étapes de mise en ligne</w:t>
+      </w:r>
+      <w:bookmarkEnd w:id="40"/>
+    </w:p>
+    <w:p>
+      <w:pPr>
+        <w:pStyle w:val="Paragraphedeliste"/>
+        <w:numPr>
+          <w:ilvl w:val="0"/>
+          <w:numId w:val="6"/>
+        </w:numPr>
+        <w:spacing w:after="60"/>
+      </w:pPr>
+      <w:r>
+        <w:t xml:space="preserve">Acheter le </w:t>
+      </w:r>
+      <w:r>
+        <w:rPr>
+          <w:b/>
+          <w:bCs/>
+        </w:rPr>
+        <w:t>nom de domaine</w:t>
+      </w:r>
+      <w:r>
+        <w:t xml:space="preserve"> et louer le </w:t>
+      </w:r>
+      <w:r>
+        <w:rPr>
+          <w:b/>
+          <w:bCs/>
+        </w:rPr>
+        <w:t>serveur</w:t>
+      </w:r>
+      <w:r>
+        <w:t xml:space="preserve"> (Ubuntu LTS).</w:t>
+      </w:r>
+    </w:p>
+    <w:p>
+      <w:pPr>
+        <w:pStyle w:val="Paragraphedeliste"/>
+        <w:numPr>
+          <w:ilvl w:val="0"/>
+          <w:numId w:val="6"/>
+        </w:numPr>
+        <w:spacing w:after="60"/>
+      </w:pPr>
+      <w:r>
+        <w:t xml:space="preserve">Sécuriser le serveur : connexion SSH </w:t>
+      </w:r>
+      <w:r>
+        <w:rPr>
+          <w:b/>
+          <w:bCs/>
+        </w:rPr>
+        <w:t>par clé uniquement</w:t>
+      </w:r>
+      <w:r>
+        <w:t>, pare-feu n’ouvrant que les ports 22, 80 et 443, mises à jour de sécurité automatiques.</w:t>
+      </w:r>
+    </w:p>
+    <w:p>
+      <w:pPr>
+        <w:pStyle w:val="Paragraphedeliste"/>
+        <w:numPr>
+          <w:ilvl w:val="0"/>
+          <w:numId w:val="6"/>
+        </w:numPr>
+        <w:spacing w:after="60"/>
+      </w:pPr>
+      <w:r>
+        <w:t xml:space="preserve">Installer </w:t>
+      </w:r>
+      <w:r>
+        <w:rPr>
+          <w:b/>
+          <w:bCs/>
+        </w:rPr>
+        <w:t>Docker</w:t>
+      </w:r>
+      <w:r>
+        <w:t xml:space="preserve"> sur le serveur.</w:t>
+      </w:r>
+    </w:p>
+    <w:p>
+      <w:pPr>
+        <w:pStyle w:val="Paragraphedeliste"/>
+        <w:numPr>
+          <w:ilvl w:val="0"/>
+          <w:numId w:val="6"/>
+        </w:numPr>
+        <w:spacing w:after="60"/>
+      </w:pPr>
+      <w:r>
+        <w:t xml:space="preserve">Chez le registraire, créer l’enregistrement DNS </w:t>
+      </w:r>
+      <w:r>
+        <w:rPr>
+          <w:b/>
+          <w:bCs/>
+        </w:rPr>
+        <w:t>A</w:t>
+      </w:r>
+      <w:r>
+        <w:t xml:space="preserve"> du domaine (et de « www ») vers l’adresse IP du serveur.</w:t>
+      </w:r>
+    </w:p>
+    <w:p>
+      <w:pPr>
+        <w:pStyle w:val="Paragraphedeliste"/>
+        <w:numPr>
+          <w:ilvl w:val="0"/>
+          <w:numId w:val="6"/>
+        </w:numPr>
+        <w:spacing w:after="60"/>
+      </w:pPr>
+      <w:r>
+        <w:t xml:space="preserve">Créer le compte </w:t>
+      </w:r>
+      <w:r>
+        <w:rPr>
+          <w:b/>
+          <w:bCs/>
+        </w:rPr>
+        <w:t>SMTP</w:t>
+      </w:r>
+      <w:r>
+        <w:t xml:space="preserve"> et valider le domaine d’envoi (enregistrements SPF et DKIM fournis par le prestataire).</w:t>
+      </w:r>
+    </w:p>
+    <w:p>
+      <w:pPr>
+        <w:pStyle w:val="Paragraphedeliste"/>
+        <w:numPr>
+          <w:ilvl w:val="0"/>
+          <w:numId w:val="6"/>
+        </w:numPr>
+        <w:spacing w:after="60"/>
+      </w:pPr>
+      <w:r>
+        <w:t xml:space="preserve">Récupérer le code, copier </w:t>
+      </w:r>
+      <w:r>
+        <w:rPr>
+          <w:b/>
+          <w:bCs/>
+        </w:rPr>
+        <w:t>.env.prod.example</w:t>
+      </w:r>
+      <w:r>
+        <w:t xml:space="preserve"> en </w:t>
+      </w:r>
+      <w:r>
+        <w:rPr>
+          <w:b/>
+          <w:bCs/>
+        </w:rPr>
+        <w:t>.env</w:t>
+      </w:r>
+      <w:r>
+        <w:t xml:space="preserve"> et le remplir : domaine, clé secrète, mot de passe de la base, SMTP, identité de facturation.</w:t>
+      </w:r>
+    </w:p>
+    <w:p>
+      <w:pPr>
+        <w:pStyle w:val="Paragraphedeliste"/>
+        <w:numPr>
+          <w:ilvl w:val="0"/>
+          <w:numId w:val="6"/>
+        </w:numPr>
+        <w:spacing w:after="60"/>
+      </w:pPr>
+      <w:r>
+        <w:t xml:space="preserve">Lancer la plateforme : </w:t>
+      </w:r>
+      <w:r>
+        <w:rPr>
+          <w:b/>
+          <w:bCs/>
+        </w:rPr>
+        <w:t>docker compose -f docker-compose.yml -f docker-compose.prod.yml up -d --build</w:t>
+      </w:r>
+      <w:r>
+        <w:t>.</w:t>
+      </w:r>
+    </w:p>
+    <w:p>
+      <w:pPr>
+        <w:pStyle w:val="Paragraphedeliste"/>
+        <w:numPr>
+          <w:ilvl w:val="0"/>
+          <w:numId w:val="6"/>
+        </w:numPr>
+        <w:spacing w:after="60"/>
+      </w:pPr>
+      <w:r>
+        <w:t xml:space="preserve">Créer le compte administrateur : </w:t>
+      </w:r>
+      <w:r>
+        <w:rPr>
+          <w:b/>
+          <w:bCs/>
+        </w:rPr>
+        <w:t>docker compose exec backend python manage.py createsuperuser</w:t>
+      </w:r>
+      <w:r>
+        <w:t>.</w:t>
+      </w:r>
+    </w:p>
+    <w:p>
+      <w:pPr>
+        <w:pStyle w:val="Paragraphedeliste"/>
+        <w:numPr>
+          <w:ilvl w:val="0"/>
+          <w:numId w:val="6"/>
+        </w:numPr>
+        <w:spacing w:after="60"/>
+      </w:pPr>
+      <w:r>
+        <w:t xml:space="preserve">Dans </w:t>
+      </w:r>
+      <w:r>
+        <w:rPr>
+          <w:b/>
+          <w:bCs/>
+        </w:rPr>
+        <w:t>/admin/</w:t>
+      </w:r>
+      <w:r>
+        <w:t xml:space="preserve"> : comptes de l’équipe, horaires, fermetures, catalogue (liste du chapitre 13.1).</w:t>
+      </w:r>
+    </w:p>
+    <w:p>
+      <w:pPr>
+        <w:pStyle w:val="Paragraphedeliste"/>
+        <w:numPr>
+          <w:ilvl w:val="0"/>
+          <w:numId w:val="6"/>
+        </w:numPr>
+        <w:spacing w:after="60"/>
+      </w:pPr>
+      <w:r>
+        <w:t>Tester un parcours complet : réservation, email reçu, réception, encaissement, facture PDF.</w:t>
+      </w:r>
+    </w:p>
+    <w:p>
+      <w:pPr>
+        <w:pStyle w:val="Paragraphedeliste"/>
+        <w:numPr>
+          <w:ilvl w:val="0"/>
+          <w:numId w:val="6"/>
+        </w:numPr>
+        <w:spacing w:after="60"/>
+      </w:pPr>
+      <w:r>
+        <w:t>Annoncer le site.</w:t>
+      </w:r>
+    </w:p>
+    <w:p>
+      <w:pPr>
+        <w:pBdr>
+          <w:left w:val="single" w:sz="18" w:space="8" w:color="B87D24"/>
+        </w:pBdr>
+        <w:shd w:val="clear" w:color="auto" w:fill="F4EBDD"/>
+        <w:spacing w:before="120" w:after="160" w:line="264" w:lineRule="auto"/>
+        <w:ind w:left="200" w:right="200"/>
+      </w:pPr>
+      <w:r>
+        <w:rPr>
+          <w:b/>
+          <w:bCs/>
+          <w:color w:val="B87D24"/>
+        </w:rPr>
+        <w:t xml:space="preserve">À ne pas faire : </w:t>
+      </w:r>
+      <w:r>
+        <w:t>charger les données de démonstration en production, ou partager le fichier .env (il contient les mots de passe).</w:t>
+      </w:r>
+    </w:p>
+    <w:p>
+      <w:pPr>
+        <w:pStyle w:val="Titre2"/>
+      </w:pPr>
+      <w:bookmarkStart w:id="41" w:name="_Toc242021081"/>
+      <w:r>
+        <w:t>15.5 Après la mise en ligne</w:t>
+      </w:r>
+      <w:bookmarkEnd w:id="41"/>
+    </w:p>
+    <w:p>
+      <w:pPr>
+        <w:pStyle w:val="Paragraphedeliste"/>
+        <w:numPr>
+          <w:ilvl w:val="0"/>
+          <w:numId w:val="2"/>
+        </w:numPr>
+        <w:spacing w:after="60" w:line="264" w:lineRule="auto"/>
+      </w:pPr>
+      <w:r>
+        <w:rPr>
+          <w:b/>
+          <w:bCs/>
+        </w:rPr>
+        <w:t>Sauvegardes</w:t>
+      </w:r>
+      <w:r>
+        <w:t xml:space="preserve"> : récupérer chaque semaine une copie hors du serveur (</w:t>
+      </w:r>
+      <w:r>
+        <w:rPr>
+          <w:b/>
+          <w:bCs/>
+        </w:rPr>
+        <w:t>docker compose cp backup:/backups ./sauvegardes</w:t>
+      </w:r>
+      <w:r>
+        <w:t>) et tester une restauration une fois par trimestre.</w:t>
+      </w:r>
+    </w:p>
+    <w:p>
+      <w:pPr>
+        <w:pStyle w:val="Paragraphedeliste"/>
+        <w:numPr>
+          <w:ilvl w:val="0"/>
+          <w:numId w:val="2"/>
+        </w:numPr>
+        <w:spacing w:after="60" w:line="264" w:lineRule="auto"/>
+      </w:pPr>
+      <w:r>
+        <w:rPr>
+          <w:b/>
+          <w:bCs/>
+        </w:rPr>
+        <w:t>Mises à jour</w:t>
+      </w:r>
+      <w:r>
+        <w:t xml:space="preserve"> : </w:t>
+      </w:r>
+      <w:r>
+        <w:rPr>
+          <w:b/>
+          <w:bCs/>
+        </w:rPr>
+        <w:t>git pull</w:t>
+      </w:r>
+      <w:r>
+        <w:t xml:space="preserve"> puis la même commande de lancement ; prévoir un créneau calme.</w:t>
+      </w:r>
+    </w:p>
+    <w:p>
+      <w:pPr>
+        <w:pStyle w:val="Paragraphedeliste"/>
+        <w:numPr>
+          <w:ilvl w:val="0"/>
+          <w:numId w:val="2"/>
+        </w:numPr>
+        <w:spacing w:after="60" w:line="264" w:lineRule="auto"/>
+      </w:pPr>
+      <w:r>
+        <w:rPr>
+          <w:b/>
+          <w:bCs/>
+        </w:rPr>
+        <w:t>Surveillance</w:t>
+      </w:r>
+      <w:r>
+        <w:t xml:space="preserve"> : un service gratuit de vérification de disponibilité (ex. alerte si le site ne répond plus) est recommandé.</w:t>
+      </w:r>
+    </w:p>
+    <w:p>
+      <w:pPr>
+        <w:pStyle w:val="Paragraphedeliste"/>
+        <w:numPr>
+          <w:ilvl w:val="0"/>
+          <w:numId w:val="2"/>
+        </w:numPr>
+        <w:spacing w:after="60" w:line="264" w:lineRule="auto"/>
+      </w:pPr>
+      <w:r>
+        <w:rPr>
+          <w:b/>
+          <w:bCs/>
+        </w:rPr>
+        <w:t>Renouvellements</w:t>
+      </w:r>
+      <w:r>
+        <w:t xml:space="preserve"> : noter les dates d’échéance du domaine et du serveur ; un domaine expiré coupe le site et les emails.</w:t>
+      </w:r>
+    </w:p>
+    <w:p>
+      <w:pPr>
+        <w:pStyle w:val="Titre1"/>
+        <w:pageBreakBefore/>
+      </w:pPr>
+      <w:bookmarkStart w:id="42" w:name="_Toc242021082"/>
       <w:r>
         <w:lastRenderedPageBreak/>
         <w:t>Annexe — Repères techniques</w:t>
       </w:r>
-      <w:bookmarkEnd w:id="36"/>
+      <w:bookmarkEnd w:id="42"/>
     </w:p>
     <w:tbl>
       <w:tblPr>
@@ -15795,7 +18421,7 @@
                 <w:sz w:val="19"/>
                 <w:szCs w:val="19"/>
               </w:rPr>
-              <w:t>Photos</w:t>
+              <w:t>Hébergement</w:t>
             </w:r>
           </w:p>
         </w:tc>
@@ -15825,7 +18451,7 @@
                 <w:sz w:val="19"/>
                 <w:szCs w:val="19"/>
               </w:rPr>
-              <w:t>Stockées sur le serveur ; stockage objet (S3 / Cloudflare R2) prévu pour la production</w:t>
+              <w:t>Docker Compose : PostgreSQL, Django (Gunicorn), Nginx, Caddy (HTTPS), sauvegarde quotidienne</w:t>
             </w:r>
           </w:p>
         </w:tc>
@@ -15862,6 +18488,73 @@
                 <w:sz w:val="19"/>
                 <w:szCs w:val="19"/>
               </w:rPr>
+              <w:t>Photos</w:t>
+            </w:r>
+          </w:p>
+        </w:tc>
+        <w:tc>
+          <w:tcPr>
+            <w:tcW w:w="6499" w:type="dxa"/>
+            <w:tcBorders>
+              <w:top w:val="single" w:sz="4" w:space="0" w:color="D9D9D9"/>
+              <w:left w:val="single" w:sz="4" w:space="0" w:color="D9D9D9"/>
+              <w:bottom w:val="single" w:sz="4" w:space="0" w:color="D9D9D9"/>
+              <w:right w:val="single" w:sz="4" w:space="0" w:color="D9D9D9"/>
+            </w:tcBorders>
+            <w:tcMar>
+              <w:top w:w="70" w:type="dxa"/>
+              <w:left w:w="110" w:type="dxa"/>
+              <w:bottom w:w="70" w:type="dxa"/>
+              <w:right w:w="110" w:type="dxa"/>
+            </w:tcMar>
+          </w:tcPr>
+          <w:p>
+            <w:pPr>
+              <w:spacing w:line="252" w:lineRule="auto"/>
+            </w:pPr>
+            <w:r>
+              <w:rPr>
+                <w:sz w:val="19"/>
+                <w:szCs w:val="19"/>
+              </w:rPr>
+              <w:t>Stockées sur le serveur ; stockage objet (S3 / Cloudflare R2) prévu pour la production</w:t>
+            </w:r>
+          </w:p>
+        </w:tc>
+      </w:tr>
+      <w:tr>
+        <w:tblPrEx>
+          <w:tblCellMar>
+            <w:top w:w="0" w:type="dxa"/>
+            <w:bottom w:w="0" w:type="dxa"/>
+          </w:tblCellMar>
+        </w:tblPrEx>
+        <w:tc>
+          <w:tcPr>
+            <w:tcW w:w="2527" w:type="dxa"/>
+            <w:tcBorders>
+              <w:top w:val="single" w:sz="4" w:space="0" w:color="D9D9D9"/>
+              <w:left w:val="single" w:sz="4" w:space="0" w:color="D9D9D9"/>
+              <w:bottom w:val="single" w:sz="4" w:space="0" w:color="D9D9D9"/>
+              <w:right w:val="single" w:sz="4" w:space="0" w:color="D9D9D9"/>
+            </w:tcBorders>
+            <w:shd w:val="clear" w:color="auto" w:fill="FAF7F2"/>
+            <w:tcMar>
+              <w:top w:w="70" w:type="dxa"/>
+              <w:left w:w="110" w:type="dxa"/>
+              <w:bottom w:w="70" w:type="dxa"/>
+              <w:right w:w="110" w:type="dxa"/>
+            </w:tcMar>
+          </w:tcPr>
+          <w:p>
+            <w:pPr>
+              <w:spacing w:line="252" w:lineRule="auto"/>
+            </w:pPr>
+            <w:r>
+              <w:rPr>
+                <w:sz w:val="19"/>
+                <w:szCs w:val="19"/>
+              </w:rPr>
               <w:t>Code source</w:t>
             </w:r>
           </w:p>
@@ -15875,6 +18568,7 @@
               <w:bottom w:val="single" w:sz="4" w:space="0" w:color="D9D9D9"/>
               <w:right w:val="single" w:sz="4" w:space="0" w:color="D9D9D9"/>
             </w:tcBorders>
+            <w:shd w:val="clear" w:color="auto" w:fill="FAF7F2"/>
             <w:tcMar>
               <w:top w:w="70" w:type="dxa"/>
               <w:left w:w="110" w:type="dxa"/>
@@ -15906,11 +18600,11 @@
       <w:pPr>
         <w:pStyle w:val="Titre2"/>
       </w:pPr>
-      <w:bookmarkStart w:id="37" w:name="_Toc242018817"/>
+      <w:bookmarkStart w:id="43" w:name="_Toc242021083"/>
       <w:r>
         <w:t>Mode démonstration</w:t>
       </w:r>
-      <w:bookmarkEnd w:id="37"/>
+      <w:bookmarkEnd w:id="43"/>
     </w:p>
     <w:p>
       <w:pPr>
@@ -16100,64 +18794,154 @@
 <file path=word/numbering.xml><?xml version="1.0" encoding="utf-8"?>
 <w:numbering xmlns:wpc="http://schemas.microsoft.com/office/word/2010/wordprocessingCanvas" xmlns:cx="http://schemas.microsoft.com/office/drawing/2014/chartex" xmlns:cx1="http://schemas.microsoft.com/office/drawing/2015/9/8/chartex" xmlns:cx2="http://schemas.microsoft.com/office/drawing/2015/10/21/chartex" xmlns:cx3="http://schemas.microsoft.com/office/drawing/2016/5/9/chartex" xmlns:cx4="http://schemas.microsoft.com/office/drawing/2016/5/10/chartex" xmlns:cx5="http://schemas.microsoft.com/office/drawing/2016/5/11/chartex" xmlns:cx6="http://schemas.microsoft.com/office/drawing/2016/5/12/chartex" xmlns:cx7="http://schemas.microsoft.com/office/drawing/2016/5/13/chartex" xmlns:cx8="http://schemas.microsoft.com/office/drawing/2016/5/14/chartex" xmlns:mc="http://schemas.openxmlformats.org/markup-compatibility/2006" xmlns:aink="http://schemas.microsoft.com/office/drawing/2016/ink" xmlns:am3d="http://schemas.microsoft.com/office/drawing/2017/model3d" xmlns:o="urn:schemas-microsoft-com:office:office" xmlns:oel="http://schemas.microsoft.com/office/2019/extlst" xmlns:r="http://schemas.openxmlformats.org/officeDocument/2006/relationships" xmlns:m="http://schemas.openxmlformats.org/officeDocument/2006/math" xmlns:v="urn:schemas-microsoft-com:vml" xmlns:wp14="http://schemas.microsoft.com/office/word/2010/wordprocessingDrawing" xmlns:wp="http://schemas.openxmlformats.org/drawingml/2006/wordprocessingDrawing" xmlns:w10="urn:schemas-microsoft-com:office:word" xmlns:w="http://schemas.openxmlformats.org/wordprocessingml/2006/main" xmlns:w14="http://schemas.microsoft.com/office/word/2010/wordml" xmlns:w15="http://schemas.microsoft.com/office/word/2012/wordml" xmlns:w16cex="http://schemas.microsoft.com/office/word/2018/wordml/cex" xmlns:w16cid="http://schemas.microsoft.com/office/word/2016/wordml/cid" xmlns:w16="http://schemas.microsoft.com/office/word/2018/wordml" xmlns:w16du="http://schemas.microsoft.com/office/word/2023/wordml/word16du" xmlns:w16sdtdh="http://schemas.microsoft.com/office/word/2020/wordml/sdtdatahash" xmlns:w16sdtfl="http://schemas.microsoft.com/office/word/2024/wordml/sdtformatlock" xmlns:w16se="http://schemas.microsoft.com/office/word/2015/wordml/symex" xmlns:wpg="http://schemas.microsoft.com/office/word/2010/wordprocessingGroup" xmlns:wpi="http://schemas.microsoft.com/office/word/2010/wordprocessingInk" xmlns:wne="http://schemas.microsoft.com/office/word/2006/wordml" xmlns:wps="http://schemas.microsoft.com/office/word/2010/wordprocessingShape" mc:Ignorable="w14 w15 w16se w16cid w16 w16cex w16sdtdh w16sdtfl w16du wp14">
   <w:abstractNum w:abstractNumId="0" w15:restartNumberingAfterBreak="0">
-    <w:nsid w:val="23A241F0"/>
+    <w:nsid w:val="0BE32A3C"/>
     <w:multiLevelType w:val="hybridMultilevel"/>
-    <w:tmpl w:val="9C5C02FA"/>
-    <w:lvl w:ilvl="0" w:tplc="735283AC">
+    <w:tmpl w:val="1764CB1E"/>
+    <w:lvl w:ilvl="0" w:tplc="CC80E366">
       <w:start w:val="1"/>
-      <w:numFmt w:val="decimal"/>
-      <w:lvlText w:val="%1."/>
+      <w:numFmt w:val="bullet"/>
+      <w:lvlText w:val="•"/>
       <w:lvlJc w:val="left"/>
       <w:pPr>
-        <w:ind w:left="360" w:hanging="300"/>
+        <w:ind w:left="360" w:hanging="240"/>
       </w:pPr>
     </w:lvl>
-    <w:lvl w:ilvl="1" w:tplc="DDAE185A">
+    <w:lvl w:ilvl="1" w:tplc="6E3EB7CE" w:tentative="1">
+      <w:start w:val="1"/>
+      <w:numFmt w:val="bullet"/>
+      <w:lvlText w:val="–"/>
+      <w:lvlJc w:val="left"/>
+      <w:pPr>
+        <w:ind w:left="720" w:hanging="240"/>
+      </w:pPr>
+    </w:lvl>
+    <w:lvl w:ilvl="2" w:tplc="D2E427CC">
       <w:numFmt w:val="decimal"/>
       <w:lvlText w:val=""/>
       <w:lvlJc w:val="left"/>
     </w:lvl>
-    <w:lvl w:ilvl="2" w:tplc="A4F03692">
+    <w:lvl w:ilvl="3" w:tplc="4B5C554A">
       <w:numFmt w:val="decimal"/>
       <w:lvlText w:val=""/>
       <w:lvlJc w:val="left"/>
     </w:lvl>
-    <w:lvl w:ilvl="3" w:tplc="0ADC0342">
+    <w:lvl w:ilvl="4" w:tplc="59C0A38A">
       <w:numFmt w:val="decimal"/>
       <w:lvlText w:val=""/>
       <w:lvlJc w:val="left"/>
     </w:lvl>
-    <w:lvl w:ilvl="4" w:tplc="5E509DAA">
+    <w:lvl w:ilvl="5" w:tplc="82F2080C">
       <w:numFmt w:val="decimal"/>
       <w:lvlText w:val=""/>
       <w:lvlJc w:val="left"/>
     </w:lvl>
-    <w:lvl w:ilvl="5" w:tplc="0A1ADE64">
+    <w:lvl w:ilvl="6" w:tplc="11901838">
       <w:numFmt w:val="decimal"/>
       <w:lvlText w:val=""/>
       <w:lvlJc w:val="left"/>
     </w:lvl>
-    <w:lvl w:ilvl="6" w:tplc="6362185E">
+    <w:lvl w:ilvl="7" w:tplc="709ECB7A">
       <w:numFmt w:val="decimal"/>
       <w:lvlText w:val=""/>
       <w:lvlJc w:val="left"/>
     </w:lvl>
-    <w:lvl w:ilvl="7" w:tplc="14FEC882">
-      <w:numFmt w:val="decimal"/>
-      <w:lvlText w:val=""/>
-      <w:lvlJc w:val="left"/>
-    </w:lvl>
-    <w:lvl w:ilvl="8" w:tplc="A882F228">
+    <w:lvl w:ilvl="8" w:tplc="AB7A0756">
       <w:numFmt w:val="decimal"/>
       <w:lvlText w:val=""/>
       <w:lvlJc w:val="left"/>
     </w:lvl>
   </w:abstractNum>
   <w:abstractNum w:abstractNumId="1" w15:restartNumberingAfterBreak="0">
-    <w:nsid w:val="2EA22CE3"/>
+    <w:nsid w:val="222B799A"/>
     <w:multiLevelType w:val="hybridMultilevel"/>
-    <w:tmpl w:val="887CA4F6"/>
-    <w:lvl w:ilvl="0" w:tplc="038ECD92">
+    <w:tmpl w:val="0396DFB0"/>
+    <w:lvl w:ilvl="0" w:tplc="119CFB74" w:tentative="1">
+      <w:start w:val="1"/>
+      <w:numFmt w:val="bullet"/>
+      <w:lvlText w:val="●"/>
+      <w:lvlJc w:val="left"/>
+      <w:pPr>
+        <w:ind w:left="720" w:hanging="360"/>
+      </w:pPr>
+    </w:lvl>
+    <w:lvl w:ilvl="1" w:tplc="478E86A6" w:tentative="1">
+      <w:start w:val="1"/>
+      <w:numFmt w:val="bullet"/>
+      <w:lvlText w:val="○"/>
+      <w:lvlJc w:val="left"/>
+      <w:pPr>
+        <w:ind w:left="1440" w:hanging="360"/>
+      </w:pPr>
+    </w:lvl>
+    <w:lvl w:ilvl="2" w:tplc="2BBC2196" w:tentative="1">
+      <w:start w:val="1"/>
+      <w:numFmt w:val="bullet"/>
+      <w:lvlText w:val="■"/>
+      <w:lvlJc w:val="left"/>
+      <w:pPr>
+        <w:ind w:left="2160" w:hanging="360"/>
+      </w:pPr>
+    </w:lvl>
+    <w:lvl w:ilvl="3" w:tplc="D3ECA63A" w:tentative="1">
+      <w:start w:val="1"/>
+      <w:numFmt w:val="bullet"/>
+      <w:lvlText w:val="●"/>
+      <w:lvlJc w:val="left"/>
+      <w:pPr>
+        <w:ind w:left="2880" w:hanging="360"/>
+      </w:pPr>
+    </w:lvl>
+    <w:lvl w:ilvl="4" w:tplc="75886F74" w:tentative="1">
+      <w:start w:val="1"/>
+      <w:numFmt w:val="bullet"/>
+      <w:lvlText w:val="○"/>
+      <w:lvlJc w:val="left"/>
+      <w:pPr>
+        <w:ind w:left="3600" w:hanging="360"/>
+      </w:pPr>
+    </w:lvl>
+    <w:lvl w:ilvl="5" w:tplc="3A74CEFC" w:tentative="1">
+      <w:start w:val="1"/>
+      <w:numFmt w:val="bullet"/>
+      <w:lvlText w:val="■"/>
+      <w:lvlJc w:val="left"/>
+      <w:pPr>
+        <w:ind w:left="4320" w:hanging="360"/>
+      </w:pPr>
+    </w:lvl>
+    <w:lvl w:ilvl="6" w:tplc="59547A94" w:tentative="1">
+      <w:start w:val="1"/>
+      <w:numFmt w:val="bullet"/>
+      <w:lvlText w:val="●"/>
+      <w:lvlJc w:val="left"/>
+      <w:pPr>
+        <w:ind w:left="5040" w:hanging="360"/>
+      </w:pPr>
+    </w:lvl>
+    <w:lvl w:ilvl="7" w:tplc="0434AA12" w:tentative="1">
+      <w:start w:val="1"/>
+      <w:numFmt w:val="bullet"/>
+      <w:lvlText w:val="●"/>
+      <w:lvlJc w:val="left"/>
+      <w:pPr>
+        <w:ind w:left="5760" w:hanging="360"/>
+      </w:pPr>
+    </w:lvl>
+    <w:lvl w:ilvl="8" w:tplc="09AC6CC4" w:tentative="1">
+      <w:start w:val="1"/>
+      <w:numFmt w:val="bullet"/>
+      <w:lvlText w:val="●"/>
+      <w:lvlJc w:val="left"/>
+      <w:pPr>
+        <w:ind w:left="6480" w:hanging="360"/>
+      </w:pPr>
+    </w:lvl>
+  </w:abstractNum>
+  <w:abstractNum w:abstractNumId="2" w15:restartNumberingAfterBreak="0">
+    <w:nsid w:val="274B2C15"/>
+    <w:multiLevelType w:val="hybridMultilevel"/>
+    <w:tmpl w:val="B2E0B0E8"/>
+    <w:lvl w:ilvl="0" w:tplc="434054E4">
       <w:start w:val="1"/>
       <w:numFmt w:val="decimal"/>
       <w:lvlText w:val="%1."/>
@@ -16166,138 +18950,52 @@
         <w:ind w:left="360" w:hanging="300"/>
       </w:pPr>
     </w:lvl>
-    <w:lvl w:ilvl="1" w:tplc="E876BF0A">
+    <w:lvl w:ilvl="1" w:tplc="24287ED6">
       <w:numFmt w:val="decimal"/>
       <w:lvlText w:val=""/>
       <w:lvlJc w:val="left"/>
     </w:lvl>
-    <w:lvl w:ilvl="2" w:tplc="5EE85808">
+    <w:lvl w:ilvl="2" w:tplc="67186210">
       <w:numFmt w:val="decimal"/>
       <w:lvlText w:val=""/>
       <w:lvlJc w:val="left"/>
     </w:lvl>
-    <w:lvl w:ilvl="3" w:tplc="AB80C0C6">
+    <w:lvl w:ilvl="3" w:tplc="7DCC7F60">
       <w:numFmt w:val="decimal"/>
       <w:lvlText w:val=""/>
       <w:lvlJc w:val="left"/>
     </w:lvl>
-    <w:lvl w:ilvl="4" w:tplc="F80EB49E">
+    <w:lvl w:ilvl="4" w:tplc="F3546C92">
       <w:numFmt w:val="decimal"/>
       <w:lvlText w:val=""/>
       <w:lvlJc w:val="left"/>
     </w:lvl>
-    <w:lvl w:ilvl="5" w:tplc="8F58BB76">
+    <w:lvl w:ilvl="5" w:tplc="74821318">
       <w:numFmt w:val="decimal"/>
       <w:lvlText w:val=""/>
       <w:lvlJc w:val="left"/>
     </w:lvl>
-    <w:lvl w:ilvl="6" w:tplc="524800D4">
+    <w:lvl w:ilvl="6" w:tplc="DBF86E98">
       <w:numFmt w:val="decimal"/>
       <w:lvlText w:val=""/>
       <w:lvlJc w:val="left"/>
     </w:lvl>
-    <w:lvl w:ilvl="7" w:tplc="341CA2D6">
+    <w:lvl w:ilvl="7" w:tplc="16C01766">
       <w:numFmt w:val="decimal"/>
       <w:lvlText w:val=""/>
       <w:lvlJc w:val="left"/>
     </w:lvl>
-    <w:lvl w:ilvl="8" w:tplc="9732BE6C">
+    <w:lvl w:ilvl="8" w:tplc="2B6E600A">
       <w:numFmt w:val="decimal"/>
       <w:lvlText w:val=""/>
       <w:lvlJc w:val="left"/>
     </w:lvl>
   </w:abstractNum>
-  <w:abstractNum w:abstractNumId="2" w15:restartNumberingAfterBreak="0">
-    <w:nsid w:val="5D42773A"/>
+  <w:abstractNum w:abstractNumId="3" w15:restartNumberingAfterBreak="0">
+    <w:nsid w:val="35511856"/>
     <w:multiLevelType w:val="hybridMultilevel"/>
-    <w:tmpl w:val="1FC41C0C"/>
-    <w:lvl w:ilvl="0" w:tplc="717E4B32" w:tentative="1">
-      <w:start w:val="1"/>
-      <w:numFmt w:val="bullet"/>
-      <w:lvlText w:val="●"/>
-      <w:lvlJc w:val="left"/>
-      <w:pPr>
-        <w:ind w:left="720" w:hanging="360"/>
-      </w:pPr>
-    </w:lvl>
-    <w:lvl w:ilvl="1" w:tplc="336625D8" w:tentative="1">
-      <w:start w:val="1"/>
-      <w:numFmt w:val="bullet"/>
-      <w:lvlText w:val="○"/>
-      <w:lvlJc w:val="left"/>
-      <w:pPr>
-        <w:ind w:left="1440" w:hanging="360"/>
-      </w:pPr>
-    </w:lvl>
-    <w:lvl w:ilvl="2" w:tplc="5860E65C" w:tentative="1">
-      <w:start w:val="1"/>
-      <w:numFmt w:val="bullet"/>
-      <w:lvlText w:val="■"/>
-      <w:lvlJc w:val="left"/>
-      <w:pPr>
-        <w:ind w:left="2160" w:hanging="360"/>
-      </w:pPr>
-    </w:lvl>
-    <w:lvl w:ilvl="3" w:tplc="000AD32E" w:tentative="1">
-      <w:start w:val="1"/>
-      <w:numFmt w:val="bullet"/>
-      <w:lvlText w:val="●"/>
-      <w:lvlJc w:val="left"/>
-      <w:pPr>
-        <w:ind w:left="2880" w:hanging="360"/>
-      </w:pPr>
-    </w:lvl>
-    <w:lvl w:ilvl="4" w:tplc="4328D2BA" w:tentative="1">
-      <w:start w:val="1"/>
-      <w:numFmt w:val="bullet"/>
-      <w:lvlText w:val="○"/>
-      <w:lvlJc w:val="left"/>
-      <w:pPr>
-        <w:ind w:left="3600" w:hanging="360"/>
-      </w:pPr>
-    </w:lvl>
-    <w:lvl w:ilvl="5" w:tplc="DB805E9C" w:tentative="1">
-      <w:start w:val="1"/>
-      <w:numFmt w:val="bullet"/>
-      <w:lvlText w:val="■"/>
-      <w:lvlJc w:val="left"/>
-      <w:pPr>
-        <w:ind w:left="4320" w:hanging="360"/>
-      </w:pPr>
-    </w:lvl>
-    <w:lvl w:ilvl="6" w:tplc="DDBE8150" w:tentative="1">
-      <w:start w:val="1"/>
-      <w:numFmt w:val="bullet"/>
-      <w:lvlText w:val="●"/>
-      <w:lvlJc w:val="left"/>
-      <w:pPr>
-        <w:ind w:left="5040" w:hanging="360"/>
-      </w:pPr>
-    </w:lvl>
-    <w:lvl w:ilvl="7" w:tplc="4F92E3C8" w:tentative="1">
-      <w:start w:val="1"/>
-      <w:numFmt w:val="bullet"/>
-      <w:lvlText w:val="●"/>
-      <w:lvlJc w:val="left"/>
-      <w:pPr>
-        <w:ind w:left="5760" w:hanging="360"/>
-      </w:pPr>
-    </w:lvl>
-    <w:lvl w:ilvl="8" w:tplc="0DF01A46" w:tentative="1">
-      <w:start w:val="1"/>
-      <w:numFmt w:val="bullet"/>
-      <w:lvlText w:val="●"/>
-      <w:lvlJc w:val="left"/>
-      <w:pPr>
-        <w:ind w:left="6480" w:hanging="360"/>
-      </w:pPr>
-    </w:lvl>
-  </w:abstractNum>
-  <w:abstractNum w:abstractNumId="3" w15:restartNumberingAfterBreak="0">
-    <w:nsid w:val="6FFF67D8"/>
-    <w:multiLevelType w:val="hybridMultilevel"/>
-    <w:tmpl w:val="1EEC9FCE"/>
-    <w:lvl w:ilvl="0" w:tplc="1C622D64">
+    <w:tmpl w:val="A2121CD0"/>
+    <w:lvl w:ilvl="0" w:tplc="DDDCCD00">
       <w:start w:val="1"/>
       <w:numFmt w:val="decimal"/>
       <w:lvlText w:val="%1."/>
@@ -16306,131 +19004,187 @@
         <w:ind w:left="360" w:hanging="300"/>
       </w:pPr>
     </w:lvl>
-    <w:lvl w:ilvl="1" w:tplc="A20EA034">
+    <w:lvl w:ilvl="1" w:tplc="326CBBDE">
       <w:numFmt w:val="decimal"/>
       <w:lvlText w:val=""/>
       <w:lvlJc w:val="left"/>
     </w:lvl>
-    <w:lvl w:ilvl="2" w:tplc="6A1AFFC6">
+    <w:lvl w:ilvl="2" w:tplc="D1C06D2E">
       <w:numFmt w:val="decimal"/>
       <w:lvlText w:val=""/>
       <w:lvlJc w:val="left"/>
     </w:lvl>
-    <w:lvl w:ilvl="3" w:tplc="0E46ECEC">
+    <w:lvl w:ilvl="3" w:tplc="FBA468F0">
       <w:numFmt w:val="decimal"/>
       <w:lvlText w:val=""/>
       <w:lvlJc w:val="left"/>
     </w:lvl>
-    <w:lvl w:ilvl="4" w:tplc="B0484B1E">
+    <w:lvl w:ilvl="4" w:tplc="31A27478">
       <w:numFmt w:val="decimal"/>
       <w:lvlText w:val=""/>
       <w:lvlJc w:val="left"/>
     </w:lvl>
-    <w:lvl w:ilvl="5" w:tplc="565EDCAC">
+    <w:lvl w:ilvl="5" w:tplc="A7AAD006">
       <w:numFmt w:val="decimal"/>
       <w:lvlText w:val=""/>
       <w:lvlJc w:val="left"/>
     </w:lvl>
-    <w:lvl w:ilvl="6" w:tplc="5232B6C2">
+    <w:lvl w:ilvl="6" w:tplc="25D245E6">
       <w:numFmt w:val="decimal"/>
       <w:lvlText w:val=""/>
       <w:lvlJc w:val="left"/>
     </w:lvl>
-    <w:lvl w:ilvl="7" w:tplc="E9EEF78C">
+    <w:lvl w:ilvl="7" w:tplc="06927A02">
       <w:numFmt w:val="decimal"/>
       <w:lvlText w:val=""/>
       <w:lvlJc w:val="left"/>
     </w:lvl>
-    <w:lvl w:ilvl="8" w:tplc="39C82444">
+    <w:lvl w:ilvl="8" w:tplc="18DAA498">
       <w:numFmt w:val="decimal"/>
       <w:lvlText w:val=""/>
       <w:lvlJc w:val="left"/>
     </w:lvl>
   </w:abstractNum>
   <w:abstractNum w:abstractNumId="4" w15:restartNumberingAfterBreak="0">
-    <w:nsid w:val="7DE92CBF"/>
+    <w:nsid w:val="67B72D99"/>
     <w:multiLevelType w:val="hybridMultilevel"/>
-    <w:tmpl w:val="A2C4CC86"/>
-    <w:lvl w:ilvl="0" w:tplc="CE5ADBC8">
+    <w:tmpl w:val="F8849D6E"/>
+    <w:lvl w:ilvl="0" w:tplc="29064B7E">
       <w:start w:val="1"/>
-      <w:numFmt w:val="bullet"/>
-      <w:lvlText w:val="•"/>
+      <w:numFmt w:val="decimal"/>
+      <w:lvlText w:val="%1."/>
       <w:lvlJc w:val="left"/>
       <w:pPr>
-        <w:ind w:left="360" w:hanging="240"/>
+        <w:ind w:left="360" w:hanging="300"/>
       </w:pPr>
     </w:lvl>
-    <w:lvl w:ilvl="1" w:tplc="422C26F8" w:tentative="1">
-      <w:start w:val="1"/>
-      <w:numFmt w:val="bullet"/>
-      <w:lvlText w:val="–"/>
-      <w:lvlJc w:val="left"/>
-      <w:pPr>
-        <w:ind w:left="720" w:hanging="240"/>
-      </w:pPr>
-    </w:lvl>
-    <w:lvl w:ilvl="2" w:tplc="6E2E474E">
+    <w:lvl w:ilvl="1" w:tplc="81C85BC8">
       <w:numFmt w:val="decimal"/>
       <w:lvlText w:val=""/>
       <w:lvlJc w:val="left"/>
     </w:lvl>
-    <w:lvl w:ilvl="3" w:tplc="F36E83FC">
+    <w:lvl w:ilvl="2" w:tplc="5C2A34FE">
       <w:numFmt w:val="decimal"/>
       <w:lvlText w:val=""/>
       <w:lvlJc w:val="left"/>
     </w:lvl>
-    <w:lvl w:ilvl="4" w:tplc="E75AFEC2">
+    <w:lvl w:ilvl="3" w:tplc="718A1682">
       <w:numFmt w:val="decimal"/>
       <w:lvlText w:val=""/>
       <w:lvlJc w:val="left"/>
     </w:lvl>
-    <w:lvl w:ilvl="5" w:tplc="E1DA275C">
+    <w:lvl w:ilvl="4" w:tplc="F6E66432">
       <w:numFmt w:val="decimal"/>
       <w:lvlText w:val=""/>
       <w:lvlJc w:val="left"/>
     </w:lvl>
-    <w:lvl w:ilvl="6" w:tplc="5C1038C6">
+    <w:lvl w:ilvl="5" w:tplc="43F22C62">
       <w:numFmt w:val="decimal"/>
       <w:lvlText w:val=""/>
       <w:lvlJc w:val="left"/>
     </w:lvl>
-    <w:lvl w:ilvl="7" w:tplc="5EA8B27E">
+    <w:lvl w:ilvl="6" w:tplc="EF72B14C">
       <w:numFmt w:val="decimal"/>
       <w:lvlText w:val=""/>
       <w:lvlJc w:val="left"/>
     </w:lvl>
-    <w:lvl w:ilvl="8" w:tplc="325E9F86">
+    <w:lvl w:ilvl="7" w:tplc="5C7A2AC2">
+      <w:numFmt w:val="decimal"/>
+      <w:lvlText w:val=""/>
+      <w:lvlJc w:val="left"/>
+    </w:lvl>
+    <w:lvl w:ilvl="8" w:tplc="B1DE03C8">
       <w:numFmt w:val="decimal"/>
       <w:lvlText w:val=""/>
       <w:lvlJc w:val="left"/>
     </w:lvl>
   </w:abstractNum>
-  <w:num w:numId="1" w16cid:durableId="1059786597">
+  <w:abstractNum w:abstractNumId="5" w15:restartNumberingAfterBreak="0">
+    <w:nsid w:val="7EE27F86"/>
+    <w:multiLevelType w:val="hybridMultilevel"/>
+    <w:tmpl w:val="F67CAE8C"/>
+    <w:lvl w:ilvl="0" w:tplc="A57862E6">
+      <w:start w:val="1"/>
+      <w:numFmt w:val="decimal"/>
+      <w:lvlText w:val="%1."/>
+      <w:lvlJc w:val="left"/>
+      <w:pPr>
+        <w:ind w:left="360" w:hanging="300"/>
+      </w:pPr>
+    </w:lvl>
+    <w:lvl w:ilvl="1" w:tplc="92D69086">
+      <w:numFmt w:val="decimal"/>
+      <w:lvlText w:val=""/>
+      <w:lvlJc w:val="left"/>
+    </w:lvl>
+    <w:lvl w:ilvl="2" w:tplc="F6D2932C">
+      <w:numFmt w:val="decimal"/>
+      <w:lvlText w:val=""/>
+      <w:lvlJc w:val="left"/>
+    </w:lvl>
+    <w:lvl w:ilvl="3" w:tplc="656A2BCE">
+      <w:numFmt w:val="decimal"/>
+      <w:lvlText w:val=""/>
+      <w:lvlJc w:val="left"/>
+    </w:lvl>
+    <w:lvl w:ilvl="4" w:tplc="F8BCD300">
+      <w:numFmt w:val="decimal"/>
+      <w:lvlText w:val=""/>
+      <w:lvlJc w:val="left"/>
+    </w:lvl>
+    <w:lvl w:ilvl="5" w:tplc="63BA5548">
+      <w:numFmt w:val="decimal"/>
+      <w:lvlText w:val=""/>
+      <w:lvlJc w:val="left"/>
+    </w:lvl>
+    <w:lvl w:ilvl="6" w:tplc="1172B24E">
+      <w:numFmt w:val="decimal"/>
+      <w:lvlText w:val=""/>
+      <w:lvlJc w:val="left"/>
+    </w:lvl>
+    <w:lvl w:ilvl="7" w:tplc="E6A299C0">
+      <w:numFmt w:val="decimal"/>
+      <w:lvlText w:val=""/>
+      <w:lvlJc w:val="left"/>
+    </w:lvl>
+    <w:lvl w:ilvl="8" w:tplc="DD1E6038">
+      <w:numFmt w:val="decimal"/>
+      <w:lvlText w:val=""/>
+      <w:lvlJc w:val="left"/>
+    </w:lvl>
+  </w:abstractNum>
+  <w:num w:numId="1" w16cid:durableId="1873765437">
+    <w:abstractNumId w:val="1"/>
+    <w:lvlOverride w:ilvl="0">
+      <w:startOverride w:val="1"/>
+    </w:lvlOverride>
+  </w:num>
+  <w:num w:numId="2" w16cid:durableId="1975063650">
+    <w:abstractNumId w:val="0"/>
+    <w:lvlOverride w:ilvl="0">
+      <w:startOverride w:val="1"/>
+    </w:lvlOverride>
+  </w:num>
+  <w:num w:numId="3" w16cid:durableId="814687912">
+    <w:abstractNumId w:val="4"/>
+    <w:lvlOverride w:ilvl="0">
+      <w:startOverride w:val="1"/>
+    </w:lvlOverride>
+  </w:num>
+  <w:num w:numId="4" w16cid:durableId="1821532771">
+    <w:abstractNumId w:val="5"/>
+    <w:lvlOverride w:ilvl="0">
+      <w:startOverride w:val="1"/>
+    </w:lvlOverride>
+  </w:num>
+  <w:num w:numId="5" w16cid:durableId="773282918">
     <w:abstractNumId w:val="2"/>
     <w:lvlOverride w:ilvl="0">
       <w:startOverride w:val="1"/>
     </w:lvlOverride>
   </w:num>
-  <w:num w:numId="2" w16cid:durableId="1167331206">
-    <w:abstractNumId w:val="4"/>
-    <w:lvlOverride w:ilvl="0">
-      <w:startOverride w:val="1"/>
-    </w:lvlOverride>
-  </w:num>
-  <w:num w:numId="3" w16cid:durableId="1689788876">
-    <w:abstractNumId w:val="1"/>
-    <w:lvlOverride w:ilvl="0">
-      <w:startOverride w:val="1"/>
-    </w:lvlOverride>
-  </w:num>
-  <w:num w:numId="4" w16cid:durableId="1220359893">
+  <w:num w:numId="6" w16cid:durableId="1238395292">
     <w:abstractNumId w:val="3"/>
-    <w:lvlOverride w:ilvl="0">
-      <w:startOverride w:val="1"/>
-    </w:lvlOverride>
-  </w:num>
-  <w:num w:numId="5" w16cid:durableId="162670615">
-    <w:abstractNumId w:val="0"/>
     <w:lvlOverride w:ilvl="0">
       <w:startOverride w:val="1"/>
     </w:lvlOverride>
@@ -17076,7 +19830,7 @@
     <w:autoRedefine/>
     <w:uiPriority w:val="39"/>
     <w:unhideWhenUsed/>
-    <w:rsid w:val="00B936D3"/>
+    <w:rsid w:val="004C0797"/>
     <w:pPr>
       <w:spacing w:after="100"/>
     </w:pPr>
@@ -17088,7 +19842,7 @@
     <w:autoRedefine/>
     <w:uiPriority w:val="39"/>
     <w:unhideWhenUsed/>
-    <w:rsid w:val="00B936D3"/>
+    <w:rsid w:val="004C0797"/>
     <w:pPr>
       <w:spacing w:after="100"/>
       <w:ind w:left="210"/>

</xml_diff>